<commit_message>
modified text colors, updated gitignore
</commit_message>
<xml_diff>
--- a/CS 401 - Group 2 - SRS Doc.docx
+++ b/CS 401 - Group 2 - SRS Doc.docx
@@ -11,7 +11,7 @@
           <w:color w:val="000000"/>
         </w:rPr>
       </w:pPr>
-      <w:bookmarkStart w:name="CompanyName" w:id="0"/>
+      <w:bookmarkStart w:id="0" w:name="CompanyName"/>
       <w:bookmarkEnd w:id="0"/>
       <w:r>
         <w:rPr>
@@ -33,7 +33,7 @@
         <w:sectPr>
           <w:headerReference w:type="default" r:id="rId7"/>
           <w:footerReference w:type="default" r:id="rId8"/>
-          <w:pgSz w:w="12240" w:h="15840" w:orient="portrait"/>
+          <w:pgSz w:w="12240" w:h="15840"/>
           <w:pgMar w:top="1440" w:right="1800" w:bottom="1800" w:left="1800" w:header="720" w:footer="1080" w:gutter="0"/>
           <w:pgNumType w:fmt="lowerRoman" w:start="1"/>
           <w:cols w:space="720"/>
@@ -47,11 +47,6 @@
           <w:color w:val="000000"/>
         </w:rPr>
         <w:br/>
-      </w:r>
-      <w:r>
-        <w:rPr>
-          <w:color w:val="000000"/>
-        </w:rPr>
         <w:t>Software Requirements Specification</w:t>
       </w:r>
       <w:r>
@@ -70,12 +65,13 @@
           <w:color w:val="000000"/>
         </w:rPr>
       </w:pPr>
-      <w:bookmarkStart w:name="CompanyName1" w:id="1"/>
+      <w:bookmarkStart w:id="1" w:name="CompanyName1"/>
       <w:bookmarkEnd w:id="1"/>
       <w:r>
         <w:rPr>
           <w:color w:val="000000"/>
         </w:rPr>
+        <w:lastRenderedPageBreak/>
         <w:t>Revision History</w:t>
       </w:r>
     </w:p>
@@ -108,12 +104,11 @@
           <w:tcPr>
             <w:tcW w:w="1275" w:type="dxa"/>
             <w:tcBorders>
-              <w:top w:val="single" w:color="000000" w:themeColor="text1" w:sz="6" w:space="0"/>
-              <w:left w:val="single" w:color="000000" w:themeColor="text1" w:sz="6" w:space="0"/>
-              <w:bottom w:val="single" w:color="000000" w:themeColor="text1" w:sz="6" w:space="0"/>
-            </w:tcBorders>
-            <w:shd w:val="clear" w:color="auto" w:fill="E5E5E5"/>
-            <w:tcMar/>
+              <w:top w:val="single" w:sz="6" w:space="0" w:color="000000" w:themeColor="text1"/>
+              <w:left w:val="single" w:sz="6" w:space="0" w:color="000000" w:themeColor="text1"/>
+              <w:bottom w:val="single" w:sz="6" w:space="0" w:color="000000" w:themeColor="text1"/>
+            </w:tcBorders>
+            <w:shd w:val="clear" w:color="auto" w:fill="E5E5E5"/>
           </w:tcPr>
           <w:p>
             <w:pPr>
@@ -137,12 +132,11 @@
           <w:tcPr>
             <w:tcW w:w="1083" w:type="dxa"/>
             <w:tcBorders>
-              <w:top w:val="single" w:color="000000" w:themeColor="text1" w:sz="6" w:space="0"/>
-              <w:left w:val="single" w:color="000000" w:themeColor="text1" w:sz="6" w:space="0"/>
-              <w:bottom w:val="single" w:color="000000" w:themeColor="text1" w:sz="6" w:space="0"/>
-            </w:tcBorders>
-            <w:shd w:val="clear" w:color="auto" w:fill="E5E5E5"/>
-            <w:tcMar/>
+              <w:top w:val="single" w:sz="6" w:space="0" w:color="000000" w:themeColor="text1"/>
+              <w:left w:val="single" w:sz="6" w:space="0" w:color="000000" w:themeColor="text1"/>
+              <w:bottom w:val="single" w:sz="6" w:space="0" w:color="000000" w:themeColor="text1"/>
+            </w:tcBorders>
+            <w:shd w:val="clear" w:color="auto" w:fill="E5E5E5"/>
           </w:tcPr>
           <w:p>
             <w:pPr>
@@ -166,12 +160,11 @@
           <w:tcPr>
             <w:tcW w:w="3813" w:type="dxa"/>
             <w:tcBorders>
-              <w:top w:val="single" w:color="000000" w:themeColor="text1" w:sz="6" w:space="0"/>
-              <w:left w:val="single" w:color="000000" w:themeColor="text1" w:sz="6" w:space="0"/>
-              <w:bottom w:val="single" w:color="000000" w:themeColor="text1" w:sz="6" w:space="0"/>
-            </w:tcBorders>
-            <w:shd w:val="clear" w:color="auto" w:fill="E5E5E5"/>
-            <w:tcMar/>
+              <w:top w:val="single" w:sz="6" w:space="0" w:color="000000" w:themeColor="text1"/>
+              <w:left w:val="single" w:sz="6" w:space="0" w:color="000000" w:themeColor="text1"/>
+              <w:bottom w:val="single" w:sz="6" w:space="0" w:color="000000" w:themeColor="text1"/>
+            </w:tcBorders>
+            <w:shd w:val="clear" w:color="auto" w:fill="E5E5E5"/>
           </w:tcPr>
           <w:p>
             <w:pPr>
@@ -195,13 +188,12 @@
           <w:tcPr>
             <w:tcW w:w="2591" w:type="dxa"/>
             <w:tcBorders>
-              <w:top w:val="single" w:color="000000" w:themeColor="text1" w:sz="6" w:space="0"/>
-              <w:left w:val="single" w:color="000000" w:themeColor="text1" w:sz="6" w:space="0"/>
-              <w:bottom w:val="single" w:color="000000" w:themeColor="text1" w:sz="6" w:space="0"/>
-              <w:right w:val="single" w:color="000000" w:themeColor="text1" w:sz="6" w:space="0"/>
-            </w:tcBorders>
-            <w:shd w:val="clear" w:color="auto" w:fill="E5E5E5"/>
-            <w:tcMar/>
+              <w:top w:val="single" w:sz="6" w:space="0" w:color="000000" w:themeColor="text1"/>
+              <w:left w:val="single" w:sz="6" w:space="0" w:color="000000" w:themeColor="text1"/>
+              <w:bottom w:val="single" w:sz="6" w:space="0" w:color="000000" w:themeColor="text1"/>
+              <w:right w:val="single" w:sz="6" w:space="0" w:color="000000" w:themeColor="text1"/>
+            </w:tcBorders>
+            <w:shd w:val="clear" w:color="auto" w:fill="E5E5E5"/>
           </w:tcPr>
           <w:p>
             <w:pPr>
@@ -227,12 +219,11 @@
           <w:tcPr>
             <w:tcW w:w="1275" w:type="dxa"/>
             <w:tcBorders>
-              <w:top w:val="single" w:color="000000" w:themeColor="text1" w:sz="6" w:space="0"/>
-              <w:left w:val="single" w:color="000000" w:themeColor="text1" w:sz="6" w:space="0"/>
-              <w:bottom w:val="single" w:color="000000" w:themeColor="text1" w:sz="6" w:space="0"/>
-            </w:tcBorders>
-            <w:shd w:val="clear" w:color="auto" w:fill="E5E5E5"/>
-            <w:tcMar/>
+              <w:top w:val="single" w:sz="6" w:space="0" w:color="000000" w:themeColor="text1"/>
+              <w:left w:val="single" w:sz="6" w:space="0" w:color="000000" w:themeColor="text1"/>
+              <w:bottom w:val="single" w:sz="6" w:space="0" w:color="000000" w:themeColor="text1"/>
+            </w:tcBorders>
+            <w:shd w:val="clear" w:color="auto" w:fill="E5E5E5"/>
           </w:tcPr>
           <w:p>
             <w:pPr>
@@ -253,12 +244,11 @@
           <w:tcPr>
             <w:tcW w:w="1083" w:type="dxa"/>
             <w:tcBorders>
-              <w:top w:val="single" w:color="000000" w:themeColor="text1" w:sz="6" w:space="0"/>
-              <w:left w:val="single" w:color="000000" w:themeColor="text1" w:sz="6" w:space="0"/>
-              <w:bottom w:val="single" w:color="000000" w:themeColor="text1" w:sz="6" w:space="0"/>
-            </w:tcBorders>
-            <w:shd w:val="clear" w:color="auto" w:fill="E5E5E5"/>
-            <w:tcMar/>
+              <w:top w:val="single" w:sz="6" w:space="0" w:color="000000" w:themeColor="text1"/>
+              <w:left w:val="single" w:sz="6" w:space="0" w:color="000000" w:themeColor="text1"/>
+              <w:bottom w:val="single" w:sz="6" w:space="0" w:color="000000" w:themeColor="text1"/>
+            </w:tcBorders>
+            <w:shd w:val="clear" w:color="auto" w:fill="E5E5E5"/>
           </w:tcPr>
           <w:p>
             <w:pPr>
@@ -279,12 +269,11 @@
           <w:tcPr>
             <w:tcW w:w="3813" w:type="dxa"/>
             <w:tcBorders>
-              <w:top w:val="single" w:color="000000" w:themeColor="text1" w:sz="6" w:space="0"/>
-              <w:left w:val="single" w:color="000000" w:themeColor="text1" w:sz="6" w:space="0"/>
-              <w:bottom w:val="single" w:color="000000" w:themeColor="text1" w:sz="6" w:space="0"/>
-            </w:tcBorders>
-            <w:shd w:val="clear" w:color="auto" w:fill="E5E5E5"/>
-            <w:tcMar/>
+              <w:top w:val="single" w:sz="6" w:space="0" w:color="000000" w:themeColor="text1"/>
+              <w:left w:val="single" w:sz="6" w:space="0" w:color="000000" w:themeColor="text1"/>
+              <w:bottom w:val="single" w:sz="6" w:space="0" w:color="000000" w:themeColor="text1"/>
+            </w:tcBorders>
+            <w:shd w:val="clear" w:color="auto" w:fill="E5E5E5"/>
           </w:tcPr>
           <w:p>
             <w:pPr>
@@ -305,13 +294,12 @@
           <w:tcPr>
             <w:tcW w:w="2591" w:type="dxa"/>
             <w:tcBorders>
-              <w:top w:val="single" w:color="000000" w:themeColor="text1" w:sz="6" w:space="0"/>
-              <w:left w:val="single" w:color="000000" w:themeColor="text1" w:sz="6" w:space="0"/>
-              <w:bottom w:val="single" w:color="000000" w:themeColor="text1" w:sz="6" w:space="0"/>
-              <w:right w:val="single" w:color="000000" w:themeColor="text1" w:sz="6" w:space="0"/>
-            </w:tcBorders>
-            <w:shd w:val="clear" w:color="auto" w:fill="E5E5E5"/>
-            <w:tcMar/>
+              <w:top w:val="single" w:sz="6" w:space="0" w:color="000000" w:themeColor="text1"/>
+              <w:left w:val="single" w:sz="6" w:space="0" w:color="000000" w:themeColor="text1"/>
+              <w:bottom w:val="single" w:sz="6" w:space="0" w:color="000000" w:themeColor="text1"/>
+              <w:right w:val="single" w:sz="6" w:space="0" w:color="000000" w:themeColor="text1"/>
+            </w:tcBorders>
+            <w:shd w:val="clear" w:color="auto" w:fill="E5E5E5"/>
           </w:tcPr>
           <w:p>
             <w:pPr>
@@ -334,12 +322,11 @@
           <w:tcPr>
             <w:tcW w:w="1275" w:type="dxa"/>
             <w:tcBorders>
-              <w:top w:val="single" w:color="000000" w:themeColor="text1" w:sz="6" w:space="0"/>
-              <w:left w:val="single" w:color="000000" w:themeColor="text1" w:sz="6" w:space="0"/>
-              <w:bottom w:val="single" w:color="000000" w:themeColor="text1" w:sz="6" w:space="0"/>
-            </w:tcBorders>
-            <w:shd w:val="clear" w:color="auto" w:fill="E5E5E5"/>
-            <w:tcMar/>
+              <w:top w:val="single" w:sz="6" w:space="0" w:color="000000" w:themeColor="text1"/>
+              <w:left w:val="single" w:sz="6" w:space="0" w:color="000000" w:themeColor="text1"/>
+              <w:bottom w:val="single" w:sz="6" w:space="0" w:color="000000" w:themeColor="text1"/>
+            </w:tcBorders>
+            <w:shd w:val="clear" w:color="auto" w:fill="E5E5E5"/>
           </w:tcPr>
           <w:p>
             <w:pPr>
@@ -352,7 +339,7 @@
             </w:pPr>
             <w:r>
               <w:rPr>
-                <w:color w:val="000000" w:themeColor="text1" w:themeTint="FF" w:themeShade="FF"/>
+                <w:color w:val="000000" w:themeColor="text1"/>
                 <w:u w:val="single"/>
               </w:rPr>
               <w:t>02/23/2026</w:t>
@@ -363,12 +350,11 @@
           <w:tcPr>
             <w:tcW w:w="1083" w:type="dxa"/>
             <w:tcBorders>
-              <w:top w:val="single" w:color="000000" w:themeColor="text1" w:sz="6" w:space="0"/>
-              <w:left w:val="single" w:color="000000" w:themeColor="text1" w:sz="6" w:space="0"/>
-              <w:bottom w:val="single" w:color="000000" w:themeColor="text1" w:sz="6" w:space="0"/>
-            </w:tcBorders>
-            <w:shd w:val="clear" w:color="auto" w:fill="E5E5E5"/>
-            <w:tcMar/>
+              <w:top w:val="single" w:sz="6" w:space="0" w:color="000000" w:themeColor="text1"/>
+              <w:left w:val="single" w:sz="6" w:space="0" w:color="000000" w:themeColor="text1"/>
+              <w:bottom w:val="single" w:sz="6" w:space="0" w:color="000000" w:themeColor="text1"/>
+            </w:tcBorders>
+            <w:shd w:val="clear" w:color="auto" w:fill="E5E5E5"/>
           </w:tcPr>
           <w:p>
             <w:pPr>
@@ -380,7 +366,7 @@
             </w:pPr>
             <w:r>
               <w:rPr>
-                <w:color w:val="000000" w:themeColor="text1" w:themeTint="FF" w:themeShade="FF"/>
+                <w:color w:val="000000" w:themeColor="text1"/>
               </w:rPr>
               <w:t>1.1</w:t>
             </w:r>
@@ -390,12 +376,11 @@
           <w:tcPr>
             <w:tcW w:w="3813" w:type="dxa"/>
             <w:tcBorders>
-              <w:top w:val="single" w:color="000000" w:themeColor="text1" w:sz="6" w:space="0"/>
-              <w:left w:val="single" w:color="000000" w:themeColor="text1" w:sz="6" w:space="0"/>
-              <w:bottom w:val="single" w:color="000000" w:themeColor="text1" w:sz="6" w:space="0"/>
-            </w:tcBorders>
-            <w:shd w:val="clear" w:color="auto" w:fill="E5E5E5"/>
-            <w:tcMar/>
+              <w:top w:val="single" w:sz="6" w:space="0" w:color="000000" w:themeColor="text1"/>
+              <w:left w:val="single" w:sz="6" w:space="0" w:color="000000" w:themeColor="text1"/>
+              <w:bottom w:val="single" w:sz="6" w:space="0" w:color="000000" w:themeColor="text1"/>
+            </w:tcBorders>
+            <w:shd w:val="clear" w:color="auto" w:fill="E5E5E5"/>
           </w:tcPr>
           <w:p>
             <w:pPr>
@@ -407,7 +392,7 @@
             </w:pPr>
             <w:r>
               <w:rPr>
-                <w:color w:val="000000" w:themeColor="text1" w:themeTint="FF" w:themeShade="FF"/>
+                <w:color w:val="000000" w:themeColor="text1"/>
               </w:rPr>
               <w:t>Definitions (1.2) &amp; Overview (1.4) Updated</w:t>
             </w:r>
@@ -417,13 +402,12 @@
           <w:tcPr>
             <w:tcW w:w="2591" w:type="dxa"/>
             <w:tcBorders>
-              <w:top w:val="single" w:color="000000" w:themeColor="text1" w:sz="6" w:space="0"/>
-              <w:left w:val="single" w:color="000000" w:themeColor="text1" w:sz="6" w:space="0"/>
-              <w:bottom w:val="single" w:color="000000" w:themeColor="text1" w:sz="6" w:space="0"/>
-              <w:right w:val="single" w:color="000000" w:themeColor="text1" w:sz="6" w:space="0"/>
-            </w:tcBorders>
-            <w:shd w:val="clear" w:color="auto" w:fill="E5E5E5"/>
-            <w:tcMar/>
+              <w:top w:val="single" w:sz="6" w:space="0" w:color="000000" w:themeColor="text1"/>
+              <w:left w:val="single" w:sz="6" w:space="0" w:color="000000" w:themeColor="text1"/>
+              <w:bottom w:val="single" w:sz="6" w:space="0" w:color="000000" w:themeColor="text1"/>
+              <w:right w:val="single" w:sz="6" w:space="0" w:color="000000" w:themeColor="text1"/>
+            </w:tcBorders>
+            <w:shd w:val="clear" w:color="auto" w:fill="E5E5E5"/>
           </w:tcPr>
           <w:p>
             <w:pPr>
@@ -435,7 +419,7 @@
             </w:pPr>
             <w:r>
               <w:rPr>
-                <w:color w:val="000000" w:themeColor="text1" w:themeTint="FF" w:themeShade="FF"/>
+                <w:color w:val="000000" w:themeColor="text1"/>
               </w:rPr>
               <w:t>Nick Vu</w:t>
             </w:r>
@@ -447,12 +431,11 @@
           <w:tcPr>
             <w:tcW w:w="1275" w:type="dxa"/>
             <w:tcBorders>
-              <w:top w:val="single" w:color="000000" w:themeColor="text1" w:sz="6" w:space="0"/>
-              <w:left w:val="single" w:color="000000" w:themeColor="text1" w:sz="6" w:space="0"/>
-              <w:bottom w:val="single" w:color="000000" w:themeColor="text1" w:sz="6" w:space="0"/>
-            </w:tcBorders>
-            <w:shd w:val="clear" w:color="auto" w:fill="E5E5E5"/>
-            <w:tcMar/>
+              <w:top w:val="single" w:sz="6" w:space="0" w:color="000000" w:themeColor="text1"/>
+              <w:left w:val="single" w:sz="6" w:space="0" w:color="000000" w:themeColor="text1"/>
+              <w:bottom w:val="single" w:sz="6" w:space="0" w:color="000000" w:themeColor="text1"/>
+            </w:tcBorders>
+            <w:shd w:val="clear" w:color="auto" w:fill="E5E5E5"/>
           </w:tcPr>
           <w:p>
             <w:pPr>
@@ -465,7 +448,7 @@
             </w:pPr>
             <w:r>
               <w:rPr>
-                <w:color w:val="000000" w:themeColor="text1" w:themeTint="FF" w:themeShade="FF"/>
+                <w:color w:val="000000" w:themeColor="text1"/>
                 <w:u w:val="single"/>
               </w:rPr>
               <w:t>02/24/2026</w:t>
@@ -476,12 +459,11 @@
           <w:tcPr>
             <w:tcW w:w="1083" w:type="dxa"/>
             <w:tcBorders>
-              <w:top w:val="single" w:color="000000" w:themeColor="text1" w:sz="6" w:space="0"/>
-              <w:left w:val="single" w:color="000000" w:themeColor="text1" w:sz="6" w:space="0"/>
-              <w:bottom w:val="single" w:color="000000" w:themeColor="text1" w:sz="6" w:space="0"/>
-            </w:tcBorders>
-            <w:shd w:val="clear" w:color="auto" w:fill="E5E5E5"/>
-            <w:tcMar/>
+              <w:top w:val="single" w:sz="6" w:space="0" w:color="000000" w:themeColor="text1"/>
+              <w:left w:val="single" w:sz="6" w:space="0" w:color="000000" w:themeColor="text1"/>
+              <w:bottom w:val="single" w:sz="6" w:space="0" w:color="000000" w:themeColor="text1"/>
+            </w:tcBorders>
+            <w:shd w:val="clear" w:color="auto" w:fill="E5E5E5"/>
           </w:tcPr>
           <w:p>
             <w:pPr>
@@ -493,7 +475,7 @@
             </w:pPr>
             <w:r>
               <w:rPr>
-                <w:color w:val="000000" w:themeColor="text1" w:themeTint="FF" w:themeShade="FF"/>
+                <w:color w:val="000000" w:themeColor="text1"/>
               </w:rPr>
               <w:t>1.2</w:t>
             </w:r>
@@ -503,12 +485,11 @@
           <w:tcPr>
             <w:tcW w:w="3813" w:type="dxa"/>
             <w:tcBorders>
-              <w:top w:val="single" w:color="000000" w:themeColor="text1" w:sz="6" w:space="0"/>
-              <w:left w:val="single" w:color="000000" w:themeColor="text1" w:sz="6" w:space="0"/>
-              <w:bottom w:val="single" w:color="000000" w:themeColor="text1" w:sz="6" w:space="0"/>
-            </w:tcBorders>
-            <w:shd w:val="clear" w:color="auto" w:fill="E5E5E5"/>
-            <w:tcMar/>
+              <w:top w:val="single" w:sz="6" w:space="0" w:color="000000" w:themeColor="text1"/>
+              <w:left w:val="single" w:sz="6" w:space="0" w:color="000000" w:themeColor="text1"/>
+              <w:bottom w:val="single" w:sz="6" w:space="0" w:color="000000" w:themeColor="text1"/>
+            </w:tcBorders>
+            <w:shd w:val="clear" w:color="auto" w:fill="E5E5E5"/>
           </w:tcPr>
           <w:p>
             <w:pPr>
@@ -520,7 +501,7 @@
             </w:pPr>
             <w:r>
               <w:rPr>
-                <w:color w:val="000000" w:themeColor="text1" w:themeTint="FF" w:themeShade="FF"/>
+                <w:color w:val="000000" w:themeColor="text1"/>
               </w:rPr>
               <w:t>Refined definitions</w:t>
             </w:r>
@@ -530,13 +511,12 @@
           <w:tcPr>
             <w:tcW w:w="2591" w:type="dxa"/>
             <w:tcBorders>
-              <w:top w:val="single" w:color="000000" w:themeColor="text1" w:sz="6" w:space="0"/>
-              <w:left w:val="single" w:color="000000" w:themeColor="text1" w:sz="6" w:space="0"/>
-              <w:bottom w:val="single" w:color="000000" w:themeColor="text1" w:sz="6" w:space="0"/>
-              <w:right w:val="single" w:color="000000" w:themeColor="text1" w:sz="6" w:space="0"/>
-            </w:tcBorders>
-            <w:shd w:val="clear" w:color="auto" w:fill="E5E5E5"/>
-            <w:tcMar/>
+              <w:top w:val="single" w:sz="6" w:space="0" w:color="000000" w:themeColor="text1"/>
+              <w:left w:val="single" w:sz="6" w:space="0" w:color="000000" w:themeColor="text1"/>
+              <w:bottom w:val="single" w:sz="6" w:space="0" w:color="000000" w:themeColor="text1"/>
+              <w:right w:val="single" w:sz="6" w:space="0" w:color="000000" w:themeColor="text1"/>
+            </w:tcBorders>
+            <w:shd w:val="clear" w:color="auto" w:fill="E5E5E5"/>
           </w:tcPr>
           <w:p>
             <w:pPr>
@@ -548,7 +528,7 @@
             </w:pPr>
             <w:r>
               <w:rPr>
-                <w:color w:val="000000" w:themeColor="text1" w:themeTint="FF" w:themeShade="FF"/>
+                <w:color w:val="000000" w:themeColor="text1"/>
               </w:rPr>
               <w:t>Nick Vu</w:t>
             </w:r>
@@ -560,12 +540,11 @@
           <w:tcPr>
             <w:tcW w:w="1275" w:type="dxa"/>
             <w:tcBorders>
-              <w:top w:val="single" w:color="000000" w:themeColor="text1" w:sz="6" w:space="0"/>
-              <w:left w:val="single" w:color="000000" w:themeColor="text1" w:sz="6" w:space="0"/>
-              <w:bottom w:val="single" w:color="000000" w:themeColor="text1" w:sz="6" w:space="0"/>
-            </w:tcBorders>
-            <w:shd w:val="clear" w:color="auto" w:fill="E5E5E5"/>
-            <w:tcMar/>
+              <w:top w:val="single" w:sz="6" w:space="0" w:color="000000" w:themeColor="text1"/>
+              <w:left w:val="single" w:sz="6" w:space="0" w:color="000000" w:themeColor="text1"/>
+              <w:bottom w:val="single" w:sz="6" w:space="0" w:color="000000" w:themeColor="text1"/>
+            </w:tcBorders>
+            <w:shd w:val="clear" w:color="auto" w:fill="E5E5E5"/>
           </w:tcPr>
           <w:p>
             <w:pPr>
@@ -582,12 +561,11 @@
           <w:tcPr>
             <w:tcW w:w="1083" w:type="dxa"/>
             <w:tcBorders>
-              <w:top w:val="single" w:color="000000" w:themeColor="text1" w:sz="6" w:space="0"/>
-              <w:left w:val="single" w:color="000000" w:themeColor="text1" w:sz="6" w:space="0"/>
-              <w:bottom w:val="single" w:color="000000" w:themeColor="text1" w:sz="6" w:space="0"/>
-            </w:tcBorders>
-            <w:shd w:val="clear" w:color="auto" w:fill="E5E5E5"/>
-            <w:tcMar/>
+              <w:top w:val="single" w:sz="6" w:space="0" w:color="000000" w:themeColor="text1"/>
+              <w:left w:val="single" w:sz="6" w:space="0" w:color="000000" w:themeColor="text1"/>
+              <w:bottom w:val="single" w:sz="6" w:space="0" w:color="000000" w:themeColor="text1"/>
+            </w:tcBorders>
+            <w:shd w:val="clear" w:color="auto" w:fill="E5E5E5"/>
           </w:tcPr>
           <w:p>
             <w:pPr>
@@ -603,12 +581,11 @@
           <w:tcPr>
             <w:tcW w:w="3813" w:type="dxa"/>
             <w:tcBorders>
-              <w:top w:val="single" w:color="000000" w:themeColor="text1" w:sz="6" w:space="0"/>
-              <w:left w:val="single" w:color="000000" w:themeColor="text1" w:sz="6" w:space="0"/>
-              <w:bottom w:val="single" w:color="000000" w:themeColor="text1" w:sz="6" w:space="0"/>
-            </w:tcBorders>
-            <w:shd w:val="clear" w:color="auto" w:fill="E5E5E5"/>
-            <w:tcMar/>
+              <w:top w:val="single" w:sz="6" w:space="0" w:color="000000" w:themeColor="text1"/>
+              <w:left w:val="single" w:sz="6" w:space="0" w:color="000000" w:themeColor="text1"/>
+              <w:bottom w:val="single" w:sz="6" w:space="0" w:color="000000" w:themeColor="text1"/>
+            </w:tcBorders>
+            <w:shd w:val="clear" w:color="auto" w:fill="E5E5E5"/>
           </w:tcPr>
           <w:p>
             <w:pPr>
@@ -624,13 +601,12 @@
           <w:tcPr>
             <w:tcW w:w="2591" w:type="dxa"/>
             <w:tcBorders>
-              <w:top w:val="single" w:color="000000" w:themeColor="text1" w:sz="6" w:space="0"/>
-              <w:left w:val="single" w:color="000000" w:themeColor="text1" w:sz="6" w:space="0"/>
-              <w:bottom w:val="single" w:color="000000" w:themeColor="text1" w:sz="6" w:space="0"/>
-              <w:right w:val="single" w:color="000000" w:themeColor="text1" w:sz="6" w:space="0"/>
-            </w:tcBorders>
-            <w:shd w:val="clear" w:color="auto" w:fill="E5E5E5"/>
-            <w:tcMar/>
+              <w:top w:val="single" w:sz="6" w:space="0" w:color="000000" w:themeColor="text1"/>
+              <w:left w:val="single" w:sz="6" w:space="0" w:color="000000" w:themeColor="text1"/>
+              <w:bottom w:val="single" w:sz="6" w:space="0" w:color="000000" w:themeColor="text1"/>
+              <w:right w:val="single" w:sz="6" w:space="0" w:color="000000" w:themeColor="text1"/>
+            </w:tcBorders>
+            <w:shd w:val="clear" w:color="auto" w:fill="E5E5E5"/>
           </w:tcPr>
           <w:p>
             <w:pPr>
@@ -648,12 +624,11 @@
           <w:tcPr>
             <w:tcW w:w="1275" w:type="dxa"/>
             <w:tcBorders>
-              <w:top w:val="single" w:color="000000" w:themeColor="text1" w:sz="6" w:space="0"/>
-              <w:left w:val="single" w:color="000000" w:themeColor="text1" w:sz="6" w:space="0"/>
-              <w:bottom w:val="single" w:color="000000" w:themeColor="text1" w:sz="6" w:space="0"/>
-            </w:tcBorders>
-            <w:shd w:val="clear" w:color="auto" w:fill="E5E5E5"/>
-            <w:tcMar/>
+              <w:top w:val="single" w:sz="6" w:space="0" w:color="000000" w:themeColor="text1"/>
+              <w:left w:val="single" w:sz="6" w:space="0" w:color="000000" w:themeColor="text1"/>
+              <w:bottom w:val="single" w:sz="6" w:space="0" w:color="000000" w:themeColor="text1"/>
+            </w:tcBorders>
+            <w:shd w:val="clear" w:color="auto" w:fill="E5E5E5"/>
           </w:tcPr>
           <w:p>
             <w:pPr>
@@ -670,12 +645,11 @@
           <w:tcPr>
             <w:tcW w:w="1083" w:type="dxa"/>
             <w:tcBorders>
-              <w:top w:val="single" w:color="000000" w:themeColor="text1" w:sz="6" w:space="0"/>
-              <w:left w:val="single" w:color="000000" w:themeColor="text1" w:sz="6" w:space="0"/>
-              <w:bottom w:val="single" w:color="000000" w:themeColor="text1" w:sz="6" w:space="0"/>
-            </w:tcBorders>
-            <w:shd w:val="clear" w:color="auto" w:fill="E5E5E5"/>
-            <w:tcMar/>
+              <w:top w:val="single" w:sz="6" w:space="0" w:color="000000" w:themeColor="text1"/>
+              <w:left w:val="single" w:sz="6" w:space="0" w:color="000000" w:themeColor="text1"/>
+              <w:bottom w:val="single" w:sz="6" w:space="0" w:color="000000" w:themeColor="text1"/>
+            </w:tcBorders>
+            <w:shd w:val="clear" w:color="auto" w:fill="E5E5E5"/>
           </w:tcPr>
           <w:p>
             <w:pPr>
@@ -691,12 +665,11 @@
           <w:tcPr>
             <w:tcW w:w="3813" w:type="dxa"/>
             <w:tcBorders>
-              <w:top w:val="single" w:color="000000" w:themeColor="text1" w:sz="6" w:space="0"/>
-              <w:left w:val="single" w:color="000000" w:themeColor="text1" w:sz="6" w:space="0"/>
-              <w:bottom w:val="single" w:color="000000" w:themeColor="text1" w:sz="6" w:space="0"/>
-            </w:tcBorders>
-            <w:shd w:val="clear" w:color="auto" w:fill="E5E5E5"/>
-            <w:tcMar/>
+              <w:top w:val="single" w:sz="6" w:space="0" w:color="000000" w:themeColor="text1"/>
+              <w:left w:val="single" w:sz="6" w:space="0" w:color="000000" w:themeColor="text1"/>
+              <w:bottom w:val="single" w:sz="6" w:space="0" w:color="000000" w:themeColor="text1"/>
+            </w:tcBorders>
+            <w:shd w:val="clear" w:color="auto" w:fill="E5E5E5"/>
           </w:tcPr>
           <w:p>
             <w:pPr>
@@ -712,13 +685,12 @@
           <w:tcPr>
             <w:tcW w:w="2591" w:type="dxa"/>
             <w:tcBorders>
-              <w:top w:val="single" w:color="000000" w:themeColor="text1" w:sz="6" w:space="0"/>
-              <w:left w:val="single" w:color="000000" w:themeColor="text1" w:sz="6" w:space="0"/>
-              <w:bottom w:val="single" w:color="000000" w:themeColor="text1" w:sz="6" w:space="0"/>
-              <w:right w:val="single" w:color="000000" w:themeColor="text1" w:sz="6" w:space="0"/>
-            </w:tcBorders>
-            <w:shd w:val="clear" w:color="auto" w:fill="E5E5E5"/>
-            <w:tcMar/>
+              <w:top w:val="single" w:sz="6" w:space="0" w:color="000000" w:themeColor="text1"/>
+              <w:left w:val="single" w:sz="6" w:space="0" w:color="000000" w:themeColor="text1"/>
+              <w:bottom w:val="single" w:sz="6" w:space="0" w:color="000000" w:themeColor="text1"/>
+              <w:right w:val="single" w:sz="6" w:space="0" w:color="000000" w:themeColor="text1"/>
+            </w:tcBorders>
+            <w:shd w:val="clear" w:color="auto" w:fill="E5E5E5"/>
           </w:tcPr>
           <w:p>
             <w:pPr>
@@ -736,12 +708,11 @@
           <w:tcPr>
             <w:tcW w:w="1275" w:type="dxa"/>
             <w:tcBorders>
-              <w:top w:val="single" w:color="000000" w:themeColor="text1" w:sz="6" w:space="0"/>
-              <w:left w:val="single" w:color="000000" w:themeColor="text1" w:sz="6" w:space="0"/>
-              <w:bottom w:val="single" w:color="000000" w:themeColor="text1" w:sz="6" w:space="0"/>
-            </w:tcBorders>
-            <w:shd w:val="clear" w:color="auto" w:fill="E5E5E5"/>
-            <w:tcMar/>
+              <w:top w:val="single" w:sz="6" w:space="0" w:color="000000" w:themeColor="text1"/>
+              <w:left w:val="single" w:sz="6" w:space="0" w:color="000000" w:themeColor="text1"/>
+              <w:bottom w:val="single" w:sz="6" w:space="0" w:color="000000" w:themeColor="text1"/>
+            </w:tcBorders>
+            <w:shd w:val="clear" w:color="auto" w:fill="E5E5E5"/>
           </w:tcPr>
           <w:p>
             <w:pPr>
@@ -758,12 +729,11 @@
           <w:tcPr>
             <w:tcW w:w="1083" w:type="dxa"/>
             <w:tcBorders>
-              <w:top w:val="single" w:color="000000" w:themeColor="text1" w:sz="6" w:space="0"/>
-              <w:left w:val="single" w:color="000000" w:themeColor="text1" w:sz="6" w:space="0"/>
-              <w:bottom w:val="single" w:color="000000" w:themeColor="text1" w:sz="6" w:space="0"/>
-            </w:tcBorders>
-            <w:shd w:val="clear" w:color="auto" w:fill="E5E5E5"/>
-            <w:tcMar/>
+              <w:top w:val="single" w:sz="6" w:space="0" w:color="000000" w:themeColor="text1"/>
+              <w:left w:val="single" w:sz="6" w:space="0" w:color="000000" w:themeColor="text1"/>
+              <w:bottom w:val="single" w:sz="6" w:space="0" w:color="000000" w:themeColor="text1"/>
+            </w:tcBorders>
+            <w:shd w:val="clear" w:color="auto" w:fill="E5E5E5"/>
           </w:tcPr>
           <w:p>
             <w:pPr>
@@ -779,12 +749,11 @@
           <w:tcPr>
             <w:tcW w:w="3813" w:type="dxa"/>
             <w:tcBorders>
-              <w:top w:val="single" w:color="000000" w:themeColor="text1" w:sz="6" w:space="0"/>
-              <w:left w:val="single" w:color="000000" w:themeColor="text1" w:sz="6" w:space="0"/>
-              <w:bottom w:val="single" w:color="000000" w:themeColor="text1" w:sz="6" w:space="0"/>
-            </w:tcBorders>
-            <w:shd w:val="clear" w:color="auto" w:fill="E5E5E5"/>
-            <w:tcMar/>
+              <w:top w:val="single" w:sz="6" w:space="0" w:color="000000" w:themeColor="text1"/>
+              <w:left w:val="single" w:sz="6" w:space="0" w:color="000000" w:themeColor="text1"/>
+              <w:bottom w:val="single" w:sz="6" w:space="0" w:color="000000" w:themeColor="text1"/>
+            </w:tcBorders>
+            <w:shd w:val="clear" w:color="auto" w:fill="E5E5E5"/>
           </w:tcPr>
           <w:p>
             <w:pPr>
@@ -800,13 +769,12 @@
           <w:tcPr>
             <w:tcW w:w="2591" w:type="dxa"/>
             <w:tcBorders>
-              <w:top w:val="single" w:color="000000" w:themeColor="text1" w:sz="6" w:space="0"/>
-              <w:left w:val="single" w:color="000000" w:themeColor="text1" w:sz="6" w:space="0"/>
-              <w:bottom w:val="single" w:color="000000" w:themeColor="text1" w:sz="6" w:space="0"/>
-              <w:right w:val="single" w:color="000000" w:themeColor="text1" w:sz="6" w:space="0"/>
-            </w:tcBorders>
-            <w:shd w:val="clear" w:color="auto" w:fill="E5E5E5"/>
-            <w:tcMar/>
+              <w:top w:val="single" w:sz="6" w:space="0" w:color="000000" w:themeColor="text1"/>
+              <w:left w:val="single" w:sz="6" w:space="0" w:color="000000" w:themeColor="text1"/>
+              <w:bottom w:val="single" w:sz="6" w:space="0" w:color="000000" w:themeColor="text1"/>
+              <w:right w:val="single" w:sz="6" w:space="0" w:color="000000" w:themeColor="text1"/>
+            </w:tcBorders>
+            <w:shd w:val="clear" w:color="auto" w:fill="E5E5E5"/>
           </w:tcPr>
           <w:p>
             <w:pPr>
@@ -824,12 +792,11 @@
           <w:tcPr>
             <w:tcW w:w="1275" w:type="dxa"/>
             <w:tcBorders>
-              <w:top w:val="single" w:color="000000" w:themeColor="text1" w:sz="6" w:space="0"/>
-              <w:left w:val="single" w:color="000000" w:themeColor="text1" w:sz="6" w:space="0"/>
-              <w:bottom w:val="single" w:color="000000" w:themeColor="text1" w:sz="6" w:space="0"/>
-            </w:tcBorders>
-            <w:shd w:val="clear" w:color="auto" w:fill="E5E5E5"/>
-            <w:tcMar/>
+              <w:top w:val="single" w:sz="6" w:space="0" w:color="000000" w:themeColor="text1"/>
+              <w:left w:val="single" w:sz="6" w:space="0" w:color="000000" w:themeColor="text1"/>
+              <w:bottom w:val="single" w:sz="6" w:space="0" w:color="000000" w:themeColor="text1"/>
+            </w:tcBorders>
+            <w:shd w:val="clear" w:color="auto" w:fill="E5E5E5"/>
           </w:tcPr>
           <w:p>
             <w:pPr>
@@ -846,12 +813,11 @@
           <w:tcPr>
             <w:tcW w:w="1083" w:type="dxa"/>
             <w:tcBorders>
-              <w:top w:val="single" w:color="000000" w:themeColor="text1" w:sz="6" w:space="0"/>
-              <w:left w:val="single" w:color="000000" w:themeColor="text1" w:sz="6" w:space="0"/>
-              <w:bottom w:val="single" w:color="000000" w:themeColor="text1" w:sz="6" w:space="0"/>
-            </w:tcBorders>
-            <w:shd w:val="clear" w:color="auto" w:fill="E5E5E5"/>
-            <w:tcMar/>
+              <w:top w:val="single" w:sz="6" w:space="0" w:color="000000" w:themeColor="text1"/>
+              <w:left w:val="single" w:sz="6" w:space="0" w:color="000000" w:themeColor="text1"/>
+              <w:bottom w:val="single" w:sz="6" w:space="0" w:color="000000" w:themeColor="text1"/>
+            </w:tcBorders>
+            <w:shd w:val="clear" w:color="auto" w:fill="E5E5E5"/>
           </w:tcPr>
           <w:p>
             <w:pPr>
@@ -867,12 +833,11 @@
           <w:tcPr>
             <w:tcW w:w="3813" w:type="dxa"/>
             <w:tcBorders>
-              <w:top w:val="single" w:color="000000" w:themeColor="text1" w:sz="6" w:space="0"/>
-              <w:left w:val="single" w:color="000000" w:themeColor="text1" w:sz="6" w:space="0"/>
-              <w:bottom w:val="single" w:color="000000" w:themeColor="text1" w:sz="6" w:space="0"/>
-            </w:tcBorders>
-            <w:shd w:val="clear" w:color="auto" w:fill="E5E5E5"/>
-            <w:tcMar/>
+              <w:top w:val="single" w:sz="6" w:space="0" w:color="000000" w:themeColor="text1"/>
+              <w:left w:val="single" w:sz="6" w:space="0" w:color="000000" w:themeColor="text1"/>
+              <w:bottom w:val="single" w:sz="6" w:space="0" w:color="000000" w:themeColor="text1"/>
+            </w:tcBorders>
+            <w:shd w:val="clear" w:color="auto" w:fill="E5E5E5"/>
           </w:tcPr>
           <w:p>
             <w:pPr>
@@ -888,13 +853,12 @@
           <w:tcPr>
             <w:tcW w:w="2591" w:type="dxa"/>
             <w:tcBorders>
-              <w:top w:val="single" w:color="000000" w:themeColor="text1" w:sz="6" w:space="0"/>
-              <w:left w:val="single" w:color="000000" w:themeColor="text1" w:sz="6" w:space="0"/>
-              <w:bottom w:val="single" w:color="000000" w:themeColor="text1" w:sz="6" w:space="0"/>
-              <w:right w:val="single" w:color="000000" w:themeColor="text1" w:sz="6" w:space="0"/>
-            </w:tcBorders>
-            <w:shd w:val="clear" w:color="auto" w:fill="E5E5E5"/>
-            <w:tcMar/>
+              <w:top w:val="single" w:sz="6" w:space="0" w:color="000000" w:themeColor="text1"/>
+              <w:left w:val="single" w:sz="6" w:space="0" w:color="000000" w:themeColor="text1"/>
+              <w:bottom w:val="single" w:sz="6" w:space="0" w:color="000000" w:themeColor="text1"/>
+              <w:right w:val="single" w:sz="6" w:space="0" w:color="000000" w:themeColor="text1"/>
+            </w:tcBorders>
+            <w:shd w:val="clear" w:color="auto" w:fill="E5E5E5"/>
           </w:tcPr>
           <w:p>
             <w:pPr>
@@ -912,12 +876,11 @@
           <w:tcPr>
             <w:tcW w:w="1275" w:type="dxa"/>
             <w:tcBorders>
-              <w:top w:val="single" w:color="000000" w:themeColor="text1" w:sz="6" w:space="0"/>
-              <w:left w:val="single" w:color="000000" w:themeColor="text1" w:sz="6" w:space="0"/>
-              <w:bottom w:val="single" w:color="000000" w:themeColor="text1" w:sz="6" w:space="0"/>
-            </w:tcBorders>
-            <w:shd w:val="clear" w:color="auto" w:fill="E5E5E5"/>
-            <w:tcMar/>
+              <w:top w:val="single" w:sz="6" w:space="0" w:color="000000" w:themeColor="text1"/>
+              <w:left w:val="single" w:sz="6" w:space="0" w:color="000000" w:themeColor="text1"/>
+              <w:bottom w:val="single" w:sz="6" w:space="0" w:color="000000" w:themeColor="text1"/>
+            </w:tcBorders>
+            <w:shd w:val="clear" w:color="auto" w:fill="E5E5E5"/>
           </w:tcPr>
           <w:p>
             <w:pPr>
@@ -934,12 +897,11 @@
           <w:tcPr>
             <w:tcW w:w="1083" w:type="dxa"/>
             <w:tcBorders>
-              <w:top w:val="single" w:color="000000" w:themeColor="text1" w:sz="6" w:space="0"/>
-              <w:left w:val="single" w:color="000000" w:themeColor="text1" w:sz="6" w:space="0"/>
-              <w:bottom w:val="single" w:color="000000" w:themeColor="text1" w:sz="6" w:space="0"/>
-            </w:tcBorders>
-            <w:shd w:val="clear" w:color="auto" w:fill="E5E5E5"/>
-            <w:tcMar/>
+              <w:top w:val="single" w:sz="6" w:space="0" w:color="000000" w:themeColor="text1"/>
+              <w:left w:val="single" w:sz="6" w:space="0" w:color="000000" w:themeColor="text1"/>
+              <w:bottom w:val="single" w:sz="6" w:space="0" w:color="000000" w:themeColor="text1"/>
+            </w:tcBorders>
+            <w:shd w:val="clear" w:color="auto" w:fill="E5E5E5"/>
           </w:tcPr>
           <w:p>
             <w:pPr>
@@ -955,12 +917,11 @@
           <w:tcPr>
             <w:tcW w:w="3813" w:type="dxa"/>
             <w:tcBorders>
-              <w:top w:val="single" w:color="000000" w:themeColor="text1" w:sz="6" w:space="0"/>
-              <w:left w:val="single" w:color="000000" w:themeColor="text1" w:sz="6" w:space="0"/>
-              <w:bottom w:val="single" w:color="000000" w:themeColor="text1" w:sz="6" w:space="0"/>
-            </w:tcBorders>
-            <w:shd w:val="clear" w:color="auto" w:fill="E5E5E5"/>
-            <w:tcMar/>
+              <w:top w:val="single" w:sz="6" w:space="0" w:color="000000" w:themeColor="text1"/>
+              <w:left w:val="single" w:sz="6" w:space="0" w:color="000000" w:themeColor="text1"/>
+              <w:bottom w:val="single" w:sz="6" w:space="0" w:color="000000" w:themeColor="text1"/>
+            </w:tcBorders>
+            <w:shd w:val="clear" w:color="auto" w:fill="E5E5E5"/>
           </w:tcPr>
           <w:p>
             <w:pPr>
@@ -976,13 +937,12 @@
           <w:tcPr>
             <w:tcW w:w="2591" w:type="dxa"/>
             <w:tcBorders>
-              <w:top w:val="single" w:color="000000" w:themeColor="text1" w:sz="6" w:space="0"/>
-              <w:left w:val="single" w:color="000000" w:themeColor="text1" w:sz="6" w:space="0"/>
-              <w:bottom w:val="single" w:color="000000" w:themeColor="text1" w:sz="6" w:space="0"/>
-              <w:right w:val="single" w:color="000000" w:themeColor="text1" w:sz="6" w:space="0"/>
-            </w:tcBorders>
-            <w:shd w:val="clear" w:color="auto" w:fill="E5E5E5"/>
-            <w:tcMar/>
+              <w:top w:val="single" w:sz="6" w:space="0" w:color="000000" w:themeColor="text1"/>
+              <w:left w:val="single" w:sz="6" w:space="0" w:color="000000" w:themeColor="text1"/>
+              <w:bottom w:val="single" w:sz="6" w:space="0" w:color="000000" w:themeColor="text1"/>
+              <w:right w:val="single" w:sz="6" w:space="0" w:color="000000" w:themeColor="text1"/>
+            </w:tcBorders>
+            <w:shd w:val="clear" w:color="auto" w:fill="E5E5E5"/>
           </w:tcPr>
           <w:p>
             <w:pPr>
@@ -1000,12 +960,11 @@
           <w:tcPr>
             <w:tcW w:w="1275" w:type="dxa"/>
             <w:tcBorders>
-              <w:top w:val="single" w:color="000000" w:themeColor="text1" w:sz="6" w:space="0"/>
-              <w:left w:val="single" w:color="000000" w:themeColor="text1" w:sz="6" w:space="0"/>
-              <w:bottom w:val="single" w:color="000000" w:themeColor="text1" w:sz="6" w:space="0"/>
-            </w:tcBorders>
-            <w:shd w:val="clear" w:color="auto" w:fill="E5E5E5"/>
-            <w:tcMar/>
+              <w:top w:val="single" w:sz="6" w:space="0" w:color="000000" w:themeColor="text1"/>
+              <w:left w:val="single" w:sz="6" w:space="0" w:color="000000" w:themeColor="text1"/>
+              <w:bottom w:val="single" w:sz="6" w:space="0" w:color="000000" w:themeColor="text1"/>
+            </w:tcBorders>
+            <w:shd w:val="clear" w:color="auto" w:fill="E5E5E5"/>
           </w:tcPr>
           <w:p>
             <w:pPr>
@@ -1022,12 +981,11 @@
           <w:tcPr>
             <w:tcW w:w="1083" w:type="dxa"/>
             <w:tcBorders>
-              <w:top w:val="single" w:color="000000" w:themeColor="text1" w:sz="6" w:space="0"/>
-              <w:left w:val="single" w:color="000000" w:themeColor="text1" w:sz="6" w:space="0"/>
-              <w:bottom w:val="single" w:color="000000" w:themeColor="text1" w:sz="6" w:space="0"/>
-            </w:tcBorders>
-            <w:shd w:val="clear" w:color="auto" w:fill="E5E5E5"/>
-            <w:tcMar/>
+              <w:top w:val="single" w:sz="6" w:space="0" w:color="000000" w:themeColor="text1"/>
+              <w:left w:val="single" w:sz="6" w:space="0" w:color="000000" w:themeColor="text1"/>
+              <w:bottom w:val="single" w:sz="6" w:space="0" w:color="000000" w:themeColor="text1"/>
+            </w:tcBorders>
+            <w:shd w:val="clear" w:color="auto" w:fill="E5E5E5"/>
           </w:tcPr>
           <w:p>
             <w:pPr>
@@ -1043,12 +1001,11 @@
           <w:tcPr>
             <w:tcW w:w="3813" w:type="dxa"/>
             <w:tcBorders>
-              <w:top w:val="single" w:color="000000" w:themeColor="text1" w:sz="6" w:space="0"/>
-              <w:left w:val="single" w:color="000000" w:themeColor="text1" w:sz="6" w:space="0"/>
-              <w:bottom w:val="single" w:color="000000" w:themeColor="text1" w:sz="6" w:space="0"/>
-            </w:tcBorders>
-            <w:shd w:val="clear" w:color="auto" w:fill="E5E5E5"/>
-            <w:tcMar/>
+              <w:top w:val="single" w:sz="6" w:space="0" w:color="000000" w:themeColor="text1"/>
+              <w:left w:val="single" w:sz="6" w:space="0" w:color="000000" w:themeColor="text1"/>
+              <w:bottom w:val="single" w:sz="6" w:space="0" w:color="000000" w:themeColor="text1"/>
+            </w:tcBorders>
+            <w:shd w:val="clear" w:color="auto" w:fill="E5E5E5"/>
           </w:tcPr>
           <w:p>
             <w:pPr>
@@ -1064,13 +1021,12 @@
           <w:tcPr>
             <w:tcW w:w="2591" w:type="dxa"/>
             <w:tcBorders>
-              <w:top w:val="single" w:color="000000" w:themeColor="text1" w:sz="6" w:space="0"/>
-              <w:left w:val="single" w:color="000000" w:themeColor="text1" w:sz="6" w:space="0"/>
-              <w:bottom w:val="single" w:color="000000" w:themeColor="text1" w:sz="6" w:space="0"/>
-              <w:right w:val="single" w:color="000000" w:themeColor="text1" w:sz="6" w:space="0"/>
-            </w:tcBorders>
-            <w:shd w:val="clear" w:color="auto" w:fill="E5E5E5"/>
-            <w:tcMar/>
+              <w:top w:val="single" w:sz="6" w:space="0" w:color="000000" w:themeColor="text1"/>
+              <w:left w:val="single" w:sz="6" w:space="0" w:color="000000" w:themeColor="text1"/>
+              <w:bottom w:val="single" w:sz="6" w:space="0" w:color="000000" w:themeColor="text1"/>
+              <w:right w:val="single" w:sz="6" w:space="0" w:color="000000" w:themeColor="text1"/>
+            </w:tcBorders>
+            <w:shd w:val="clear" w:color="auto" w:fill="E5E5E5"/>
           </w:tcPr>
           <w:p>
             <w:pPr>
@@ -1088,12 +1044,11 @@
           <w:tcPr>
             <w:tcW w:w="1275" w:type="dxa"/>
             <w:tcBorders>
-              <w:top w:val="single" w:color="000000" w:themeColor="text1" w:sz="6" w:space="0"/>
-              <w:left w:val="single" w:color="000000" w:themeColor="text1" w:sz="6" w:space="0"/>
-              <w:bottom w:val="single" w:color="000000" w:themeColor="text1" w:sz="6" w:space="0"/>
-            </w:tcBorders>
-            <w:shd w:val="clear" w:color="auto" w:fill="E5E5E5"/>
-            <w:tcMar/>
+              <w:top w:val="single" w:sz="6" w:space="0" w:color="000000" w:themeColor="text1"/>
+              <w:left w:val="single" w:sz="6" w:space="0" w:color="000000" w:themeColor="text1"/>
+              <w:bottom w:val="single" w:sz="6" w:space="0" w:color="000000" w:themeColor="text1"/>
+            </w:tcBorders>
+            <w:shd w:val="clear" w:color="auto" w:fill="E5E5E5"/>
           </w:tcPr>
           <w:p>
             <w:pPr>
@@ -1110,12 +1065,11 @@
           <w:tcPr>
             <w:tcW w:w="1083" w:type="dxa"/>
             <w:tcBorders>
-              <w:top w:val="single" w:color="000000" w:themeColor="text1" w:sz="6" w:space="0"/>
-              <w:left w:val="single" w:color="000000" w:themeColor="text1" w:sz="6" w:space="0"/>
-              <w:bottom w:val="single" w:color="000000" w:themeColor="text1" w:sz="6" w:space="0"/>
-            </w:tcBorders>
-            <w:shd w:val="clear" w:color="auto" w:fill="E5E5E5"/>
-            <w:tcMar/>
+              <w:top w:val="single" w:sz="6" w:space="0" w:color="000000" w:themeColor="text1"/>
+              <w:left w:val="single" w:sz="6" w:space="0" w:color="000000" w:themeColor="text1"/>
+              <w:bottom w:val="single" w:sz="6" w:space="0" w:color="000000" w:themeColor="text1"/>
+            </w:tcBorders>
+            <w:shd w:val="clear" w:color="auto" w:fill="E5E5E5"/>
           </w:tcPr>
           <w:p>
             <w:pPr>
@@ -1131,12 +1085,11 @@
           <w:tcPr>
             <w:tcW w:w="3813" w:type="dxa"/>
             <w:tcBorders>
-              <w:top w:val="single" w:color="000000" w:themeColor="text1" w:sz="6" w:space="0"/>
-              <w:left w:val="single" w:color="000000" w:themeColor="text1" w:sz="6" w:space="0"/>
-              <w:bottom w:val="single" w:color="000000" w:themeColor="text1" w:sz="6" w:space="0"/>
-            </w:tcBorders>
-            <w:shd w:val="clear" w:color="auto" w:fill="E5E5E5"/>
-            <w:tcMar/>
+              <w:top w:val="single" w:sz="6" w:space="0" w:color="000000" w:themeColor="text1"/>
+              <w:left w:val="single" w:sz="6" w:space="0" w:color="000000" w:themeColor="text1"/>
+              <w:bottom w:val="single" w:sz="6" w:space="0" w:color="000000" w:themeColor="text1"/>
+            </w:tcBorders>
+            <w:shd w:val="clear" w:color="auto" w:fill="E5E5E5"/>
           </w:tcPr>
           <w:p>
             <w:pPr>
@@ -1152,13 +1105,12 @@
           <w:tcPr>
             <w:tcW w:w="2591" w:type="dxa"/>
             <w:tcBorders>
-              <w:top w:val="single" w:color="000000" w:themeColor="text1" w:sz="6" w:space="0"/>
-              <w:left w:val="single" w:color="000000" w:themeColor="text1" w:sz="6" w:space="0"/>
-              <w:bottom w:val="single" w:color="000000" w:themeColor="text1" w:sz="6" w:space="0"/>
-              <w:right w:val="single" w:color="000000" w:themeColor="text1" w:sz="6" w:space="0"/>
-            </w:tcBorders>
-            <w:shd w:val="clear" w:color="auto" w:fill="E5E5E5"/>
-            <w:tcMar/>
+              <w:top w:val="single" w:sz="6" w:space="0" w:color="000000" w:themeColor="text1"/>
+              <w:left w:val="single" w:sz="6" w:space="0" w:color="000000" w:themeColor="text1"/>
+              <w:bottom w:val="single" w:sz="6" w:space="0" w:color="000000" w:themeColor="text1"/>
+              <w:right w:val="single" w:sz="6" w:space="0" w:color="000000" w:themeColor="text1"/>
+            </w:tcBorders>
+            <w:shd w:val="clear" w:color="auto" w:fill="E5E5E5"/>
           </w:tcPr>
           <w:p>
             <w:pPr>
@@ -1176,12 +1128,11 @@
           <w:tcPr>
             <w:tcW w:w="1275" w:type="dxa"/>
             <w:tcBorders>
-              <w:top w:val="single" w:color="000000" w:themeColor="text1" w:sz="6" w:space="0"/>
-              <w:left w:val="single" w:color="000000" w:themeColor="text1" w:sz="6" w:space="0"/>
-              <w:bottom w:val="single" w:color="000000" w:themeColor="text1" w:sz="6" w:space="0"/>
-            </w:tcBorders>
-            <w:shd w:val="clear" w:color="auto" w:fill="E5E5E5"/>
-            <w:tcMar/>
+              <w:top w:val="single" w:sz="6" w:space="0" w:color="000000" w:themeColor="text1"/>
+              <w:left w:val="single" w:sz="6" w:space="0" w:color="000000" w:themeColor="text1"/>
+              <w:bottom w:val="single" w:sz="6" w:space="0" w:color="000000" w:themeColor="text1"/>
+            </w:tcBorders>
+            <w:shd w:val="clear" w:color="auto" w:fill="E5E5E5"/>
           </w:tcPr>
           <w:p>
             <w:pPr>
@@ -1198,12 +1149,11 @@
           <w:tcPr>
             <w:tcW w:w="1083" w:type="dxa"/>
             <w:tcBorders>
-              <w:top w:val="single" w:color="000000" w:themeColor="text1" w:sz="6" w:space="0"/>
-              <w:left w:val="single" w:color="000000" w:themeColor="text1" w:sz="6" w:space="0"/>
-              <w:bottom w:val="single" w:color="000000" w:themeColor="text1" w:sz="6" w:space="0"/>
-            </w:tcBorders>
-            <w:shd w:val="clear" w:color="auto" w:fill="E5E5E5"/>
-            <w:tcMar/>
+              <w:top w:val="single" w:sz="6" w:space="0" w:color="000000" w:themeColor="text1"/>
+              <w:left w:val="single" w:sz="6" w:space="0" w:color="000000" w:themeColor="text1"/>
+              <w:bottom w:val="single" w:sz="6" w:space="0" w:color="000000" w:themeColor="text1"/>
+            </w:tcBorders>
+            <w:shd w:val="clear" w:color="auto" w:fill="E5E5E5"/>
           </w:tcPr>
           <w:p>
             <w:pPr>
@@ -1219,12 +1169,11 @@
           <w:tcPr>
             <w:tcW w:w="3813" w:type="dxa"/>
             <w:tcBorders>
-              <w:top w:val="single" w:color="000000" w:themeColor="text1" w:sz="6" w:space="0"/>
-              <w:left w:val="single" w:color="000000" w:themeColor="text1" w:sz="6" w:space="0"/>
-              <w:bottom w:val="single" w:color="000000" w:themeColor="text1" w:sz="6" w:space="0"/>
-            </w:tcBorders>
-            <w:shd w:val="clear" w:color="auto" w:fill="E5E5E5"/>
-            <w:tcMar/>
+              <w:top w:val="single" w:sz="6" w:space="0" w:color="000000" w:themeColor="text1"/>
+              <w:left w:val="single" w:sz="6" w:space="0" w:color="000000" w:themeColor="text1"/>
+              <w:bottom w:val="single" w:sz="6" w:space="0" w:color="000000" w:themeColor="text1"/>
+            </w:tcBorders>
+            <w:shd w:val="clear" w:color="auto" w:fill="E5E5E5"/>
           </w:tcPr>
           <w:p>
             <w:pPr>
@@ -1240,13 +1189,12 @@
           <w:tcPr>
             <w:tcW w:w="2591" w:type="dxa"/>
             <w:tcBorders>
-              <w:top w:val="single" w:color="000000" w:themeColor="text1" w:sz="6" w:space="0"/>
-              <w:left w:val="single" w:color="000000" w:themeColor="text1" w:sz="6" w:space="0"/>
-              <w:bottom w:val="single" w:color="000000" w:themeColor="text1" w:sz="6" w:space="0"/>
-              <w:right w:val="single" w:color="000000" w:themeColor="text1" w:sz="6" w:space="0"/>
-            </w:tcBorders>
-            <w:shd w:val="clear" w:color="auto" w:fill="E5E5E5"/>
-            <w:tcMar/>
+              <w:top w:val="single" w:sz="6" w:space="0" w:color="000000" w:themeColor="text1"/>
+              <w:left w:val="single" w:sz="6" w:space="0" w:color="000000" w:themeColor="text1"/>
+              <w:bottom w:val="single" w:sz="6" w:space="0" w:color="000000" w:themeColor="text1"/>
+              <w:right w:val="single" w:sz="6" w:space="0" w:color="000000" w:themeColor="text1"/>
+            </w:tcBorders>
+            <w:shd w:val="clear" w:color="auto" w:fill="E5E5E5"/>
           </w:tcPr>
           <w:p>
             <w:pPr>
@@ -1264,12 +1212,11 @@
           <w:tcPr>
             <w:tcW w:w="1275" w:type="dxa"/>
             <w:tcBorders>
-              <w:top w:val="single" w:color="000000" w:themeColor="text1" w:sz="6" w:space="0"/>
-              <w:left w:val="single" w:color="000000" w:themeColor="text1" w:sz="6" w:space="0"/>
-              <w:bottom w:val="single" w:color="000000" w:themeColor="text1" w:sz="6" w:space="0"/>
-            </w:tcBorders>
-            <w:shd w:val="clear" w:color="auto" w:fill="E5E5E5"/>
-            <w:tcMar/>
+              <w:top w:val="single" w:sz="6" w:space="0" w:color="000000" w:themeColor="text1"/>
+              <w:left w:val="single" w:sz="6" w:space="0" w:color="000000" w:themeColor="text1"/>
+              <w:bottom w:val="single" w:sz="6" w:space="0" w:color="000000" w:themeColor="text1"/>
+            </w:tcBorders>
+            <w:shd w:val="clear" w:color="auto" w:fill="E5E5E5"/>
           </w:tcPr>
           <w:p>
             <w:pPr>
@@ -1286,12 +1233,11 @@
           <w:tcPr>
             <w:tcW w:w="1083" w:type="dxa"/>
             <w:tcBorders>
-              <w:top w:val="single" w:color="000000" w:themeColor="text1" w:sz="6" w:space="0"/>
-              <w:left w:val="single" w:color="000000" w:themeColor="text1" w:sz="6" w:space="0"/>
-              <w:bottom w:val="single" w:color="000000" w:themeColor="text1" w:sz="6" w:space="0"/>
-            </w:tcBorders>
-            <w:shd w:val="clear" w:color="auto" w:fill="E5E5E5"/>
-            <w:tcMar/>
+              <w:top w:val="single" w:sz="6" w:space="0" w:color="000000" w:themeColor="text1"/>
+              <w:left w:val="single" w:sz="6" w:space="0" w:color="000000" w:themeColor="text1"/>
+              <w:bottom w:val="single" w:sz="6" w:space="0" w:color="000000" w:themeColor="text1"/>
+            </w:tcBorders>
+            <w:shd w:val="clear" w:color="auto" w:fill="E5E5E5"/>
           </w:tcPr>
           <w:p>
             <w:pPr>
@@ -1307,12 +1253,11 @@
           <w:tcPr>
             <w:tcW w:w="3813" w:type="dxa"/>
             <w:tcBorders>
-              <w:top w:val="single" w:color="000000" w:themeColor="text1" w:sz="6" w:space="0"/>
-              <w:left w:val="single" w:color="000000" w:themeColor="text1" w:sz="6" w:space="0"/>
-              <w:bottom w:val="single" w:color="000000" w:themeColor="text1" w:sz="6" w:space="0"/>
-            </w:tcBorders>
-            <w:shd w:val="clear" w:color="auto" w:fill="E5E5E5"/>
-            <w:tcMar/>
+              <w:top w:val="single" w:sz="6" w:space="0" w:color="000000" w:themeColor="text1"/>
+              <w:left w:val="single" w:sz="6" w:space="0" w:color="000000" w:themeColor="text1"/>
+              <w:bottom w:val="single" w:sz="6" w:space="0" w:color="000000" w:themeColor="text1"/>
+            </w:tcBorders>
+            <w:shd w:val="clear" w:color="auto" w:fill="E5E5E5"/>
           </w:tcPr>
           <w:p>
             <w:pPr>
@@ -1328,13 +1273,12 @@
           <w:tcPr>
             <w:tcW w:w="2591" w:type="dxa"/>
             <w:tcBorders>
-              <w:top w:val="single" w:color="000000" w:themeColor="text1" w:sz="6" w:space="0"/>
-              <w:left w:val="single" w:color="000000" w:themeColor="text1" w:sz="6" w:space="0"/>
-              <w:bottom w:val="single" w:color="000000" w:themeColor="text1" w:sz="6" w:space="0"/>
-              <w:right w:val="single" w:color="000000" w:themeColor="text1" w:sz="6" w:space="0"/>
-            </w:tcBorders>
-            <w:shd w:val="clear" w:color="auto" w:fill="E5E5E5"/>
-            <w:tcMar/>
+              <w:top w:val="single" w:sz="6" w:space="0" w:color="000000" w:themeColor="text1"/>
+              <w:left w:val="single" w:sz="6" w:space="0" w:color="000000" w:themeColor="text1"/>
+              <w:bottom w:val="single" w:sz="6" w:space="0" w:color="000000" w:themeColor="text1"/>
+              <w:right w:val="single" w:sz="6" w:space="0" w:color="000000" w:themeColor="text1"/>
+            </w:tcBorders>
+            <w:shd w:val="clear" w:color="auto" w:fill="E5E5E5"/>
           </w:tcPr>
           <w:p>
             <w:pPr>
@@ -1352,12 +1296,11 @@
           <w:tcPr>
             <w:tcW w:w="1275" w:type="dxa"/>
             <w:tcBorders>
-              <w:top w:val="single" w:color="000000" w:themeColor="text1" w:sz="6" w:space="0"/>
-              <w:left w:val="single" w:color="000000" w:themeColor="text1" w:sz="6" w:space="0"/>
-              <w:bottom w:val="single" w:color="000000" w:themeColor="text1" w:sz="6" w:space="0"/>
-            </w:tcBorders>
-            <w:shd w:val="clear" w:color="auto" w:fill="E5E5E5"/>
-            <w:tcMar/>
+              <w:top w:val="single" w:sz="6" w:space="0" w:color="000000" w:themeColor="text1"/>
+              <w:left w:val="single" w:sz="6" w:space="0" w:color="000000" w:themeColor="text1"/>
+              <w:bottom w:val="single" w:sz="6" w:space="0" w:color="000000" w:themeColor="text1"/>
+            </w:tcBorders>
+            <w:shd w:val="clear" w:color="auto" w:fill="E5E5E5"/>
           </w:tcPr>
           <w:p>
             <w:pPr>
@@ -1374,12 +1317,11 @@
           <w:tcPr>
             <w:tcW w:w="1083" w:type="dxa"/>
             <w:tcBorders>
-              <w:top w:val="single" w:color="000000" w:themeColor="text1" w:sz="6" w:space="0"/>
-              <w:left w:val="single" w:color="000000" w:themeColor="text1" w:sz="6" w:space="0"/>
-              <w:bottom w:val="single" w:color="000000" w:themeColor="text1" w:sz="6" w:space="0"/>
-            </w:tcBorders>
-            <w:shd w:val="clear" w:color="auto" w:fill="E5E5E5"/>
-            <w:tcMar/>
+              <w:top w:val="single" w:sz="6" w:space="0" w:color="000000" w:themeColor="text1"/>
+              <w:left w:val="single" w:sz="6" w:space="0" w:color="000000" w:themeColor="text1"/>
+              <w:bottom w:val="single" w:sz="6" w:space="0" w:color="000000" w:themeColor="text1"/>
+            </w:tcBorders>
+            <w:shd w:val="clear" w:color="auto" w:fill="E5E5E5"/>
           </w:tcPr>
           <w:p>
             <w:pPr>
@@ -1395,12 +1337,11 @@
           <w:tcPr>
             <w:tcW w:w="3813" w:type="dxa"/>
             <w:tcBorders>
-              <w:top w:val="single" w:color="000000" w:themeColor="text1" w:sz="6" w:space="0"/>
-              <w:left w:val="single" w:color="000000" w:themeColor="text1" w:sz="6" w:space="0"/>
-              <w:bottom w:val="single" w:color="000000" w:themeColor="text1" w:sz="6" w:space="0"/>
-            </w:tcBorders>
-            <w:shd w:val="clear" w:color="auto" w:fill="E5E5E5"/>
-            <w:tcMar/>
+              <w:top w:val="single" w:sz="6" w:space="0" w:color="000000" w:themeColor="text1"/>
+              <w:left w:val="single" w:sz="6" w:space="0" w:color="000000" w:themeColor="text1"/>
+              <w:bottom w:val="single" w:sz="6" w:space="0" w:color="000000" w:themeColor="text1"/>
+            </w:tcBorders>
+            <w:shd w:val="clear" w:color="auto" w:fill="E5E5E5"/>
           </w:tcPr>
           <w:p>
             <w:pPr>
@@ -1416,13 +1357,12 @@
           <w:tcPr>
             <w:tcW w:w="2591" w:type="dxa"/>
             <w:tcBorders>
-              <w:top w:val="single" w:color="000000" w:themeColor="text1" w:sz="6" w:space="0"/>
-              <w:left w:val="single" w:color="000000" w:themeColor="text1" w:sz="6" w:space="0"/>
-              <w:bottom w:val="single" w:color="000000" w:themeColor="text1" w:sz="6" w:space="0"/>
-              <w:right w:val="single" w:color="000000" w:themeColor="text1" w:sz="6" w:space="0"/>
-            </w:tcBorders>
-            <w:shd w:val="clear" w:color="auto" w:fill="E5E5E5"/>
-            <w:tcMar/>
+              <w:top w:val="single" w:sz="6" w:space="0" w:color="000000" w:themeColor="text1"/>
+              <w:left w:val="single" w:sz="6" w:space="0" w:color="000000" w:themeColor="text1"/>
+              <w:bottom w:val="single" w:sz="6" w:space="0" w:color="000000" w:themeColor="text1"/>
+              <w:right w:val="single" w:sz="6" w:space="0" w:color="000000" w:themeColor="text1"/>
+            </w:tcBorders>
+            <w:shd w:val="clear" w:color="auto" w:fill="E5E5E5"/>
           </w:tcPr>
           <w:p>
             <w:pPr>
@@ -1440,12 +1380,11 @@
           <w:tcPr>
             <w:tcW w:w="1275" w:type="dxa"/>
             <w:tcBorders>
-              <w:top w:val="single" w:color="000000" w:themeColor="text1" w:sz="6" w:space="0"/>
-              <w:left w:val="single" w:color="000000" w:themeColor="text1" w:sz="6" w:space="0"/>
-              <w:bottom w:val="single" w:color="000000" w:themeColor="text1" w:sz="6" w:space="0"/>
-            </w:tcBorders>
-            <w:shd w:val="clear" w:color="auto" w:fill="E5E5E5"/>
-            <w:tcMar/>
+              <w:top w:val="single" w:sz="6" w:space="0" w:color="000000" w:themeColor="text1"/>
+              <w:left w:val="single" w:sz="6" w:space="0" w:color="000000" w:themeColor="text1"/>
+              <w:bottom w:val="single" w:sz="6" w:space="0" w:color="000000" w:themeColor="text1"/>
+            </w:tcBorders>
+            <w:shd w:val="clear" w:color="auto" w:fill="E5E5E5"/>
           </w:tcPr>
           <w:p>
             <w:pPr>
@@ -1462,12 +1401,11 @@
           <w:tcPr>
             <w:tcW w:w="1083" w:type="dxa"/>
             <w:tcBorders>
-              <w:top w:val="single" w:color="000000" w:themeColor="text1" w:sz="6" w:space="0"/>
-              <w:left w:val="single" w:color="000000" w:themeColor="text1" w:sz="6" w:space="0"/>
-              <w:bottom w:val="single" w:color="000000" w:themeColor="text1" w:sz="6" w:space="0"/>
-            </w:tcBorders>
-            <w:shd w:val="clear" w:color="auto" w:fill="E5E5E5"/>
-            <w:tcMar/>
+              <w:top w:val="single" w:sz="6" w:space="0" w:color="000000" w:themeColor="text1"/>
+              <w:left w:val="single" w:sz="6" w:space="0" w:color="000000" w:themeColor="text1"/>
+              <w:bottom w:val="single" w:sz="6" w:space="0" w:color="000000" w:themeColor="text1"/>
+            </w:tcBorders>
+            <w:shd w:val="clear" w:color="auto" w:fill="E5E5E5"/>
           </w:tcPr>
           <w:p>
             <w:pPr>
@@ -1483,12 +1421,11 @@
           <w:tcPr>
             <w:tcW w:w="3813" w:type="dxa"/>
             <w:tcBorders>
-              <w:top w:val="single" w:color="000000" w:themeColor="text1" w:sz="6" w:space="0"/>
-              <w:left w:val="single" w:color="000000" w:themeColor="text1" w:sz="6" w:space="0"/>
-              <w:bottom w:val="single" w:color="000000" w:themeColor="text1" w:sz="6" w:space="0"/>
-            </w:tcBorders>
-            <w:shd w:val="clear" w:color="auto" w:fill="E5E5E5"/>
-            <w:tcMar/>
+              <w:top w:val="single" w:sz="6" w:space="0" w:color="000000" w:themeColor="text1"/>
+              <w:left w:val="single" w:sz="6" w:space="0" w:color="000000" w:themeColor="text1"/>
+              <w:bottom w:val="single" w:sz="6" w:space="0" w:color="000000" w:themeColor="text1"/>
+            </w:tcBorders>
+            <w:shd w:val="clear" w:color="auto" w:fill="E5E5E5"/>
           </w:tcPr>
           <w:p>
             <w:pPr>
@@ -1504,13 +1441,12 @@
           <w:tcPr>
             <w:tcW w:w="2591" w:type="dxa"/>
             <w:tcBorders>
-              <w:top w:val="single" w:color="000000" w:themeColor="text1" w:sz="6" w:space="0"/>
-              <w:left w:val="single" w:color="000000" w:themeColor="text1" w:sz="6" w:space="0"/>
-              <w:bottom w:val="single" w:color="000000" w:themeColor="text1" w:sz="6" w:space="0"/>
-              <w:right w:val="single" w:color="000000" w:themeColor="text1" w:sz="6" w:space="0"/>
-            </w:tcBorders>
-            <w:shd w:val="clear" w:color="auto" w:fill="E5E5E5"/>
-            <w:tcMar/>
+              <w:top w:val="single" w:sz="6" w:space="0" w:color="000000" w:themeColor="text1"/>
+              <w:left w:val="single" w:sz="6" w:space="0" w:color="000000" w:themeColor="text1"/>
+              <w:bottom w:val="single" w:sz="6" w:space="0" w:color="000000" w:themeColor="text1"/>
+              <w:right w:val="single" w:sz="6" w:space="0" w:color="000000" w:themeColor="text1"/>
+            </w:tcBorders>
+            <w:shd w:val="clear" w:color="auto" w:fill="E5E5E5"/>
           </w:tcPr>
           <w:p>
             <w:pPr>
@@ -1528,12 +1464,11 @@
           <w:tcPr>
             <w:tcW w:w="1275" w:type="dxa"/>
             <w:tcBorders>
-              <w:top w:val="single" w:color="000000" w:themeColor="text1" w:sz="6" w:space="0"/>
-              <w:left w:val="single" w:color="000000" w:themeColor="text1" w:sz="6" w:space="0"/>
-              <w:bottom w:val="single" w:color="000000" w:themeColor="text1" w:sz="6" w:space="0"/>
-            </w:tcBorders>
-            <w:shd w:val="clear" w:color="auto" w:fill="E5E5E5"/>
-            <w:tcMar/>
+              <w:top w:val="single" w:sz="6" w:space="0" w:color="000000" w:themeColor="text1"/>
+              <w:left w:val="single" w:sz="6" w:space="0" w:color="000000" w:themeColor="text1"/>
+              <w:bottom w:val="single" w:sz="6" w:space="0" w:color="000000" w:themeColor="text1"/>
+            </w:tcBorders>
+            <w:shd w:val="clear" w:color="auto" w:fill="E5E5E5"/>
           </w:tcPr>
           <w:p>
             <w:pPr>
@@ -1550,12 +1485,11 @@
           <w:tcPr>
             <w:tcW w:w="1083" w:type="dxa"/>
             <w:tcBorders>
-              <w:top w:val="single" w:color="000000" w:themeColor="text1" w:sz="6" w:space="0"/>
-              <w:left w:val="single" w:color="000000" w:themeColor="text1" w:sz="6" w:space="0"/>
-              <w:bottom w:val="single" w:color="000000" w:themeColor="text1" w:sz="6" w:space="0"/>
-            </w:tcBorders>
-            <w:shd w:val="clear" w:color="auto" w:fill="E5E5E5"/>
-            <w:tcMar/>
+              <w:top w:val="single" w:sz="6" w:space="0" w:color="000000" w:themeColor="text1"/>
+              <w:left w:val="single" w:sz="6" w:space="0" w:color="000000" w:themeColor="text1"/>
+              <w:bottom w:val="single" w:sz="6" w:space="0" w:color="000000" w:themeColor="text1"/>
+            </w:tcBorders>
+            <w:shd w:val="clear" w:color="auto" w:fill="E5E5E5"/>
           </w:tcPr>
           <w:p>
             <w:pPr>
@@ -1571,12 +1505,11 @@
           <w:tcPr>
             <w:tcW w:w="3813" w:type="dxa"/>
             <w:tcBorders>
-              <w:top w:val="single" w:color="000000" w:themeColor="text1" w:sz="6" w:space="0"/>
-              <w:left w:val="single" w:color="000000" w:themeColor="text1" w:sz="6" w:space="0"/>
-              <w:bottom w:val="single" w:color="000000" w:themeColor="text1" w:sz="6" w:space="0"/>
-            </w:tcBorders>
-            <w:shd w:val="clear" w:color="auto" w:fill="E5E5E5"/>
-            <w:tcMar/>
+              <w:top w:val="single" w:sz="6" w:space="0" w:color="000000" w:themeColor="text1"/>
+              <w:left w:val="single" w:sz="6" w:space="0" w:color="000000" w:themeColor="text1"/>
+              <w:bottom w:val="single" w:sz="6" w:space="0" w:color="000000" w:themeColor="text1"/>
+            </w:tcBorders>
+            <w:shd w:val="clear" w:color="auto" w:fill="E5E5E5"/>
           </w:tcPr>
           <w:p>
             <w:pPr>
@@ -1592,13 +1525,12 @@
           <w:tcPr>
             <w:tcW w:w="2591" w:type="dxa"/>
             <w:tcBorders>
-              <w:top w:val="single" w:color="000000" w:themeColor="text1" w:sz="6" w:space="0"/>
-              <w:left w:val="single" w:color="000000" w:themeColor="text1" w:sz="6" w:space="0"/>
-              <w:bottom w:val="single" w:color="000000" w:themeColor="text1" w:sz="6" w:space="0"/>
-              <w:right w:val="single" w:color="000000" w:themeColor="text1" w:sz="6" w:space="0"/>
-            </w:tcBorders>
-            <w:shd w:val="clear" w:color="auto" w:fill="E5E5E5"/>
-            <w:tcMar/>
+              <w:top w:val="single" w:sz="6" w:space="0" w:color="000000" w:themeColor="text1"/>
+              <w:left w:val="single" w:sz="6" w:space="0" w:color="000000" w:themeColor="text1"/>
+              <w:bottom w:val="single" w:sz="6" w:space="0" w:color="000000" w:themeColor="text1"/>
+              <w:right w:val="single" w:sz="6" w:space="0" w:color="000000" w:themeColor="text1"/>
+            </w:tcBorders>
+            <w:shd w:val="clear" w:color="auto" w:fill="E5E5E5"/>
           </w:tcPr>
           <w:p>
             <w:pPr>
@@ -1616,12 +1548,11 @@
           <w:tcPr>
             <w:tcW w:w="1275" w:type="dxa"/>
             <w:tcBorders>
-              <w:top w:val="single" w:color="000000" w:themeColor="text1" w:sz="6" w:space="0"/>
-              <w:left w:val="single" w:color="000000" w:themeColor="text1" w:sz="6" w:space="0"/>
-              <w:bottom w:val="single" w:color="000000" w:themeColor="text1" w:sz="6" w:space="0"/>
-            </w:tcBorders>
-            <w:shd w:val="clear" w:color="auto" w:fill="E5E5E5"/>
-            <w:tcMar/>
+              <w:top w:val="single" w:sz="6" w:space="0" w:color="000000" w:themeColor="text1"/>
+              <w:left w:val="single" w:sz="6" w:space="0" w:color="000000" w:themeColor="text1"/>
+              <w:bottom w:val="single" w:sz="6" w:space="0" w:color="000000" w:themeColor="text1"/>
+            </w:tcBorders>
+            <w:shd w:val="clear" w:color="auto" w:fill="E5E5E5"/>
           </w:tcPr>
           <w:p>
             <w:pPr>
@@ -1638,12 +1569,11 @@
           <w:tcPr>
             <w:tcW w:w="1083" w:type="dxa"/>
             <w:tcBorders>
-              <w:top w:val="single" w:color="000000" w:themeColor="text1" w:sz="6" w:space="0"/>
-              <w:left w:val="single" w:color="000000" w:themeColor="text1" w:sz="6" w:space="0"/>
-              <w:bottom w:val="single" w:color="000000" w:themeColor="text1" w:sz="6" w:space="0"/>
-            </w:tcBorders>
-            <w:shd w:val="clear" w:color="auto" w:fill="E5E5E5"/>
-            <w:tcMar/>
+              <w:top w:val="single" w:sz="6" w:space="0" w:color="000000" w:themeColor="text1"/>
+              <w:left w:val="single" w:sz="6" w:space="0" w:color="000000" w:themeColor="text1"/>
+              <w:bottom w:val="single" w:sz="6" w:space="0" w:color="000000" w:themeColor="text1"/>
+            </w:tcBorders>
+            <w:shd w:val="clear" w:color="auto" w:fill="E5E5E5"/>
           </w:tcPr>
           <w:p>
             <w:pPr>
@@ -1659,12 +1589,11 @@
           <w:tcPr>
             <w:tcW w:w="3813" w:type="dxa"/>
             <w:tcBorders>
-              <w:top w:val="single" w:color="000000" w:themeColor="text1" w:sz="6" w:space="0"/>
-              <w:left w:val="single" w:color="000000" w:themeColor="text1" w:sz="6" w:space="0"/>
-              <w:bottom w:val="single" w:color="000000" w:themeColor="text1" w:sz="6" w:space="0"/>
-            </w:tcBorders>
-            <w:shd w:val="clear" w:color="auto" w:fill="E5E5E5"/>
-            <w:tcMar/>
+              <w:top w:val="single" w:sz="6" w:space="0" w:color="000000" w:themeColor="text1"/>
+              <w:left w:val="single" w:sz="6" w:space="0" w:color="000000" w:themeColor="text1"/>
+              <w:bottom w:val="single" w:sz="6" w:space="0" w:color="000000" w:themeColor="text1"/>
+            </w:tcBorders>
+            <w:shd w:val="clear" w:color="auto" w:fill="E5E5E5"/>
           </w:tcPr>
           <w:p>
             <w:pPr>
@@ -1680,13 +1609,12 @@
           <w:tcPr>
             <w:tcW w:w="2591" w:type="dxa"/>
             <w:tcBorders>
-              <w:top w:val="single" w:color="000000" w:themeColor="text1" w:sz="6" w:space="0"/>
-              <w:left w:val="single" w:color="000000" w:themeColor="text1" w:sz="6" w:space="0"/>
-              <w:bottom w:val="single" w:color="000000" w:themeColor="text1" w:sz="6" w:space="0"/>
-              <w:right w:val="single" w:color="000000" w:themeColor="text1" w:sz="6" w:space="0"/>
-            </w:tcBorders>
-            <w:shd w:val="clear" w:color="auto" w:fill="E5E5E5"/>
-            <w:tcMar/>
+              <w:top w:val="single" w:sz="6" w:space="0" w:color="000000" w:themeColor="text1"/>
+              <w:left w:val="single" w:sz="6" w:space="0" w:color="000000" w:themeColor="text1"/>
+              <w:bottom w:val="single" w:sz="6" w:space="0" w:color="000000" w:themeColor="text1"/>
+              <w:right w:val="single" w:sz="6" w:space="0" w:color="000000" w:themeColor="text1"/>
+            </w:tcBorders>
+            <w:shd w:val="clear" w:color="auto" w:fill="E5E5E5"/>
           </w:tcPr>
           <w:p>
             <w:pPr>
@@ -1704,12 +1632,11 @@
           <w:tcPr>
             <w:tcW w:w="1275" w:type="dxa"/>
             <w:tcBorders>
-              <w:top w:val="single" w:color="000000" w:themeColor="text1" w:sz="6" w:space="0"/>
-              <w:left w:val="single" w:color="000000" w:themeColor="text1" w:sz="6" w:space="0"/>
-              <w:bottom w:val="single" w:color="000000" w:themeColor="text1" w:sz="6" w:space="0"/>
-            </w:tcBorders>
-            <w:shd w:val="clear" w:color="auto" w:fill="E5E5E5"/>
-            <w:tcMar/>
+              <w:top w:val="single" w:sz="6" w:space="0" w:color="000000" w:themeColor="text1"/>
+              <w:left w:val="single" w:sz="6" w:space="0" w:color="000000" w:themeColor="text1"/>
+              <w:bottom w:val="single" w:sz="6" w:space="0" w:color="000000" w:themeColor="text1"/>
+            </w:tcBorders>
+            <w:shd w:val="clear" w:color="auto" w:fill="E5E5E5"/>
           </w:tcPr>
           <w:p>
             <w:pPr>
@@ -1726,12 +1653,11 @@
           <w:tcPr>
             <w:tcW w:w="1083" w:type="dxa"/>
             <w:tcBorders>
-              <w:top w:val="single" w:color="000000" w:themeColor="text1" w:sz="6" w:space="0"/>
-              <w:left w:val="single" w:color="000000" w:themeColor="text1" w:sz="6" w:space="0"/>
-              <w:bottom w:val="single" w:color="000000" w:themeColor="text1" w:sz="6" w:space="0"/>
-            </w:tcBorders>
-            <w:shd w:val="clear" w:color="auto" w:fill="E5E5E5"/>
-            <w:tcMar/>
+              <w:top w:val="single" w:sz="6" w:space="0" w:color="000000" w:themeColor="text1"/>
+              <w:left w:val="single" w:sz="6" w:space="0" w:color="000000" w:themeColor="text1"/>
+              <w:bottom w:val="single" w:sz="6" w:space="0" w:color="000000" w:themeColor="text1"/>
+            </w:tcBorders>
+            <w:shd w:val="clear" w:color="auto" w:fill="E5E5E5"/>
           </w:tcPr>
           <w:p>
             <w:pPr>
@@ -1747,12 +1673,11 @@
           <w:tcPr>
             <w:tcW w:w="3813" w:type="dxa"/>
             <w:tcBorders>
-              <w:top w:val="single" w:color="000000" w:themeColor="text1" w:sz="6" w:space="0"/>
-              <w:left w:val="single" w:color="000000" w:themeColor="text1" w:sz="6" w:space="0"/>
-              <w:bottom w:val="single" w:color="000000" w:themeColor="text1" w:sz="6" w:space="0"/>
-            </w:tcBorders>
-            <w:shd w:val="clear" w:color="auto" w:fill="E5E5E5"/>
-            <w:tcMar/>
+              <w:top w:val="single" w:sz="6" w:space="0" w:color="000000" w:themeColor="text1"/>
+              <w:left w:val="single" w:sz="6" w:space="0" w:color="000000" w:themeColor="text1"/>
+              <w:bottom w:val="single" w:sz="6" w:space="0" w:color="000000" w:themeColor="text1"/>
+            </w:tcBorders>
+            <w:shd w:val="clear" w:color="auto" w:fill="E5E5E5"/>
           </w:tcPr>
           <w:p>
             <w:pPr>
@@ -1768,13 +1693,12 @@
           <w:tcPr>
             <w:tcW w:w="2591" w:type="dxa"/>
             <w:tcBorders>
-              <w:top w:val="single" w:color="000000" w:themeColor="text1" w:sz="6" w:space="0"/>
-              <w:left w:val="single" w:color="000000" w:themeColor="text1" w:sz="6" w:space="0"/>
-              <w:bottom w:val="single" w:color="000000" w:themeColor="text1" w:sz="6" w:space="0"/>
-              <w:right w:val="single" w:color="000000" w:themeColor="text1" w:sz="6" w:space="0"/>
-            </w:tcBorders>
-            <w:shd w:val="clear" w:color="auto" w:fill="E5E5E5"/>
-            <w:tcMar/>
+              <w:top w:val="single" w:sz="6" w:space="0" w:color="000000" w:themeColor="text1"/>
+              <w:left w:val="single" w:sz="6" w:space="0" w:color="000000" w:themeColor="text1"/>
+              <w:bottom w:val="single" w:sz="6" w:space="0" w:color="000000" w:themeColor="text1"/>
+              <w:right w:val="single" w:sz="6" w:space="0" w:color="000000" w:themeColor="text1"/>
+            </w:tcBorders>
+            <w:shd w:val="clear" w:color="auto" w:fill="E5E5E5"/>
           </w:tcPr>
           <w:p>
             <w:pPr>
@@ -1792,12 +1716,11 @@
           <w:tcPr>
             <w:tcW w:w="1275" w:type="dxa"/>
             <w:tcBorders>
-              <w:top w:val="single" w:color="000000" w:themeColor="text1" w:sz="6" w:space="0"/>
-              <w:left w:val="single" w:color="000000" w:themeColor="text1" w:sz="6" w:space="0"/>
-              <w:bottom w:val="single" w:color="000000" w:themeColor="text1" w:sz="6" w:space="0"/>
-            </w:tcBorders>
-            <w:shd w:val="clear" w:color="auto" w:fill="E5E5E5"/>
-            <w:tcMar/>
+              <w:top w:val="single" w:sz="6" w:space="0" w:color="000000" w:themeColor="text1"/>
+              <w:left w:val="single" w:sz="6" w:space="0" w:color="000000" w:themeColor="text1"/>
+              <w:bottom w:val="single" w:sz="6" w:space="0" w:color="000000" w:themeColor="text1"/>
+            </w:tcBorders>
+            <w:shd w:val="clear" w:color="auto" w:fill="E5E5E5"/>
           </w:tcPr>
           <w:p>
             <w:pPr>
@@ -1814,12 +1737,11 @@
           <w:tcPr>
             <w:tcW w:w="1083" w:type="dxa"/>
             <w:tcBorders>
-              <w:top w:val="single" w:color="000000" w:themeColor="text1" w:sz="6" w:space="0"/>
-              <w:left w:val="single" w:color="000000" w:themeColor="text1" w:sz="6" w:space="0"/>
-              <w:bottom w:val="single" w:color="000000" w:themeColor="text1" w:sz="6" w:space="0"/>
-            </w:tcBorders>
-            <w:shd w:val="clear" w:color="auto" w:fill="E5E5E5"/>
-            <w:tcMar/>
+              <w:top w:val="single" w:sz="6" w:space="0" w:color="000000" w:themeColor="text1"/>
+              <w:left w:val="single" w:sz="6" w:space="0" w:color="000000" w:themeColor="text1"/>
+              <w:bottom w:val="single" w:sz="6" w:space="0" w:color="000000" w:themeColor="text1"/>
+            </w:tcBorders>
+            <w:shd w:val="clear" w:color="auto" w:fill="E5E5E5"/>
           </w:tcPr>
           <w:p>
             <w:pPr>
@@ -1835,12 +1757,11 @@
           <w:tcPr>
             <w:tcW w:w="3813" w:type="dxa"/>
             <w:tcBorders>
-              <w:top w:val="single" w:color="000000" w:themeColor="text1" w:sz="6" w:space="0"/>
-              <w:left w:val="single" w:color="000000" w:themeColor="text1" w:sz="6" w:space="0"/>
-              <w:bottom w:val="single" w:color="000000" w:themeColor="text1" w:sz="6" w:space="0"/>
-            </w:tcBorders>
-            <w:shd w:val="clear" w:color="auto" w:fill="E5E5E5"/>
-            <w:tcMar/>
+              <w:top w:val="single" w:sz="6" w:space="0" w:color="000000" w:themeColor="text1"/>
+              <w:left w:val="single" w:sz="6" w:space="0" w:color="000000" w:themeColor="text1"/>
+              <w:bottom w:val="single" w:sz="6" w:space="0" w:color="000000" w:themeColor="text1"/>
+            </w:tcBorders>
+            <w:shd w:val="clear" w:color="auto" w:fill="E5E5E5"/>
           </w:tcPr>
           <w:p>
             <w:pPr>
@@ -1856,13 +1777,12 @@
           <w:tcPr>
             <w:tcW w:w="2591" w:type="dxa"/>
             <w:tcBorders>
-              <w:top w:val="single" w:color="000000" w:themeColor="text1" w:sz="6" w:space="0"/>
-              <w:left w:val="single" w:color="000000" w:themeColor="text1" w:sz="6" w:space="0"/>
-              <w:bottom w:val="single" w:color="000000" w:themeColor="text1" w:sz="6" w:space="0"/>
-              <w:right w:val="single" w:color="000000" w:themeColor="text1" w:sz="6" w:space="0"/>
-            </w:tcBorders>
-            <w:shd w:val="clear" w:color="auto" w:fill="E5E5E5"/>
-            <w:tcMar/>
+              <w:top w:val="single" w:sz="6" w:space="0" w:color="000000" w:themeColor="text1"/>
+              <w:left w:val="single" w:sz="6" w:space="0" w:color="000000" w:themeColor="text1"/>
+              <w:bottom w:val="single" w:sz="6" w:space="0" w:color="000000" w:themeColor="text1"/>
+              <w:right w:val="single" w:sz="6" w:space="0" w:color="000000" w:themeColor="text1"/>
+            </w:tcBorders>
+            <w:shd w:val="clear" w:color="auto" w:fill="E5E5E5"/>
           </w:tcPr>
           <w:p>
             <w:pPr>
@@ -1885,7 +1805,7 @@
         <w:sectPr>
           <w:headerReference w:type="default" r:id="rId9"/>
           <w:footerReference w:type="default" r:id="rId10"/>
-          <w:pgSz w:w="12240" w:h="15840" w:orient="portrait"/>
+          <w:pgSz w:w="12240" w:h="15840"/>
           <w:pgMar w:top="1440" w:right="1800" w:bottom="1800" w:left="1800" w:header="720" w:footer="1080" w:gutter="0"/>
           <w:pgNumType w:fmt="lowerRoman"/>
           <w:cols w:space="720"/>
@@ -1911,9 +1831,8 @@
         </w:rPr>
       </w:pPr>
       <w:r>
+        <w:lastRenderedPageBreak/>
         <w:tab/>
-      </w:r>
-      <w:r>
         <w:t>Table of Contents</w:t>
       </w:r>
     </w:p>
@@ -2951,13 +2870,6 @@
           </w:r>
         </w:p>
       </w:sdtContent>
-      <w:sdtEndPr>
-        <w:rPr>
-          <w:b w:val="0"/>
-          <w:bCs w:val="0"/>
-          <w:smallCaps w:val="1"/>
-        </w:rPr>
-      </w:sdtEndPr>
     </w:sdt>
     <w:p>
       <w:pPr>
@@ -2979,9 +2891,10 @@
           <w:numId w:val="2"/>
         </w:numPr>
       </w:pPr>
-      <w:bookmarkStart w:name="__RefHeading___Toc19440719" w:id="2"/>
+      <w:bookmarkStart w:id="2" w:name="__RefHeading___Toc19440719"/>
       <w:bookmarkEnd w:id="2"/>
       <w:r>
+        <w:lastRenderedPageBreak/>
         <w:t>Purpose</w:t>
       </w:r>
     </w:p>
@@ -2990,23 +2903,18 @@
         <w:pStyle w:val="Paragraph2"/>
       </w:pPr>
       <w:r>
-        <w:rPr/>
         <w:t xml:space="preserve">This document outlines the requirements for the </w:t>
       </w:r>
       <w:r>
-        <w:rPr/>
         <w:t>Blackjack Handling System</w:t>
       </w:r>
       <w:r>
-        <w:rPr/>
         <w:t xml:space="preserve"> (</w:t>
       </w:r>
       <w:r>
-        <w:rPr/>
         <w:t>BHS</w:t>
       </w:r>
       <w:r>
-        <w:rPr/>
         <w:t>).</w:t>
       </w:r>
     </w:p>
@@ -3018,7 +2926,7 @@
           <w:numId w:val="2"/>
         </w:numPr>
       </w:pPr>
-      <w:bookmarkStart w:name="__RefHeading___Toc19440720" w:id="3"/>
+      <w:bookmarkStart w:id="3" w:name="__RefHeading___Toc19440720"/>
       <w:bookmarkEnd w:id="3"/>
       <w:r>
         <w:t>Scope</w:t>
@@ -3029,28 +2937,22 @@
         <w:pStyle w:val="Paragraph2"/>
       </w:pPr>
       <w:r>
-        <w:rPr/>
         <w:t xml:space="preserve">This document will catalog the user, system, and hardware requirements for the </w:t>
       </w:r>
       <w:r>
-        <w:rPr/>
         <w:t xml:space="preserve">BHS </w:t>
       </w:r>
       <w:r>
-        <w:rPr/>
         <w:t>system. It will not, however, document how these requirements will be implemented.</w:t>
       </w:r>
     </w:p>
     <w:p>
       <w:pPr>
         <w:pStyle w:val="Heading2"/>
-        <w:ind/>
-        <w:rPr/>
-      </w:pPr>
-      <w:bookmarkStart w:name="__RefHeading___Toc19440721" w:id="4"/>
+      </w:pPr>
+      <w:bookmarkStart w:id="4" w:name="__RefHeading___Toc19440721"/>
       <w:bookmarkEnd w:id="4"/>
       <w:r>
-        <w:rPr/>
         <w:t>Definitions, Acronyms, Abbreviations</w:t>
       </w:r>
     </w:p>
@@ -3059,54 +2961,30 @@
         <w:pStyle w:val="Paragraph3"/>
         <w:ind w:left="720" w:firstLine="720"/>
         <w:rPr>
-          <w:color w:val="7030A0"/>
-        </w:rPr>
-      </w:pPr>
-      <w:r>
-        <w:rPr>
-          <w:color w:val="7030A0"/>
+          <w:color w:val="0070C0"/>
+        </w:rPr>
+      </w:pPr>
+      <w:r>
+        <w:rPr>
+          <w:color w:val="0070C0"/>
         </w:rPr>
         <w:t>Player</w:t>
       </w:r>
       <w:r>
         <w:rPr>
-          <w:color w:val="7030A0"/>
-        </w:rPr>
-        <w:t xml:space="preserve">: A user role that can </w:t>
-      </w:r>
-      <w:r>
-        <w:rPr>
-          <w:color w:val="7030A0"/>
-        </w:rPr>
-        <w:t>participate</w:t>
-      </w:r>
-      <w:r>
-        <w:rPr>
-          <w:color w:val="7030A0"/>
-        </w:rPr>
-        <w:t xml:space="preserve"> in Blackjack games, </w:t>
-      </w:r>
-      <w:r>
-        <w:rPr>
-          <w:color w:val="7030A0"/>
-        </w:rPr>
-        <w:t xml:space="preserve">and </w:t>
-      </w:r>
-      <w:r>
-        <w:rPr>
-          <w:color w:val="7030A0"/>
-        </w:rPr>
-        <w:t>participate</w:t>
-      </w:r>
-      <w:r>
-        <w:rPr>
-          <w:color w:val="7030A0"/>
-        </w:rPr>
-        <w:t xml:space="preserve"> in standard game actions such as betting, hit, stand, and folding</w:t>
-      </w:r>
-      <w:r>
-        <w:rPr>
-          <w:color w:val="7030A0"/>
+          <w:color w:val="0070C0"/>
+        </w:rPr>
+        <w:t xml:space="preserve">: A user role that can participate in Blackjack games, </w:t>
+      </w:r>
+      <w:r>
+        <w:rPr>
+          <w:color w:val="0070C0"/>
+        </w:rPr>
+        <w:t>and participate in standard game actions such as betting, hit, stand, and folding</w:t>
+      </w:r>
+      <w:r>
+        <w:rPr>
+          <w:color w:val="0070C0"/>
         </w:rPr>
         <w:t>/surrendering</w:t>
       </w:r>
@@ -3116,38 +2994,40 @@
         <w:pStyle w:val="Paragraph3"/>
         <w:ind w:left="720" w:firstLine="720"/>
         <w:rPr>
-          <w:color w:val="7030A0"/>
-        </w:rPr>
-      </w:pPr>
-      <w:r>
-        <w:rPr>
-          <w:color w:val="7030A0"/>
+          <w:color w:val="0070C0"/>
+        </w:rPr>
+      </w:pPr>
+      <w:r>
+        <w:rPr>
+          <w:color w:val="0070C0"/>
         </w:rPr>
         <w:t>Dealer</w:t>
       </w:r>
       <w:r>
         <w:rPr>
-          <w:color w:val="7030A0"/>
+          <w:color w:val="0070C0"/>
         </w:rPr>
         <w:t>:</w:t>
       </w:r>
       <w:r>
         <w:rPr>
-          <w:color w:val="7030A0"/>
-        </w:rPr>
-        <w:t xml:space="preserve"> A specialized user role with the added ability to </w:t>
-      </w:r>
-      <w:r>
-        <w:rPr>
-          <w:color w:val="7030A0"/>
-        </w:rPr>
-        <w:t>operate</w:t>
-      </w:r>
-      <w:r>
-        <w:rPr>
-          <w:color w:val="7030A0"/>
-        </w:rPr>
-        <w:t xml:space="preserve"> as a dealer for the games and the configurator of game parameters when creating joinable tables for blackjack, deals cards in accordance to standard blackjack rules</w:t>
+          <w:color w:val="0070C0"/>
+        </w:rPr>
+        <w:t xml:space="preserve"> A specialized user role with the added ability to operate as a dealer for the games and the configurator of game parameters when creating joinable tables for blackjack, deals cards in accordance </w:t>
+      </w:r>
+      <w:proofErr w:type="gramStart"/>
+      <w:r>
+        <w:rPr>
+          <w:color w:val="0070C0"/>
+        </w:rPr>
+        <w:t>to</w:t>
+      </w:r>
+      <w:proofErr w:type="gramEnd"/>
+      <w:r>
+        <w:rPr>
+          <w:color w:val="0070C0"/>
+        </w:rPr>
+        <w:t xml:space="preserve"> standard blackjack rules</w:t>
       </w:r>
     </w:p>
     <w:p>
@@ -3155,24 +3035,24 @@
         <w:pStyle w:val="Paragraph3"/>
         <w:ind w:left="720" w:firstLine="720"/>
         <w:rPr>
-          <w:color w:val="7030A0"/>
-        </w:rPr>
-      </w:pPr>
-      <w:r>
-        <w:rPr>
-          <w:color w:val="7030A0"/>
+          <w:color w:val="0070C0"/>
+        </w:rPr>
+      </w:pPr>
+      <w:r>
+        <w:rPr>
+          <w:color w:val="0070C0"/>
         </w:rPr>
         <w:t>Hand</w:t>
       </w:r>
       <w:r>
         <w:rPr>
-          <w:color w:val="7030A0"/>
+          <w:color w:val="0070C0"/>
         </w:rPr>
         <w:t>:</w:t>
       </w:r>
       <w:r>
         <w:rPr>
-          <w:color w:val="7030A0"/>
+          <w:color w:val="0070C0"/>
         </w:rPr>
         <w:t xml:space="preserve"> A collection of cards assigned to a player or dealer during a round of Blackjack, which changes based on gameplay actions and outcomes</w:t>
       </w:r>
@@ -3182,18 +3062,18 @@
         <w:pStyle w:val="Paragraph3"/>
         <w:ind w:left="720" w:firstLine="720"/>
         <w:rPr>
-          <w:color w:val="7030A0"/>
-        </w:rPr>
-      </w:pPr>
-      <w:r>
-        <w:rPr>
-          <w:color w:val="7030A0"/>
+          <w:color w:val="0070C0"/>
+        </w:rPr>
+      </w:pPr>
+      <w:r>
+        <w:rPr>
+          <w:color w:val="0070C0"/>
         </w:rPr>
         <w:t>Table</w:t>
       </w:r>
       <w:r>
         <w:rPr>
-          <w:color w:val="7030A0"/>
+          <w:color w:val="0070C0"/>
         </w:rPr>
         <w:t>: The instance of a game in a lobby, up to six players including the hosting dealer</w:t>
       </w:r>
@@ -3203,26 +3083,14 @@
         <w:pStyle w:val="Paragraph3"/>
         <w:ind w:left="720" w:firstLine="720"/>
         <w:rPr>
-          <w:color w:val="7030A0"/>
-        </w:rPr>
-      </w:pPr>
-      <w:r>
-        <w:rPr>
-          <w:color w:val="7030A0"/>
-        </w:rPr>
-        <w:t xml:space="preserve">Lobby: An area of the Blackjack program </w:t>
-      </w:r>
-      <w:r>
-        <w:rPr>
-          <w:color w:val="7030A0"/>
-        </w:rPr>
-        <w:t>where</w:t>
-      </w:r>
-      <w:r>
-        <w:rPr>
-          <w:color w:val="7030A0"/>
-        </w:rPr>
-        <w:t xml:space="preserve"> tables are viewable for players to join or for dealers to create a table</w:t>
+          <w:color w:val="0070C0"/>
+        </w:rPr>
+      </w:pPr>
+      <w:r>
+        <w:rPr>
+          <w:color w:val="0070C0"/>
+        </w:rPr>
+        <w:t>Lobby: An area of the Blackjack program where tables are viewable for players to join or for dealers to create a table</w:t>
       </w:r>
     </w:p>
     <w:p>
@@ -3230,18 +3098,18 @@
         <w:pStyle w:val="Paragraph3"/>
         <w:ind w:left="720" w:firstLine="720"/>
         <w:rPr>
-          <w:color w:val="7030A0"/>
-        </w:rPr>
-      </w:pPr>
-      <w:r>
-        <w:rPr>
-          <w:color w:val="7030A0"/>
+          <w:color w:val="0070C0"/>
+        </w:rPr>
+      </w:pPr>
+      <w:r>
+        <w:rPr>
+          <w:color w:val="0070C0"/>
         </w:rPr>
         <w:t>Round: A cycle of player betting and playing in a blackjack game</w:t>
       </w:r>
       <w:r>
         <w:rPr>
-          <w:color w:val="7030A0"/>
+          <w:color w:val="0070C0"/>
         </w:rPr>
         <w:t xml:space="preserve"> between the betting and outcome phases</w:t>
       </w:r>
@@ -3251,12 +3119,12 @@
         <w:pStyle w:val="Paragraph3"/>
         <w:ind w:left="720" w:firstLine="720"/>
         <w:rPr>
-          <w:color w:val="7030A0"/>
-        </w:rPr>
-      </w:pPr>
-      <w:r>
-        <w:rPr>
-          <w:color w:val="7030A0"/>
+          <w:color w:val="0070C0"/>
+        </w:rPr>
+      </w:pPr>
+      <w:r>
+        <w:rPr>
+          <w:color w:val="0070C0"/>
         </w:rPr>
         <w:t>Game phase: Distinct phases for player betting, dealing and actions, and outcome</w:t>
       </w:r>
@@ -3266,26 +3134,14 @@
         <w:pStyle w:val="Paragraph3"/>
         <w:ind w:left="720" w:firstLine="720"/>
         <w:rPr>
-          <w:color w:val="7030A0"/>
-        </w:rPr>
-      </w:pPr>
-      <w:r>
-        <w:rPr>
-          <w:color w:val="7030A0"/>
-        </w:rPr>
-        <w:t xml:space="preserve">Payout: A specific outcome for a player to be paid out the </w:t>
-      </w:r>
-      <w:r>
-        <w:rPr>
-          <w:color w:val="7030A0"/>
-        </w:rPr>
-        <w:t>appropriate bet</w:t>
-      </w:r>
-      <w:r>
-        <w:rPr>
-          <w:color w:val="7030A0"/>
-        </w:rPr>
-        <w:t xml:space="preserve"> they won against the dealer</w:t>
+          <w:color w:val="0070C0"/>
+        </w:rPr>
+      </w:pPr>
+      <w:r>
+        <w:rPr>
+          <w:color w:val="0070C0"/>
+        </w:rPr>
+        <w:t>Payout: A specific outcome for a player to be paid out the appropriate bet they won against the dealer</w:t>
       </w:r>
     </w:p>
     <w:p>
@@ -3293,24 +3149,24 @@
         <w:pStyle w:val="Paragraph3"/>
         <w:ind w:left="720" w:firstLine="720"/>
         <w:rPr>
-          <w:color w:val="7030A0"/>
-        </w:rPr>
-      </w:pPr>
-      <w:r>
-        <w:rPr>
-          <w:color w:val="7030A0"/>
+          <w:color w:val="0070C0"/>
+        </w:rPr>
+      </w:pPr>
+      <w:r>
+        <w:rPr>
+          <w:color w:val="0070C0"/>
         </w:rPr>
         <w:t>Deck</w:t>
       </w:r>
       <w:r>
         <w:rPr>
-          <w:color w:val="7030A0"/>
+          <w:color w:val="0070C0"/>
         </w:rPr>
         <w:t xml:space="preserve">: </w:t>
       </w:r>
       <w:r>
         <w:rPr>
-          <w:color w:val="7030A0"/>
+          <w:color w:val="0070C0"/>
         </w:rPr>
         <w:t>A standard set of 52 cards used to interact with the gameplay</w:t>
       </w:r>
@@ -3320,42 +3176,42 @@
         <w:pStyle w:val="Paragraph3"/>
         <w:ind w:left="720" w:firstLine="720"/>
         <w:rPr>
-          <w:color w:val="7030A0"/>
-        </w:rPr>
-      </w:pPr>
-      <w:r>
-        <w:rPr>
-          <w:color w:val="7030A0"/>
+          <w:color w:val="0070C0"/>
+        </w:rPr>
+      </w:pPr>
+      <w:r>
+        <w:rPr>
+          <w:color w:val="0070C0"/>
         </w:rPr>
         <w:t xml:space="preserve">Card: </w:t>
       </w:r>
       <w:r>
         <w:rPr>
-          <w:color w:val="7030A0"/>
+          <w:color w:val="0070C0"/>
         </w:rPr>
         <w:t>A</w:t>
       </w:r>
       <w:r>
         <w:rPr>
-          <w:color w:val="7030A0"/>
+          <w:color w:val="0070C0"/>
         </w:rPr>
         <w:t xml:space="preserve"> singular card from a </w:t>
       </w:r>
       <w:r>
         <w:rPr>
-          <w:color w:val="7030A0"/>
+          <w:color w:val="0070C0"/>
         </w:rPr>
         <w:t xml:space="preserve">standard </w:t>
       </w:r>
       <w:r>
         <w:rPr>
-          <w:color w:val="7030A0"/>
+          <w:color w:val="0070C0"/>
         </w:rPr>
         <w:t>deck of 52 cards</w:t>
       </w:r>
       <w:r>
         <w:rPr>
-          <w:color w:val="7030A0"/>
+          <w:color w:val="0070C0"/>
         </w:rPr>
         <w:t>, categorized by suit and rank value</w:t>
       </w:r>
@@ -3365,36 +3221,30 @@
         <w:pStyle w:val="Paragraph3"/>
         <w:ind w:left="720" w:firstLine="720"/>
         <w:rPr>
-          <w:color w:val="7030A0"/>
-        </w:rPr>
-      </w:pPr>
-      <w:r>
-        <w:rPr>
-          <w:color w:val="7030A0"/>
+          <w:color w:val="0070C0"/>
+        </w:rPr>
+      </w:pPr>
+      <w:r>
+        <w:rPr>
+          <w:color w:val="0070C0"/>
         </w:rPr>
         <w:t>Shoe</w:t>
       </w:r>
       <w:r>
         <w:rPr>
-          <w:color w:val="7030A0"/>
+          <w:color w:val="0070C0"/>
         </w:rPr>
         <w:t xml:space="preserve">: A collection </w:t>
       </w:r>
       <w:r>
         <w:rPr>
-          <w:color w:val="7030A0"/>
-        </w:rPr>
-        <w:t>of multiple</w:t>
-      </w:r>
-      <w:r>
-        <w:rPr>
-          <w:color w:val="7030A0"/>
-        </w:rPr>
-        <w:t xml:space="preserve"> </w:t>
-      </w:r>
-      <w:r>
-        <w:rPr>
-          <w:color w:val="7030A0"/>
+          <w:color w:val="0070C0"/>
+        </w:rPr>
+        <w:t xml:space="preserve">of multiple </w:t>
+      </w:r>
+      <w:r>
+        <w:rPr>
+          <w:color w:val="0070C0"/>
         </w:rPr>
         <w:t>decks used in the Blackjack games</w:t>
       </w:r>
@@ -3404,44 +3254,40 @@
         <w:pStyle w:val="Paragraph3"/>
         <w:ind w:left="720" w:firstLine="720"/>
         <w:rPr>
-          <w:color w:val="7030A0"/>
-        </w:rPr>
-      </w:pPr>
-      <w:r>
-        <w:rPr>
-          <w:color w:val="7030A0"/>
+          <w:color w:val="0070C0"/>
+        </w:rPr>
+      </w:pPr>
+      <w:r>
+        <w:rPr>
+          <w:color w:val="0070C0"/>
         </w:rPr>
         <w:t>Bet</w:t>
       </w:r>
       <w:r>
         <w:rPr>
-          <w:color w:val="7030A0"/>
+          <w:color w:val="0070C0"/>
         </w:rPr>
         <w:t xml:space="preserve">: </w:t>
       </w:r>
-      <w:r>
-        <w:rPr>
-          <w:color w:val="7030A0"/>
+      <w:proofErr w:type="gramStart"/>
+      <w:r>
+        <w:rPr>
+          <w:color w:val="0070C0"/>
         </w:rPr>
         <w:t>A</w:t>
       </w:r>
       <w:r>
         <w:rPr>
-          <w:color w:val="7030A0"/>
-        </w:rPr>
-        <w:t xml:space="preserve"> number of credits </w:t>
-      </w:r>
-      <w:r>
-        <w:rPr>
-          <w:color w:val="7030A0"/>
-        </w:rPr>
-        <w:t>submitted</w:t>
-      </w:r>
-      <w:r>
-        <w:rPr>
-          <w:color w:val="7030A0"/>
-        </w:rPr>
-        <w:t xml:space="preserve"> by a player before being dealt hands to start playing the game</w:t>
+          <w:color w:val="0070C0"/>
+        </w:rPr>
+        <w:t xml:space="preserve"> number of</w:t>
+      </w:r>
+      <w:proofErr w:type="gramEnd"/>
+      <w:r>
+        <w:rPr>
+          <w:color w:val="0070C0"/>
+        </w:rPr>
+        <w:t xml:space="preserve"> credits submitted by a player before being dealt hands to start playing the game</w:t>
       </w:r>
     </w:p>
     <w:p>
@@ -3449,48 +3295,52 @@
         <w:pStyle w:val="Paragraph3"/>
         <w:ind w:left="720" w:firstLine="720"/>
         <w:rPr>
-          <w:color w:val="7030A0"/>
-        </w:rPr>
-      </w:pPr>
-      <w:r>
-        <w:rPr>
-          <w:color w:val="7030A0"/>
+          <w:color w:val="0070C0"/>
+        </w:rPr>
+      </w:pPr>
+      <w:r>
+        <w:rPr>
+          <w:color w:val="0070C0"/>
         </w:rPr>
         <w:t>Timer</w:t>
       </w:r>
       <w:r>
         <w:rPr>
-          <w:color w:val="7030A0"/>
+          <w:color w:val="0070C0"/>
         </w:rPr>
         <w:t xml:space="preserve">: </w:t>
       </w:r>
       <w:r>
         <w:rPr>
-          <w:color w:val="7030A0"/>
+          <w:color w:val="0070C0"/>
         </w:rPr>
         <w:t xml:space="preserve">A countdown for the time players </w:t>
       </w:r>
-      <w:r>
-        <w:rPr>
-          <w:color w:val="7030A0"/>
+      <w:proofErr w:type="gramStart"/>
+      <w:r>
+        <w:rPr>
+          <w:color w:val="0070C0"/>
         </w:rPr>
         <w:t>have</w:t>
       </w:r>
-      <w:r>
-        <w:rPr>
-          <w:color w:val="7030A0"/>
+      <w:proofErr w:type="gramEnd"/>
+      <w:r>
+        <w:rPr>
+          <w:color w:val="0070C0"/>
         </w:rPr>
         <w:t xml:space="preserve"> to </w:t>
       </w:r>
-      <w:r>
-        <w:rPr>
-          <w:color w:val="7030A0"/>
+      <w:proofErr w:type="gramStart"/>
+      <w:r>
+        <w:rPr>
+          <w:color w:val="0070C0"/>
         </w:rPr>
         <w:t>take action</w:t>
       </w:r>
-      <w:r>
-        <w:rPr>
-          <w:color w:val="7030A0"/>
+      <w:proofErr w:type="gramEnd"/>
+      <w:r>
+        <w:rPr>
+          <w:color w:val="0070C0"/>
         </w:rPr>
         <w:t xml:space="preserve"> in a round of the game</w:t>
       </w:r>
@@ -3500,24 +3350,24 @@
         <w:pStyle w:val="Paragraph3"/>
         <w:ind w:left="720" w:firstLine="720"/>
         <w:rPr>
-          <w:color w:val="7030A0"/>
-        </w:rPr>
-      </w:pPr>
-      <w:r>
-        <w:rPr>
-          <w:color w:val="7030A0"/>
+          <w:color w:val="0070C0"/>
+        </w:rPr>
+      </w:pPr>
+      <w:r>
+        <w:rPr>
+          <w:color w:val="0070C0"/>
         </w:rPr>
         <w:t>Credits</w:t>
       </w:r>
       <w:r>
         <w:rPr>
-          <w:color w:val="7030A0"/>
+          <w:color w:val="0070C0"/>
         </w:rPr>
         <w:t xml:space="preserve">: </w:t>
       </w:r>
       <w:r>
         <w:rPr>
-          <w:color w:val="7030A0"/>
+          <w:color w:val="0070C0"/>
         </w:rPr>
         <w:t>Virtual currency with a 1-to-1 conversion with player dollars from their payment method attached to their account, used in bets for games</w:t>
       </w:r>
@@ -3527,24 +3377,24 @@
         <w:pStyle w:val="Paragraph3"/>
         <w:ind w:left="720" w:firstLine="720"/>
         <w:rPr>
-          <w:color w:val="7030A0"/>
-        </w:rPr>
-      </w:pPr>
-      <w:r>
-        <w:rPr>
-          <w:color w:val="7030A0"/>
+          <w:color w:val="0070C0"/>
+        </w:rPr>
+      </w:pPr>
+      <w:r>
+        <w:rPr>
+          <w:color w:val="0070C0"/>
         </w:rPr>
         <w:t>Credit Card (CC)</w:t>
       </w:r>
       <w:r>
         <w:rPr>
-          <w:color w:val="7030A0"/>
+          <w:color w:val="0070C0"/>
         </w:rPr>
         <w:t>: A player user’s payment method</w:t>
       </w:r>
       <w:r>
         <w:rPr>
-          <w:color w:val="7030A0"/>
+          <w:color w:val="0070C0"/>
         </w:rPr>
         <w:t xml:space="preserve"> for credits</w:t>
       </w:r>
@@ -3554,18 +3404,18 @@
         <w:pStyle w:val="Paragraph3"/>
         <w:ind w:left="720" w:firstLine="720"/>
         <w:rPr>
-          <w:color w:val="7030A0"/>
-        </w:rPr>
-      </w:pPr>
-      <w:r>
-        <w:rPr>
-          <w:color w:val="7030A0"/>
+          <w:color w:val="0070C0"/>
+        </w:rPr>
+      </w:pPr>
+      <w:r>
+        <w:rPr>
+          <w:color w:val="0070C0"/>
         </w:rPr>
         <w:t xml:space="preserve">Blackjack Handling System (BHS): </w:t>
       </w:r>
       <w:r>
         <w:rPr>
-          <w:color w:val="7030A0"/>
+          <w:color w:val="0070C0"/>
         </w:rPr>
         <w:t>The software responsible for handling the blackjack game functions and logic, network connectivity for players to the server, as well as player interactions and active games</w:t>
       </w:r>
@@ -3575,18 +3425,18 @@
         <w:pStyle w:val="Paragraph3"/>
         <w:ind w:left="720" w:firstLine="720"/>
         <w:rPr>
-          <w:color w:val="7030A0"/>
-        </w:rPr>
-      </w:pPr>
-      <w:r>
-        <w:rPr>
-          <w:color w:val="7030A0"/>
+          <w:color w:val="0070C0"/>
+        </w:rPr>
+      </w:pPr>
+      <w:r>
+        <w:rPr>
+          <w:color w:val="0070C0"/>
         </w:rPr>
         <w:t xml:space="preserve">Graphical User Interface (GUI): The visual </w:t>
       </w:r>
       <w:r>
         <w:rPr>
-          <w:color w:val="7030A0"/>
+          <w:color w:val="0070C0"/>
         </w:rPr>
         <w:t>interface players use to interact with the BHS</w:t>
       </w:r>
@@ -3596,36 +3446,36 @@
         <w:pStyle w:val="Paragraph3"/>
         <w:ind w:left="720" w:firstLine="720"/>
         <w:rPr>
-          <w:color w:val="7030A0"/>
-        </w:rPr>
-      </w:pPr>
-      <w:r>
-        <w:rPr>
-          <w:color w:val="7030A0"/>
+          <w:color w:val="0070C0"/>
+        </w:rPr>
+      </w:pPr>
+      <w:r>
+        <w:rPr>
+          <w:color w:val="0070C0"/>
         </w:rPr>
         <w:t>Server:</w:t>
       </w:r>
       <w:r>
         <w:rPr>
-          <w:color w:val="7030A0"/>
+          <w:color w:val="0070C0"/>
         </w:rPr>
         <w:t xml:space="preserve"> The program responsible for allowing multiple client programs to connect, allowing users to play blackjack games against each other over a network connection</w:t>
       </w:r>
       <w:r>
         <w:rPr>
-          <w:color w:val="7030A0"/>
+          <w:color w:val="0070C0"/>
         </w:rPr>
         <w:t xml:space="preserve">, receives player actions and </w:t>
       </w:r>
       <w:r>
         <w:rPr>
-          <w:color w:val="7030A0"/>
+          <w:color w:val="0070C0"/>
         </w:rPr>
         <w:t>enforces game rules</w:t>
       </w:r>
       <w:r>
         <w:rPr>
-          <w:color w:val="7030A0"/>
+          <w:color w:val="0070C0"/>
         </w:rPr>
         <w:t xml:space="preserve"> with network communication between clients</w:t>
       </w:r>
@@ -3635,30 +3485,30 @@
         <w:pStyle w:val="Paragraph3"/>
         <w:ind w:left="720" w:firstLine="720"/>
         <w:rPr>
-          <w:color w:val="7030A0"/>
-        </w:rPr>
-      </w:pPr>
-      <w:r>
-        <w:rPr>
-          <w:color w:val="7030A0"/>
+          <w:color w:val="0070C0"/>
+        </w:rPr>
+      </w:pPr>
+      <w:r>
+        <w:rPr>
+          <w:color w:val="0070C0"/>
         </w:rPr>
         <w:t>Client:</w:t>
       </w:r>
       <w:r>
         <w:rPr>
-          <w:color w:val="7030A0"/>
+          <w:color w:val="0070C0"/>
         </w:rPr>
         <w:t xml:space="preserve"> The program used by players to connect to the server program for connection to blackjack games over a network connection</w:t>
       </w:r>
       <w:r>
         <w:rPr>
-          <w:color w:val="7030A0"/>
+          <w:color w:val="0070C0"/>
         </w:rPr>
         <w:t xml:space="preserve">, </w:t>
       </w:r>
       <w:r>
         <w:rPr>
-          <w:color w:val="7030A0"/>
+          <w:color w:val="0070C0"/>
         </w:rPr>
         <w:t>sends actions to the server</w:t>
       </w:r>
@@ -3725,7 +3575,7 @@
           <w:numId w:val="2"/>
         </w:numPr>
       </w:pPr>
-      <w:bookmarkStart w:name="__RefHeading___Toc19440722" w:id="5"/>
+      <w:bookmarkStart w:id="5" w:name="__RefHeading___Toc19440722"/>
       <w:bookmarkEnd w:id="5"/>
       <w:r>
         <w:t>References</w:t>
@@ -3816,7 +3666,7 @@
           <w:numId w:val="2"/>
         </w:numPr>
       </w:pPr>
-      <w:bookmarkStart w:name="__RefHeading___Toc19440723" w:id="6"/>
+      <w:bookmarkStart w:id="6" w:name="__RefHeading___Toc19440723"/>
       <w:bookmarkEnd w:id="6"/>
       <w:r>
         <w:t>Overview</w:t>
@@ -3824,23 +3674,21 @@
     </w:p>
     <w:p>
       <w:pPr>
-        <w:pStyle w:val="Normal"/>
         <w:ind w:left="1440"/>
-      </w:pPr>
-      <w:r>
-        <w:rPr/>
-        <w:t xml:space="preserve">The Blackjack Handling System is designed to </w:t>
-      </w:r>
-      <w:r>
-        <w:rPr/>
-        <w:t>facilitate</w:t>
-      </w:r>
-      <w:r>
-        <w:rPr/>
-        <w:t xml:space="preserve"> multiplayer games of Blackjack. Live players as both regular users and dealer players with privileges to deal cards will be hosted on tables for games. </w:t>
-      </w:r>
-      <w:r>
-        <w:rPr/>
+        <w:rPr>
+          <w:color w:val="0070C0"/>
+        </w:rPr>
+      </w:pPr>
+      <w:r>
+        <w:rPr>
+          <w:color w:val="0070C0"/>
+        </w:rPr>
+        <w:t xml:space="preserve">The Blackjack Handling System is designed to facilitate multiplayer games of Blackjack. Live players as both regular users and dealer players with privileges to deal cards will be hosted on tables for games. </w:t>
+      </w:r>
+      <w:r>
+        <w:rPr>
+          <w:color w:val="0070C0"/>
+        </w:rPr>
         <w:t xml:space="preserve"> </w:t>
       </w:r>
     </w:p>
@@ -3852,9 +3700,10 @@
           <w:numId w:val="2"/>
         </w:numPr>
       </w:pPr>
-      <w:bookmarkStart w:name="__RefHeading___Toc19440724" w:id="7"/>
+      <w:bookmarkStart w:id="7" w:name="__RefHeading___Toc19440724"/>
       <w:bookmarkEnd w:id="7"/>
       <w:r>
+        <w:lastRenderedPageBreak/>
         <w:t>Overall Description</w:t>
       </w:r>
     </w:p>
@@ -3866,7 +3715,7 @@
           <w:numId w:val="2"/>
         </w:numPr>
       </w:pPr>
-      <w:bookmarkStart w:name="__RefHeading___Toc19440725" w:id="8"/>
+      <w:bookmarkStart w:id="8" w:name="__RefHeading___Toc19440725"/>
       <w:bookmarkEnd w:id="8"/>
       <w:r>
         <w:t>Product Perspective</w:t>
@@ -3880,7 +3729,7 @@
           <w:numId w:val="2"/>
         </w:numPr>
       </w:pPr>
-      <w:bookmarkStart w:name="__RefHeading___Toc19440726" w:id="9"/>
+      <w:bookmarkStart w:id="9" w:name="__RefHeading___Toc19440726"/>
       <w:bookmarkEnd w:id="9"/>
       <w:r>
         <w:t>Product Architecture</w:t>
@@ -3920,7 +3769,7 @@
           <w:numId w:val="2"/>
         </w:numPr>
       </w:pPr>
-      <w:bookmarkStart w:name="__RefHeading___Toc19440727" w:id="10"/>
+      <w:bookmarkStart w:id="10" w:name="__RefHeading___Toc19440727"/>
       <w:bookmarkEnd w:id="10"/>
       <w:r>
         <w:t>Product Functionality/Features</w:t>
@@ -3931,11 +3780,9 @@
         <w:ind w:left="1440"/>
       </w:pPr>
       <w:r>
-        <w:rPr/>
         <w:t>The high-level features of the system are as follows (see section 3 of this document for more detailed requirements that address these features):</w:t>
       </w:r>
       <w:r>
-        <w:rPr/>
         <w:t xml:space="preserve"> </w:t>
       </w:r>
     </w:p>
@@ -3947,7 +3794,7 @@
           <w:numId w:val="2"/>
         </w:numPr>
       </w:pPr>
-      <w:bookmarkStart w:name="__RefHeading___Toc19440728" w:id="11"/>
+      <w:bookmarkStart w:id="11" w:name="__RefHeading___Toc19440728"/>
       <w:bookmarkEnd w:id="11"/>
       <w:r>
         <w:t>Constraints</w:t>
@@ -3960,35 +3807,19 @@
           <w:color w:val="7030A0"/>
         </w:rPr>
       </w:pPr>
-      <w:bookmarkStart w:name="REQBV0L32" w:id="12"/>
-      <w:r>
-        <w:rPr>
-          <w:color w:val="7030A0"/>
-        </w:rPr>
-        <w:t xml:space="preserve">List </w:t>
-      </w:r>
-      <w:r>
-        <w:rPr>
-          <w:color w:val="7030A0"/>
-        </w:rPr>
-        <w:t>appropriate constraints</w:t>
-      </w:r>
-      <w:r>
-        <w:rPr>
-          <w:color w:val="7030A0"/>
-        </w:rPr>
-        <w:t>.</w:t>
+      <w:bookmarkStart w:id="12" w:name="REQBV0L32"/>
+      <w:r>
+        <w:rPr>
+          <w:color w:val="7030A0"/>
+        </w:rPr>
+        <w:t>List appropriate constraints.</w:t>
       </w:r>
       <w:bookmarkEnd w:id="12"/>
     </w:p>
     <w:p>
       <w:pPr>
         <w:pStyle w:val="Paragraph2"/>
-        <w:suppressLineNumbers w:val="0"/>
-        <w:bidi w:val="0"/>
-        <w:spacing w:before="80" w:beforeAutospacing="off" w:after="0" w:afterAutospacing="off" w:line="259" w:lineRule="auto"/>
-        <w:ind w:left="1440" w:right="0"/>
-        <w:jc w:val="both"/>
+        <w:spacing w:line="259" w:lineRule="auto"/>
         <w:rPr>
           <w:color w:val="7030A0"/>
         </w:rPr>
@@ -4002,7 +3833,7 @@
           <w:numId w:val="2"/>
         </w:numPr>
       </w:pPr>
-      <w:bookmarkStart w:name="__RefHeading___Toc19440729" w:id="13"/>
+      <w:bookmarkStart w:id="13" w:name="__RefHeading___Toc19440729"/>
       <w:bookmarkEnd w:id="13"/>
       <w:r>
         <w:t>Assumptions and Dependencies</w:t>
@@ -4074,19 +3905,7 @@
         <w:rPr>
           <w:color w:val="7030A0"/>
         </w:rPr>
-        <w:t xml:space="preserve">It is assumed that for every game to be hosted there will be a dealer logged in to create and host the table, as well as </w:t>
-      </w:r>
-      <w:r>
-        <w:rPr>
-          <w:color w:val="7030A0"/>
-        </w:rPr>
-        <w:t>facilitate</w:t>
-      </w:r>
-      <w:r>
-        <w:rPr>
-          <w:color w:val="7030A0"/>
-        </w:rPr>
-        <w:t xml:space="preserve"> dealer functions in game.</w:t>
+        <w:t>It is assumed that for every game to be hosted there will be a dealer logged in to create and host the table, as well as facilitate dealer functions in game.</w:t>
       </w:r>
     </w:p>
     <w:p>
@@ -4097,9 +3916,10 @@
           <w:numId w:val="2"/>
         </w:numPr>
       </w:pPr>
-      <w:bookmarkStart w:name="__RefHeading___Toc19440730" w:id="14"/>
+      <w:bookmarkStart w:id="14" w:name="__RefHeading___Toc19440730"/>
       <w:bookmarkEnd w:id="14"/>
       <w:r>
+        <w:lastRenderedPageBreak/>
         <w:t>Specific Requirements</w:t>
       </w:r>
     </w:p>
@@ -4111,7 +3931,7 @@
           <w:numId w:val="2"/>
         </w:numPr>
       </w:pPr>
-      <w:bookmarkStart w:name="__RefHeading___Toc19440731" w:id="15"/>
+      <w:bookmarkStart w:id="15" w:name="__RefHeading___Toc19440731"/>
       <w:bookmarkEnd w:id="15"/>
       <w:r>
         <w:t>Functional Requirements</w:t>
@@ -4136,7 +3956,7 @@
           <w:color w:val="7030A0"/>
         </w:rPr>
       </w:pPr>
-      <w:bookmarkStart w:name="REQBV1E74" w:id="16"/>
+      <w:bookmarkStart w:id="16" w:name="REQBV1E74"/>
       <w:r>
         <w:rPr>
           <w:color w:val="7030A0"/>
@@ -4200,7 +4020,7 @@
           <w:color w:val="7030A0"/>
         </w:rPr>
       </w:pPr>
-      <w:bookmarkStart w:name="REQBV3V65" w:id="17"/>
+      <w:bookmarkStart w:id="17" w:name="REQBV3V65"/>
       <w:r>
         <w:rPr>
           <w:color w:val="7030A0"/>
@@ -4241,7 +4061,7 @@
           <w:color w:val="7030A0"/>
         </w:rPr>
       </w:pPr>
-      <w:bookmarkStart w:name="REQBV1F34" w:id="18"/>
+      <w:bookmarkStart w:id="18" w:name="REQBV1F34"/>
       <w:r>
         <w:rPr>
           <w:color w:val="7030A0"/>
@@ -4318,7 +4138,7 @@
           <w:bCs/>
         </w:rPr>
       </w:pPr>
-      <w:bookmarkStart w:name="REQBV2F75" w:id="19"/>
+      <w:bookmarkStart w:id="19" w:name="REQBV2F75"/>
       <w:r>
         <w:rPr>
           <w:color w:val="7030A0"/>
@@ -4401,7 +4221,7 @@
           <w:color w:val="7030A0"/>
         </w:rPr>
       </w:pPr>
-      <w:bookmarkStart w:name="REQBV2YM5" w:id="20"/>
+      <w:bookmarkStart w:id="20" w:name="REQBV2YM5"/>
       <w:r>
         <w:rPr>
           <w:color w:val="7030A0"/>
@@ -4474,7 +4294,7 @@
           <w:numId w:val="2"/>
         </w:numPr>
       </w:pPr>
-      <w:bookmarkStart w:name="__RefHeading___Toc19440736" w:id="21"/>
+      <w:bookmarkStart w:id="21" w:name="__RefHeading___Toc19440736"/>
       <w:bookmarkEnd w:id="21"/>
       <w:r>
         <w:t>External Interface Requirements</w:t>
@@ -4487,7 +4307,7 @@
           <w:color w:val="7030A0"/>
         </w:rPr>
       </w:pPr>
-      <w:bookmarkStart w:name="REQBUZLF2" w:id="22"/>
+      <w:bookmarkStart w:id="22" w:name="REQBUZLF2"/>
       <w:r>
         <w:rPr>
           <w:color w:val="7030A0"/>
@@ -4579,7 +4399,7 @@
           <w:numId w:val="2"/>
         </w:numPr>
       </w:pPr>
-      <w:bookmarkStart w:name="__RefHeading___Toc19440737" w:id="23"/>
+      <w:bookmarkStart w:id="23" w:name="__RefHeading___Toc19440737"/>
       <w:bookmarkEnd w:id="23"/>
       <w:r>
         <w:t>Internal Interface Requirements</w:t>
@@ -4592,7 +4412,7 @@
           <w:color w:val="7030A0"/>
         </w:rPr>
       </w:pPr>
-      <w:bookmarkStart w:name="REQBV3515" w:id="24"/>
+      <w:bookmarkStart w:id="24" w:name="REQBV3515"/>
       <w:r>
         <w:rPr>
           <w:color w:val="7030A0"/>
@@ -4632,6 +4452,7 @@
         <w:rPr>
           <w:color w:val="7030A0"/>
         </w:rPr>
+        <w:lastRenderedPageBreak/>
         <w:t xml:space="preserve">3.3.1 </w:t>
       </w:r>
       <w:r>
@@ -4670,7 +4491,7 @@
           <w:color w:val="7030A0"/>
         </w:rPr>
       </w:pPr>
-      <w:bookmarkStart w:name="REQBV46L8" w:id="25"/>
+      <w:bookmarkStart w:id="25" w:name="REQBV46L8"/>
       <w:r>
         <w:rPr>
           <w:color w:val="7030A0"/>
@@ -4714,9 +4535,10 @@
           <w:numId w:val="2"/>
         </w:numPr>
       </w:pPr>
-      <w:bookmarkStart w:name="__RefHeading___Toc19440738" w:id="26"/>
+      <w:bookmarkStart w:id="26" w:name="__RefHeading___Toc19440738"/>
       <w:bookmarkEnd w:id="26"/>
       <w:r>
+        <w:lastRenderedPageBreak/>
         <w:t>Non-Functional Requirements</w:t>
       </w:r>
     </w:p>
@@ -4728,7 +4550,7 @@
           <w:numId w:val="2"/>
         </w:numPr>
       </w:pPr>
-      <w:bookmarkStart w:name="__RefHeading___Toc19440739" w:id="27"/>
+      <w:bookmarkStart w:id="27" w:name="__RefHeading___Toc19440739"/>
       <w:bookmarkEnd w:id="27"/>
       <w:r>
         <w:t>Security and Privacy Requirements</w:t>
@@ -4741,7 +4563,7 @@
           <w:color w:val="7030A0"/>
         </w:rPr>
       </w:pPr>
-      <w:bookmarkStart w:name="REQBV1AR4" w:id="28"/>
+      <w:bookmarkStart w:id="28" w:name="REQBV1AR4"/>
       <w:r>
         <w:rPr>
           <w:color w:val="7030A0"/>
@@ -4766,19 +4588,7 @@
         <w:rPr>
           <w:color w:val="7030A0"/>
         </w:rPr>
-        <w:t xml:space="preserve">Blackjack Handling System shall hold user account information in a file </w:t>
-      </w:r>
-      <w:r>
-        <w:rPr>
-          <w:color w:val="7030A0"/>
-        </w:rPr>
-        <w:t>unaccessible</w:t>
-      </w:r>
-      <w:r>
-        <w:rPr>
-          <w:color w:val="7030A0"/>
-        </w:rPr>
-        <w:t xml:space="preserve"> to regular users.</w:t>
+        <w:t>Blackjack Handling System shall hold user account information in a file unaccessible to regular users.</w:t>
       </w:r>
       <w:bookmarkEnd w:id="28"/>
     </w:p>
@@ -4790,7 +4600,7 @@
           <w:numId w:val="2"/>
         </w:numPr>
       </w:pPr>
-      <w:bookmarkStart w:name="__RefHeading___Toc19440740" w:id="29"/>
+      <w:bookmarkStart w:id="29" w:name="__RefHeading___Toc19440740"/>
       <w:bookmarkEnd w:id="29"/>
       <w:r>
         <w:t>Environmental Requirements</w:t>
@@ -4803,7 +4613,7 @@
           <w:color w:val="7030A0"/>
         </w:rPr>
       </w:pPr>
-      <w:bookmarkStart w:name="REQBV3HG5" w:id="30"/>
+      <w:bookmarkStart w:id="30" w:name="REQBV3HG5"/>
       <w:r>
         <w:rPr>
           <w:color w:val="7030A0"/>
@@ -4874,7 +4684,7 @@
           <w:color w:val="7030A0"/>
         </w:rPr>
       </w:pPr>
-      <w:bookmarkStart w:name="REQBV5QU8" w:id="31"/>
+      <w:bookmarkStart w:id="31" w:name="REQBV5QU8"/>
       <w:r>
         <w:rPr>
           <w:color w:val="7030A0"/>
@@ -4903,7 +4713,7 @@
           <w:color w:val="7030A0"/>
         </w:rPr>
       </w:pPr>
-      <w:bookmarkStart w:name="REQBV5RT8" w:id="32"/>
+      <w:bookmarkStart w:id="32" w:name="REQBV5RT8"/>
       <w:r>
         <w:rPr>
           <w:color w:val="7030A0"/>
@@ -4933,7 +4743,7 @@
           <w:numId w:val="2"/>
         </w:numPr>
       </w:pPr>
-      <w:bookmarkStart w:name="__RefHeading___Toc19440741" w:id="33"/>
+      <w:bookmarkStart w:id="33" w:name="__RefHeading___Toc19440741"/>
       <w:bookmarkEnd w:id="33"/>
       <w:r>
         <w:t>Performance Requirements</w:t>
@@ -4946,7 +4756,7 @@
           <w:color w:val="7030A0"/>
         </w:rPr>
       </w:pPr>
-      <w:bookmarkStart w:name="REQBV5SS8" w:id="34"/>
+      <w:bookmarkStart w:id="34" w:name="REQBV5SS8"/>
       <w:r>
         <w:rPr>
           <w:color w:val="7030A0"/>
@@ -5004,7 +4814,7 @@
           <w:footerReference w:type="default" r:id="rId12"/>
           <w:headerReference w:type="first" r:id="rId13"/>
           <w:footerReference w:type="first" r:id="rId14"/>
-          <w:pgSz w:w="12240" w:h="15840" w:orient="portrait"/>
+          <w:pgSz w:w="12240" w:h="15840"/>
           <w:pgMar w:top="1440" w:right="1800" w:bottom="1800" w:left="1800" w:header="720" w:footer="1080" w:gutter="0"/>
           <w:pgNumType w:fmt="lowerRoman"/>
           <w:cols w:space="720"/>
@@ -5019,7 +4829,7 @@
       <w:pPr>
         <w:sectPr>
           <w:type w:val="continuous"/>
-          <w:pgSz w:w="12240" w:h="15840" w:orient="portrait"/>
+          <w:pgSz w:w="12240" w:h="15840"/>
           <w:pgMar w:top="1440" w:right="1800" w:bottom="1800" w:left="1800" w:header="720" w:footer="1080" w:gutter="0"/>
           <w:cols w:space="720"/>
           <w:formProt w:val="0"/>
@@ -5030,7 +4840,7 @@
     <w:p/>
     <w:sectPr>
       <w:type w:val="continuous"/>
-      <w:pgSz w:w="12240" w:h="15840" w:orient="portrait"/>
+      <w:pgSz w:w="12240" w:h="15840"/>
       <w:pgMar w:top="1440" w:right="1800" w:bottom="1800" w:left="1800" w:header="720" w:footer="1080" w:gutter="0"/>
       <w:cols w:space="720"/>
       <w:formProt w:val="0"/>
@@ -5070,7 +4880,7 @@
 </file>
 
 <file path=word/footer2.xml><?xml version="1.0" encoding="utf-8"?>
-<w:ftr xmlns:wpc="http://schemas.microsoft.com/office/word/2010/wordprocessingCanvas" xmlns:cx="http://schemas.microsoft.com/office/drawing/2014/chartex" xmlns:cx1="http://schemas.microsoft.com/office/drawing/2015/9/8/chartex" xmlns:cx2="http://schemas.microsoft.com/office/drawing/2015/10/21/chartex" xmlns:cx3="http://schemas.microsoft.com/office/drawing/2016/5/9/chartex" xmlns:cx4="http://schemas.microsoft.com/office/drawing/2016/5/10/chartex" xmlns:cx5="http://schemas.microsoft.com/office/drawing/2016/5/11/chartex" xmlns:cx6="http://schemas.microsoft.com/office/drawing/2016/5/12/chartex" xmlns:cx7="http://schemas.microsoft.com/office/drawing/2016/5/13/chartex" xmlns:cx8="http://schemas.microsoft.com/office/drawing/2016/5/14/chartex" xmlns:mc="http://schemas.openxmlformats.org/markup-compatibility/2006" xmlns:aink="http://schemas.microsoft.com/office/drawing/2016/ink" xmlns:am3d="http://schemas.microsoft.com/office/drawing/2017/model3d" xmlns:o="urn:schemas-microsoft-com:office:office" xmlns:oel="http://schemas.microsoft.com/office/2019/extlst" xmlns:r="http://schemas.openxmlformats.org/officeDocument/2006/relationships" xmlns:m="http://schemas.openxmlformats.org/officeDocument/2006/math" xmlns:v="urn:schemas-microsoft-com:vml" xmlns:wp14="http://schemas.microsoft.com/office/word/2010/wordprocessingDrawing" xmlns:wp="http://schemas.openxmlformats.org/drawingml/2006/wordprocessingDrawing" xmlns:w10="urn:schemas-microsoft-com:office:word" xmlns:w="http://schemas.openxmlformats.org/wordprocessingml/2006/main" xmlns:w14="http://schemas.microsoft.com/office/word/2010/wordml" xmlns:w15="http://schemas.microsoft.com/office/word/2012/wordml" xmlns:w16cex="http://schemas.microsoft.com/office/word/2018/wordml/cex" xmlns:w16cid="http://schemas.microsoft.com/office/word/2016/wordml/cid" xmlns:w16="http://schemas.microsoft.com/office/word/2018/wordml" xmlns:w16du="http://schemas.microsoft.com/office/word/2023/wordml/word16du" xmlns:w16sdtdh="http://schemas.microsoft.com/office/word/2020/wordml/sdtdatahash" xmlns:w16sdtfl="http://schemas.microsoft.com/office/word/2024/wordml/sdtformatlock" xmlns:w16se="http://schemas.microsoft.com/office/word/2015/wordml/symex" xmlns:wpg="http://schemas.microsoft.com/office/word/2010/wordprocessingGroup" xmlns:wpi="http://schemas.microsoft.com/office/word/2010/wordprocessingInk" xmlns:wne="http://schemas.microsoft.com/office/word/2006/wordml" xmlns:wps="http://schemas.microsoft.com/office/word/2010/wordprocessingShape" xmlns:a="http://schemas.openxmlformats.org/drawingml/2006/main" mc:Ignorable="w14 w15 w16se w16cid w16 w16cex w16sdtdh w16sdtfl w16du wp14">
+<w:ftr xmlns:wpc="http://schemas.microsoft.com/office/word/2010/wordprocessingCanvas" xmlns:cx="http://schemas.microsoft.com/office/drawing/2014/chartex" xmlns:cx1="http://schemas.microsoft.com/office/drawing/2015/9/8/chartex" xmlns:cx2="http://schemas.microsoft.com/office/drawing/2015/10/21/chartex" xmlns:cx3="http://schemas.microsoft.com/office/drawing/2016/5/9/chartex" xmlns:cx4="http://schemas.microsoft.com/office/drawing/2016/5/10/chartex" xmlns:cx5="http://schemas.microsoft.com/office/drawing/2016/5/11/chartex" xmlns:cx6="http://schemas.microsoft.com/office/drawing/2016/5/12/chartex" xmlns:cx7="http://schemas.microsoft.com/office/drawing/2016/5/13/chartex" xmlns:cx8="http://schemas.microsoft.com/office/drawing/2016/5/14/chartex" xmlns:mc="http://schemas.openxmlformats.org/markup-compatibility/2006" xmlns:aink="http://schemas.microsoft.com/office/drawing/2016/ink" xmlns:am3d="http://schemas.microsoft.com/office/drawing/2017/model3d" xmlns:o="urn:schemas-microsoft-com:office:office" xmlns:oel="http://schemas.microsoft.com/office/2019/extlst" xmlns:r="http://schemas.openxmlformats.org/officeDocument/2006/relationships" xmlns:m="http://schemas.openxmlformats.org/officeDocument/2006/math" xmlns:v="urn:schemas-microsoft-com:vml" xmlns:wp14="http://schemas.microsoft.com/office/word/2010/wordprocessingDrawing" xmlns:wp="http://schemas.openxmlformats.org/drawingml/2006/wordprocessingDrawing" xmlns:w10="urn:schemas-microsoft-com:office:word" xmlns:w="http://schemas.openxmlformats.org/wordprocessingml/2006/main" xmlns:w14="http://schemas.microsoft.com/office/word/2010/wordml" xmlns:w15="http://schemas.microsoft.com/office/word/2012/wordml" xmlns:w16cex="http://schemas.microsoft.com/office/word/2018/wordml/cex" xmlns:w16cid="http://schemas.microsoft.com/office/word/2016/wordml/cid" xmlns:w16="http://schemas.microsoft.com/office/word/2018/wordml" xmlns:w16du="http://schemas.microsoft.com/office/word/2023/wordml/word16du" xmlns:w16sdtdh="http://schemas.microsoft.com/office/word/2020/wordml/sdtdatahash" xmlns:w16sdtfl="http://schemas.microsoft.com/office/word/2024/wordml/sdtformatlock" xmlns:w16se="http://schemas.microsoft.com/office/word/2015/wordml/symex" xmlns:wpg="http://schemas.microsoft.com/office/word/2010/wordprocessingGroup" xmlns:wpi="http://schemas.microsoft.com/office/word/2010/wordprocessingInk" xmlns:wne="http://schemas.microsoft.com/office/word/2006/wordml" xmlns:wps="http://schemas.microsoft.com/office/word/2010/wordprocessingShape" mc:Ignorable="w14 w15 w16se w16cid w16 w16cex w16sdtdh w16sdtfl w16du wp14">
   <w:p>
     <w:pPr>
       <w:pStyle w:val="Footer"/>
@@ -5156,17 +4966,8 @@
                               <w:rStyle w:val="PageNumber"/>
                               <w:color w:val="000000"/>
                             </w:rPr>
-                            <w:t>i</w:t>
+                            <w:t>ii</w:t>
                           </w:r>
-                          <w:proofErr w:type="spellStart"/>
-                          <w:r>
-                            <w:rPr>
-                              <w:rStyle w:val="PageNumber"/>
-                              <w:color w:val="000000"/>
-                            </w:rPr>
-                            <w:t>i</w:t>
-                          </w:r>
-                          <w:proofErr w:type="spellEnd"/>
                           <w:r>
                             <w:rPr>
                               <w:rStyle w:val="PageNumber"/>
@@ -5187,8 +4988,8 @@
           </w:drawing>
         </mc:Choice>
         <mc:Fallback>
-          <w:pict w14:anchorId="74B43875">
-            <v:rect id="Frame1" style="position:absolute;margin-left:0;margin-top:.05pt;width:4.65pt;height:9.35pt;z-index:-503316473;visibility:visible;mso-wrap-style:square;mso-wrap-distance-left:0;mso-wrap-distance-top:0;mso-wrap-distance-right:0;mso-wrap-distance-bottom:0;mso-position-horizontal:center;mso-position-horizontal-relative:margin;mso-position-vertical:absolute;mso-position-vertical-relative:text;v-text-anchor:top" o:spid="_x0000_s1026" o:allowincell="f" filled="f" stroked="f" strokeweight="0" w14:anchorId="07B49E00" o:gfxdata="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">
+          <w:pict>
+            <v:rect w14:anchorId="07B49E00" id="Frame1" o:spid="_x0000_s1026" style="position:absolute;margin-left:0;margin-top:.05pt;width:4.65pt;height:9.35pt;z-index:-503316473;visibility:visible;mso-wrap-style:square;mso-wrap-distance-left:0;mso-wrap-distance-top:0;mso-wrap-distance-right:0;mso-wrap-distance-bottom:0;mso-position-horizontal:center;mso-position-horizontal-relative:margin;mso-position-vertical:absolute;mso-position-vertical-relative:text;v-text-anchor:top" o:gfxdata="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" o:allowincell="f" filled="f" stroked="f" strokeweight="0">
               <v:textbox inset="0,0,0,0">
                 <w:txbxContent>
                   <w:p>
@@ -5221,17 +5022,8 @@
                         <w:rStyle w:val="PageNumber"/>
                         <w:color w:val="000000"/>
                       </w:rPr>
-                      <w:t>i</w:t>
+                      <w:t>ii</w:t>
                     </w:r>
-                    <w:proofErr w:type="spellStart"/>
-                    <w:r>
-                      <w:rPr>
-                        <w:rStyle w:val="PageNumber"/>
-                        <w:color w:val="000000"/>
-                      </w:rPr>
-                      <w:t>i</w:t>
-                    </w:r>
-                    <w:proofErr w:type="spellEnd"/>
                     <w:r>
                       <w:rPr>
                         <w:rStyle w:val="PageNumber"/>
@@ -5253,7 +5045,7 @@
 </file>
 
 <file path=word/footer3.xml><?xml version="1.0" encoding="utf-8"?>
-<w:ftr xmlns:wpc="http://schemas.microsoft.com/office/word/2010/wordprocessingCanvas" xmlns:cx="http://schemas.microsoft.com/office/drawing/2014/chartex" xmlns:cx1="http://schemas.microsoft.com/office/drawing/2015/9/8/chartex" xmlns:cx2="http://schemas.microsoft.com/office/drawing/2015/10/21/chartex" xmlns:cx3="http://schemas.microsoft.com/office/drawing/2016/5/9/chartex" xmlns:cx4="http://schemas.microsoft.com/office/drawing/2016/5/10/chartex" xmlns:cx5="http://schemas.microsoft.com/office/drawing/2016/5/11/chartex" xmlns:cx6="http://schemas.microsoft.com/office/drawing/2016/5/12/chartex" xmlns:cx7="http://schemas.microsoft.com/office/drawing/2016/5/13/chartex" xmlns:cx8="http://schemas.microsoft.com/office/drawing/2016/5/14/chartex" xmlns:mc="http://schemas.openxmlformats.org/markup-compatibility/2006" xmlns:aink="http://schemas.microsoft.com/office/drawing/2016/ink" xmlns:am3d="http://schemas.microsoft.com/office/drawing/2017/model3d" xmlns:o="urn:schemas-microsoft-com:office:office" xmlns:oel="http://schemas.microsoft.com/office/2019/extlst" xmlns:r="http://schemas.openxmlformats.org/officeDocument/2006/relationships" xmlns:m="http://schemas.openxmlformats.org/officeDocument/2006/math" xmlns:v="urn:schemas-microsoft-com:vml" xmlns:wp14="http://schemas.microsoft.com/office/word/2010/wordprocessingDrawing" xmlns:wp="http://schemas.openxmlformats.org/drawingml/2006/wordprocessingDrawing" xmlns:w10="urn:schemas-microsoft-com:office:word" xmlns:w="http://schemas.openxmlformats.org/wordprocessingml/2006/main" xmlns:w14="http://schemas.microsoft.com/office/word/2010/wordml" xmlns:w15="http://schemas.microsoft.com/office/word/2012/wordml" xmlns:w16cex="http://schemas.microsoft.com/office/word/2018/wordml/cex" xmlns:w16cid="http://schemas.microsoft.com/office/word/2016/wordml/cid" xmlns:w16="http://schemas.microsoft.com/office/word/2018/wordml" xmlns:w16du="http://schemas.microsoft.com/office/word/2023/wordml/word16du" xmlns:w16sdtdh="http://schemas.microsoft.com/office/word/2020/wordml/sdtdatahash" xmlns:w16sdtfl="http://schemas.microsoft.com/office/word/2024/wordml/sdtformatlock" xmlns:w16se="http://schemas.microsoft.com/office/word/2015/wordml/symex" xmlns:wpg="http://schemas.microsoft.com/office/word/2010/wordprocessingGroup" xmlns:wpi="http://schemas.microsoft.com/office/word/2010/wordprocessingInk" xmlns:wne="http://schemas.microsoft.com/office/word/2006/wordml" xmlns:wps="http://schemas.microsoft.com/office/word/2010/wordprocessingShape" xmlns:a="http://schemas.openxmlformats.org/drawingml/2006/main" mc:Ignorable="w14 w15 w16se w16cid w16 w16cex w16sdtdh w16sdtfl w16du wp14">
+<w:ftr xmlns:wpc="http://schemas.microsoft.com/office/word/2010/wordprocessingCanvas" xmlns:cx="http://schemas.microsoft.com/office/drawing/2014/chartex" xmlns:cx1="http://schemas.microsoft.com/office/drawing/2015/9/8/chartex" xmlns:cx2="http://schemas.microsoft.com/office/drawing/2015/10/21/chartex" xmlns:cx3="http://schemas.microsoft.com/office/drawing/2016/5/9/chartex" xmlns:cx4="http://schemas.microsoft.com/office/drawing/2016/5/10/chartex" xmlns:cx5="http://schemas.microsoft.com/office/drawing/2016/5/11/chartex" xmlns:cx6="http://schemas.microsoft.com/office/drawing/2016/5/12/chartex" xmlns:cx7="http://schemas.microsoft.com/office/drawing/2016/5/13/chartex" xmlns:cx8="http://schemas.microsoft.com/office/drawing/2016/5/14/chartex" xmlns:mc="http://schemas.openxmlformats.org/markup-compatibility/2006" xmlns:aink="http://schemas.microsoft.com/office/drawing/2016/ink" xmlns:am3d="http://schemas.microsoft.com/office/drawing/2017/model3d" xmlns:o="urn:schemas-microsoft-com:office:office" xmlns:oel="http://schemas.microsoft.com/office/2019/extlst" xmlns:r="http://schemas.openxmlformats.org/officeDocument/2006/relationships" xmlns:m="http://schemas.openxmlformats.org/officeDocument/2006/math" xmlns:v="urn:schemas-microsoft-com:vml" xmlns:wp14="http://schemas.microsoft.com/office/word/2010/wordprocessingDrawing" xmlns:wp="http://schemas.openxmlformats.org/drawingml/2006/wordprocessingDrawing" xmlns:w10="urn:schemas-microsoft-com:office:word" xmlns:w="http://schemas.openxmlformats.org/wordprocessingml/2006/main" xmlns:w14="http://schemas.microsoft.com/office/word/2010/wordml" xmlns:w15="http://schemas.microsoft.com/office/word/2012/wordml" xmlns:w16cex="http://schemas.microsoft.com/office/word/2018/wordml/cex" xmlns:w16cid="http://schemas.microsoft.com/office/word/2016/wordml/cid" xmlns:w16="http://schemas.microsoft.com/office/word/2018/wordml" xmlns:w16du="http://schemas.microsoft.com/office/word/2023/wordml/word16du" xmlns:w16sdtdh="http://schemas.microsoft.com/office/word/2020/wordml/sdtdatahash" xmlns:w16sdtfl="http://schemas.microsoft.com/office/word/2024/wordml/sdtformatlock" xmlns:w16se="http://schemas.microsoft.com/office/word/2015/wordml/symex" xmlns:wpg="http://schemas.microsoft.com/office/word/2010/wordprocessingGroup" xmlns:wpi="http://schemas.microsoft.com/office/word/2010/wordprocessingInk" xmlns:wne="http://schemas.microsoft.com/office/word/2006/wordml" xmlns:wps="http://schemas.microsoft.com/office/word/2010/wordprocessingShape" mc:Ignorable="w14 w15 w16se w16cid w16 w16cex w16sdtdh w16sdtfl w16du wp14">
   <w:p>
     <w:pPr>
       <w:pStyle w:val="Footer"/>
@@ -5339,17 +5131,8 @@
                               <w:rStyle w:val="PageNumber"/>
                               <w:color w:val="000000"/>
                             </w:rPr>
-                            <w:t>vii</w:t>
+                            <w:t>viii</w:t>
                           </w:r>
-                          <w:proofErr w:type="spellStart"/>
-                          <w:r>
-                            <w:rPr>
-                              <w:rStyle w:val="PageNumber"/>
-                              <w:color w:val="000000"/>
-                            </w:rPr>
-                            <w:t>i</w:t>
-                          </w:r>
-                          <w:proofErr w:type="spellEnd"/>
                           <w:r>
                             <w:rPr>
                               <w:rStyle w:val="PageNumber"/>
@@ -5370,8 +5153,8 @@
           </w:drawing>
         </mc:Choice>
         <mc:Fallback>
-          <w:pict w14:anchorId="1C4E5E06">
-            <v:rect id="Frame2" style="position:absolute;margin-left:0;margin-top:.05pt;width:5.65pt;height:1.8pt;z-index:-503316474;visibility:visible;mso-wrap-style:square;mso-wrap-distance-left:0;mso-wrap-distance-top:0;mso-wrap-distance-right:0;mso-wrap-distance-bottom:0;mso-position-horizontal:center;mso-position-horizontal-relative:margin;mso-position-vertical:absolute;mso-position-vertical-relative:text;v-text-anchor:top" o:spid="_x0000_s1027" o:allowincell="f" filled="f" stroked="f" strokeweight="0" w14:anchorId="16546B0F" o:gfxdata="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">
+          <w:pict>
+            <v:rect w14:anchorId="16546B0F" id="Frame2" o:spid="_x0000_s1027" style="position:absolute;margin-left:0;margin-top:.05pt;width:5.65pt;height:1.8pt;z-index:-503316474;visibility:visible;mso-wrap-style:square;mso-wrap-distance-left:0;mso-wrap-distance-top:0;mso-wrap-distance-right:0;mso-wrap-distance-bottom:0;mso-position-horizontal:center;mso-position-horizontal-relative:margin;mso-position-vertical:absolute;mso-position-vertical-relative:text;v-text-anchor:top" o:gfxdata="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" o:allowincell="f" filled="f" stroked="f" strokeweight="0">
               <v:textbox inset="0,0,0,0">
                 <w:txbxContent>
                   <w:p>
@@ -5404,17 +5187,8 @@
                         <w:rStyle w:val="PageNumber"/>
                         <w:color w:val="000000"/>
                       </w:rPr>
-                      <w:t>vii</w:t>
+                      <w:t>viii</w:t>
                     </w:r>
-                    <w:proofErr w:type="spellStart"/>
-                    <w:r>
-                      <w:rPr>
-                        <w:rStyle w:val="PageNumber"/>
-                        <w:color w:val="000000"/>
-                      </w:rPr>
-                      <w:t>i</w:t>
-                    </w:r>
-                    <w:proofErr w:type="spellEnd"/>
                     <w:r>
                       <w:rPr>
                         <w:rStyle w:val="PageNumber"/>
@@ -5469,16 +5243,8 @@
       <w:rPr>
         <w:rStyle w:val="PageNumber"/>
       </w:rPr>
-      <w:t>ii</w:t>
+      <w:t>iii</w:t>
     </w:r>
-    <w:proofErr w:type="spellStart"/>
-    <w:r>
-      <w:rPr>
-        <w:rStyle w:val="PageNumber"/>
-      </w:rPr>
-      <w:t>i</w:t>
-    </w:r>
-    <w:proofErr w:type="spellEnd"/>
     <w:r>
       <w:rPr>
         <w:rStyle w:val="PageNumber"/>
@@ -5807,11 +5573,11 @@
 </file>
 
 <file path=word/styles.xml><?xml version="1.0" encoding="utf-8"?>
-<w:styles xmlns:wp14="http://schemas.microsoft.com/office/word/2010/wordprocessingDrawing" xmlns:mc="http://schemas.openxmlformats.org/markup-compatibility/2006" xmlns:r="http://schemas.openxmlformats.org/officeDocument/2006/relationships" xmlns:w="http://schemas.openxmlformats.org/wordprocessingml/2006/main" xmlns:w14="http://schemas.microsoft.com/office/word/2010/wordml" xmlns:w15="http://schemas.microsoft.com/office/word/2012/wordml" xmlns:w16cex="http://schemas.microsoft.com/office/word/2018/wordml/cex" xmlns:w16cid="http://schemas.microsoft.com/office/word/2016/wordml/cid" xmlns:w16="http://schemas.microsoft.com/office/word/2018/wordml" xmlns:w16du="http://schemas.microsoft.com/office/word/2023/wordml/word16du" xmlns:w16sdtdh="http://schemas.microsoft.com/office/word/2020/wordml/sdtdatahash" xmlns:w16sdtfl="http://schemas.microsoft.com/office/word/2024/wordml/sdtformatlock" xmlns:w16se="http://schemas.microsoft.com/office/word/2015/wordml/symex" mc:Ignorable="w14 w15 w16se w16cid w16 w16cex w16sdtdh w16sdtfl w16du wp14">
+<w:styles xmlns:mc="http://schemas.openxmlformats.org/markup-compatibility/2006" xmlns:r="http://schemas.openxmlformats.org/officeDocument/2006/relationships" xmlns:w="http://schemas.openxmlformats.org/wordprocessingml/2006/main" xmlns:w14="http://schemas.microsoft.com/office/word/2010/wordml" xmlns:w15="http://schemas.microsoft.com/office/word/2012/wordml" xmlns:w16cex="http://schemas.microsoft.com/office/word/2018/wordml/cex" xmlns:w16cid="http://schemas.microsoft.com/office/word/2016/wordml/cid" xmlns:w16="http://schemas.microsoft.com/office/word/2018/wordml" xmlns:w16du="http://schemas.microsoft.com/office/word/2023/wordml/word16du" xmlns:w16sdtdh="http://schemas.microsoft.com/office/word/2020/wordml/sdtdatahash" xmlns:w16sdtfl="http://schemas.microsoft.com/office/word/2024/wordml/sdtformatlock" xmlns:w16se="http://schemas.microsoft.com/office/word/2015/wordml/symex" mc:Ignorable="w14 w15 w16se w16cid w16 w16cex w16sdtdh w16sdtfl w16du">
   <w:docDefaults>
     <w:rPrDefault>
       <w:rPr>
-        <w:rFonts w:ascii="Liberation Serif" w:hAnsi="Liberation Serif" w:eastAsia="Noto Sans CJK SC" w:cs="Lohit Devanagari"/>
+        <w:rFonts w:ascii="Liberation Serif" w:eastAsia="Noto Sans CJK SC" w:hAnsi="Liberation Serif" w:cs="Lohit Devanagari"/>
         <w:sz w:val="24"/>
         <w:szCs w:val="24"/>
         <w:lang w:val="en-US" w:eastAsia="zh-CN" w:bidi="hi-IN"/>
@@ -5826,14 +5592,14 @@
   <w:latentStyles w:defLockedState="0" w:defUIPriority="99" w:defSemiHidden="0" w:defUnhideWhenUsed="0" w:defQFormat="0" w:count="376">
     <w:lsdException w:name="Normal" w:uiPriority="0" w:qFormat="1"/>
     <w:lsdException w:name="heading 1" w:uiPriority="9" w:qFormat="1"/>
-    <w:lsdException w:name="heading 2" w:uiPriority="9" w:semiHidden="1" w:unhideWhenUsed="1" w:qFormat="1"/>
-    <w:lsdException w:name="heading 3" w:uiPriority="9" w:semiHidden="1" w:unhideWhenUsed="1" w:qFormat="1"/>
-    <w:lsdException w:name="heading 4" w:uiPriority="9" w:semiHidden="1" w:unhideWhenUsed="1" w:qFormat="1"/>
-    <w:lsdException w:name="heading 5" w:uiPriority="9" w:semiHidden="1" w:unhideWhenUsed="1" w:qFormat="1"/>
-    <w:lsdException w:name="heading 6" w:uiPriority="9" w:semiHidden="1" w:unhideWhenUsed="1" w:qFormat="1"/>
-    <w:lsdException w:name="heading 7" w:uiPriority="9" w:semiHidden="1" w:unhideWhenUsed="1" w:qFormat="1"/>
-    <w:lsdException w:name="heading 8" w:uiPriority="9" w:semiHidden="1" w:unhideWhenUsed="1" w:qFormat="1"/>
-    <w:lsdException w:name="heading 9" w:uiPriority="9" w:semiHidden="1" w:unhideWhenUsed="1" w:qFormat="1"/>
+    <w:lsdException w:name="heading 2" w:semiHidden="1" w:uiPriority="9" w:unhideWhenUsed="1" w:qFormat="1"/>
+    <w:lsdException w:name="heading 3" w:semiHidden="1" w:uiPriority="9" w:unhideWhenUsed="1" w:qFormat="1"/>
+    <w:lsdException w:name="heading 4" w:semiHidden="1" w:uiPriority="9" w:unhideWhenUsed="1" w:qFormat="1"/>
+    <w:lsdException w:name="heading 5" w:semiHidden="1" w:uiPriority="9" w:unhideWhenUsed="1" w:qFormat="1"/>
+    <w:lsdException w:name="heading 6" w:semiHidden="1" w:uiPriority="9" w:unhideWhenUsed="1" w:qFormat="1"/>
+    <w:lsdException w:name="heading 7" w:semiHidden="1" w:uiPriority="9" w:unhideWhenUsed="1" w:qFormat="1"/>
+    <w:lsdException w:name="heading 8" w:semiHidden="1" w:uiPriority="9" w:unhideWhenUsed="1" w:qFormat="1"/>
+    <w:lsdException w:name="heading 9" w:semiHidden="1" w:uiPriority="9" w:unhideWhenUsed="1" w:qFormat="1"/>
     <w:lsdException w:name="index 1" w:semiHidden="1" w:unhideWhenUsed="1"/>
     <w:lsdException w:name="index 2" w:semiHidden="1" w:unhideWhenUsed="1"/>
     <w:lsdException w:name="index 3" w:semiHidden="1" w:unhideWhenUsed="1"/>
@@ -5843,22 +5609,22 @@
     <w:lsdException w:name="index 7" w:semiHidden="1" w:unhideWhenUsed="1"/>
     <w:lsdException w:name="index 8" w:semiHidden="1" w:unhideWhenUsed="1"/>
     <w:lsdException w:name="index 9" w:semiHidden="1" w:unhideWhenUsed="1"/>
-    <w:lsdException w:name="toc 1" w:uiPriority="39" w:semiHidden="1" w:unhideWhenUsed="1"/>
-    <w:lsdException w:name="toc 2" w:uiPriority="39" w:semiHidden="1" w:unhideWhenUsed="1"/>
-    <w:lsdException w:name="toc 3" w:uiPriority="39" w:semiHidden="1" w:unhideWhenUsed="1"/>
-    <w:lsdException w:name="toc 4" w:uiPriority="39" w:semiHidden="1" w:unhideWhenUsed="1"/>
-    <w:lsdException w:name="toc 5" w:uiPriority="39" w:semiHidden="1" w:unhideWhenUsed="1"/>
-    <w:lsdException w:name="toc 6" w:uiPriority="39" w:semiHidden="1" w:unhideWhenUsed="1"/>
-    <w:lsdException w:name="toc 7" w:uiPriority="39" w:semiHidden="1" w:unhideWhenUsed="1"/>
-    <w:lsdException w:name="toc 8" w:uiPriority="39" w:semiHidden="1" w:unhideWhenUsed="1"/>
-    <w:lsdException w:name="toc 9" w:uiPriority="39" w:semiHidden="1" w:unhideWhenUsed="1"/>
+    <w:lsdException w:name="toc 1" w:semiHidden="1" w:uiPriority="39" w:unhideWhenUsed="1"/>
+    <w:lsdException w:name="toc 2" w:semiHidden="1" w:uiPriority="39" w:unhideWhenUsed="1"/>
+    <w:lsdException w:name="toc 3" w:semiHidden="1" w:uiPriority="39" w:unhideWhenUsed="1"/>
+    <w:lsdException w:name="toc 4" w:semiHidden="1" w:uiPriority="39" w:unhideWhenUsed="1"/>
+    <w:lsdException w:name="toc 5" w:semiHidden="1" w:uiPriority="39" w:unhideWhenUsed="1"/>
+    <w:lsdException w:name="toc 6" w:semiHidden="1" w:uiPriority="39" w:unhideWhenUsed="1"/>
+    <w:lsdException w:name="toc 7" w:semiHidden="1" w:uiPriority="39" w:unhideWhenUsed="1"/>
+    <w:lsdException w:name="toc 8" w:semiHidden="1" w:uiPriority="39" w:unhideWhenUsed="1"/>
+    <w:lsdException w:name="toc 9" w:semiHidden="1" w:uiPriority="39" w:unhideWhenUsed="1"/>
     <w:lsdException w:name="Normal Indent" w:semiHidden="1" w:unhideWhenUsed="1"/>
     <w:lsdException w:name="footnote text" w:semiHidden="1" w:unhideWhenUsed="1"/>
     <w:lsdException w:name="annotation text" w:semiHidden="1" w:unhideWhenUsed="1"/>
     <w:lsdException w:name="header" w:semiHidden="1" w:unhideWhenUsed="1"/>
     <w:lsdException w:name="footer" w:semiHidden="1" w:unhideWhenUsed="1"/>
     <w:lsdException w:name="index heading" w:semiHidden="1" w:unhideWhenUsed="1"/>
-    <w:lsdException w:name="caption" w:uiPriority="35" w:semiHidden="1" w:unhideWhenUsed="1" w:qFormat="1"/>
+    <w:lsdException w:name="caption" w:semiHidden="1" w:uiPriority="35" w:unhideWhenUsed="1" w:qFormat="1"/>
     <w:lsdException w:name="table of figures" w:semiHidden="1" w:unhideWhenUsed="1"/>
     <w:lsdException w:name="envelope address" w:semiHidden="1" w:unhideWhenUsed="1"/>
     <w:lsdException w:name="envelope return" w:semiHidden="1" w:unhideWhenUsed="1"/>
@@ -5889,7 +5655,7 @@
     <w:lsdException w:name="Title" w:uiPriority="10" w:qFormat="1"/>
     <w:lsdException w:name="Closing" w:semiHidden="1" w:unhideWhenUsed="1"/>
     <w:lsdException w:name="Signature" w:semiHidden="1" w:unhideWhenUsed="1"/>
-    <w:lsdException w:name="Default Paragraph Font" w:uiPriority="1" w:semiHidden="1" w:unhideWhenUsed="1"/>
+    <w:lsdException w:name="Default Paragraph Font" w:semiHidden="1" w:uiPriority="1" w:unhideWhenUsed="1"/>
     <w:lsdException w:name="Body Text" w:semiHidden="1" w:unhideWhenUsed="1"/>
     <w:lsdException w:name="Body Text Indent" w:semiHidden="1" w:unhideWhenUsed="1"/>
     <w:lsdException w:name="List Continue" w:semiHidden="1" w:unhideWhenUsed="1"/>
@@ -6089,8 +5855,8 @@
     <w:lsdException w:name="Subtle Reference" w:uiPriority="31" w:qFormat="1"/>
     <w:lsdException w:name="Intense Reference" w:uiPriority="32" w:qFormat="1"/>
     <w:lsdException w:name="Book Title" w:uiPriority="33" w:qFormat="1"/>
-    <w:lsdException w:name="Bibliography" w:uiPriority="37" w:semiHidden="1" w:unhideWhenUsed="1"/>
-    <w:lsdException w:name="TOC Heading" w:uiPriority="39" w:semiHidden="1" w:unhideWhenUsed="1" w:qFormat="1"/>
+    <w:lsdException w:name="Bibliography" w:semiHidden="1" w:uiPriority="37" w:unhideWhenUsed="1"/>
+    <w:lsdException w:name="TOC Heading" w:semiHidden="1" w:uiPriority="39" w:unhideWhenUsed="1" w:qFormat="1"/>
     <w:lsdException w:name="Plain Table 1" w:uiPriority="41"/>
     <w:lsdException w:name="Plain Table 2" w:uiPriority="42"/>
     <w:lsdException w:name="Plain Table 3" w:uiPriority="43"/>
@@ -6201,11 +5967,11 @@
     <w:lsdException w:name="Unresolved Mention" w:semiHidden="1" w:unhideWhenUsed="1"/>
     <w:lsdException w:name="Smart Link" w:semiHidden="1" w:unhideWhenUsed="1"/>
   </w:latentStyles>
-  <w:style w:type="paragraph" w:styleId="Normal" w:default="1">
+  <w:style w:type="paragraph" w:default="1" w:styleId="Normal">
     <w:name w:val="Normal"/>
     <w:qFormat/>
     <w:rPr>
-      <w:rFonts w:ascii="Times New Roman" w:hAnsi="Times New Roman" w:eastAsia="Times New Roman" w:cs="Times New Roman"/>
+      <w:rFonts w:ascii="Times New Roman" w:eastAsia="Times New Roman" w:hAnsi="Times New Roman" w:cs="Times New Roman"/>
       <w:sz w:val="20"/>
       <w:szCs w:val="20"/>
       <w:lang w:bidi="ar-SA"/>
@@ -6224,10 +5990,10 @@
         <w:numId w:val="1"/>
       </w:numPr>
       <w:pBdr>
-        <w:top w:val="single" w:color="000000" w:sz="12" w:space="1"/>
-        <w:left w:val="single" w:color="000000" w:sz="12" w:space="1"/>
-        <w:bottom w:val="single" w:color="000000" w:sz="12" w:space="1"/>
-        <w:right w:val="single" w:color="000000" w:sz="12" w:space="1"/>
+        <w:top w:val="single" w:sz="12" w:space="1" w:color="000000"/>
+        <w:left w:val="single" w:sz="12" w:space="1" w:color="000000"/>
+        <w:bottom w:val="single" w:sz="12" w:space="1" w:color="000000"/>
+        <w:right w:val="single" w:sz="12" w:space="1" w:color="000000"/>
       </w:pBdr>
       <w:spacing w:after="60"/>
       <w:outlineLvl w:val="0"/>
@@ -6397,13 +6163,13 @@
       <w:sz w:val="18"/>
     </w:rPr>
   </w:style>
-  <w:style w:type="character" w:styleId="DefaultParagraphFont" w:default="1">
+  <w:style w:type="character" w:default="1" w:styleId="DefaultParagraphFont">
     <w:name w:val="Default Paragraph Font"/>
     <w:uiPriority w:val="1"/>
     <w:semiHidden/>
     <w:unhideWhenUsed/>
   </w:style>
-  <w:style w:type="table" w:styleId="TableNormal" w:default="1">
+  <w:style w:type="table" w:default="1" w:styleId="TableNormal">
     <w:name w:val="Normal Table"/>
     <w:uiPriority w:val="99"/>
     <w:semiHidden/>
@@ -6418,13 +6184,13 @@
       </w:tblCellMar>
     </w:tblPr>
   </w:style>
-  <w:style w:type="numbering" w:styleId="NoList" w:default="1">
+  <w:style w:type="numbering" w:default="1" w:styleId="NoList">
     <w:name w:val="No List"/>
     <w:uiPriority w:val="99"/>
     <w:semiHidden/>
     <w:unhideWhenUsed/>
   </w:style>
-  <w:style w:type="character" w:styleId="WW8Num1z0" w:customStyle="1">
+  <w:style w:type="character" w:customStyle="1" w:styleId="WW8Num1z0">
     <w:name w:val="WW8Num1z0"/>
     <w:qFormat/>
     <w:rPr>
@@ -6434,35 +6200,35 @@
       <w:lang w:val="en-US" w:bidi="en-US"/>
     </w:rPr>
   </w:style>
-  <w:style w:type="character" w:styleId="WW8Num1z1" w:customStyle="1">
+  <w:style w:type="character" w:customStyle="1" w:styleId="WW8Num1z1">
     <w:name w:val="WW8Num1z1"/>
     <w:qFormat/>
   </w:style>
-  <w:style w:type="character" w:styleId="WW8Num1z2" w:customStyle="1">
+  <w:style w:type="character" w:customStyle="1" w:styleId="WW8Num1z2">
     <w:name w:val="WW8Num1z2"/>
     <w:qFormat/>
   </w:style>
-  <w:style w:type="character" w:styleId="WW8Num1z3" w:customStyle="1">
+  <w:style w:type="character" w:customStyle="1" w:styleId="WW8Num1z3">
     <w:name w:val="WW8Num1z3"/>
     <w:qFormat/>
   </w:style>
-  <w:style w:type="character" w:styleId="WW8Num1z4" w:customStyle="1">
+  <w:style w:type="character" w:customStyle="1" w:styleId="WW8Num1z4">
     <w:name w:val="WW8Num1z4"/>
     <w:qFormat/>
   </w:style>
-  <w:style w:type="character" w:styleId="WW8Num1z5" w:customStyle="1">
+  <w:style w:type="character" w:customStyle="1" w:styleId="WW8Num1z5">
     <w:name w:val="WW8Num1z5"/>
     <w:qFormat/>
   </w:style>
-  <w:style w:type="character" w:styleId="WW8Num1z6" w:customStyle="1">
+  <w:style w:type="character" w:customStyle="1" w:styleId="WW8Num1z6">
     <w:name w:val="WW8Num1z6"/>
     <w:qFormat/>
   </w:style>
-  <w:style w:type="character" w:styleId="WW8Num1z7" w:customStyle="1">
+  <w:style w:type="character" w:customStyle="1" w:styleId="WW8Num1z7">
     <w:name w:val="WW8Num1z7"/>
     <w:qFormat/>
   </w:style>
-  <w:style w:type="character" w:styleId="WW8Num1z8" w:customStyle="1">
+  <w:style w:type="character" w:customStyle="1" w:styleId="WW8Num1z8">
     <w:name w:val="WW8Num1z8"/>
     <w:qFormat/>
   </w:style>
@@ -6475,14 +6241,13 @@
     <w:rPr>
       <w:color w:val="000080"/>
       <w:u w:val="single"/>
-      <w:lang/>
     </w:rPr>
   </w:style>
-  <w:style w:type="character" w:styleId="IndexLink" w:customStyle="1">
+  <w:style w:type="character" w:customStyle="1" w:styleId="IndexLink">
     <w:name w:val="Index Link"/>
     <w:qFormat/>
   </w:style>
-  <w:style w:type="paragraph" w:styleId="Heading" w:customStyle="1">
+  <w:style w:type="paragraph" w:customStyle="1" w:styleId="Heading">
     <w:name w:val="Heading"/>
     <w:basedOn w:val="Normal"/>
     <w:next w:val="BodyText"/>
@@ -6529,7 +6294,7 @@
       <w:szCs w:val="24"/>
     </w:rPr>
   </w:style>
-  <w:style w:type="paragraph" w:styleId="Index" w:customStyle="1">
+  <w:style w:type="paragraph" w:customStyle="1" w:styleId="Index">
     <w:name w:val="Index"/>
     <w:basedOn w:val="Normal"/>
     <w:qFormat/>
@@ -6540,7 +6305,7 @@
       <w:rFonts w:cs="Lohit Devanagari"/>
     </w:rPr>
   </w:style>
-  <w:style w:type="paragraph" w:styleId="Paragraph1" w:customStyle="1">
+  <w:style w:type="paragraph" w:customStyle="1" w:styleId="Paragraph1">
     <w:name w:val="Paragraph1"/>
     <w:basedOn w:val="Normal"/>
     <w:qFormat/>
@@ -6549,7 +6314,7 @@
       <w:jc w:val="both"/>
     </w:pPr>
   </w:style>
-  <w:style w:type="paragraph" w:styleId="Paragraph4" w:customStyle="1">
+  <w:style w:type="paragraph" w:customStyle="1" w:styleId="Paragraph4">
     <w:name w:val="Paragraph4"/>
     <w:basedOn w:val="Paragraph1"/>
     <w:qFormat/>
@@ -6557,7 +6322,7 @@
       <w:ind w:left="2880"/>
     </w:pPr>
   </w:style>
-  <w:style w:type="paragraph" w:styleId="Style2" w:customStyle="1">
+  <w:style w:type="paragraph" w:customStyle="1" w:styleId="Style2">
     <w:name w:val="Style2"/>
     <w:basedOn w:val="Paragraph1"/>
     <w:qFormat/>
@@ -6568,7 +6333,7 @@
       </w:tabs>
     </w:pPr>
   </w:style>
-  <w:style w:type="paragraph" w:styleId="Paragraph5" w:customStyle="1">
+  <w:style w:type="paragraph" w:customStyle="1" w:styleId="Paragraph5">
     <w:name w:val="Paragraph5"/>
     <w:basedOn w:val="Normal"/>
     <w:qFormat/>
@@ -6576,7 +6341,7 @@
       <w:ind w:left="3600"/>
     </w:pPr>
   </w:style>
-  <w:style w:type="paragraph" w:styleId="TableofContents" w:customStyle="1">
+  <w:style w:type="paragraph" w:customStyle="1" w:styleId="TableofContents">
     <w:name w:val="Table of Contents"/>
     <w:basedOn w:val="Normal"/>
     <w:qFormat/>
@@ -6632,7 +6397,7 @@
       <w:i/>
     </w:rPr>
   </w:style>
-  <w:style w:type="paragraph" w:styleId="Paragraph2" w:customStyle="1">
+  <w:style w:type="paragraph" w:customStyle="1" w:styleId="Paragraph2">
     <w:name w:val="Paragraph2"/>
     <w:basedOn w:val="Paragraph1"/>
     <w:qFormat/>
@@ -6640,7 +6405,7 @@
       <w:ind w:left="1440"/>
     </w:pPr>
   </w:style>
-  <w:style w:type="paragraph" w:styleId="Paragraph3" w:customStyle="1">
+  <w:style w:type="paragraph" w:customStyle="1" w:styleId="Paragraph3">
     <w:name w:val="Paragraph3"/>
     <w:basedOn w:val="Paragraph1"/>
     <w:qFormat/>
@@ -6648,7 +6413,7 @@
       <w:ind w:left="2160"/>
     </w:pPr>
   </w:style>
-  <w:style w:type="paragraph" w:styleId="HeaderandFooter" w:customStyle="1">
+  <w:style w:type="paragraph" w:customStyle="1" w:styleId="HeaderandFooter">
     <w:name w:val="Header and Footer"/>
     <w:basedOn w:val="Normal"/>
     <w:qFormat/>
@@ -6781,7 +6546,7 @@
       <w:sz w:val="36"/>
     </w:rPr>
   </w:style>
-  <w:style w:type="paragraph" w:styleId="RevHistory" w:customStyle="1">
+  <w:style w:type="paragraph" w:customStyle="1" w:styleId="RevHistory">
     <w:name w:val="RevHistory"/>
     <w:basedOn w:val="Normal"/>
     <w:qFormat/>
@@ -6795,7 +6560,7 @@
       <w:sz w:val="36"/>
     </w:rPr>
   </w:style>
-  <w:style w:type="paragraph" w:styleId="TableText" w:customStyle="1">
+  <w:style w:type="paragraph" w:customStyle="1" w:styleId="TableText">
     <w:name w:val="Table Text"/>
     <w:qFormat/>
     <w:pPr>
@@ -6803,7 +6568,7 @@
       <w:spacing w:before="40" w:after="40"/>
     </w:pPr>
     <w:rPr>
-      <w:rFonts w:ascii="Times New Roman" w:hAnsi="Times New Roman" w:eastAsia="Times New Roman" w:cs="Times New Roman"/>
+      <w:rFonts w:ascii="Times New Roman" w:eastAsia="Times New Roman" w:hAnsi="Times New Roman" w:cs="Times New Roman"/>
       <w:sz w:val="20"/>
       <w:szCs w:val="20"/>
       <w:lang w:bidi="ar-SA"/>
@@ -6816,7 +6581,7 @@
       <w:ind w:left="1440"/>
     </w:pPr>
   </w:style>
-  <w:style w:type="paragraph" w:styleId="TableContents" w:customStyle="1">
+  <w:style w:type="paragraph" w:customStyle="1" w:styleId="TableContents">
     <w:name w:val="Table Contents"/>
     <w:basedOn w:val="Normal"/>
     <w:qFormat/>
@@ -6824,7 +6589,7 @@
       <w:suppressLineNumbers/>
     </w:pPr>
   </w:style>
-  <w:style w:type="paragraph" w:styleId="TableHeading" w:customStyle="1">
+  <w:style w:type="paragraph" w:customStyle="1" w:styleId="TableHeading">
     <w:name w:val="Table Heading"/>
     <w:basedOn w:val="TableContents"/>
     <w:qFormat/>
@@ -6836,12 +6601,12 @@
       <w:bCs/>
     </w:rPr>
   </w:style>
-  <w:style w:type="paragraph" w:styleId="FrameContents" w:customStyle="1">
+  <w:style w:type="paragraph" w:customStyle="1" w:styleId="FrameContents">
     <w:name w:val="Frame Contents"/>
     <w:basedOn w:val="Normal"/>
     <w:qFormat/>
   </w:style>
-  <w:style w:type="paragraph" w:styleId="HeaderLeft" w:customStyle="1">
+  <w:style w:type="paragraph" w:customStyle="1" w:styleId="HeaderLeft">
     <w:name w:val="Header Left"/>
     <w:basedOn w:val="Normal"/>
     <w:qFormat/>
@@ -6853,7 +6618,7 @@
       </w:tabs>
     </w:pPr>
   </w:style>
-  <w:style w:type="numbering" w:styleId="WW8Num1" w:customStyle="1">
+  <w:style w:type="numbering" w:customStyle="1" w:styleId="WW8Num1">
     <w:name w:val="WW8Num1"/>
     <w:qFormat/>
   </w:style>
@@ -6861,7 +6626,7 @@
 </file>
 
 <file path=word/theme/theme1.xml><?xml version="1.0" encoding="utf-8"?>
-<a:theme xmlns:a="http://schemas.openxmlformats.org/drawingml/2006/main" xmlns:thm15="http://schemas.microsoft.com/office/thememl/2012/main" name="Office Theme">
+<a:theme xmlns:a="http://schemas.openxmlformats.org/drawingml/2006/main" name="Office Theme">
   <a:themeElements>
     <a:clrScheme name="Office">
       <a:dk1>

</xml_diff>

<commit_message>
added additional definitions to section 1.1
</commit_message>
<xml_diff>
--- a/CS 401 - Group 2 - SRS Doc.docx
+++ b/CS 401 - Group 2 - SRS Doc.docx
@@ -2901,20 +2901,38 @@
     <w:p>
       <w:pPr>
         <w:pStyle w:val="Paragraph2"/>
-      </w:pPr>
-      <w:r>
+        <w:rPr>
+          <w:color w:val="0070C0"/>
+        </w:rPr>
+      </w:pPr>
+      <w:r>
+        <w:rPr>
+          <w:color w:val="0070C0"/>
+        </w:rPr>
         <w:t xml:space="preserve">This document outlines the requirements for the </w:t>
       </w:r>
       <w:r>
+        <w:rPr>
+          <w:color w:val="0070C0"/>
+        </w:rPr>
         <w:t>Blackjack Handling System</w:t>
       </w:r>
       <w:r>
+        <w:rPr>
+          <w:color w:val="0070C0"/>
+        </w:rPr>
         <w:t xml:space="preserve"> (</w:t>
       </w:r>
       <w:r>
+        <w:rPr>
+          <w:color w:val="0070C0"/>
+        </w:rPr>
         <w:t>BHS</w:t>
       </w:r>
       <w:r>
+        <w:rPr>
+          <w:color w:val="0070C0"/>
+        </w:rPr>
         <w:t>).</w:t>
       </w:r>
     </w:p>
@@ -2935,14 +2953,26 @@
     <w:p>
       <w:pPr>
         <w:pStyle w:val="Paragraph2"/>
-      </w:pPr>
-      <w:r>
+        <w:rPr>
+          <w:color w:val="0070C0"/>
+        </w:rPr>
+      </w:pPr>
+      <w:r>
+        <w:rPr>
+          <w:color w:val="0070C0"/>
+        </w:rPr>
         <w:t xml:space="preserve">This document will catalog the user, system, and hardware requirements for the </w:t>
       </w:r>
       <w:r>
+        <w:rPr>
+          <w:color w:val="0070C0"/>
+        </w:rPr>
         <w:t xml:space="preserve">BHS </w:t>
       </w:r>
       <w:r>
+        <w:rPr>
+          <w:color w:val="0070C0"/>
+        </w:rPr>
         <w:t>system. It will not, however, document how these requirements will be implemented.</w:t>
       </w:r>
     </w:p>
@@ -3042,19 +3072,7 @@
         <w:rPr>
           <w:color w:val="0070C0"/>
         </w:rPr>
-        <w:t>Hand</w:t>
-      </w:r>
-      <w:r>
-        <w:rPr>
-          <w:color w:val="0070C0"/>
-        </w:rPr>
-        <w:t>:</w:t>
-      </w:r>
-      <w:r>
-        <w:rPr>
-          <w:color w:val="0070C0"/>
-        </w:rPr>
-        <w:t xml:space="preserve"> A collection of cards assigned to a player or dealer during a round of Blackjack, which changes based on gameplay actions and outcomes</w:t>
+        <w:t>User: Either a player or a dealer, generally used before the system has identified the individual during the login phase.</w:t>
       </w:r>
     </w:p>
     <w:p>
@@ -3069,13 +3087,19 @@
         <w:rPr>
           <w:color w:val="0070C0"/>
         </w:rPr>
-        <w:t>Table</w:t>
-      </w:r>
-      <w:r>
-        <w:rPr>
-          <w:color w:val="0070C0"/>
-        </w:rPr>
-        <w:t>: The instance of a game in a lobby, up to six players including the hosting dealer</w:t>
+        <w:t>Hand</w:t>
+      </w:r>
+      <w:r>
+        <w:rPr>
+          <w:color w:val="0070C0"/>
+        </w:rPr>
+        <w:t>:</w:t>
+      </w:r>
+      <w:r>
+        <w:rPr>
+          <w:color w:val="0070C0"/>
+        </w:rPr>
+        <w:t xml:space="preserve"> A collection of cards assigned to a player or dealer during a round of Blackjack, which changes based on gameplay actions and outcomes</w:t>
       </w:r>
     </w:p>
     <w:p>
@@ -3090,7 +3114,13 @@
         <w:rPr>
           <w:color w:val="0070C0"/>
         </w:rPr>
-        <w:t>Lobby: An area of the Blackjack program where tables are viewable for players to join or for dealers to create a table</w:t>
+        <w:t>Table</w:t>
+      </w:r>
+      <w:r>
+        <w:rPr>
+          <w:color w:val="0070C0"/>
+        </w:rPr>
+        <w:t>: The instance of a game in a lobby, up to six players including the hosting dealer</w:t>
       </w:r>
     </w:p>
     <w:p>
@@ -3105,13 +3135,7 @@
         <w:rPr>
           <w:color w:val="0070C0"/>
         </w:rPr>
-        <w:t>Round: A cycle of player betting and playing in a blackjack game</w:t>
-      </w:r>
-      <w:r>
-        <w:rPr>
-          <w:color w:val="0070C0"/>
-        </w:rPr>
-        <w:t xml:space="preserve"> between the betting and outcome phases</w:t>
+        <w:t>Lobby: An area of the Blackjack program where tables are viewable for players to join or for dealers to create a table</w:t>
       </w:r>
     </w:p>
     <w:p>
@@ -3126,7 +3150,13 @@
         <w:rPr>
           <w:color w:val="0070C0"/>
         </w:rPr>
-        <w:t>Game phase: Distinct phases for player betting, dealing and actions, and outcome</w:t>
+        <w:t>Round: A cycle of player betting and playing in a blackjack game</w:t>
+      </w:r>
+      <w:r>
+        <w:rPr>
+          <w:color w:val="0070C0"/>
+        </w:rPr>
+        <w:t xml:space="preserve"> between the betting and outcome phases</w:t>
       </w:r>
     </w:p>
     <w:p>
@@ -3141,7 +3171,7 @@
         <w:rPr>
           <w:color w:val="0070C0"/>
         </w:rPr>
-        <w:t>Payout: A specific outcome for a player to be paid out the appropriate bet they won against the dealer</w:t>
+        <w:t>Game phase: Distinct phases for player betting, dealing and actions, and outcome</w:t>
       </w:r>
     </w:p>
     <w:p>
@@ -3156,19 +3186,7 @@
         <w:rPr>
           <w:color w:val="0070C0"/>
         </w:rPr>
-        <w:t>Deck</w:t>
-      </w:r>
-      <w:r>
-        <w:rPr>
-          <w:color w:val="0070C0"/>
-        </w:rPr>
-        <w:t xml:space="preserve">: </w:t>
-      </w:r>
-      <w:r>
-        <w:rPr>
-          <w:color w:val="0070C0"/>
-        </w:rPr>
-        <w:t>A standard set of 52 cards used to interact with the gameplay</w:t>
+        <w:t>Payout: A specific outcome for a player to be paid out the appropriate bet they won against the dealer</w:t>
       </w:r>
     </w:p>
     <w:p>
@@ -3183,37 +3201,19 @@
         <w:rPr>
           <w:color w:val="0070C0"/>
         </w:rPr>
-        <w:t xml:space="preserve">Card: </w:t>
-      </w:r>
-      <w:r>
-        <w:rPr>
-          <w:color w:val="0070C0"/>
-        </w:rPr>
-        <w:t>A</w:t>
-      </w:r>
-      <w:r>
-        <w:rPr>
-          <w:color w:val="0070C0"/>
-        </w:rPr>
-        <w:t xml:space="preserve"> singular card from a </w:t>
-      </w:r>
-      <w:r>
-        <w:rPr>
-          <w:color w:val="0070C0"/>
-        </w:rPr>
-        <w:t xml:space="preserve">standard </w:t>
-      </w:r>
-      <w:r>
-        <w:rPr>
-          <w:color w:val="0070C0"/>
-        </w:rPr>
-        <w:t>deck of 52 cards</w:t>
-      </w:r>
-      <w:r>
-        <w:rPr>
-          <w:color w:val="0070C0"/>
-        </w:rPr>
-        <w:t>, categorized by suit and rank value</w:t>
+        <w:t>Deck</w:t>
+      </w:r>
+      <w:r>
+        <w:rPr>
+          <w:color w:val="0070C0"/>
+        </w:rPr>
+        <w:t xml:space="preserve">: </w:t>
+      </w:r>
+      <w:r>
+        <w:rPr>
+          <w:color w:val="0070C0"/>
+        </w:rPr>
+        <w:t>A standard set of 52 cards used to interact with the gameplay</w:t>
       </w:r>
     </w:p>
     <w:p>
@@ -3228,25 +3228,37 @@
         <w:rPr>
           <w:color w:val="0070C0"/>
         </w:rPr>
-        <w:t>Shoe</w:t>
-      </w:r>
-      <w:r>
-        <w:rPr>
-          <w:color w:val="0070C0"/>
-        </w:rPr>
-        <w:t xml:space="preserve">: A collection </w:t>
-      </w:r>
-      <w:r>
-        <w:rPr>
-          <w:color w:val="0070C0"/>
-        </w:rPr>
-        <w:t xml:space="preserve">of multiple </w:t>
-      </w:r>
-      <w:r>
-        <w:rPr>
-          <w:color w:val="0070C0"/>
-        </w:rPr>
-        <w:t>decks used in the Blackjack games</w:t>
+        <w:t xml:space="preserve">Card: </w:t>
+      </w:r>
+      <w:r>
+        <w:rPr>
+          <w:color w:val="0070C0"/>
+        </w:rPr>
+        <w:t>A</w:t>
+      </w:r>
+      <w:r>
+        <w:rPr>
+          <w:color w:val="0070C0"/>
+        </w:rPr>
+        <w:t xml:space="preserve"> singular card from a </w:t>
+      </w:r>
+      <w:r>
+        <w:rPr>
+          <w:color w:val="0070C0"/>
+        </w:rPr>
+        <w:t xml:space="preserve">standard </w:t>
+      </w:r>
+      <w:r>
+        <w:rPr>
+          <w:color w:val="0070C0"/>
+        </w:rPr>
+        <w:t>deck of 52 cards</w:t>
+      </w:r>
+      <w:r>
+        <w:rPr>
+          <w:color w:val="0070C0"/>
+        </w:rPr>
+        <w:t>, categorized by suit and rank value</w:t>
       </w:r>
     </w:p>
     <w:p>
@@ -3261,33 +3273,25 @@
         <w:rPr>
           <w:color w:val="0070C0"/>
         </w:rPr>
-        <w:t>Bet</w:t>
-      </w:r>
-      <w:r>
-        <w:rPr>
-          <w:color w:val="0070C0"/>
-        </w:rPr>
-        <w:t xml:space="preserve">: </w:t>
-      </w:r>
-      <w:proofErr w:type="gramStart"/>
-      <w:r>
-        <w:rPr>
-          <w:color w:val="0070C0"/>
-        </w:rPr>
-        <w:t>A</w:t>
-      </w:r>
-      <w:r>
-        <w:rPr>
-          <w:color w:val="0070C0"/>
-        </w:rPr>
-        <w:t xml:space="preserve"> number of</w:t>
-      </w:r>
-      <w:proofErr w:type="gramEnd"/>
-      <w:r>
-        <w:rPr>
-          <w:color w:val="0070C0"/>
-        </w:rPr>
-        <w:t xml:space="preserve"> credits submitted by a player before being dealt hands to start playing the game</w:t>
+        <w:t>Shoe</w:t>
+      </w:r>
+      <w:r>
+        <w:rPr>
+          <w:color w:val="0070C0"/>
+        </w:rPr>
+        <w:t xml:space="preserve">: A collection </w:t>
+      </w:r>
+      <w:r>
+        <w:rPr>
+          <w:color w:val="0070C0"/>
+        </w:rPr>
+        <w:t xml:space="preserve">of multiple </w:t>
+      </w:r>
+      <w:r>
+        <w:rPr>
+          <w:color w:val="0070C0"/>
+        </w:rPr>
+        <w:t>decks used in the Blackjack games</w:t>
       </w:r>
     </w:p>
     <w:p>
@@ -3302,7 +3306,7 @@
         <w:rPr>
           <w:color w:val="0070C0"/>
         </w:rPr>
-        <w:t>Timer</w:t>
+        <w:t>Bet</w:t>
       </w:r>
       <w:r>
         <w:rPr>
@@ -3310,39 +3314,25 @@
         </w:rPr>
         <w:t xml:space="preserve">: </w:t>
       </w:r>
-      <w:r>
-        <w:rPr>
-          <w:color w:val="0070C0"/>
-        </w:rPr>
-        <w:t xml:space="preserve">A countdown for the time players </w:t>
-      </w:r>
       <w:proofErr w:type="gramStart"/>
       <w:r>
         <w:rPr>
           <w:color w:val="0070C0"/>
         </w:rPr>
-        <w:t>have</w:t>
+        <w:t>A</w:t>
+      </w:r>
+      <w:r>
+        <w:rPr>
+          <w:color w:val="0070C0"/>
+        </w:rPr>
+        <w:t xml:space="preserve"> number of</w:t>
       </w:r>
       <w:proofErr w:type="gramEnd"/>
       <w:r>
         <w:rPr>
           <w:color w:val="0070C0"/>
         </w:rPr>
-        <w:t xml:space="preserve"> to </w:t>
-      </w:r>
-      <w:proofErr w:type="gramStart"/>
-      <w:r>
-        <w:rPr>
-          <w:color w:val="0070C0"/>
-        </w:rPr>
-        <w:t>take action</w:t>
-      </w:r>
-      <w:proofErr w:type="gramEnd"/>
-      <w:r>
-        <w:rPr>
-          <w:color w:val="0070C0"/>
-        </w:rPr>
-        <w:t xml:space="preserve"> in a round of the game</w:t>
+        <w:t xml:space="preserve"> credits submitted by a player before being dealt hands to start playing the game</w:t>
       </w:r>
     </w:p>
     <w:p>
@@ -3357,7 +3347,7 @@
         <w:rPr>
           <w:color w:val="0070C0"/>
         </w:rPr>
-        <w:t>Credits</w:t>
+        <w:t>Timer</w:t>
       </w:r>
       <w:r>
         <w:rPr>
@@ -3369,7 +3359,35 @@
         <w:rPr>
           <w:color w:val="0070C0"/>
         </w:rPr>
-        <w:t>Virtual currency with a 1-to-1 conversion with player dollars from their payment method attached to their account, used in bets for games</w:t>
+        <w:t xml:space="preserve">A countdown for the time players </w:t>
+      </w:r>
+      <w:proofErr w:type="gramStart"/>
+      <w:r>
+        <w:rPr>
+          <w:color w:val="0070C0"/>
+        </w:rPr>
+        <w:t>have</w:t>
+      </w:r>
+      <w:proofErr w:type="gramEnd"/>
+      <w:r>
+        <w:rPr>
+          <w:color w:val="0070C0"/>
+        </w:rPr>
+        <w:t xml:space="preserve"> to </w:t>
+      </w:r>
+      <w:proofErr w:type="gramStart"/>
+      <w:r>
+        <w:rPr>
+          <w:color w:val="0070C0"/>
+        </w:rPr>
+        <w:t>take action</w:t>
+      </w:r>
+      <w:proofErr w:type="gramEnd"/>
+      <w:r>
+        <w:rPr>
+          <w:color w:val="0070C0"/>
+        </w:rPr>
+        <w:t xml:space="preserve"> in a round of the game</w:t>
       </w:r>
     </w:p>
     <w:p>
@@ -3384,19 +3402,19 @@
         <w:rPr>
           <w:color w:val="0070C0"/>
         </w:rPr>
-        <w:t>Credit Card (CC)</w:t>
-      </w:r>
-      <w:r>
-        <w:rPr>
-          <w:color w:val="0070C0"/>
-        </w:rPr>
-        <w:t>: A player user’s payment method</w:t>
-      </w:r>
-      <w:r>
-        <w:rPr>
-          <w:color w:val="0070C0"/>
-        </w:rPr>
-        <w:t xml:space="preserve"> for credits</w:t>
+        <w:t>Credits</w:t>
+      </w:r>
+      <w:r>
+        <w:rPr>
+          <w:color w:val="0070C0"/>
+        </w:rPr>
+        <w:t xml:space="preserve">: </w:t>
+      </w:r>
+      <w:r>
+        <w:rPr>
+          <w:color w:val="0070C0"/>
+        </w:rPr>
+        <w:t>Virtual currency with a 1-to-1 conversion with player dollars from their payment method attached to their account, used in bets for games</w:t>
       </w:r>
     </w:p>
     <w:p>
@@ -3411,13 +3429,19 @@
         <w:rPr>
           <w:color w:val="0070C0"/>
         </w:rPr>
-        <w:t xml:space="preserve">Blackjack Handling System (BHS): </w:t>
-      </w:r>
-      <w:r>
-        <w:rPr>
-          <w:color w:val="0070C0"/>
-        </w:rPr>
-        <w:t>The software responsible for handling the blackjack game functions and logic, network connectivity for players to the server, as well as player interactions and active games</w:t>
+        <w:t>Credit Card (CC)</w:t>
+      </w:r>
+      <w:r>
+        <w:rPr>
+          <w:color w:val="0070C0"/>
+        </w:rPr>
+        <w:t>: A player user’s payment method</w:t>
+      </w:r>
+      <w:r>
+        <w:rPr>
+          <w:color w:val="0070C0"/>
+        </w:rPr>
+        <w:t xml:space="preserve"> for credits</w:t>
       </w:r>
     </w:p>
     <w:p>
@@ -3432,13 +3456,13 @@
         <w:rPr>
           <w:color w:val="0070C0"/>
         </w:rPr>
-        <w:t xml:space="preserve">Graphical User Interface (GUI): The visual </w:t>
-      </w:r>
-      <w:r>
-        <w:rPr>
-          <w:color w:val="0070C0"/>
-        </w:rPr>
-        <w:t>interface players use to interact with the BHS</w:t>
+        <w:t xml:space="preserve">Blackjack Handling System (BHS): </w:t>
+      </w:r>
+      <w:r>
+        <w:rPr>
+          <w:color w:val="0070C0"/>
+        </w:rPr>
+        <w:t>The software responsible for handling the blackjack game functions and logic, network connectivity for players to the server, as well as player interactions and active games</w:t>
       </w:r>
     </w:p>
     <w:p>
@@ -3453,31 +3477,13 @@
         <w:rPr>
           <w:color w:val="0070C0"/>
         </w:rPr>
-        <w:t>Server:</w:t>
-      </w:r>
-      <w:r>
-        <w:rPr>
-          <w:color w:val="0070C0"/>
-        </w:rPr>
-        <w:t xml:space="preserve"> The program responsible for allowing multiple client programs to connect, allowing users to play blackjack games against each other over a network connection</w:t>
-      </w:r>
-      <w:r>
-        <w:rPr>
-          <w:color w:val="0070C0"/>
-        </w:rPr>
-        <w:t xml:space="preserve">, receives player actions and </w:t>
-      </w:r>
-      <w:r>
-        <w:rPr>
-          <w:color w:val="0070C0"/>
-        </w:rPr>
-        <w:t>enforces game rules</w:t>
-      </w:r>
-      <w:r>
-        <w:rPr>
-          <w:color w:val="0070C0"/>
-        </w:rPr>
-        <w:t xml:space="preserve"> with network communication between clients</w:t>
+        <w:t xml:space="preserve">Graphical User Interface (GUI): The visual </w:t>
+      </w:r>
+      <w:r>
+        <w:rPr>
+          <w:color w:val="0070C0"/>
+        </w:rPr>
+        <w:t>interface players use to interact with the BHS</w:t>
       </w:r>
     </w:p>
     <w:p>
@@ -3492,25 +3498,31 @@
         <w:rPr>
           <w:color w:val="0070C0"/>
         </w:rPr>
-        <w:t>Client:</w:t>
-      </w:r>
-      <w:r>
-        <w:rPr>
-          <w:color w:val="0070C0"/>
-        </w:rPr>
-        <w:t xml:space="preserve"> The program used by players to connect to the server program for connection to blackjack games over a network connection</w:t>
-      </w:r>
-      <w:r>
-        <w:rPr>
-          <w:color w:val="0070C0"/>
-        </w:rPr>
-        <w:t xml:space="preserve">, </w:t>
-      </w:r>
-      <w:r>
-        <w:rPr>
-          <w:color w:val="0070C0"/>
-        </w:rPr>
-        <w:t>sends actions to the server</w:t>
+        <w:t>Server:</w:t>
+      </w:r>
+      <w:r>
+        <w:rPr>
+          <w:color w:val="0070C0"/>
+        </w:rPr>
+        <w:t xml:space="preserve"> The program responsible for allowing multiple client programs to connect, allowing users to play blackjack games against each other over a network connection</w:t>
+      </w:r>
+      <w:r>
+        <w:rPr>
+          <w:color w:val="0070C0"/>
+        </w:rPr>
+        <w:t xml:space="preserve">, receives player actions and </w:t>
+      </w:r>
+      <w:r>
+        <w:rPr>
+          <w:color w:val="0070C0"/>
+        </w:rPr>
+        <w:t>enforces game rules</w:t>
+      </w:r>
+      <w:r>
+        <w:rPr>
+          <w:color w:val="0070C0"/>
+        </w:rPr>
+        <w:t xml:space="preserve"> with network communication between clients</w:t>
       </w:r>
     </w:p>
     <w:p>
@@ -3518,45 +3530,270 @@
         <w:pStyle w:val="Paragraph3"/>
         <w:ind w:left="720" w:firstLine="720"/>
         <w:rPr>
-          <w:color w:val="7030A0"/>
-        </w:rPr>
-      </w:pPr>
+          <w:color w:val="0070C0"/>
+        </w:rPr>
+      </w:pPr>
+      <w:r>
+        <w:rPr>
+          <w:color w:val="0070C0"/>
+        </w:rPr>
+        <w:t>Client:</w:t>
+      </w:r>
+      <w:r>
+        <w:rPr>
+          <w:color w:val="0070C0"/>
+        </w:rPr>
+        <w:t xml:space="preserve"> The program used by players to connect to the server program for connection to blackjack games over a network connection</w:t>
+      </w:r>
+      <w:r>
+        <w:rPr>
+          <w:color w:val="0070C0"/>
+        </w:rPr>
+        <w:t xml:space="preserve">, </w:t>
+      </w:r>
+      <w:r>
+        <w:rPr>
+          <w:color w:val="0070C0"/>
+        </w:rPr>
+        <w:t>sends actions to the server</w:t>
+      </w:r>
     </w:p>
     <w:p>
       <w:pPr>
         <w:pStyle w:val="Paragraph3"/>
         <w:ind w:left="720" w:firstLine="720"/>
         <w:rPr>
-          <w:color w:val="7030A0"/>
-        </w:rPr>
-      </w:pPr>
+          <w:color w:val="0070C0"/>
+        </w:rPr>
+      </w:pPr>
+      <w:r>
+        <w:rPr>
+          <w:color w:val="0070C0"/>
+        </w:rPr>
+        <w:t>Soft hand: When a player or dealer has an ace whose current value is 11. Standard blackjack rules require the dealer to hit when they have a soft 17 or less.</w:t>
+      </w:r>
     </w:p>
     <w:p>
       <w:pPr>
         <w:pStyle w:val="Paragraph3"/>
         <w:ind w:left="720" w:firstLine="720"/>
         <w:rPr>
-          <w:color w:val="7030A0"/>
-        </w:rPr>
-      </w:pPr>
+          <w:color w:val="0070C0"/>
+        </w:rPr>
+      </w:pPr>
+      <w:r>
+        <w:rPr>
+          <w:color w:val="0070C0"/>
+        </w:rPr>
+        <w:lastRenderedPageBreak/>
+        <w:t>Hit: When a player requests an additional card from the dealer.</w:t>
+      </w:r>
     </w:p>
     <w:p>
       <w:pPr>
         <w:pStyle w:val="Paragraph3"/>
         <w:ind w:left="720" w:firstLine="720"/>
         <w:rPr>
-          <w:color w:val="7030A0"/>
-        </w:rPr>
-      </w:pPr>
+          <w:color w:val="0070C0"/>
+        </w:rPr>
+      </w:pPr>
+      <w:r>
+        <w:rPr>
+          <w:color w:val="0070C0"/>
+        </w:rPr>
+        <w:t xml:space="preserve">Stand: When a player </w:t>
+      </w:r>
+      <w:proofErr w:type="gramStart"/>
+      <w:r>
+        <w:rPr>
+          <w:color w:val="0070C0"/>
+        </w:rPr>
+        <w:t>signals</w:t>
+      </w:r>
+      <w:proofErr w:type="gramEnd"/>
+      <w:r>
+        <w:rPr>
+          <w:color w:val="0070C0"/>
+        </w:rPr>
+        <w:t xml:space="preserve"> they don’t want any additional cards dealt to them during the current round.</w:t>
+      </w:r>
     </w:p>
     <w:p>
       <w:pPr>
         <w:pStyle w:val="Paragraph3"/>
         <w:ind w:left="720" w:firstLine="720"/>
         <w:rPr>
-          <w:color w:val="7030A0"/>
-        </w:rPr>
-      </w:pPr>
+          <w:color w:val="0070C0"/>
+        </w:rPr>
+      </w:pPr>
+      <w:r>
+        <w:rPr>
+          <w:color w:val="0070C0"/>
+        </w:rPr>
+        <w:t>Double down: When a player asks for one more card to be dealt to them that round while also doubling their current bet.</w:t>
+      </w:r>
+    </w:p>
+    <w:p>
+      <w:pPr>
+        <w:pStyle w:val="Paragraph3"/>
+        <w:ind w:left="720" w:firstLine="720"/>
+        <w:rPr>
+          <w:color w:val="0070C0"/>
+        </w:rPr>
+      </w:pPr>
+      <w:r>
+        <w:rPr>
+          <w:color w:val="0070C0"/>
+        </w:rPr>
+        <w:t xml:space="preserve">Split: When a player has matching cards, they can pay to have their hand divided into two separate hands. The dealer will then </w:t>
+      </w:r>
+      <w:proofErr w:type="gramStart"/>
+      <w:r>
+        <w:rPr>
+          <w:color w:val="0070C0"/>
+        </w:rPr>
+        <w:t>deal</w:t>
+      </w:r>
+      <w:proofErr w:type="gramEnd"/>
+      <w:r>
+        <w:rPr>
+          <w:color w:val="0070C0"/>
+        </w:rPr>
+        <w:t xml:space="preserve"> each </w:t>
+      </w:r>
+      <w:proofErr w:type="gramStart"/>
+      <w:r>
+        <w:rPr>
+          <w:color w:val="0070C0"/>
+        </w:rPr>
+        <w:t>hand</w:t>
+      </w:r>
+      <w:proofErr w:type="gramEnd"/>
+      <w:r>
+        <w:rPr>
+          <w:color w:val="0070C0"/>
+        </w:rPr>
+        <w:t xml:space="preserve"> an additional card to bring the total cards in each hand to two.</w:t>
+      </w:r>
+    </w:p>
+    <w:p>
+      <w:pPr>
+        <w:pStyle w:val="Paragraph3"/>
+        <w:ind w:left="720" w:firstLine="720"/>
+        <w:rPr>
+          <w:color w:val="0070C0"/>
+        </w:rPr>
+      </w:pPr>
+      <w:r>
+        <w:rPr>
+          <w:color w:val="0070C0"/>
+        </w:rPr>
+        <w:t>Bust: When the hand value of either the player or the dealer goes above 21, resulting in an automatic loss.</w:t>
+      </w:r>
+    </w:p>
+    <w:p>
+      <w:pPr>
+        <w:pStyle w:val="Paragraph3"/>
+        <w:ind w:left="720" w:firstLine="720"/>
+        <w:rPr>
+          <w:color w:val="0070C0"/>
+        </w:rPr>
+      </w:pPr>
+      <w:r>
+        <w:rPr>
+          <w:color w:val="0070C0"/>
+        </w:rPr>
+        <w:t>Push: When the dealer and the player end the round with the same hand value and all bets are returned.</w:t>
+      </w:r>
+    </w:p>
+    <w:p>
+      <w:pPr>
+        <w:pStyle w:val="Paragraph3"/>
+        <w:ind w:left="720" w:firstLine="720"/>
+        <w:rPr>
+          <w:color w:val="0070C0"/>
+        </w:rPr>
+      </w:pPr>
+      <w:r>
+        <w:rPr>
+          <w:color w:val="0070C0"/>
+        </w:rPr>
+        <w:t>Win: When the player ends the round with a higher hand value than the dealer.</w:t>
+      </w:r>
+    </w:p>
+    <w:p>
+      <w:pPr>
+        <w:pStyle w:val="Paragraph3"/>
+        <w:ind w:left="720" w:firstLine="720"/>
+        <w:rPr>
+          <w:color w:val="0070C0"/>
+        </w:rPr>
+      </w:pPr>
+      <w:r>
+        <w:rPr>
+          <w:color w:val="0070C0"/>
+        </w:rPr>
+        <w:t>Lose: When the player ends the round with a lower hand value than the dealer, or they bust.</w:t>
+      </w:r>
+    </w:p>
+    <w:p>
+      <w:pPr>
+        <w:pStyle w:val="Paragraph3"/>
+        <w:ind w:left="720" w:firstLine="720"/>
+        <w:rPr>
+          <w:color w:val="0070C0"/>
+        </w:rPr>
+      </w:pPr>
+      <w:r>
+        <w:rPr>
+          <w:color w:val="0070C0"/>
+        </w:rPr>
+        <w:t>Insurance: When a dealer is showing an ace in their hand, the players are offered the option to pay 50% more to protect their hands. If the dealer does have a blackjack, the bets are returned to the players that opted for insurance. If the dealer does not have a blackjack, the additional money goes to the house.</w:t>
+      </w:r>
+    </w:p>
+    <w:p>
+      <w:pPr>
+        <w:pStyle w:val="Paragraph3"/>
+        <w:ind w:left="720" w:firstLine="720"/>
+        <w:rPr>
+          <w:color w:val="0070C0"/>
+        </w:rPr>
+      </w:pPr>
+      <w:r>
+        <w:rPr>
+          <w:color w:val="0070C0"/>
+        </w:rPr>
+        <w:t>House: the organization the dealer works for. All bets are either covered by the house if the dealer loses or paid to the house if the player loses.</w:t>
+      </w:r>
+    </w:p>
+    <w:p>
+      <w:pPr>
+        <w:pStyle w:val="Paragraph3"/>
+        <w:ind w:left="720" w:firstLine="720"/>
+        <w:rPr>
+          <w:color w:val="7030A0"/>
+        </w:rPr>
+      </w:pPr>
+      <w:r>
+        <w:rPr>
+          <w:color w:val="0070C0"/>
+        </w:rPr>
+        <w:t xml:space="preserve">Shuffling: when the order of the cards in the shoe </w:t>
+      </w:r>
+      <w:proofErr w:type="gramStart"/>
+      <w:r>
+        <w:rPr>
+          <w:color w:val="0070C0"/>
+        </w:rPr>
+        <w:t>are</w:t>
+      </w:r>
+      <w:proofErr w:type="gramEnd"/>
+      <w:r>
+        <w:rPr>
+          <w:color w:val="0070C0"/>
+        </w:rPr>
+        <w:t xml:space="preserve"> randomized.</w:t>
+      </w:r>
     </w:p>
     <w:p>
       <w:pPr>
@@ -3683,13 +3920,7 @@
         <w:rPr>
           <w:color w:val="0070C0"/>
         </w:rPr>
-        <w:t xml:space="preserve">The Blackjack Handling System is designed to facilitate multiplayer games of Blackjack. Live players as both regular users and dealer players with privileges to deal cards will be hosted on tables for games. </w:t>
-      </w:r>
-      <w:r>
-        <w:rPr>
-          <w:color w:val="0070C0"/>
-        </w:rPr>
-        <w:t xml:space="preserve"> </w:t>
+        <w:t xml:space="preserve">The Blackjack Handling System is designed to facilitate multiplayer games of Blackjack. Live players as both regular users and dealer players with privileges to deal cards will be hosted on tables for games.  </w:t>
       </w:r>
     </w:p>
     <w:p>
@@ -5243,8 +5474,16 @@
       <w:rPr>
         <w:rStyle w:val="PageNumber"/>
       </w:rPr>
-      <w:t>iii</w:t>
+      <w:t>ii</w:t>
     </w:r>
+    <w:proofErr w:type="spellStart"/>
+    <w:r>
+      <w:rPr>
+        <w:rStyle w:val="PageNumber"/>
+      </w:rPr>
+      <w:t>i</w:t>
+    </w:r>
+    <w:proofErr w:type="spellEnd"/>
     <w:r>
       <w:rPr>
         <w:rStyle w:val="PageNumber"/>

</xml_diff>

<commit_message>
added additional requirements to SRS and additional filtering to gitignore
</commit_message>
<xml_diff>
--- a/CS 401 - Group 2 - SRS Doc.docx
+++ b/CS 401 - Group 2 - SRS Doc.docx
@@ -555,6 +555,13 @@
                 <w:u w:val="single"/>
               </w:rPr>
             </w:pPr>
+            <w:r>
+              <w:rPr>
+                <w:color w:val="000000"/>
+                <w:u w:val="single"/>
+              </w:rPr>
+              <w:t>03/01/2026</w:t>
+            </w:r>
           </w:p>
         </w:tc>
         <w:tc>
@@ -575,6 +582,12 @@
                 <w:color w:val="000000"/>
               </w:rPr>
             </w:pPr>
+            <w:r>
+              <w:rPr>
+                <w:color w:val="000000"/>
+              </w:rPr>
+              <w:t>1.3</w:t>
+            </w:r>
           </w:p>
         </w:tc>
         <w:tc>
@@ -595,6 +608,12 @@
                 <w:color w:val="000000"/>
               </w:rPr>
             </w:pPr>
+            <w:r>
+              <w:rPr>
+                <w:color w:val="000000"/>
+              </w:rPr>
+              <w:t>Added additional definitions. Filled in some requirements in sections 2.4,2.5,3.2,3.3,4.2,4.3</w:t>
+            </w:r>
           </w:p>
         </w:tc>
         <w:tc>
@@ -616,6 +635,12 @@
                 <w:color w:val="000000"/>
               </w:rPr>
             </w:pPr>
+            <w:r>
+              <w:rPr>
+                <w:color w:val="000000"/>
+              </w:rPr>
+              <w:t>Paul Cooper</w:t>
+            </w:r>
           </w:p>
         </w:tc>
       </w:tr>
@@ -4050,6 +4075,66 @@
     <w:p>
       <w:pPr>
         <w:pStyle w:val="Paragraph2"/>
+        <w:rPr>
+          <w:color w:val="0070C0"/>
+        </w:rPr>
+      </w:pPr>
+      <w:r>
+        <w:rPr>
+          <w:color w:val="0070C0"/>
+        </w:rPr>
+        <w:t>Java based client</w:t>
+      </w:r>
+      <w:r>
+        <w:rPr>
+          <w:color w:val="0070C0"/>
+        </w:rPr>
+        <w:t>/</w:t>
+      </w:r>
+      <w:r>
+        <w:rPr>
+          <w:color w:val="0070C0"/>
+        </w:rPr>
+        <w:t>server application with no</w:t>
+      </w:r>
+      <w:r>
+        <w:rPr>
+          <w:color w:val="0070C0"/>
+        </w:rPr>
+        <w:t xml:space="preserve"> web interfaces.</w:t>
+      </w:r>
+    </w:p>
+    <w:p>
+      <w:pPr>
+        <w:pStyle w:val="Paragraph2"/>
+        <w:rPr>
+          <w:color w:val="0070C0"/>
+        </w:rPr>
+      </w:pPr>
+      <w:r>
+        <w:rPr>
+          <w:color w:val="0070C0"/>
+        </w:rPr>
+        <w:t>All participants must have network access configured to allow them to communicate with the server.</w:t>
+      </w:r>
+    </w:p>
+    <w:p>
+      <w:pPr>
+        <w:pStyle w:val="Paragraph2"/>
+        <w:rPr>
+          <w:color w:val="0070C0"/>
+        </w:rPr>
+      </w:pPr>
+      <w:r>
+        <w:rPr>
+          <w:color w:val="0070C0"/>
+        </w:rPr>
+        <w:t>The server must have network access configured to allow it to communicate with the clients.</w:t>
+      </w:r>
+    </w:p>
+    <w:p>
+      <w:pPr>
+        <w:pStyle w:val="Paragraph2"/>
         <w:spacing w:line="259" w:lineRule="auto"/>
         <w:rPr>
           <w:color w:val="7030A0"/>
@@ -4141,6 +4226,102 @@
     </w:p>
     <w:p>
       <w:pPr>
+        <w:pStyle w:val="Paragraph2"/>
+        <w:rPr>
+          <w:color w:val="0070C0"/>
+        </w:rPr>
+      </w:pPr>
+      <w:r>
+        <w:rPr>
+          <w:color w:val="0070C0"/>
+        </w:rPr>
+        <w:t>Any users will have a functioning network connection and a recent version of jav</w:t>
+      </w:r>
+      <w:r>
+        <w:rPr>
+          <w:color w:val="0070C0"/>
+        </w:rPr>
+        <w:t>a</w:t>
+      </w:r>
+      <w:r>
+        <w:rPr>
+          <w:color w:val="0070C0"/>
+        </w:rPr>
+        <w:t xml:space="preserve"> installed </w:t>
+      </w:r>
+      <w:proofErr w:type="gramStart"/>
+      <w:r>
+        <w:rPr>
+          <w:color w:val="0070C0"/>
+        </w:rPr>
+        <w:t>in order to</w:t>
+      </w:r>
+      <w:proofErr w:type="gramEnd"/>
+      <w:r>
+        <w:rPr>
+          <w:color w:val="0070C0"/>
+        </w:rPr>
+        <w:t xml:space="preserve"> be able to play the game.</w:t>
+      </w:r>
+    </w:p>
+    <w:p>
+      <w:pPr>
+        <w:pStyle w:val="Paragraph2"/>
+        <w:rPr>
+          <w:color w:val="0070C0"/>
+        </w:rPr>
+      </w:pPr>
+      <w:r>
+        <w:rPr>
+          <w:color w:val="0070C0"/>
+        </w:rPr>
+        <w:t>Each table has a limit of 6 players plus the dealer.</w:t>
+      </w:r>
+    </w:p>
+    <w:p>
+      <w:pPr>
+        <w:pStyle w:val="Paragraph2"/>
+        <w:rPr>
+          <w:color w:val="0070C0"/>
+        </w:rPr>
+      </w:pPr>
+      <w:r>
+        <w:rPr>
+          <w:color w:val="0070C0"/>
+        </w:rPr>
+        <w:t>To prevent games from slowing down, a standard 30 second timer per decision will be implemented, though this is configurable by the dealer. When the time limit is reached, the current player will automatically stand.</w:t>
+      </w:r>
+    </w:p>
+    <w:p>
+      <w:pPr>
+        <w:pStyle w:val="Paragraph2"/>
+        <w:rPr>
+          <w:color w:val="0070C0"/>
+        </w:rPr>
+      </w:pPr>
+      <w:r>
+        <w:rPr>
+          <w:color w:val="0070C0"/>
+        </w:rPr>
+        <w:t>If the player loses access to the game during play, they will automatically stand when the time limit is reached during their turn. Any bets that were active at the time will go to the house if the player loses or be returned to the players account if they win.</w:t>
+      </w:r>
+    </w:p>
+    <w:p>
+      <w:pPr>
+        <w:pStyle w:val="Paragraph2"/>
+        <w:rPr>
+          <w:color w:val="0070C0"/>
+        </w:rPr>
+      </w:pPr>
+      <w:r>
+        <w:rPr>
+          <w:color w:val="0070C0"/>
+        </w:rPr>
+        <w:t>Players can only be logged into one player session at a time. Dealers are permitted to login to multiple dealer sessions simultaneously.</w:t>
+      </w:r>
+    </w:p>
+    <w:p>
+      <w:pPr>
         <w:pStyle w:val="Heading1"/>
         <w:numPr>
           <w:ilvl w:val="0"/>
@@ -4624,6 +4805,20 @@
     </w:p>
     <w:p>
       <w:pPr>
+        <w:pStyle w:val="Paragraph2"/>
+        <w:rPr>
+          <w:color w:val="0070C0"/>
+        </w:rPr>
+      </w:pPr>
+      <w:r>
+        <w:rPr>
+          <w:color w:val="0070C0"/>
+        </w:rPr>
+        <w:t>The user interface must be graphical in nature and provide intuitive controls to allow for account management, including the adding and withdrawing of funds, and give users the ability to play blackjack with features such as button to hit, stand, double down, or split their hands and purchase insurance when applicable.</w:t>
+      </w:r>
+    </w:p>
+    <w:p>
+      <w:pPr>
         <w:pStyle w:val="Heading2"/>
         <w:numPr>
           <w:ilvl w:val="1"/>
@@ -4633,6 +4828,7 @@
       <w:bookmarkStart w:id="23" w:name="__RefHeading___Toc19440737"/>
       <w:bookmarkEnd w:id="23"/>
       <w:r>
+        <w:lastRenderedPageBreak/>
         <w:t>Internal Interface Requirements</w:t>
       </w:r>
     </w:p>
@@ -4683,7 +4879,6 @@
         <w:rPr>
           <w:color w:val="7030A0"/>
         </w:rPr>
-        <w:lastRenderedPageBreak/>
         <w:t xml:space="preserve">3.3.1 </w:t>
       </w:r>
       <w:r>
@@ -4757,6 +4952,34 @@
         <w:t>-feed from the University billing system that contains new student records. The feed will be in the form of a comma-separated text file and will be exported from the billing system nightly with new student records. The fields included in the file are student name, student id, and student pin number.  </w:t>
       </w:r>
       <w:bookmarkEnd w:id="25"/>
+    </w:p>
+    <w:p>
+      <w:pPr>
+        <w:ind w:left="1440"/>
+        <w:rPr>
+          <w:color w:val="0070C0"/>
+        </w:rPr>
+      </w:pPr>
+      <w:r>
+        <w:rPr>
+          <w:color w:val="0070C0"/>
+        </w:rPr>
+        <w:t>All gameplay calculations must be performed on the server and only relevant data to each play must be sent to them.</w:t>
+      </w:r>
+    </w:p>
+    <w:p>
+      <w:pPr>
+        <w:ind w:left="1440"/>
+        <w:rPr>
+          <w:color w:val="0070C0"/>
+        </w:rPr>
+      </w:pPr>
+      <w:r>
+        <w:rPr>
+          <w:color w:val="0070C0"/>
+        </w:rPr>
+        <w:t>User ID and passwords will be stored, along with current funds and active bets so that they can be restored in the event of any outage or system failure.</w:t>
+      </w:r>
     </w:p>
     <w:p>
       <w:pPr>
@@ -4819,9 +5042,63 @@
         <w:rPr>
           <w:color w:val="7030A0"/>
         </w:rPr>
-        <w:t>Blackjack Handling System shall hold user account information in a file unaccessible to regular users.</w:t>
+        <w:t xml:space="preserve">Blackjack Handling System shall hold user account information in a file </w:t>
+      </w:r>
+      <w:proofErr w:type="spellStart"/>
+      <w:r>
+        <w:rPr>
+          <w:color w:val="7030A0"/>
+        </w:rPr>
+        <w:t>unaccessible</w:t>
+      </w:r>
+      <w:proofErr w:type="spellEnd"/>
+      <w:r>
+        <w:rPr>
+          <w:color w:val="7030A0"/>
+        </w:rPr>
+        <w:t xml:space="preserve"> to regular users.</w:t>
       </w:r>
       <w:bookmarkEnd w:id="28"/>
+    </w:p>
+    <w:p>
+      <w:pPr>
+        <w:pStyle w:val="Paragraph2"/>
+        <w:rPr>
+          <w:color w:val="0070C0"/>
+        </w:rPr>
+      </w:pPr>
+      <w:r>
+        <w:rPr>
+          <w:color w:val="0070C0"/>
+        </w:rPr>
+        <w:t>All user accounts must use non</w:t>
+      </w:r>
+      <w:r>
+        <w:rPr>
+          <w:color w:val="0070C0"/>
+        </w:rPr>
+        <w:t>-</w:t>
+      </w:r>
+      <w:r>
+        <w:rPr>
+          <w:color w:val="0070C0"/>
+        </w:rPr>
+        <w:t>sensitive ID/password combinations as encryption will not be used</w:t>
+      </w:r>
+      <w:r>
+        <w:rPr>
+          <w:color w:val="0070C0"/>
+        </w:rPr>
+        <w:t xml:space="preserve"> and will be visible to developers.</w:t>
+      </w:r>
+    </w:p>
+    <w:p>
+      <w:pPr>
+        <w:ind w:left="720" w:firstLine="720"/>
+        <w:rPr>
+          <w:color w:val="7030A0"/>
+        </w:rPr>
+      </w:pPr>
     </w:p>
     <w:p>
       <w:pPr>
@@ -4968,6 +5245,14 @@
     </w:p>
     <w:p>
       <w:pPr>
+        <w:ind w:left="1440"/>
+        <w:rPr>
+          <w:color w:val="7030A0"/>
+        </w:rPr>
+      </w:pPr>
+    </w:p>
+    <w:p>
+      <w:pPr>
         <w:pStyle w:val="Heading2"/>
         <w:numPr>
           <w:ilvl w:val="1"/>
@@ -5022,6 +5307,20 @@
         <w:t>System must render all UI pages in no more than 9 seconds for dynamic pages. Static pages (HTML-only) must be rendered in less than 3 seconds. </w:t>
       </w:r>
       <w:bookmarkEnd w:id="34"/>
+    </w:p>
+    <w:p>
+      <w:pPr>
+        <w:ind w:left="1440"/>
+        <w:rPr>
+          <w:color w:val="0070C0"/>
+        </w:rPr>
+      </w:pPr>
+      <w:r>
+        <w:rPr>
+          <w:color w:val="0070C0"/>
+        </w:rPr>
+        <w:t>While we hope for significantly more, for demonstration purposes the server should be able to handle the workload for at least four tables and fifteen users at speeds comparable to real world blackjack tables found in any casino.</w:t>
+      </w:r>
     </w:p>
     <w:p>
       <w:pPr>

</xml_diff>

<commit_message>
Updated SRS sections 2.1 & 2.3
product overview + product functionality/features
</commit_message>
<xml_diff>
--- a/CS 401 - Group 2 - SRS Doc.docx
+++ b/CS 401 - Group 2 - SRS Doc.docx
@@ -30,6 +30,14 @@
     </w:p>
     <w:p>
       <w:pPr>
+        <w:pStyle w:val="Subtitle"/>
+        <w:spacing w:before="0" w:after="720"/>
+        <w:rPr>
+          <w:b/>
+          <w:i w:val="false"/>
+          <w:color w:val="000000"/>
+          <w:sz w:val="28"/>
+        </w:rPr>
         <w:sectPr>
           <w:headerReference w:type="even" r:id="rId2"/>
           <w:headerReference w:type="default" r:id="rId3"/>
@@ -46,15 +54,6 @@
           <w:textDirection w:val="lrTb"/>
           <w:docGrid w:type="default" w:linePitch="360" w:charSpace="0"/>
         </w:sectPr>
-        <w:pStyle w:val="Subtitle"/>
-        <w:spacing w:before="0" w:after="720"/>
-        <w:rPr>
-          <w:b/>
-          <w:i w:val="false"/>
-          <w:i w:val="false"/>
-          <w:color w:val="000000"/>
-          <w:sz w:val="28"/>
-        </w:rPr>
       </w:pPr>
       <w:r>
         <w:rPr>
@@ -112,8 +111,8 @@
       <w:tblGrid>
         <w:gridCol w:w="1275"/>
         <w:gridCol w:w="1083"/>
-        <w:gridCol w:w="3813"/>
-        <w:gridCol w:w="2592"/>
+        <w:gridCol w:w="3812"/>
+        <w:gridCol w:w="2593"/>
       </w:tblGrid>
       <w:tr>
         <w:trPr/>
@@ -177,7 +176,7 @@
         </w:tc>
         <w:tc>
           <w:tcPr>
-            <w:tcW w:w="3813" w:type="dxa"/>
+            <w:tcW w:w="3812" w:type="dxa"/>
             <w:tcBorders>
               <w:top w:val="single" w:sz="6" w:space="0" w:color="000000"/>
               <w:start w:val="single" w:sz="6" w:space="0" w:color="000000"/>
@@ -206,7 +205,7 @@
         </w:tc>
         <w:tc>
           <w:tcPr>
-            <w:tcW w:w="2592" w:type="dxa"/>
+            <w:tcW w:w="2593" w:type="dxa"/>
             <w:tcBorders>
               <w:top w:val="single" w:sz="6" w:space="0" w:color="000000"/>
               <w:start w:val="single" w:sz="6" w:space="0" w:color="000000"/>
@@ -291,7 +290,7 @@
         </w:tc>
         <w:tc>
           <w:tcPr>
-            <w:tcW w:w="3813" w:type="dxa"/>
+            <w:tcW w:w="3812" w:type="dxa"/>
             <w:tcBorders>
               <w:top w:val="single" w:sz="6" w:space="0" w:color="000000"/>
               <w:start w:val="single" w:sz="6" w:space="0" w:color="000000"/>
@@ -317,7 +316,7 @@
         </w:tc>
         <w:tc>
           <w:tcPr>
-            <w:tcW w:w="2592" w:type="dxa"/>
+            <w:tcW w:w="2593" w:type="dxa"/>
             <w:tcBorders>
               <w:top w:val="single" w:sz="6" w:space="0" w:color="000000"/>
               <w:start w:val="single" w:sz="6" w:space="0" w:color="000000"/>
@@ -403,7 +402,7 @@
         </w:tc>
         <w:tc>
           <w:tcPr>
-            <w:tcW w:w="3813" w:type="dxa"/>
+            <w:tcW w:w="3812" w:type="dxa"/>
             <w:tcBorders>
               <w:top w:val="single" w:sz="6" w:space="0" w:color="000000"/>
               <w:start w:val="single" w:sz="6" w:space="0" w:color="000000"/>
@@ -430,7 +429,7 @@
         </w:tc>
         <w:tc>
           <w:tcPr>
-            <w:tcW w:w="2592" w:type="dxa"/>
+            <w:tcW w:w="2593" w:type="dxa"/>
             <w:tcBorders>
               <w:top w:val="single" w:sz="6" w:space="0" w:color="000000"/>
               <w:start w:val="single" w:sz="6" w:space="0" w:color="000000"/>
@@ -517,7 +516,7 @@
         </w:tc>
         <w:tc>
           <w:tcPr>
-            <w:tcW w:w="3813" w:type="dxa"/>
+            <w:tcW w:w="3812" w:type="dxa"/>
             <w:tcBorders>
               <w:top w:val="single" w:sz="6" w:space="0" w:color="000000"/>
               <w:start w:val="single" w:sz="6" w:space="0" w:color="000000"/>
@@ -544,7 +543,7 @@
         </w:tc>
         <w:tc>
           <w:tcPr>
-            <w:tcW w:w="2592" w:type="dxa"/>
+            <w:tcW w:w="2593" w:type="dxa"/>
             <w:tcBorders>
               <w:top w:val="single" w:sz="6" w:space="0" w:color="000000"/>
               <w:start w:val="single" w:sz="6" w:space="0" w:color="000000"/>
@@ -631,7 +630,7 @@
         </w:tc>
         <w:tc>
           <w:tcPr>
-            <w:tcW w:w="3813" w:type="dxa"/>
+            <w:tcW w:w="3812" w:type="dxa"/>
             <w:tcBorders>
               <w:top w:val="single" w:sz="6" w:space="0" w:color="000000"/>
               <w:start w:val="single" w:sz="6" w:space="0" w:color="000000"/>
@@ -658,7 +657,7 @@
         </w:tc>
         <w:tc>
           <w:tcPr>
-            <w:tcW w:w="2592" w:type="dxa"/>
+            <w:tcW w:w="2593" w:type="dxa"/>
             <w:tcBorders>
               <w:top w:val="single" w:sz="6" w:space="0" w:color="000000"/>
               <w:start w:val="single" w:sz="6" w:space="0" w:color="000000"/>
@@ -712,6 +711,7 @@
                 <w:color w:val="000000"/>
                 <w:u w:val="single"/>
               </w:rPr>
+              <w:t>03/02/2026</w:t>
             </w:r>
           </w:p>
         </w:tc>
@@ -738,12 +738,13 @@
               <w:rPr>
                 <w:color w:val="000000"/>
               </w:rPr>
+              <w:t>1.4</w:t>
             </w:r>
           </w:p>
         </w:tc>
         <w:tc>
           <w:tcPr>
-            <w:tcW w:w="3813" w:type="dxa"/>
+            <w:tcW w:w="3812" w:type="dxa"/>
             <w:tcBorders>
               <w:top w:val="single" w:sz="6" w:space="0" w:color="000000"/>
               <w:start w:val="single" w:sz="6" w:space="0" w:color="000000"/>
@@ -764,12 +765,13 @@
               <w:rPr>
                 <w:color w:val="000000"/>
               </w:rPr>
+              <w:t>Added product perspective (2.1) and product functionality/features (2.3)</w:t>
             </w:r>
           </w:p>
         </w:tc>
         <w:tc>
           <w:tcPr>
-            <w:tcW w:w="2592" w:type="dxa"/>
+            <w:tcW w:w="2593" w:type="dxa"/>
             <w:tcBorders>
               <w:top w:val="single" w:sz="6" w:space="0" w:color="000000"/>
               <w:start w:val="single" w:sz="6" w:space="0" w:color="000000"/>
@@ -791,6 +793,7 @@
               <w:rPr>
                 <w:color w:val="000000"/>
               </w:rPr>
+              <w:t>Nick Vu</w:t>
             </w:r>
           </w:p>
         </w:tc>
@@ -853,7 +856,7 @@
         </w:tc>
         <w:tc>
           <w:tcPr>
-            <w:tcW w:w="3813" w:type="dxa"/>
+            <w:tcW w:w="3812" w:type="dxa"/>
             <w:tcBorders>
               <w:top w:val="single" w:sz="6" w:space="0" w:color="000000"/>
               <w:start w:val="single" w:sz="6" w:space="0" w:color="000000"/>
@@ -879,7 +882,7 @@
         </w:tc>
         <w:tc>
           <w:tcPr>
-            <w:tcW w:w="2592" w:type="dxa"/>
+            <w:tcW w:w="2593" w:type="dxa"/>
             <w:tcBorders>
               <w:top w:val="single" w:sz="6" w:space="0" w:color="000000"/>
               <w:start w:val="single" w:sz="6" w:space="0" w:color="000000"/>
@@ -963,7 +966,7 @@
         </w:tc>
         <w:tc>
           <w:tcPr>
-            <w:tcW w:w="3813" w:type="dxa"/>
+            <w:tcW w:w="3812" w:type="dxa"/>
             <w:tcBorders>
               <w:top w:val="single" w:sz="6" w:space="0" w:color="000000"/>
               <w:start w:val="single" w:sz="6" w:space="0" w:color="000000"/>
@@ -989,7 +992,7 @@
         </w:tc>
         <w:tc>
           <w:tcPr>
-            <w:tcW w:w="2592" w:type="dxa"/>
+            <w:tcW w:w="2593" w:type="dxa"/>
             <w:tcBorders>
               <w:top w:val="single" w:sz="6" w:space="0" w:color="000000"/>
               <w:start w:val="single" w:sz="6" w:space="0" w:color="000000"/>
@@ -1073,7 +1076,7 @@
         </w:tc>
         <w:tc>
           <w:tcPr>
-            <w:tcW w:w="3813" w:type="dxa"/>
+            <w:tcW w:w="3812" w:type="dxa"/>
             <w:tcBorders>
               <w:top w:val="single" w:sz="6" w:space="0" w:color="000000"/>
               <w:start w:val="single" w:sz="6" w:space="0" w:color="000000"/>
@@ -1099,7 +1102,7 @@
         </w:tc>
         <w:tc>
           <w:tcPr>
-            <w:tcW w:w="2592" w:type="dxa"/>
+            <w:tcW w:w="2593" w:type="dxa"/>
             <w:tcBorders>
               <w:top w:val="single" w:sz="6" w:space="0" w:color="000000"/>
               <w:start w:val="single" w:sz="6" w:space="0" w:color="000000"/>
@@ -1183,7 +1186,7 @@
         </w:tc>
         <w:tc>
           <w:tcPr>
-            <w:tcW w:w="3813" w:type="dxa"/>
+            <w:tcW w:w="3812" w:type="dxa"/>
             <w:tcBorders>
               <w:top w:val="single" w:sz="6" w:space="0" w:color="000000"/>
               <w:start w:val="single" w:sz="6" w:space="0" w:color="000000"/>
@@ -1209,7 +1212,7 @@
         </w:tc>
         <w:tc>
           <w:tcPr>
-            <w:tcW w:w="2592" w:type="dxa"/>
+            <w:tcW w:w="2593" w:type="dxa"/>
             <w:tcBorders>
               <w:top w:val="single" w:sz="6" w:space="0" w:color="000000"/>
               <w:start w:val="single" w:sz="6" w:space="0" w:color="000000"/>
@@ -1293,7 +1296,7 @@
         </w:tc>
         <w:tc>
           <w:tcPr>
-            <w:tcW w:w="3813" w:type="dxa"/>
+            <w:tcW w:w="3812" w:type="dxa"/>
             <w:tcBorders>
               <w:top w:val="single" w:sz="6" w:space="0" w:color="000000"/>
               <w:start w:val="single" w:sz="6" w:space="0" w:color="000000"/>
@@ -1319,7 +1322,7 @@
         </w:tc>
         <w:tc>
           <w:tcPr>
-            <w:tcW w:w="2592" w:type="dxa"/>
+            <w:tcW w:w="2593" w:type="dxa"/>
             <w:tcBorders>
               <w:top w:val="single" w:sz="6" w:space="0" w:color="000000"/>
               <w:start w:val="single" w:sz="6" w:space="0" w:color="000000"/>
@@ -1403,7 +1406,7 @@
         </w:tc>
         <w:tc>
           <w:tcPr>
-            <w:tcW w:w="3813" w:type="dxa"/>
+            <w:tcW w:w="3812" w:type="dxa"/>
             <w:tcBorders>
               <w:top w:val="single" w:sz="6" w:space="0" w:color="000000"/>
               <w:start w:val="single" w:sz="6" w:space="0" w:color="000000"/>
@@ -1429,7 +1432,7 @@
         </w:tc>
         <w:tc>
           <w:tcPr>
-            <w:tcW w:w="2592" w:type="dxa"/>
+            <w:tcW w:w="2593" w:type="dxa"/>
             <w:tcBorders>
               <w:top w:val="single" w:sz="6" w:space="0" w:color="000000"/>
               <w:start w:val="single" w:sz="6" w:space="0" w:color="000000"/>
@@ -1513,7 +1516,7 @@
         </w:tc>
         <w:tc>
           <w:tcPr>
-            <w:tcW w:w="3813" w:type="dxa"/>
+            <w:tcW w:w="3812" w:type="dxa"/>
             <w:tcBorders>
               <w:top w:val="single" w:sz="6" w:space="0" w:color="000000"/>
               <w:start w:val="single" w:sz="6" w:space="0" w:color="000000"/>
@@ -1539,7 +1542,7 @@
         </w:tc>
         <w:tc>
           <w:tcPr>
-            <w:tcW w:w="2592" w:type="dxa"/>
+            <w:tcW w:w="2593" w:type="dxa"/>
             <w:tcBorders>
               <w:top w:val="single" w:sz="6" w:space="0" w:color="000000"/>
               <w:start w:val="single" w:sz="6" w:space="0" w:color="000000"/>
@@ -1623,7 +1626,7 @@
         </w:tc>
         <w:tc>
           <w:tcPr>
-            <w:tcW w:w="3813" w:type="dxa"/>
+            <w:tcW w:w="3812" w:type="dxa"/>
             <w:tcBorders>
               <w:top w:val="single" w:sz="6" w:space="0" w:color="000000"/>
               <w:start w:val="single" w:sz="6" w:space="0" w:color="000000"/>
@@ -1649,7 +1652,7 @@
         </w:tc>
         <w:tc>
           <w:tcPr>
-            <w:tcW w:w="2592" w:type="dxa"/>
+            <w:tcW w:w="2593" w:type="dxa"/>
             <w:tcBorders>
               <w:top w:val="single" w:sz="6" w:space="0" w:color="000000"/>
               <w:start w:val="single" w:sz="6" w:space="0" w:color="000000"/>
@@ -1733,7 +1736,7 @@
         </w:tc>
         <w:tc>
           <w:tcPr>
-            <w:tcW w:w="3813" w:type="dxa"/>
+            <w:tcW w:w="3812" w:type="dxa"/>
             <w:tcBorders>
               <w:top w:val="single" w:sz="6" w:space="0" w:color="000000"/>
               <w:start w:val="single" w:sz="6" w:space="0" w:color="000000"/>
@@ -1759,7 +1762,7 @@
         </w:tc>
         <w:tc>
           <w:tcPr>
-            <w:tcW w:w="2592" w:type="dxa"/>
+            <w:tcW w:w="2593" w:type="dxa"/>
             <w:tcBorders>
               <w:top w:val="single" w:sz="6" w:space="0" w:color="000000"/>
               <w:start w:val="single" w:sz="6" w:space="0" w:color="000000"/>
@@ -1843,7 +1846,7 @@
         </w:tc>
         <w:tc>
           <w:tcPr>
-            <w:tcW w:w="3813" w:type="dxa"/>
+            <w:tcW w:w="3812" w:type="dxa"/>
             <w:tcBorders>
               <w:top w:val="single" w:sz="6" w:space="0" w:color="000000"/>
               <w:start w:val="single" w:sz="6" w:space="0" w:color="000000"/>
@@ -1869,7 +1872,7 @@
         </w:tc>
         <w:tc>
           <w:tcPr>
-            <w:tcW w:w="2592" w:type="dxa"/>
+            <w:tcW w:w="2593" w:type="dxa"/>
             <w:tcBorders>
               <w:top w:val="single" w:sz="6" w:space="0" w:color="000000"/>
               <w:start w:val="single" w:sz="6" w:space="0" w:color="000000"/>
@@ -1953,7 +1956,7 @@
         </w:tc>
         <w:tc>
           <w:tcPr>
-            <w:tcW w:w="3813" w:type="dxa"/>
+            <w:tcW w:w="3812" w:type="dxa"/>
             <w:tcBorders>
               <w:top w:val="single" w:sz="6" w:space="0" w:color="000000"/>
               <w:start w:val="single" w:sz="6" w:space="0" w:color="000000"/>
@@ -1979,7 +1982,7 @@
         </w:tc>
         <w:tc>
           <w:tcPr>
-            <w:tcW w:w="2592" w:type="dxa"/>
+            <w:tcW w:w="2593" w:type="dxa"/>
             <w:tcBorders>
               <w:top w:val="single" w:sz="6" w:space="0" w:color="000000"/>
               <w:start w:val="single" w:sz="6" w:space="0" w:color="000000"/>
@@ -2063,7 +2066,7 @@
         </w:tc>
         <w:tc>
           <w:tcPr>
-            <w:tcW w:w="3813" w:type="dxa"/>
+            <w:tcW w:w="3812" w:type="dxa"/>
             <w:tcBorders>
               <w:top w:val="single" w:sz="6" w:space="0" w:color="000000"/>
               <w:start w:val="single" w:sz="6" w:space="0" w:color="000000"/>
@@ -2089,7 +2092,7 @@
         </w:tc>
         <w:tc>
           <w:tcPr>
-            <w:tcW w:w="2592" w:type="dxa"/>
+            <w:tcW w:w="2593" w:type="dxa"/>
             <w:tcBorders>
               <w:top w:val="single" w:sz="6" w:space="0" w:color="000000"/>
               <w:start w:val="single" w:sz="6" w:space="0" w:color="000000"/>
@@ -2173,7 +2176,7 @@
         </w:tc>
         <w:tc>
           <w:tcPr>
-            <w:tcW w:w="3813" w:type="dxa"/>
+            <w:tcW w:w="3812" w:type="dxa"/>
             <w:tcBorders>
               <w:top w:val="single" w:sz="6" w:space="0" w:color="000000"/>
               <w:start w:val="single" w:sz="6" w:space="0" w:color="000000"/>
@@ -2199,7 +2202,7 @@
         </w:tc>
         <w:tc>
           <w:tcPr>
-            <w:tcW w:w="2592" w:type="dxa"/>
+            <w:tcW w:w="2593" w:type="dxa"/>
             <w:tcBorders>
               <w:top w:val="single" w:sz="6" w:space="0" w:color="000000"/>
               <w:start w:val="single" w:sz="6" w:space="0" w:color="000000"/>
@@ -2228,6 +2231,11 @@
     </w:tbl>
     <w:p>
       <w:pPr>
+        <w:pStyle w:val="Normal"/>
+        <w:rPr>
+          <w:color w:val="000000"/>
+          <w:u w:val="single"/>
+        </w:rPr>
         <w:sectPr>
           <w:headerReference w:type="even" r:id="rId8"/>
           <w:headerReference w:type="default" r:id="rId9"/>
@@ -2243,11 +2251,6 @@
           <w:textDirection w:val="lrTb"/>
           <w:docGrid w:type="default" w:linePitch="360" w:charSpace="0"/>
         </w:sectPr>
-        <w:pStyle w:val="Normal"/>
-        <w:rPr>
-          <w:color w:val="000000"/>
-          <w:u w:val="single"/>
-        </w:rPr>
       </w:pPr>
       <w:r>
         <w:rPr>
@@ -3259,8 +3262,8 @@
           <w:r>
             <w:rPr>
               <w:rStyle w:val="IndexLink"/>
+              <w:caps w:val="false"/>
               <w:smallCaps w:val="false"/>
-              <w:caps w:val="false"/>
               <w:lang w:eastAsia="en-US"/>
             </w:rPr>
             <w:fldChar w:fldCharType="end"/>
@@ -4015,6 +4018,24 @@
     </w:p>
     <w:p>
       <w:pPr>
+        <w:pStyle w:val="Normal"/>
+        <w:widowControl/>
+        <w:suppressAutoHyphens w:val="true"/>
+        <w:bidi w:val="0"/>
+        <w:spacing w:before="0" w:after="0"/>
+        <w:ind w:hanging="0" w:start="1440" w:end="0"/>
+        <w:jc w:val="start"/>
+        <w:rPr/>
+      </w:pPr>
+      <w:r>
+        <w:rPr>
+          <w:color w:val="2A6099"/>
+        </w:rPr>
+        <w:t>This is a multiplayer blackjack playing application that uses a client-server architecture for networked gameplay. The client will provide the GUI for the login, lobby, and the tables for playing and facilitating separate player and dealer actions. Along with maintaining the game state for the duration of a table being live, the server program enforces the standard rules for blackjack play. The server will also persistently store the user account credentials and credit balances for each account. Communication for the networking occurs over TCP/IP and this system assumes a server to be run before client startup.</w:t>
+      </w:r>
+    </w:p>
+    <w:p>
+      <w:pPr>
         <w:pStyle w:val="Heading2"/>
         <w:numPr>
           <w:ilvl w:val="1"/>
@@ -4033,62 +4054,14 @@
       <w:pPr>
         <w:pStyle w:val="Paragraph2"/>
         <w:rPr>
-          <w:color w:val="7030A0"/>
-        </w:rPr>
-      </w:pPr>
-      <w:r>
-        <w:rPr>
-          <w:color w:val="7030A0"/>
-        </w:rPr>
-        <w:t xml:space="preserve">The system will be organized into </w:t>
-      </w:r>
-      <w:r>
-        <w:rPr>
-          <w:color w:val="7030A0"/>
-        </w:rPr>
-        <w:t>6</w:t>
-      </w:r>
-      <w:r>
-        <w:rPr>
-          <w:color w:val="7030A0"/>
-        </w:rPr>
-        <w:t xml:space="preserve"> major modules: the </w:t>
-      </w:r>
-      <w:r>
-        <w:rPr>
-          <w:color w:val="7030A0"/>
-        </w:rPr>
-        <w:t xml:space="preserve">network </w:t>
-      </w:r>
-      <w:r>
-        <w:rPr>
-          <w:color w:val="7030A0"/>
-        </w:rPr>
-        <w:t xml:space="preserve"> module, </w:t>
-      </w:r>
-      <w:r>
-        <w:rPr>
-          <w:color w:val="7030A0"/>
-        </w:rPr>
-        <w:t>lobby/account</w:t>
-      </w:r>
-      <w:r>
-        <w:rPr>
-          <w:color w:val="7030A0"/>
-        </w:rPr>
-        <w:t xml:space="preserve"> module, </w:t>
-      </w:r>
-      <w:r>
-        <w:rPr>
-          <w:color w:val="7030A0"/>
-        </w:rPr>
-        <w:t xml:space="preserve">table module, user/login module, storage module </w:t>
-      </w:r>
-      <w:r>
-        <w:rPr>
-          <w:color w:val="7030A0"/>
-        </w:rPr>
-        <w:t>and the game module</w:t>
+          <w:color w:val="2A6099"/>
+        </w:rPr>
+      </w:pPr>
+      <w:r>
+        <w:rPr>
+          <w:color w:val="2A6099"/>
+        </w:rPr>
+        <w:t>The system will be organized into 6 major modules: the network  module, lobby/account module, table module, user/login module, storage module and the game module</w:t>
       </w:r>
     </w:p>
     <w:p>
@@ -4111,11 +4084,73 @@
       <w:pPr>
         <w:pStyle w:val="Normal"/>
         <w:ind w:start="1440"/>
-        <w:rPr/>
-      </w:pPr>
-      <w:r>
-        <w:rPr/>
-        <w:t xml:space="preserve">The high-level features of the system are as follows (see section 3 of this document for more detailed requirements that address these features): </w:t>
+        <w:rPr>
+          <w:color w:val="2A6099"/>
+        </w:rPr>
+      </w:pPr>
+      <w:r>
+        <w:rPr>
+          <w:color w:val="2A6099"/>
+        </w:rPr>
+        <w:t xml:space="preserve">Users can log into their accounts and with the appropriate roles authenticated, participate as a player with their betting balance or as a dealer. The system further enforces role-based permissions through the allowed actions in the GUI. Users can view available tables in the lobby, players are capable of joining tables while dealers are brought to a table setup configuration before opening a 6-person table themselves. </w:t>
+      </w:r>
+    </w:p>
+    <w:p>
+      <w:pPr>
+        <w:pStyle w:val="Normal"/>
+        <w:ind w:start="1440"/>
+        <w:rPr>
+          <w:color w:val="2A6099"/>
+        </w:rPr>
+      </w:pPr>
+      <w:r>
+        <w:rPr>
+          <w:color w:val="2A6099"/>
+        </w:rPr>
+      </w:r>
+    </w:p>
+    <w:p>
+      <w:pPr>
+        <w:pStyle w:val="Normal"/>
+        <w:ind w:start="1440"/>
+        <w:rPr>
+          <w:color w:val="2A6099"/>
+        </w:rPr>
+      </w:pPr>
+      <w:r>
+        <w:rPr>
+          <w:color w:val="2A6099"/>
+        </w:rPr>
+        <w:t xml:space="preserve">The system will provide management for the blackjack game in distinct phases: betting, player action, and outcome. Further enforcement of the rules are in the valid player actions they can take with the standard set of blackjack hitting, standing, double down, split, insurance, and surrender. Dealer actions follow rules as expected from a casino game of blackjack. </w:t>
+      </w:r>
+    </w:p>
+    <w:p>
+      <w:pPr>
+        <w:pStyle w:val="Normal"/>
+        <w:ind w:start="1440"/>
+        <w:rPr>
+          <w:color w:val="2A6099"/>
+        </w:rPr>
+      </w:pPr>
+      <w:r>
+        <w:rPr>
+          <w:color w:val="2A6099"/>
+        </w:rPr>
+      </w:r>
+    </w:p>
+    <w:p>
+      <w:pPr>
+        <w:pStyle w:val="Normal"/>
+        <w:ind w:start="1440"/>
+        <w:rPr>
+          <w:color w:val="2A6099"/>
+        </w:rPr>
+      </w:pPr>
+      <w:r>
+        <w:rPr>
+          <w:color w:val="2A6099"/>
+        </w:rPr>
+        <w:t>The players can add funds to bet with and cash out, with the system validating their bets and ability to participate in the game with enough credits. The client interfaces in real-time with the game state from the server, and the system handles disconnections and re-connections from clients. The GUI enables controls per turn in game, and facilitates the actions within an active game alongside external menu actions such as lobby functionality.</w:t>
       </w:r>
     </w:p>
     <w:p>
@@ -5210,7 +5245,6 @@
           <w:color w:val="7030A0"/>
         </w:rPr>
       </w:pPr>
-      <w:bookmarkStart w:id="30" w:name="REQBV1AR4"/>
       <w:r>
         <w:rPr>
           <w:color w:val="7030A0"/>
@@ -5226,14 +5260,14 @@
           <w:color w:val="7030A0"/>
         </w:rPr>
       </w:pPr>
-      <w:bookmarkStart w:id="31" w:name="REQBV1AR4"/>
+      <w:bookmarkStart w:id="30" w:name="REQBV1AR4"/>
       <w:r>
         <w:rPr>
           <w:color w:val="7030A0"/>
         </w:rPr>
         <w:t>4.1.1 The Blackjack Handling System shall hold user account information in a file unaccessible to regular users.</w:t>
       </w:r>
-      <w:bookmarkEnd w:id="31"/>
+      <w:bookmarkEnd w:id="30"/>
     </w:p>
     <w:p>
       <w:pPr>
@@ -5272,8 +5306,8 @@
         </w:numPr>
         <w:rPr/>
       </w:pPr>
-      <w:bookmarkStart w:id="32" w:name="__RefHeading___Toc19440740"/>
-      <w:bookmarkEnd w:id="32"/>
+      <w:bookmarkStart w:id="31" w:name="__RefHeading___Toc19440740"/>
+      <w:bookmarkEnd w:id="31"/>
       <w:r>
         <w:rPr/>
         <w:t>Environmental Requirements</w:t>
@@ -5287,7 +5321,7 @@
           <w:color w:val="7030A0"/>
         </w:rPr>
       </w:pPr>
-      <w:bookmarkStart w:id="33" w:name="REQBV3HG5"/>
+      <w:bookmarkStart w:id="32" w:name="REQBV3HG5"/>
       <w:r>
         <w:rPr>
           <w:color w:val="7030A0"/>
@@ -5322,7 +5356,7 @@
         </w:rPr>
         <w:t>System cannot require that any software other than a web browser be installed on user computers. </w:t>
       </w:r>
-      <w:bookmarkEnd w:id="33"/>
+      <w:bookmarkEnd w:id="32"/>
     </w:p>
     <w:p>
       <w:pPr>
@@ -5332,7 +5366,7 @@
           <w:color w:val="7030A0"/>
         </w:rPr>
       </w:pPr>
-      <w:bookmarkStart w:id="34" w:name="REQBV5QU8"/>
+      <w:bookmarkStart w:id="33" w:name="REQBV5QU8"/>
       <w:r>
         <w:rPr>
           <w:color w:val="7030A0"/>
@@ -5352,7 +5386,7 @@
         </w:rPr>
         <w:t>System must make use of the University’s existing Oracle 9i implementation for its database. </w:t>
       </w:r>
-      <w:bookmarkEnd w:id="34"/>
+      <w:bookmarkEnd w:id="33"/>
     </w:p>
     <w:p>
       <w:pPr>
@@ -5362,7 +5396,7 @@
           <w:color w:val="7030A0"/>
         </w:rPr>
       </w:pPr>
-      <w:bookmarkStart w:id="35" w:name="REQBV5RT8"/>
+      <w:bookmarkStart w:id="34" w:name="REQBV5RT8"/>
       <w:r>
         <w:rPr>
           <w:color w:val="7030A0"/>
@@ -5382,7 +5416,7 @@
         </w:rPr>
         <w:t>System must be deployed on existing Linux-based server infrastructure. </w:t>
       </w:r>
-      <w:bookmarkEnd w:id="35"/>
+      <w:bookmarkEnd w:id="34"/>
     </w:p>
     <w:p>
       <w:pPr>
@@ -5407,8 +5441,8 @@
         </w:numPr>
         <w:rPr/>
       </w:pPr>
-      <w:bookmarkStart w:id="36" w:name="__RefHeading___Toc19440741"/>
-      <w:bookmarkEnd w:id="36"/>
+      <w:bookmarkStart w:id="35" w:name="__RefHeading___Toc19440741"/>
+      <w:bookmarkEnd w:id="35"/>
       <w:r>
         <w:rPr/>
         <w:t>Performance Requirements</w:t>
@@ -5422,7 +5456,7 @@
           <w:color w:val="7030A0"/>
         </w:rPr>
       </w:pPr>
-      <w:bookmarkStart w:id="37" w:name="REQBV5SS8"/>
+      <w:bookmarkStart w:id="36" w:name="REQBV5SS8"/>
       <w:r>
         <w:rPr>
           <w:color w:val="7030A0"/>
@@ -5457,7 +5491,7 @@
         </w:rPr>
         <w:t>System must render all UI pages in no more than 9 seconds for dynamic pages. Static pages (HTML-only) must be rendered in less than 3 seconds. </w:t>
       </w:r>
-      <w:bookmarkEnd w:id="37"/>
+      <w:bookmarkEnd w:id="36"/>
     </w:p>
     <w:p>
       <w:pPr>
@@ -5651,7 +5685,7 @@
       <mc:AlternateContent>
         <mc:Choice Requires="wps">
           <w:drawing>
-            <wp:anchor behindDoc="1" distT="0" distB="0" distL="0" distR="0" simplePos="0" locked="0" layoutInCell="0" allowOverlap="1" relativeHeight="14" wp14:anchorId="07B49E00">
+            <wp:anchor behindDoc="1" distT="0" distB="0" distL="0" distR="0" simplePos="0" locked="0" layoutInCell="0" allowOverlap="1" relativeHeight="2" wp14:anchorId="07B49E00">
               <wp:simplePos x="0" y="0"/>
               <wp:positionH relativeFrom="margin">
                 <wp:align>center</wp:align>
@@ -5742,7 +5776,7 @@
         </mc:Choice>
         <mc:Fallback>
           <w:pict>
-            <v:rect id="shape_0" ID="Frame1" path="m0,0l-2147483645,0l-2147483645,-2147483646l0,-2147483646xe" stroked="f" o:allowincell="f" style="position:absolute;margin-left:213.65pt;margin-top:0.05pt;width:4.6pt;height:9.3pt;mso-wrap-style:square;v-text-anchor:top;mso-position-horizontal:center;mso-position-horizontal-relative:margin" wp14:anchorId="07B49E00">
+            <v:rect id="shape_0" stroked="f" o:allowincell="f" style="position:absolute;margin-left:213.65pt;margin-top:0.05pt;width:4.6pt;height:9.3pt;mso-wrap-style:square;v-text-anchor:top;mso-position-horizontal:center;mso-position-horizontal-relative:margin" wp14:anchorId="07B49E00">
               <v:fill o:detectmouseclick="t" on="false"/>
               <v:stroke color="#3465a4" joinstyle="round" endcap="flat"/>
               <v:textbox>
@@ -5812,7 +5846,7 @@
       <mc:AlternateContent>
         <mc:Choice Requires="wps">
           <w:drawing>
-            <wp:anchor behindDoc="1" distT="0" distB="0" distL="0" distR="0" simplePos="0" locked="0" layoutInCell="0" allowOverlap="1" relativeHeight="14" wp14:anchorId="07B49E00">
+            <wp:anchor behindDoc="1" distT="0" distB="0" distL="0" distR="0" simplePos="0" locked="0" layoutInCell="0" allowOverlap="1" relativeHeight="2" wp14:anchorId="07B49E00">
               <wp:simplePos x="0" y="0"/>
               <wp:positionH relativeFrom="margin">
                 <wp:align>center</wp:align>
@@ -5903,7 +5937,7 @@
         </mc:Choice>
         <mc:Fallback>
           <w:pict>
-            <v:rect id="shape_0" ID="Frame1" path="m0,0l-2147483645,0l-2147483645,-2147483646l0,-2147483646xe" stroked="f" o:allowincell="f" style="position:absolute;margin-left:213.65pt;margin-top:0.05pt;width:4.6pt;height:9.3pt;mso-wrap-style:square;v-text-anchor:top;mso-position-horizontal:center;mso-position-horizontal-relative:margin" wp14:anchorId="07B49E00">
+            <v:rect id="shape_0" stroked="f" o:allowincell="f" style="position:absolute;margin-left:213.65pt;margin-top:0.05pt;width:4.6pt;height:9.3pt;mso-wrap-style:square;v-text-anchor:top;mso-position-horizontal:center;mso-position-horizontal-relative:margin" wp14:anchorId="07B49E00">
               <v:fill o:detectmouseclick="t" on="false"/>
               <v:stroke color="#3465a4" joinstyle="round" endcap="flat"/>
               <v:textbox>
@@ -5987,7 +6021,7 @@
       <mc:AlternateContent>
         <mc:Choice Requires="wps">
           <w:drawing>
-            <wp:anchor behindDoc="1" distT="0" distB="0" distL="0" distR="0" simplePos="0" locked="0" layoutInCell="0" allowOverlap="1" relativeHeight="12" wp14:anchorId="16546B0F">
+            <wp:anchor behindDoc="1" distT="0" distB="0" distL="0" distR="0" simplePos="0" locked="0" layoutInCell="0" allowOverlap="1" relativeHeight="17" wp14:anchorId="16546B0F">
               <wp:simplePos x="0" y="0"/>
               <wp:positionH relativeFrom="margin">
                 <wp:align>center</wp:align>
@@ -6055,7 +6089,7 @@
                               <w:rStyle w:val="PageNumber"/>
                               <w:color w:val="000000"/>
                             </w:rPr>
-                            <w:t>ix</w:t>
+                            <w:t>x</w:t>
                           </w:r>
                           <w:r>
                             <w:rPr>
@@ -6078,7 +6112,7 @@
         </mc:Choice>
         <mc:Fallback>
           <w:pict>
-            <v:rect id="shape_0" ID="Frame2" path="m0,0l-2147483645,0l-2147483645,-2147483646l0,-2147483646xe" stroked="f" o:allowincell="f" style="position:absolute;margin-left:213.15pt;margin-top:0.05pt;width:5.6pt;height:1.75pt;mso-wrap-style:square;v-text-anchor:top;mso-position-horizontal:center;mso-position-horizontal-relative:margin" wp14:anchorId="16546B0F">
+            <v:rect id="shape_0" stroked="f" o:allowincell="f" style="position:absolute;margin-left:213.15pt;margin-top:0.05pt;width:5.6pt;height:1.75pt;mso-wrap-style:square;v-text-anchor:top;mso-position-horizontal:center;mso-position-horizontal-relative:margin" wp14:anchorId="16546B0F">
               <v:fill o:detectmouseclick="t" on="false"/>
               <v:stroke color="#3465a4" joinstyle="round" endcap="flat"/>
               <v:textbox>
@@ -6114,7 +6148,7 @@
                         <w:rStyle w:val="PageNumber"/>
                         <w:color w:val="000000"/>
                       </w:rPr>
-                      <w:t>ix</w:t>
+                      <w:t>x</w:t>
                     </w:r>
                     <w:r>
                       <w:rPr>
@@ -6314,8 +6348,8 @@
   <w:abstractNum w:abstractNumId="1">
     <w:lvl w:ilvl="0">
       <w:start w:val="1"/>
+      <w:numFmt w:val="decimal"/>
       <w:pStyle w:val="Heading1"/>
-      <w:numFmt w:val="decimal"/>
       <w:lvlText w:val="%1."/>
       <w:lvlJc w:val="start"/>
       <w:pPr>
@@ -6325,16 +6359,16 @@
         <w:ind w:start="720" w:hanging="720"/>
       </w:pPr>
       <w:rPr>
-        <w:sz w:val="36"/>
         <w:b/>
         <w:kern w:val="2"/>
+        <w:sz w:val="36"/>
         <w:lang w:val="en-US" w:bidi="en-US"/>
       </w:rPr>
     </w:lvl>
     <w:lvl w:ilvl="1">
       <w:start w:val="1"/>
+      <w:numFmt w:val="decimal"/>
       <w:pStyle w:val="Heading2"/>
-      <w:numFmt w:val="decimal"/>
       <w:lvlText w:val="%1.%2."/>
       <w:lvlJc w:val="start"/>
       <w:pPr>
@@ -6347,8 +6381,8 @@
     </w:lvl>
     <w:lvl w:ilvl="2">
       <w:start w:val="1"/>
+      <w:numFmt w:val="decimal"/>
       <w:pStyle w:val="Heading3"/>
-      <w:numFmt w:val="decimal"/>
       <w:lvlText w:val="%1.%2.%3."/>
       <w:lvlJc w:val="start"/>
       <w:pPr>
@@ -6361,8 +6395,8 @@
     </w:lvl>
     <w:lvl w:ilvl="3">
       <w:start w:val="1"/>
+      <w:numFmt w:val="decimal"/>
       <w:pStyle w:val="Heading4"/>
-      <w:numFmt w:val="decimal"/>
       <w:lvlText w:val="%1.%2.%3.%4."/>
       <w:lvlJc w:val="start"/>
       <w:pPr>
@@ -6375,8 +6409,8 @@
     </w:lvl>
     <w:lvl w:ilvl="4">
       <w:start w:val="1"/>
+      <w:numFmt w:val="decimal"/>
       <w:pStyle w:val="Heading5"/>
-      <w:numFmt w:val="decimal"/>
       <w:lvlText w:val="%1.%2.%3.%4.%5."/>
       <w:lvlJc w:val="start"/>
       <w:pPr>
@@ -6389,8 +6423,8 @@
     </w:lvl>
     <w:lvl w:ilvl="5">
       <w:start w:val="1"/>
+      <w:numFmt w:val="decimal"/>
       <w:pStyle w:val="Heading6"/>
-      <w:numFmt w:val="decimal"/>
       <w:lvlText w:val="%1.%2.%3.%4.%5.%6."/>
       <w:lvlJc w:val="start"/>
       <w:pPr>
@@ -6403,8 +6437,8 @@
     </w:lvl>
     <w:lvl w:ilvl="6">
       <w:start w:val="1"/>
+      <w:numFmt w:val="decimal"/>
       <w:pStyle w:val="Heading7"/>
-      <w:numFmt w:val="decimal"/>
       <w:lvlText w:val="%1.%2.%3.%4.%5.%6.%7."/>
       <w:lvlJc w:val="start"/>
       <w:pPr>
@@ -6417,8 +6451,8 @@
     </w:lvl>
     <w:lvl w:ilvl="7">
       <w:start w:val="1"/>
+      <w:numFmt w:val="decimal"/>
       <w:pStyle w:val="Heading8"/>
-      <w:numFmt w:val="decimal"/>
       <w:lvlText w:val="%1.%2.%3.%4.%5.%6.%7.%8."/>
       <w:lvlJc w:val="start"/>
       <w:pPr>
@@ -6431,8 +6465,8 @@
     </w:lvl>
     <w:lvl w:ilvl="8">
       <w:start w:val="1"/>
+      <w:numFmt w:val="decimal"/>
       <w:pStyle w:val="Heading9"/>
-      <w:numFmt w:val="decimal"/>
       <w:lvlText w:val="%1.%2.%3.%4.%5.%6.%7.%8.%9."/>
       <w:lvlJc w:val="start"/>
       <w:pPr>
@@ -6457,9 +6491,9 @@
         <w:ind w:start="720" w:hanging="720"/>
       </w:pPr>
       <w:rPr>
-        <w:sz w:val="36"/>
         <w:b/>
         <w:kern w:val="2"/>
+        <w:sz w:val="36"/>
         <w:lang w:val="en-US" w:bidi="en-US"/>
       </w:rPr>
     </w:lvl>
@@ -6988,7 +7022,7 @@
       <w:kern w:val="0"/>
       <w:sz w:val="20"/>
       <w:szCs w:val="20"/>
-      <w:lang w:bidi="ar-SA" w:val="en-US" w:eastAsia="zh-CN"/>
+      <w:lang w:val="en-US" w:eastAsia="zh-CN" w:bidi="ar-SA"/>
     </w:rPr>
   </w:style>
   <w:style w:type="paragraph" w:styleId="Heading1">
@@ -7604,7 +7638,7 @@
       <w:kern w:val="0"/>
       <w:sz w:val="20"/>
       <w:szCs w:val="20"/>
-      <w:lang w:bidi="ar-SA" w:val="en-US" w:eastAsia="zh-CN"/>
+      <w:lang w:val="en-US" w:eastAsia="zh-CN" w:bidi="ar-SA"/>
     </w:rPr>
   </w:style>
   <w:style w:type="paragraph" w:styleId="BodyTextIndent">

</xml_diff>

<commit_message>
removed surrender from SRS
</commit_message>
<xml_diff>
--- a/CS 401 - Group 2 - SRS Doc.docx
+++ b/CS 401 - Group 2 - SRS Doc.docx
@@ -3968,7 +3968,21 @@
         <w:rPr>
           <w:color w:val="2A6099"/>
         </w:rPr>
-        <w:t xml:space="preserve"> in the valid player actions they can take with the standard set of blackjack hitting, standing, double down, split, insurance, and surrender. Dealer actions follow rules as expected from a casino game of blackjack. </w:t>
+        <w:t xml:space="preserve"> in the valid player actions they can take with the standard set of blackjack hitting, standing, double down, </w:t>
+      </w:r>
+      <w:proofErr w:type="gramStart"/>
+      <w:r>
+        <w:rPr>
+          <w:color w:val="2A6099"/>
+        </w:rPr>
+        <w:t>split</w:t>
+      </w:r>
+      <w:proofErr w:type="gramEnd"/>
+      <w:r>
+        <w:rPr>
+          <w:color w:val="2A6099"/>
+        </w:rPr>
+        <w:t xml:space="preserve">, insurance. Dealer actions follow rules as expected from a casino game of blackjack. </w:t>
       </w:r>
     </w:p>
     <w:p>
@@ -4124,7 +4138,6 @@
         <w:rPr>
           <w:color w:val="7030A0"/>
         </w:rPr>
-        <w:lastRenderedPageBreak/>
         <w:t>Assumption Example: It is assumed that the maximum number of users at a given time is 15,000.</w:t>
       </w:r>
     </w:p>

</xml_diff>

<commit_message>
added and named requirements in section 3.1
</commit_message>
<xml_diff>
--- a/CS 401 - Group 2 - SRS Doc.docx
+++ b/CS 401 - Group 2 - SRS Doc.docx
@@ -4266,7 +4266,7 @@
         <w:rPr>
           <w:color w:val="0070C0"/>
         </w:rPr>
-        <w:t>Players can only be logged into one player session at a time. Dealers are permitted to login to multiple dealer sessions simultaneously.</w:t>
+        <w:t>Players can only be logged into one player session at a time.</w:t>
       </w:r>
     </w:p>
     <w:p>
@@ -4412,7 +4412,10 @@
         </w:numPr>
       </w:pPr>
       <w:r>
-        <w:t>_____ Module Requirements:</w:t>
+        <w:t>Users</w:t>
+      </w:r>
+      <w:r>
+        <w:t xml:space="preserve"> Module Requirements:</w:t>
       </w:r>
     </w:p>
     <w:p>
@@ -4456,25 +4459,25 @@
       <w:pPr>
         <w:pStyle w:val="Paragraph2"/>
         <w:rPr>
-          <w:color w:val="7030A0"/>
-        </w:rPr>
-      </w:pPr>
-      <w:r>
-        <w:rPr>
-          <w:color w:val="7030A0"/>
+          <w:color w:val="00B0F0"/>
+        </w:rPr>
+      </w:pPr>
+      <w:r>
+        <w:rPr>
+          <w:color w:val="00B0F0"/>
         </w:rPr>
         <w:t xml:space="preserve">3.1.2.1 </w:t>
       </w:r>
       <w:r>
         <w:rPr>
           <w:vanish/>
-          <w:color w:val="7030A0"/>
+          <w:color w:val="00B0F0"/>
         </w:rPr>
         <w:t xml:space="preserve">SR9 </w:t>
       </w:r>
       <w:r>
         <w:rPr>
-          <w:color w:val="7030A0"/>
+          <w:color w:val="00B0F0"/>
         </w:rPr>
         <w:t>Users should be allowed to log in using their issued id and pin, both of which are alphanumeric strings between 6 and 20 characters in length. </w:t>
       </w:r>
@@ -4488,7 +4491,10 @@
         </w:numPr>
       </w:pPr>
       <w:r>
-        <w:t>_____ Module Requirements:</w:t>
+        <w:t>Datastore</w:t>
+      </w:r>
+      <w:r>
+        <w:t xml:space="preserve"> Module Requirements:</w:t>
       </w:r>
     </w:p>
     <w:p>
@@ -4572,7 +4578,10 @@
         </w:numPr>
       </w:pPr>
       <w:r>
-        <w:t>_____ Module Requirements:</w:t>
+        <w:t>Network</w:t>
+      </w:r>
+      <w:r>
+        <w:t xml:space="preserve"> Module Requirements:</w:t>
       </w:r>
     </w:p>
     <w:p>
@@ -4648,7 +4657,10 @@
         </w:numPr>
       </w:pPr>
       <w:r>
-        <w:t>_____ Module Requirements:</w:t>
+        <w:t>GUI</w:t>
+      </w:r>
+      <w:r>
+        <w:t xml:space="preserve"> Module Requirements:</w:t>
       </w:r>
     </w:p>
     <w:p>
@@ -4724,7 +4736,10 @@
         </w:numPr>
       </w:pPr>
       <w:r>
-        <w:t>_____ Module Requirements:</w:t>
+        <w:t>Lobby</w:t>
+      </w:r>
+      <w:r>
+        <w:t xml:space="preserve"> Module Requirements:</w:t>
       </w:r>
     </w:p>
     <w:p>
@@ -4790,6 +4805,193 @@
         </w:rPr>
         <w:t>Users should be allowed to log in using their issued id and pin, both of which are alphanumeric strings between 6 and 20 characters in length. </w:t>
       </w:r>
+    </w:p>
+    <w:p>
+      <w:pPr>
+        <w:pStyle w:val="Heading3"/>
+        <w:numPr>
+          <w:ilvl w:val="2"/>
+          <w:numId w:val="2"/>
+        </w:numPr>
+      </w:pPr>
+      <w:r>
+        <w:t>Table</w:t>
+      </w:r>
+      <w:r>
+        <w:t xml:space="preserve"> Module Requirements:</w:t>
+      </w:r>
+    </w:p>
+    <w:p>
+      <w:pPr>
+        <w:pStyle w:val="Paragraph2"/>
+        <w:rPr>
+          <w:color w:val="7030A0"/>
+        </w:rPr>
+      </w:pPr>
+      <w:r>
+        <w:rPr>
+          <w:color w:val="7030A0"/>
+        </w:rPr>
+        <w:t xml:space="preserve">Provide module specific requirements as appropriate. </w:t>
+      </w:r>
+      <w:r>
+        <w:rPr>
+          <w:vanish/>
+          <w:color w:val="7030A0"/>
+        </w:rPr>
+        <w:t xml:space="preserve">SR10 </w:t>
+      </w:r>
+    </w:p>
+    <w:p>
+      <w:pPr>
+        <w:pStyle w:val="Paragraph2"/>
+        <w:rPr>
+          <w:color w:val="7030A0"/>
+        </w:rPr>
+      </w:pPr>
+      <w:r>
+        <w:rPr>
+          <w:color w:val="7030A0"/>
+        </w:rPr>
+        <w:lastRenderedPageBreak/>
+        <w:t>Example:</w:t>
+      </w:r>
+    </w:p>
+    <w:p>
+      <w:pPr>
+        <w:pStyle w:val="Paragraph2"/>
+        <w:rPr>
+          <w:color w:val="7030A0"/>
+        </w:rPr>
+      </w:pPr>
+      <w:r>
+        <w:rPr>
+          <w:color w:val="7030A0"/>
+        </w:rPr>
+        <w:t xml:space="preserve">3.1.2.1 </w:t>
+      </w:r>
+      <w:r>
+        <w:rPr>
+          <w:vanish/>
+          <w:color w:val="7030A0"/>
+        </w:rPr>
+        <w:t xml:space="preserve">SR9 </w:t>
+      </w:r>
+      <w:r>
+        <w:rPr>
+          <w:color w:val="7030A0"/>
+        </w:rPr>
+        <w:t>Users should be allowed to log in using their issued id and pin, both of which are alphanumeric strings between 6 and 20 characters in length. </w:t>
+      </w:r>
+    </w:p>
+    <w:p>
+      <w:pPr>
+        <w:pStyle w:val="Heading3"/>
+        <w:numPr>
+          <w:ilvl w:val="2"/>
+          <w:numId w:val="2"/>
+        </w:numPr>
+      </w:pPr>
+      <w:r>
+        <w:t>Game</w:t>
+      </w:r>
+      <w:r>
+        <w:t xml:space="preserve"> Module Requirements:</w:t>
+      </w:r>
+    </w:p>
+    <w:p>
+      <w:pPr>
+        <w:pStyle w:val="Paragraph2"/>
+        <w:rPr>
+          <w:color w:val="7030A0"/>
+        </w:rPr>
+      </w:pPr>
+      <w:r>
+        <w:rPr>
+          <w:color w:val="7030A0"/>
+        </w:rPr>
+        <w:t xml:space="preserve">Provide module specific requirements as appropriate. </w:t>
+      </w:r>
+      <w:r>
+        <w:rPr>
+          <w:vanish/>
+          <w:color w:val="7030A0"/>
+        </w:rPr>
+        <w:t xml:space="preserve">SR10 </w:t>
+      </w:r>
+    </w:p>
+    <w:p>
+      <w:pPr>
+        <w:pStyle w:val="Paragraph2"/>
+        <w:rPr>
+          <w:color w:val="7030A0"/>
+        </w:rPr>
+      </w:pPr>
+      <w:r>
+        <w:rPr>
+          <w:color w:val="7030A0"/>
+        </w:rPr>
+        <w:t>Example:</w:t>
+      </w:r>
+    </w:p>
+    <w:p>
+      <w:pPr>
+        <w:pStyle w:val="Paragraph2"/>
+        <w:rPr>
+          <w:color w:val="00B0F0"/>
+        </w:rPr>
+      </w:pPr>
+      <w:r>
+        <w:rPr>
+          <w:color w:val="00B0F0"/>
+        </w:rPr>
+        <w:t>3.1.</w:t>
+      </w:r>
+      <w:r>
+        <w:rPr>
+          <w:color w:val="00B0F0"/>
+        </w:rPr>
+        <w:t>8</w:t>
+      </w:r>
+      <w:r>
+        <w:rPr>
+          <w:color w:val="00B0F0"/>
+        </w:rPr>
+        <w:t xml:space="preserve">.1 </w:t>
+      </w:r>
+      <w:r>
+        <w:rPr>
+          <w:vanish/>
+          <w:color w:val="00B0F0"/>
+        </w:rPr>
+        <w:t xml:space="preserve">SR9 </w:t>
+      </w:r>
+      <w:r>
+        <w:rPr>
+          <w:color w:val="00B0F0"/>
+        </w:rPr>
+        <w:t>S</w:t>
+      </w:r>
+      <w:r>
+        <w:rPr>
+          <w:color w:val="00B0F0"/>
+        </w:rPr>
+        <w:t>etup player and dealer controls to accommodate game play and flow.</w:t>
+      </w:r>
+      <w:r>
+        <w:rPr>
+          <w:color w:val="00B0F0"/>
+        </w:rPr>
+        <w:t> </w:t>
+      </w:r>
+    </w:p>
+    <w:p>
+      <w:pPr>
+        <w:pStyle w:val="Paragraph2"/>
+        <w:rPr>
+          <w:color w:val="7030A0"/>
+        </w:rPr>
+      </w:pPr>
     </w:p>
     <w:p>
       <w:pPr>
@@ -4810,7 +5012,6 @@
       <w:bookmarkStart w:id="23" w:name="__RefHeading___Toc19440736"/>
       <w:bookmarkEnd w:id="23"/>
       <w:r>
-        <w:lastRenderedPageBreak/>
         <w:t>External Interface Requirements</w:t>
       </w:r>
     </w:p>
@@ -5637,17 +5838,14 @@
             </wp:anchor>
           </w:drawing>
         </mc:Choice>
-        <mc:Fallback xmlns:pic="http://schemas.openxmlformats.org/drawingml/2006/picture">
+        <mc:Fallback>
           <w:pict>
-            <v:rect id="shape_0" stroked="f" o:allowincell="f" style="position:absolute;margin-left:213.65pt;margin-top:0.05pt;width:4.6pt;height:9.3pt;mso-wrap-style:square;v-text-anchor:top;mso-position-horizontal:center;mso-position-horizontal-relative:margin" wp14:anchorId="07B49E00">
-              <v:fill o:detectmouseclick="t" on="false"/>
-              <v:stroke color="#3465a4" joinstyle="round" endcap="flat"/>
-              <v:textbox>
+            <v:rect w14:anchorId="07B49E00" id="Frame1" o:spid="_x0000_s1026" style="position:absolute;margin-left:0;margin-top:.05pt;width:4.65pt;height:9.35pt;z-index:-251659776;visibility:visible;mso-wrap-style:square;mso-wrap-distance-left:0;mso-wrap-distance-top:0;mso-wrap-distance-right:0;mso-wrap-distance-bottom:0;mso-position-horizontal:center;mso-position-horizontal-relative:margin;mso-position-vertical:absolute;mso-position-vertical-relative:text;v-text-anchor:top" o:gfxdata="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" o:allowincell="f" filled="f" stroked="f" strokeweight="0">
+              <v:textbox inset="0,0,0,0">
                 <w:txbxContent>
                   <w:p>
                     <w:pPr>
                       <w:pStyle w:val="Footer"/>
-                      <w:rPr/>
                     </w:pPr>
                     <w:r>
                       <w:rPr>
@@ -5675,8 +5873,17 @@
                         <w:rStyle w:val="PageNumber"/>
                         <w:color w:val="000000"/>
                       </w:rPr>
-                      <w:t>ii</w:t>
+                      <w:t>i</w:t>
                     </w:r>
+                    <w:proofErr w:type="spellStart"/>
+                    <w:r>
+                      <w:rPr>
+                        <w:rStyle w:val="PageNumber"/>
+                        <w:color w:val="000000"/>
+                      </w:rPr>
+                      <w:t>i</w:t>
+                    </w:r>
+                    <w:proofErr w:type="spellEnd"/>
                     <w:r>
                       <w:rPr>
                         <w:rStyle w:val="PageNumber"/>
@@ -5687,7 +5894,7 @@
                   </w:p>
                 </w:txbxContent>
               </v:textbox>
-              <w10:wrap type="square" side="largest"/>
+              <w10:wrap type="square" side="largest" anchorx="margin"/>
             </v:rect>
           </w:pict>
         </mc:Fallback>
@@ -5814,17 +6021,14 @@
             </wp:anchor>
           </w:drawing>
         </mc:Choice>
-        <mc:Fallback xmlns:pic="http://schemas.openxmlformats.org/drawingml/2006/picture">
+        <mc:Fallback>
           <w:pict>
-            <v:rect id="shape_0" stroked="f" o:allowincell="f" style="position:absolute;margin-left:213.65pt;margin-top:0.05pt;width:4.6pt;height:9.3pt;mso-wrap-style:square;v-text-anchor:top;mso-position-horizontal:center;mso-position-horizontal-relative:margin" wp14:anchorId="07B49E00">
-              <v:fill o:detectmouseclick="t" on="false"/>
-              <v:stroke color="#3465a4" joinstyle="round" endcap="flat"/>
-              <v:textbox>
+            <v:rect w14:anchorId="07B49E00" id="_x0000_s1027" style="position:absolute;margin-left:0;margin-top:.05pt;width:4.65pt;height:9.35pt;z-index:-251658752;visibility:visible;mso-wrap-style:square;mso-wrap-distance-left:0;mso-wrap-distance-top:0;mso-wrap-distance-right:0;mso-wrap-distance-bottom:0;mso-position-horizontal:center;mso-position-horizontal-relative:margin;mso-position-vertical:absolute;mso-position-vertical-relative:text;v-text-anchor:top" o:gfxdata="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" o:allowincell="f" filled="f" stroked="f" strokeweight="0">
+              <v:textbox inset="0,0,0,0">
                 <w:txbxContent>
                   <w:p>
                     <w:pPr>
                       <w:pStyle w:val="Footer"/>
-                      <w:rPr/>
                     </w:pPr>
                     <w:r>
                       <w:rPr>
@@ -5852,8 +6056,17 @@
                         <w:rStyle w:val="PageNumber"/>
                         <w:color w:val="000000"/>
                       </w:rPr>
-                      <w:t>ii</w:t>
+                      <w:t>i</w:t>
                     </w:r>
+                    <w:proofErr w:type="spellStart"/>
+                    <w:r>
+                      <w:rPr>
+                        <w:rStyle w:val="PageNumber"/>
+                        <w:color w:val="000000"/>
+                      </w:rPr>
+                      <w:t>i</w:t>
+                    </w:r>
+                    <w:proofErr w:type="spellEnd"/>
                     <w:r>
                       <w:rPr>
                         <w:rStyle w:val="PageNumber"/>
@@ -5864,7 +6077,7 @@
                   </w:p>
                 </w:txbxContent>
               </v:textbox>
-              <w10:wrap type="square" side="largest"/>
+              <w10:wrap type="square" side="largest" anchorx="margin"/>
             </v:rect>
           </w:pict>
         </mc:Fallback>
@@ -5992,17 +6205,14 @@
             </wp:anchor>
           </w:drawing>
         </mc:Choice>
-        <mc:Fallback xmlns:pic="http://schemas.openxmlformats.org/drawingml/2006/picture">
+        <mc:Fallback>
           <w:pict>
-            <v:rect id="shape_0" stroked="f" o:allowincell="f" style="position:absolute;margin-left:213.15pt;margin-top:0.05pt;width:5.6pt;height:1.75pt;mso-wrap-style:square;v-text-anchor:top;mso-position-horizontal:center;mso-position-horizontal-relative:margin" wp14:anchorId="16546B0F">
-              <v:fill o:detectmouseclick="t" on="false"/>
-              <v:stroke color="#3465a4" joinstyle="round" endcap="flat"/>
-              <v:textbox>
+            <v:rect w14:anchorId="16546B0F" id="Frame2" o:spid="_x0000_s1028" style="position:absolute;margin-left:0;margin-top:.05pt;width:5.65pt;height:1.8pt;z-index:-251657728;visibility:visible;mso-wrap-style:square;mso-wrap-distance-left:0;mso-wrap-distance-top:0;mso-wrap-distance-right:0;mso-wrap-distance-bottom:0;mso-position-horizontal:center;mso-position-horizontal-relative:margin;mso-position-vertical:absolute;mso-position-vertical-relative:text;v-text-anchor:top" o:gfxdata="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" o:allowincell="f" filled="f" stroked="f" strokeweight="0">
+              <v:textbox inset="0,0,0,0">
                 <w:txbxContent>
                   <w:p>
                     <w:pPr>
                       <w:pStyle w:val="Footer"/>
-                      <w:rPr/>
                     </w:pPr>
                     <w:r>
                       <w:rPr>
@@ -6042,7 +6252,7 @@
                   </w:p>
                 </w:txbxContent>
               </v:textbox>
-              <w10:wrap type="square" side="largest"/>
+              <w10:wrap type="square" side="largest" anchorx="margin"/>
             </v:rect>
           </w:pict>
         </mc:Fallback>

</xml_diff>

<commit_message>
Added 3.1.5, revised and cleaned sections 3 & 4
</commit_message>
<xml_diff>
--- a/CS 401 - Group 2 - SRS Doc.docx
+++ b/CS 401 - Group 2 - SRS Doc.docx
@@ -30,6 +30,14 @@
     </w:p>
     <w:p>
       <w:pPr>
+        <w:pStyle w:val="Subtitle"/>
+        <w:spacing w:before="0" w:after="720"/>
+        <w:rPr>
+          <w:b/>
+          <w:i w:val="false"/>
+          <w:color w:val="000000"/>
+          <w:sz w:val="28"/>
+        </w:rPr>
         <w:sectPr>
           <w:headerReference w:type="even" r:id="rId2"/>
           <w:headerReference w:type="default" r:id="rId3"/>
@@ -46,15 +54,6 @@
           <w:textDirection w:val="lrTb"/>
           <w:docGrid w:type="default" w:linePitch="360" w:charSpace="0"/>
         </w:sectPr>
-        <w:pStyle w:val="Subtitle"/>
-        <w:spacing w:before="0" w:after="720"/>
-        <w:rPr>
-          <w:b/>
-          <w:i w:val="false"/>
-          <w:i w:val="false"/>
-          <w:color w:val="000000"/>
-          <w:sz w:val="28"/>
-        </w:rPr>
       </w:pPr>
       <w:r>
         <w:rPr>
@@ -826,6 +825,7 @@
                 <w:color w:val="000000"/>
                 <w:u w:val="single"/>
               </w:rPr>
+              <w:t>03/04/2026</w:t>
             </w:r>
           </w:p>
         </w:tc>
@@ -852,6 +852,7 @@
               <w:rPr>
                 <w:color w:val="000000"/>
               </w:rPr>
+              <w:t>1.5</w:t>
             </w:r>
           </w:p>
         </w:tc>
@@ -878,6 +879,19 @@
               <w:rPr>
                 <w:color w:val="000000"/>
               </w:rPr>
+              <w:t>Added 3.</w:t>
+            </w:r>
+            <w:r>
+              <w:rPr>
+                <w:color w:val="000000"/>
+              </w:rPr>
+              <w:t>1.</w:t>
+            </w:r>
+            <w:r>
+              <w:rPr>
+                <w:color w:val="000000"/>
+              </w:rPr>
+              <w:t>8</w:t>
             </w:r>
           </w:p>
         </w:tc>
@@ -905,6 +919,7 @@
               <w:rPr>
                 <w:color w:val="000000"/>
               </w:rPr>
+              <w:t>Manny Gonzales</w:t>
             </w:r>
           </w:p>
         </w:tc>
@@ -936,6 +951,7 @@
                 <w:color w:val="000000"/>
                 <w:u w:val="single"/>
               </w:rPr>
+              <w:t>03/04/2026</w:t>
             </w:r>
           </w:p>
         </w:tc>
@@ -962,6 +978,7 @@
               <w:rPr>
                 <w:color w:val="000000"/>
               </w:rPr>
+              <w:t>1.5.1</w:t>
             </w:r>
           </w:p>
         </w:tc>
@@ -988,6 +1005,7 @@
               <w:rPr>
                 <w:color w:val="000000"/>
               </w:rPr>
+              <w:t>Added 3.1.5, cleaned formatting and entries for sections 3 and 4</w:t>
             </w:r>
           </w:p>
         </w:tc>
@@ -1015,6 +1033,7 @@
               <w:rPr>
                 <w:color w:val="000000"/>
               </w:rPr>
+              <w:t>Nick Vu</w:t>
             </w:r>
           </w:p>
         </w:tc>
@@ -2232,6 +2251,11 @@
     </w:tbl>
     <w:p>
       <w:pPr>
+        <w:pStyle w:val="Normal"/>
+        <w:rPr>
+          <w:color w:val="000000"/>
+          <w:u w:val="single"/>
+        </w:rPr>
         <w:sectPr>
           <w:headerReference w:type="even" r:id="rId8"/>
           <w:headerReference w:type="default" r:id="rId9"/>
@@ -2247,11 +2271,6 @@
           <w:textDirection w:val="lrTb"/>
           <w:docGrid w:type="default" w:linePitch="360" w:charSpace="0"/>
         </w:sectPr>
-        <w:pStyle w:val="Normal"/>
-        <w:rPr>
-          <w:color w:val="000000"/>
-          <w:u w:val="single"/>
-        </w:rPr>
       </w:pPr>
       <w:r>
         <w:rPr>
@@ -3263,8 +3282,8 @@
           <w:r>
             <w:rPr>
               <w:rStyle w:val="IndexLink"/>
+              <w:caps w:val="false"/>
               <w:smallCaps w:val="false"/>
-              <w:caps w:val="false"/>
               <w:lang w:eastAsia="en-US"/>
             </w:rPr>
             <w:fldChar w:fldCharType="end"/>
@@ -4560,43 +4579,6 @@
       <w:pPr>
         <w:pStyle w:val="Paragraph2"/>
         <w:rPr>
-          <w:color w:val="7030A0"/>
-        </w:rPr>
-      </w:pPr>
-      <w:bookmarkStart w:id="18" w:name="REQBV1F34"/>
-      <w:r>
-        <w:rPr>
-          <w:color w:val="7030A0"/>
-        </w:rPr>
-        <w:t xml:space="preserve">Provide module specific requirements as appropriate. </w:t>
-      </w:r>
-      <w:r>
-        <w:rPr>
-          <w:vanish/>
-          <w:color w:val="7030A0"/>
-        </w:rPr>
-        <w:t xml:space="preserve">SR10 </w:t>
-      </w:r>
-      <w:bookmarkEnd w:id="18"/>
-    </w:p>
-    <w:p>
-      <w:pPr>
-        <w:pStyle w:val="Paragraph2"/>
-        <w:rPr>
-          <w:color w:val="7030A0"/>
-        </w:rPr>
-      </w:pPr>
-      <w:r>
-        <w:rPr>
-          <w:color w:val="7030A0"/>
-        </w:rPr>
-        <w:t>Example:</w:t>
-      </w:r>
-    </w:p>
-    <w:p>
-      <w:pPr>
-        <w:pStyle w:val="Paragraph2"/>
-        <w:rPr>
           <w:color w:val="00B0F0"/>
         </w:rPr>
       </w:pPr>
@@ -4637,73 +4619,11 @@
     <w:p>
       <w:pPr>
         <w:pStyle w:val="Paragraph2"/>
-        <w:rPr>
-          <w:b/>
-          <w:bCs/>
-        </w:rPr>
-      </w:pPr>
-      <w:bookmarkStart w:id="19" w:name="REQBV2F75"/>
-      <w:r>
-        <w:rPr>
-          <w:color w:val="7030A0"/>
-        </w:rPr>
-        <w:t xml:space="preserve">Provide module specific requirements as appropriate. </w:t>
-      </w:r>
-      <w:r>
-        <w:rPr>
-          <w:vanish/>
-          <w:color w:val="7030A0"/>
-        </w:rPr>
-        <w:t xml:space="preserve">SR10 </w:t>
-      </w:r>
-      <w:bookmarkEnd w:id="19"/>
-      <w:r>
-        <w:rPr>
-          <w:b/>
-          <w:bCs/>
-        </w:rPr>
-        <w:tab/>
-      </w:r>
-    </w:p>
-    <w:p>
-      <w:pPr>
-        <w:pStyle w:val="Paragraph2"/>
-        <w:rPr>
-          <w:color w:val="7030A0"/>
-        </w:rPr>
-      </w:pPr>
-      <w:r>
-        <w:rPr>
-          <w:color w:val="7030A0"/>
-        </w:rPr>
-        <w:t>Example:</w:t>
-      </w:r>
-    </w:p>
-    <w:p>
-      <w:pPr>
-        <w:pStyle w:val="Paragraph2"/>
-        <w:rPr>
-          <w:color w:val="7030A0"/>
-        </w:rPr>
-      </w:pPr>
-      <w:r>
-        <w:rPr>
-          <w:color w:val="7030A0"/>
-        </w:rPr>
-        <w:t xml:space="preserve">3.1.2.1 </w:t>
-      </w:r>
-      <w:r>
-        <w:rPr>
-          <w:vanish/>
-          <w:color w:val="7030A0"/>
-        </w:rPr>
-        <w:t xml:space="preserve">SR9 </w:t>
-      </w:r>
-      <w:r>
-        <w:rPr>
-          <w:color w:val="7030A0"/>
-        </w:rPr>
-        <w:t>Users should be allowed to log in using their issued id and pin, both of which are alphanumeric strings between 6 and 20 characters in length. </w:t>
+        <w:ind w:hanging="0" w:start="0"/>
+        <w:rPr/>
+      </w:pPr>
+      <w:r>
+        <w:rPr/>
       </w:r>
     </w:p>
     <w:p>
@@ -4723,65 +4643,11 @@
     <w:p>
       <w:pPr>
         <w:pStyle w:val="Paragraph2"/>
-        <w:rPr>
-          <w:color w:val="7030A0"/>
-        </w:rPr>
-      </w:pPr>
-      <w:bookmarkStart w:id="20" w:name="REQBV2YM5"/>
-      <w:r>
-        <w:rPr>
-          <w:color w:val="7030A0"/>
-        </w:rPr>
-        <w:t xml:space="preserve">Provide module specific requirements as appropriate. </w:t>
-      </w:r>
-      <w:r>
-        <w:rPr>
-          <w:vanish/>
-          <w:color w:val="7030A0"/>
-        </w:rPr>
-        <w:t xml:space="preserve">SR10 </w:t>
-      </w:r>
-      <w:bookmarkEnd w:id="20"/>
-    </w:p>
-    <w:p>
-      <w:pPr>
-        <w:pStyle w:val="Paragraph2"/>
-        <w:rPr>
-          <w:color w:val="7030A0"/>
-        </w:rPr>
-      </w:pPr>
-      <w:r>
-        <w:rPr>
-          <w:color w:val="7030A0"/>
-        </w:rPr>
-        <w:t>Example:</w:t>
-      </w:r>
-    </w:p>
-    <w:p>
-      <w:pPr>
-        <w:pStyle w:val="Paragraph2"/>
-        <w:rPr>
-          <w:color w:val="7030A0"/>
-        </w:rPr>
-      </w:pPr>
-      <w:r>
-        <w:rPr>
-          <w:color w:val="7030A0"/>
-        </w:rPr>
-        <w:t xml:space="preserve">3.1.2.1 </w:t>
-      </w:r>
-      <w:r>
-        <w:rPr>
-          <w:vanish/>
-          <w:color w:val="7030A0"/>
-        </w:rPr>
-        <w:t xml:space="preserve">SR9 </w:t>
-      </w:r>
-      <w:r>
-        <w:rPr>
-          <w:color w:val="7030A0"/>
-        </w:rPr>
-        <w:t>Users should be allowed to log in using their issued id and pin, both of which are alphanumeric strings between 6 and 20 characters in length. </w:t>
+        <w:ind w:hanging="0" w:start="0"/>
+        <w:rPr/>
+      </w:pPr>
+      <w:r>
+        <w:rPr/>
       </w:r>
     </w:p>
     <w:p>
@@ -4802,64 +4668,161 @@
       <w:pPr>
         <w:pStyle w:val="Paragraph2"/>
         <w:rPr>
-          <w:color w:val="7030A0"/>
-        </w:rPr>
-      </w:pPr>
-      <w:bookmarkStart w:id="21" w:name="REQBV2YM5_Copy_1"/>
-      <w:r>
-        <w:rPr>
-          <w:color w:val="7030A0"/>
-        </w:rPr>
-        <w:t xml:space="preserve">Provide module specific requirements as appropriate. </w:t>
-      </w:r>
-      <w:r>
-        <w:rPr>
-          <w:vanish/>
-          <w:color w:val="7030A0"/>
-        </w:rPr>
-        <w:t xml:space="preserve">SR10 </w:t>
-      </w:r>
-      <w:bookmarkEnd w:id="21"/>
+          <w:color w:val="00B0F0"/>
+        </w:rPr>
+      </w:pPr>
+      <w:r>
+        <w:rPr>
+          <w:color w:val="00B0F0"/>
+        </w:rPr>
+        <w:t>3.1.</w:t>
+      </w:r>
+      <w:r>
+        <w:rPr>
+          <w:color w:val="00B0F0"/>
+        </w:rPr>
+        <w:t>5</w:t>
+      </w:r>
+      <w:r>
+        <w:rPr>
+          <w:color w:val="00B0F0"/>
+        </w:rPr>
+        <w:t xml:space="preserve">.1 </w:t>
+      </w:r>
+      <w:r>
+        <w:rPr>
+          <w:color w:val="00B0F0"/>
+        </w:rPr>
+        <w:t>For the three distinct areas of the game client users interact with, the GUI will provide the proper actions and notifications based on what is happening and the role of the user.</w:t>
+      </w:r>
     </w:p>
     <w:p>
       <w:pPr>
         <w:pStyle w:val="Paragraph2"/>
         <w:rPr>
-          <w:color w:val="7030A0"/>
-        </w:rPr>
-      </w:pPr>
-      <w:r>
-        <w:rPr>
-          <w:color w:val="7030A0"/>
-        </w:rPr>
-        <w:t>Example:</w:t>
+          <w:color w:val="00B0F0"/>
+        </w:rPr>
+      </w:pPr>
+      <w:r>
+        <w:rPr>
+          <w:color w:val="00B0F0"/>
+        </w:rPr>
       </w:r>
     </w:p>
     <w:p>
       <w:pPr>
         <w:pStyle w:val="Paragraph2"/>
         <w:rPr>
-          <w:color w:val="800080"/>
-        </w:rPr>
-      </w:pPr>
-      <w:r>
-        <w:rPr>
-          <w:color w:val="800080"/>
-        </w:rPr>
-        <w:t xml:space="preserve">3.1.2.1 </w:t>
-      </w:r>
-      <w:r>
-        <w:rPr>
-          <w:vanish/>
-          <w:color w:val="800080"/>
-        </w:rPr>
-        <w:t xml:space="preserve">SR9 </w:t>
-      </w:r>
-      <w:r>
-        <w:rPr>
-          <w:color w:val="800080"/>
-        </w:rPr>
-        <w:t>Users should be allowed to log in using their issued id and pin, both of which are alphanumeric strings between 6 and 20 characters in length. </w:t>
+          <w:color w:val="00B0F0"/>
+        </w:rPr>
+      </w:pPr>
+      <w:r>
+        <w:rPr>
+          <w:color w:val="00B0F0"/>
+        </w:rPr>
+        <w:t>3.1.5.2 Between all the other classes and modules, the GUI will facilitate signals and communication between the client and server by relaying user actions and input alongside server responses and behavior.</w:t>
+      </w:r>
+    </w:p>
+    <w:p>
+      <w:pPr>
+        <w:pStyle w:val="Paragraph2"/>
+        <w:rPr>
+          <w:color w:val="00B0F0"/>
+        </w:rPr>
+      </w:pPr>
+      <w:r>
+        <w:rPr>
+          <w:color w:val="00B0F0"/>
+        </w:rPr>
+      </w:r>
+    </w:p>
+    <w:p>
+      <w:pPr>
+        <w:pStyle w:val="Paragraph2"/>
+        <w:rPr>
+          <w:color w:val="00B0F0"/>
+        </w:rPr>
+      </w:pPr>
+      <w:r>
+        <w:rPr>
+          <w:color w:val="00B0F0"/>
+        </w:rPr>
+        <w:t xml:space="preserve">3.1.5.3 </w:t>
+      </w:r>
+      <w:r>
+        <w:rPr>
+          <w:color w:val="00B0F0"/>
+        </w:rPr>
+        <w:t>T</w:t>
+      </w:r>
+      <w:r>
+        <w:rPr>
+          <w:color w:val="00B0F0"/>
+        </w:rPr>
+        <w:t xml:space="preserve">he GUI will display the relevant information </w:t>
+      </w:r>
+      <w:r>
+        <w:rPr>
+          <w:color w:val="00B0F0"/>
+        </w:rPr>
+        <w:t>for</w:t>
+      </w:r>
+      <w:r>
+        <w:rPr>
+          <w:color w:val="00B0F0"/>
+        </w:rPr>
+        <w:t xml:space="preserve"> </w:t>
+      </w:r>
+      <w:r>
+        <w:rPr>
+          <w:color w:val="00B0F0"/>
+        </w:rPr>
+        <w:t>d</w:t>
+      </w:r>
+      <w:r>
+        <w:rPr>
+          <w:color w:val="00B0F0"/>
+        </w:rPr>
+        <w:t xml:space="preserve">ifferent scenarios like phases of the game or differing timings </w:t>
+      </w:r>
+      <w:r>
+        <w:rPr>
+          <w:color w:val="00B0F0"/>
+        </w:rPr>
+        <w:t>and</w:t>
+      </w:r>
+      <w:r>
+        <w:rPr>
+          <w:color w:val="00B0F0"/>
+        </w:rPr>
+        <w:t xml:space="preserve"> specific actions.</w:t>
+      </w:r>
+    </w:p>
+    <w:p>
+      <w:pPr>
+        <w:pStyle w:val="Paragraph2"/>
+        <w:rPr>
+          <w:color w:val="00B0F0"/>
+        </w:rPr>
+      </w:pPr>
+      <w:r>
+        <w:rPr>
+          <w:color w:val="00B0F0"/>
+        </w:rPr>
+      </w:r>
+    </w:p>
+    <w:p>
+      <w:pPr>
+        <w:pStyle w:val="Paragraph2"/>
+        <w:rPr>
+          <w:color w:val="00B0F0"/>
+        </w:rPr>
+      </w:pPr>
+      <w:r>
+        <w:rPr>
+          <w:color w:val="00B0F0"/>
+        </w:rPr>
+        <w:t xml:space="preserve">3.1.5.4 </w:t>
       </w:r>
     </w:p>
     <w:p>
@@ -4883,61 +4846,8 @@
           <w:color w:val="7030A0"/>
         </w:rPr>
       </w:pPr>
-      <w:bookmarkStart w:id="22" w:name="REQBV2YM5_Copy_2"/>
-      <w:r>
-        <w:rPr>
-          <w:color w:val="7030A0"/>
-        </w:rPr>
-        <w:t xml:space="preserve">Provide module specific requirements as appropriate. </w:t>
-      </w:r>
-      <w:r>
-        <w:rPr>
-          <w:vanish/>
-          <w:color w:val="7030A0"/>
-        </w:rPr>
-        <w:t xml:space="preserve">SR10 </w:t>
-      </w:r>
-      <w:bookmarkEnd w:id="22"/>
-    </w:p>
-    <w:p>
-      <w:pPr>
-        <w:pStyle w:val="Paragraph2"/>
-        <w:rPr>
-          <w:color w:val="7030A0"/>
-        </w:rPr>
-      </w:pPr>
-      <w:r>
-        <w:rPr>
-          <w:color w:val="7030A0"/>
-        </w:rPr>
-        <w:t>Example:</w:t>
-      </w:r>
-    </w:p>
-    <w:p>
-      <w:pPr>
-        <w:pStyle w:val="Paragraph2"/>
-        <w:rPr>
-          <w:color w:val="7030A0"/>
-        </w:rPr>
-      </w:pPr>
-      <w:r>
-        <w:rPr>
-          <w:color w:val="7030A0"/>
-        </w:rPr>
-        <w:t xml:space="preserve">3.1.2.1 </w:t>
-      </w:r>
-      <w:r>
-        <w:rPr>
-          <w:vanish/>
-          <w:color w:val="7030A0"/>
-        </w:rPr>
-        <w:t xml:space="preserve">SR9 </w:t>
-      </w:r>
-      <w:r>
-        <w:rPr>
-          <w:color w:val="7030A0"/>
-        </w:rPr>
-        <w:t>Users should be allowed to log in using their issued id and pin, both of which are alphanumeric strings between 6 and 20 characters in length. </w:t>
+      <w:r>
+        <w:rPr/>
       </w:r>
     </w:p>
     <w:p>
@@ -4962,58 +4872,7 @@
         </w:rPr>
       </w:pPr>
       <w:r>
-        <w:rPr>
-          <w:color w:val="7030A0"/>
-        </w:rPr>
-        <w:t xml:space="preserve">Provide module specific requirements as appropriate. </w:t>
-      </w:r>
-      <w:r>
-        <w:rPr>
-          <w:vanish/>
-          <w:color w:val="7030A0"/>
-        </w:rPr>
-        <w:t xml:space="preserve">SR10 </w:t>
-      </w:r>
-    </w:p>
-    <w:p>
-      <w:pPr>
-        <w:pStyle w:val="Paragraph2"/>
-        <w:rPr>
-          <w:color w:val="7030A0"/>
-        </w:rPr>
-      </w:pPr>
-      <w:r>
-        <w:rPr>
-          <w:color w:val="7030A0"/>
-        </w:rPr>
-        <w:t>Example:</w:t>
-      </w:r>
-    </w:p>
-    <w:p>
-      <w:pPr>
-        <w:pStyle w:val="Paragraph2"/>
-        <w:rPr>
-          <w:color w:val="7030A0"/>
-        </w:rPr>
-      </w:pPr>
-      <w:r>
-        <w:rPr>
-          <w:color w:val="7030A0"/>
-        </w:rPr>
-        <w:t xml:space="preserve">3.1.2.1 </w:t>
-      </w:r>
-      <w:r>
-        <w:rPr>
-          <w:vanish/>
-          <w:color w:val="7030A0"/>
-        </w:rPr>
-        <w:t xml:space="preserve">SR9 </w:t>
-      </w:r>
-      <w:r>
-        <w:rPr>
-          <w:color w:val="7030A0"/>
-        </w:rPr>
-        <w:t>Users should be allowed to log in using their issued id and pin, both of which are alphanumeric strings between 6 and 20 characters in length. </w:t>
+        <w:rPr/>
       </w:r>
     </w:p>
     <w:p>
@@ -5034,41 +4893,6 @@
       <w:pPr>
         <w:pStyle w:val="Paragraph2"/>
         <w:rPr>
-          <w:color w:val="7030A0"/>
-        </w:rPr>
-      </w:pPr>
-      <w:r>
-        <w:rPr>
-          <w:color w:val="7030A0"/>
-        </w:rPr>
-        <w:t xml:space="preserve">Provide module specific requirements as appropriate. </w:t>
-      </w:r>
-      <w:r>
-        <w:rPr>
-          <w:vanish/>
-          <w:color w:val="7030A0"/>
-        </w:rPr>
-        <w:t xml:space="preserve">SR10 </w:t>
-      </w:r>
-    </w:p>
-    <w:p>
-      <w:pPr>
-        <w:pStyle w:val="Paragraph2"/>
-        <w:rPr>
-          <w:color w:val="7030A0"/>
-        </w:rPr>
-      </w:pPr>
-      <w:r>
-        <w:rPr>
-          <w:color w:val="7030A0"/>
-        </w:rPr>
-        <w:t>Example:</w:t>
-      </w:r>
-    </w:p>
-    <w:p>
-      <w:pPr>
-        <w:pStyle w:val="Paragraph2"/>
-        <w:rPr>
           <w:color w:val="00B0F0"/>
         </w:rPr>
       </w:pPr>
@@ -5173,25 +4997,35 @@
         <w:rPr>
           <w:color w:val="00B0F0"/>
         </w:rPr>
-        <w:t>3.1.8.</w:t>
-      </w:r>
-      <w:r>
+        <w:t>3.1.8.7 Dealer can offer insurance when they show an Ace. Player must pay an additional 50% of their original bet. If dealer has blackjack, player receives 2:1 from insurance. Else the player would lose the additional 50%.</w:t>
+      </w:r>
+    </w:p>
+    <w:p>
+      <w:pPr>
+        <w:pStyle w:val="Paragraph2"/>
         <w:rPr>
           <w:color w:val="00B0F0"/>
         </w:rPr>
-        <w:t>7</w:t>
-      </w:r>
+      </w:pPr>
       <w:r>
         <w:rPr>
           <w:color w:val="00B0F0"/>
         </w:rPr>
-        <w:t xml:space="preserve"> Dealer can offer insurance when they show an Ace. Player must pay an additional 50% of their original bet. </w:t>
-      </w:r>
-      <w:r>
+        <w:t>3.1.8.8 Players and Dealer bust when their hand value is over 21</w:t>
+      </w:r>
+    </w:p>
+    <w:p>
+      <w:pPr>
+        <w:pStyle w:val="Paragraph2"/>
         <w:rPr>
           <w:color w:val="00B0F0"/>
         </w:rPr>
-        <w:t>If dealer has blackjack, player receives 2:1 from insurance. Else the player would lose the additional 50%.</w:t>
+      </w:pPr>
+      <w:r>
+        <w:rPr>
+          <w:color w:val="00B0F0"/>
+        </w:rPr>
+        <w:t>3.1.8.9 If the player’s hand value is greater than the dealer, but less or equal to 21, they win.</w:t>
       </w:r>
     </w:p>
     <w:p>
@@ -5205,19 +5039,21 @@
         <w:rPr>
           <w:color w:val="00B0F0"/>
         </w:rPr>
-        <w:t>3.1.8.</w:t>
-      </w:r>
-      <w:r>
+        <w:t>3.1.8.10 If the player and dealer tie, bet is returned.</w:t>
+      </w:r>
+    </w:p>
+    <w:p>
+      <w:pPr>
+        <w:pStyle w:val="Paragraph2"/>
         <w:rPr>
           <w:color w:val="00B0F0"/>
         </w:rPr>
-        <w:t>8</w:t>
-      </w:r>
+      </w:pPr>
       <w:r>
         <w:rPr>
           <w:color w:val="00B0F0"/>
         </w:rPr>
-        <w:t xml:space="preserve"> Players and Dealer bust when their hand value is over 21</w:t>
+        <w:t>3.1.8.11 If any player has a blackjack they beat the dealer unless the dealer also has blackjack.</w:t>
       </w:r>
     </w:p>
     <w:p>
@@ -5231,61 +5067,7 @@
         <w:rPr>
           <w:color w:val="00B0F0"/>
         </w:rPr>
-        <w:t>3.1.8.</w:t>
-      </w:r>
-      <w:r>
-        <w:rPr>
-          <w:color w:val="00B0F0"/>
-        </w:rPr>
-        <w:t>9 If the player’s hand value is greater than the dealer, but less or equal to 21, they win.</w:t>
-      </w:r>
-    </w:p>
-    <w:p>
-      <w:pPr>
-        <w:pStyle w:val="Paragraph2"/>
-        <w:rPr>
-          <w:color w:val="00B0F0"/>
-        </w:rPr>
-      </w:pPr>
-      <w:r>
-        <w:rPr>
-          <w:color w:val="00B0F0"/>
-        </w:rPr>
-        <w:t>3.1.8.10 If the player and dealer tie, bet is returned.</w:t>
-      </w:r>
-    </w:p>
-    <w:p>
-      <w:pPr>
-        <w:pStyle w:val="Paragraph2"/>
-        <w:rPr>
-          <w:color w:val="00B0F0"/>
-        </w:rPr>
-      </w:pPr>
-      <w:r>
-        <w:rPr>
-          <w:color w:val="00B0F0"/>
-        </w:rPr>
-        <w:t>3.1.8.11 If any player has a blackjack they beat the dealer unless the dealer also has blackjack.</w:t>
-      </w:r>
-    </w:p>
-    <w:p>
-      <w:pPr>
-        <w:pStyle w:val="Paragraph2"/>
-        <w:rPr>
-          <w:color w:val="00B0F0"/>
-        </w:rPr>
-      </w:pPr>
-      <w:r>
-        <w:rPr>
-          <w:color w:val="00B0F0"/>
-        </w:rPr>
-        <w:t xml:space="preserve">3.1.8.12 </w:t>
-      </w:r>
-      <w:r>
-        <w:rPr>
-          <w:color w:val="00B0F0"/>
-        </w:rPr>
-        <w:t>If a player has a blackjack and wins, player gets 3 to 2 their bet</w:t>
+        <w:t>3.1.8.12 If a player has a blackjack and wins, player gets 3 to 2 their bet</w:t>
       </w:r>
     </w:p>
     <w:p>
@@ -5336,8 +5118,8 @@
         </w:numPr>
         <w:rPr/>
       </w:pPr>
-      <w:bookmarkStart w:id="23" w:name="__RefHeading___Toc19440736"/>
-      <w:bookmarkEnd w:id="23"/>
+      <w:bookmarkStart w:id="18" w:name="__RefHeading___Toc19440736"/>
+      <w:bookmarkEnd w:id="18"/>
       <w:r>
         <w:rPr/>
         <w:t>External Interface Requirements</w:t>
@@ -5347,86 +5129,15 @@
       <w:pPr>
         <w:pStyle w:val="Paragraph2"/>
         <w:rPr>
-          <w:color w:val="7030A0"/>
-        </w:rPr>
-      </w:pPr>
-      <w:bookmarkStart w:id="24" w:name="REQBUZLF2"/>
-      <w:r>
-        <w:rPr>
-          <w:color w:val="7030A0"/>
-        </w:rPr>
-        <w:t xml:space="preserve">Provide module specific requirements as appropriate. </w:t>
-      </w:r>
-      <w:r>
-        <w:rPr>
-          <w:vanish/>
-          <w:color w:val="7030A0"/>
-        </w:rPr>
-        <w:t xml:space="preserve">SR10 </w:t>
-      </w:r>
-    </w:p>
-    <w:p>
-      <w:pPr>
-        <w:pStyle w:val="Paragraph2"/>
-        <w:rPr>
-          <w:color w:val="7030A0"/>
-        </w:rPr>
-      </w:pPr>
-      <w:r>
-        <w:rPr>
-          <w:color w:val="7030A0"/>
-        </w:rPr>
-        <w:t>Example:</w:t>
-      </w:r>
-    </w:p>
-    <w:p>
-      <w:pPr>
-        <w:pStyle w:val="Paragraph2"/>
-        <w:rPr>
-          <w:color w:val="7030A0"/>
-        </w:rPr>
-      </w:pPr>
-      <w:r>
-        <w:rPr>
-          <w:color w:val="7030A0"/>
+          <w:color w:val="0070C0"/>
+        </w:rPr>
+      </w:pPr>
+      <w:r>
+        <w:rPr>
+          <w:color w:val="0070C0"/>
         </w:rPr>
         <w:t xml:space="preserve">3.2.1 </w:t>
       </w:r>
-      <w:r>
-        <w:rPr>
-          <w:vanish/>
-          <w:color w:val="7030A0"/>
-        </w:rPr>
-        <w:t xml:space="preserve">SR9 SR1 </w:t>
-      </w:r>
-      <w:r>
-        <w:rPr>
-          <w:color w:val="7030A0"/>
-        </w:rPr>
-        <w:t>The system must provide an interface to the University billing system administered by the Bursar’s office so that students can be automatically billed for the courses in which they have enrolled. The interface is to be in a comma-separated text file containing</w:t>
-      </w:r>
-      <w:r>
-        <w:rPr>
-          <w:color w:val="800000"/>
-          <w:u w:val="double"/>
-        </w:rPr>
-        <w:t xml:space="preserve"> </w:t>
-      </w:r>
-      <w:r>
-        <w:rPr>
-          <w:color w:val="7030A0"/>
-        </w:rPr>
-        <w:t>the following fields: student id, course id, term id, action. Where “action” is whether the student has added or dropped the course. The file will be exported nightly and will contain new transactions only. </w:t>
-      </w:r>
-      <w:bookmarkEnd w:id="24"/>
-    </w:p>
-    <w:p>
-      <w:pPr>
-        <w:pStyle w:val="Paragraph2"/>
-        <w:rPr>
-          <w:color w:val="0070C0"/>
-        </w:rPr>
-      </w:pPr>
       <w:r>
         <w:rPr>
           <w:color w:val="0070C0"/>
@@ -5443,8 +5154,8 @@
         </w:numPr>
         <w:rPr/>
       </w:pPr>
-      <w:bookmarkStart w:id="25" w:name="__RefHeading___Toc19440737"/>
-      <w:bookmarkEnd w:id="25"/>
+      <w:bookmarkStart w:id="19" w:name="__RefHeading___Toc19440737"/>
+      <w:bookmarkEnd w:id="19"/>
       <w:r>
         <w:rPr/>
         <w:t>Internal Interface Requirements</w:t>
@@ -5452,98 +5163,38 @@
     </w:p>
     <w:p>
       <w:pPr>
-        <w:pStyle w:val="Paragraph2"/>
-        <w:rPr>
-          <w:color w:val="7030A0"/>
-        </w:rPr>
-      </w:pPr>
-      <w:bookmarkStart w:id="26" w:name="REQBV3515"/>
-      <w:r>
-        <w:rPr>
-          <w:color w:val="7030A0"/>
-        </w:rPr>
-        <w:t xml:space="preserve">Provide module specific requirements as appropriate. </w:t>
-      </w:r>
-      <w:r>
-        <w:rPr>
-          <w:vanish/>
-          <w:color w:val="7030A0"/>
-        </w:rPr>
-        <w:t xml:space="preserve">SR10 </w:t>
-      </w:r>
-    </w:p>
-    <w:p>
-      <w:pPr>
-        <w:pStyle w:val="Paragraph2"/>
-        <w:rPr>
-          <w:color w:val="7030A0"/>
-        </w:rPr>
-      </w:pPr>
-      <w:r>
-        <w:rPr>
-          <w:color w:val="7030A0"/>
-        </w:rPr>
-        <w:t>Example:</w:t>
-      </w:r>
-    </w:p>
-    <w:p>
-      <w:pPr>
         <w:pStyle w:val="Normal"/>
         <w:ind w:start="1440"/>
         <w:rPr>
-          <w:color w:val="7030A0"/>
-        </w:rPr>
-      </w:pPr>
-      <w:r>
-        <w:rPr>
-          <w:color w:val="7030A0"/>
+          <w:color w:val="0070C0"/>
+        </w:rPr>
+      </w:pPr>
+      <w:r>
+        <w:rPr>
+          <w:color w:val="0070C0"/>
         </w:rPr>
         <w:t xml:space="preserve">3.3.1 </w:t>
       </w:r>
       <w:r>
         <w:rPr>
-          <w:vanish/>
-          <w:color w:val="7030A0"/>
-        </w:rPr>
-        <w:t xml:space="preserve">SR17 </w:t>
-      </w:r>
-      <w:r>
-        <w:rPr>
-          <w:color w:val="7030A0"/>
-        </w:rPr>
-        <w:t>The system must process a data-feed from the grading system such that student grades are stored along with the historical student course enrolments. Data feed will be in the form of a comma-separated interface file that is exported from the grading system nightly.</w:t>
-      </w:r>
-      <w:bookmarkEnd w:id="26"/>
+          <w:color w:val="0070C0"/>
+        </w:rPr>
+        <w:t>All gameplay calculations must be performed on the server and only relevant data to each play must be sent to them.</w:t>
+      </w:r>
     </w:p>
     <w:p>
       <w:pPr>
         <w:pStyle w:val="Normal"/>
         <w:ind w:start="1440"/>
         <w:rPr>
-          <w:color w:val="7030A0"/>
-        </w:rPr>
-      </w:pPr>
-      <w:bookmarkStart w:id="27" w:name="REQBV46L8"/>
-      <w:r>
-        <w:rPr>
-          <w:color w:val="7030A0"/>
-        </w:rPr>
-        <w:t xml:space="preserve">3.3.2 </w:t>
-      </w:r>
-      <w:r>
-        <w:rPr>
-          <w:vanish/>
-          <w:color w:val="7030A0"/>
-        </w:rPr>
-        <w:t xml:space="preserve">SR24 </w:t>
-      </w:r>
-      <w:r>
-        <w:rPr>
-          <w:color w:val="7030A0"/>
-        </w:rPr>
-        <w:t>The system must process a data-feed from the University billing system that contains new student records. The feed will be in the form of a comma-separated text file and will be exported from the billing system nightly with new student records. The fields included in the file are student name, student id, and student pin number.  </w:t>
-      </w:r>
-      <w:bookmarkEnd w:id="27"/>
+          <w:color w:val="0070C0"/>
+        </w:rPr>
+      </w:pPr>
+      <w:r>
+        <w:rPr>
+          <w:color w:val="0070C0"/>
+        </w:rPr>
+      </w:r>
     </w:p>
     <w:p>
       <w:pPr>
@@ -5557,17 +5208,8 @@
         <w:rPr>
           <w:color w:val="0070C0"/>
         </w:rPr>
-        <w:t>All gameplay calculations must be performed on the server and only relevant data to each play must be sent to them.</w:t>
-      </w:r>
-    </w:p>
-    <w:p>
-      <w:pPr>
-        <w:pStyle w:val="Normal"/>
-        <w:ind w:start="1440"/>
-        <w:rPr>
-          <w:color w:val="0070C0"/>
-        </w:rPr>
-      </w:pPr>
+        <w:t xml:space="preserve">3.3.2 </w:t>
+      </w:r>
       <w:r>
         <w:rPr>
           <w:color w:val="0070C0"/>
@@ -5584,8 +5226,8 @@
         </w:numPr>
         <w:rPr/>
       </w:pPr>
-      <w:bookmarkStart w:id="28" w:name="__RefHeading___Toc19440738"/>
-      <w:bookmarkEnd w:id="28"/>
+      <w:bookmarkStart w:id="20" w:name="__RefHeading___Toc19440738"/>
+      <w:bookmarkEnd w:id="20"/>
       <w:r>
         <w:rPr/>
         <w:t>Non-Functional Requirements</w:t>
@@ -5600,8 +5242,8 @@
         </w:numPr>
         <w:rPr/>
       </w:pPr>
-      <w:bookmarkStart w:id="29" w:name="__RefHeading___Toc19440739"/>
-      <w:bookmarkEnd w:id="29"/>
+      <w:bookmarkStart w:id="21" w:name="__RefHeading___Toc19440739"/>
+      <w:bookmarkEnd w:id="21"/>
       <w:r>
         <w:rPr/>
         <w:t>Security and Privacy Requirements</w:t>
@@ -5609,43 +5251,17 @@
     </w:p>
     <w:p>
       <w:pPr>
-        <w:pStyle w:val="Normal"/>
-        <w:ind w:firstLine="720" w:start="720"/>
-        <w:rPr>
-          <w:color w:val="7030A0"/>
-        </w:rPr>
-      </w:pPr>
-      <w:r>
-        <w:rPr>
-          <w:color w:val="7030A0"/>
-        </w:rPr>
-        <w:t>Example:</w:t>
-      </w:r>
-    </w:p>
-    <w:p>
-      <w:pPr>
-        <w:pStyle w:val="Normal"/>
-        <w:ind w:firstLine="720" w:start="720"/>
-        <w:rPr>
-          <w:color w:val="7030A0"/>
-        </w:rPr>
-      </w:pPr>
-      <w:bookmarkStart w:id="30" w:name="REQBV1AR4"/>
-      <w:r>
-        <w:rPr>
-          <w:color w:val="7030A0"/>
-        </w:rPr>
-        <w:t>4.1.1 The Blackjack Handling System shall hold user account information in a file unaccessible to regular users.</w:t>
-      </w:r>
-      <w:bookmarkEnd w:id="30"/>
-    </w:p>
-    <w:p>
-      <w:pPr>
         <w:pStyle w:val="Paragraph2"/>
         <w:rPr>
           <w:color w:val="0070C0"/>
         </w:rPr>
       </w:pPr>
+      <w:r>
+        <w:rPr>
+          <w:color w:val="0070C0"/>
+        </w:rPr>
+        <w:t xml:space="preserve">4.4.1 </w:t>
+      </w:r>
       <w:r>
         <w:rPr>
           <w:color w:val="0070C0"/>
@@ -5676,8 +5292,8 @@
         </w:numPr>
         <w:rPr/>
       </w:pPr>
-      <w:bookmarkStart w:id="31" w:name="__RefHeading___Toc19440740"/>
-      <w:bookmarkEnd w:id="31"/>
+      <w:bookmarkStart w:id="22" w:name="__RefHeading___Toc19440740"/>
+      <w:bookmarkEnd w:id="22"/>
       <w:r>
         <w:rPr/>
         <w:t>Environmental Requirements</w:t>
@@ -5691,7 +5307,7 @@
           <w:color w:val="7030A0"/>
         </w:rPr>
       </w:pPr>
-      <w:bookmarkStart w:id="32" w:name="REQBV3HG5"/>
+      <w:bookmarkStart w:id="23" w:name="REQBV3HG5"/>
       <w:r>
         <w:rPr>
           <w:color w:val="7030A0"/>
@@ -5726,7 +5342,7 @@
         </w:rPr>
         <w:t>System cannot require that any software other than a web browser be installed on user computers. </w:t>
       </w:r>
-      <w:bookmarkEnd w:id="32"/>
+      <w:bookmarkEnd w:id="23"/>
     </w:p>
     <w:p>
       <w:pPr>
@@ -5736,7 +5352,7 @@
           <w:color w:val="7030A0"/>
         </w:rPr>
       </w:pPr>
-      <w:bookmarkStart w:id="33" w:name="REQBV5QU8"/>
+      <w:bookmarkStart w:id="24" w:name="REQBV5QU8"/>
       <w:r>
         <w:rPr>
           <w:color w:val="7030A0"/>
@@ -5756,7 +5372,7 @@
         </w:rPr>
         <w:t>System must make use of the University’s existing Oracle 9i implementation for its database. </w:t>
       </w:r>
-      <w:bookmarkEnd w:id="33"/>
+      <w:bookmarkEnd w:id="24"/>
     </w:p>
     <w:p>
       <w:pPr>
@@ -5766,7 +5382,7 @@
           <w:color w:val="7030A0"/>
         </w:rPr>
       </w:pPr>
-      <w:bookmarkStart w:id="34" w:name="REQBV5RT8"/>
+      <w:bookmarkStart w:id="25" w:name="REQBV5RT8"/>
       <w:r>
         <w:rPr>
           <w:color w:val="7030A0"/>
@@ -5786,7 +5402,7 @@
         </w:rPr>
         <w:t>System must be deployed on existing Linux-based server infrastructure. </w:t>
       </w:r>
-      <w:bookmarkEnd w:id="34"/>
+      <w:bookmarkEnd w:id="25"/>
     </w:p>
     <w:p>
       <w:pPr>
@@ -5811,66 +5427,29 @@
         </w:numPr>
         <w:rPr/>
       </w:pPr>
-      <w:bookmarkStart w:id="35" w:name="__RefHeading___Toc19440741"/>
-      <w:bookmarkEnd w:id="35"/>
+      <w:bookmarkStart w:id="26" w:name="__RefHeading___Toc19440741"/>
+      <w:bookmarkEnd w:id="26"/>
       <w:r>
         <w:rPr/>
         <w:t>Performance Requirements</w:t>
       </w:r>
+      <w:bookmarkStart w:id="27" w:name="REQBV5SS8"/>
+      <w:bookmarkEnd w:id="27"/>
     </w:p>
     <w:p>
       <w:pPr>
         <w:pStyle w:val="Normal"/>
         <w:ind w:start="1440"/>
         <w:rPr>
-          <w:color w:val="7030A0"/>
-        </w:rPr>
-      </w:pPr>
-      <w:bookmarkStart w:id="36" w:name="REQBV5SS8"/>
-      <w:r>
-        <w:rPr>
-          <w:color w:val="7030A0"/>
-        </w:rPr>
-        <w:t>Example:</w:t>
-      </w:r>
-    </w:p>
-    <w:p>
-      <w:pPr>
-        <w:pStyle w:val="Normal"/>
-        <w:ind w:start="1440"/>
-        <w:rPr>
-          <w:color w:val="7030A0"/>
-        </w:rPr>
-      </w:pPr>
-      <w:r>
-        <w:rPr>
-          <w:color w:val="7030A0"/>
+          <w:color w:val="0070C0"/>
+        </w:rPr>
+      </w:pPr>
+      <w:r>
+        <w:rPr>
+          <w:color w:val="0070C0"/>
         </w:rPr>
         <w:t xml:space="preserve">4.3.1 </w:t>
       </w:r>
-      <w:r>
-        <w:rPr>
-          <w:vanish/>
-          <w:color w:val="7030A0"/>
-        </w:rPr>
-        <w:t xml:space="preserve">SR27 </w:t>
-      </w:r>
-      <w:r>
-        <w:rPr>
-          <w:color w:val="7030A0"/>
-        </w:rPr>
-        <w:t>System must render all UI pages in no more than 9 seconds for dynamic pages. Static pages (HTML-only) must be rendered in less than 3 seconds. </w:t>
-      </w:r>
-      <w:bookmarkEnd w:id="36"/>
-    </w:p>
-    <w:p>
-      <w:pPr>
-        <w:pStyle w:val="Normal"/>
-        <w:ind w:start="1440"/>
-        <w:rPr>
-          <w:color w:val="0070C0"/>
-        </w:rPr>
-      </w:pPr>
       <w:r>
         <w:rPr>
           <w:color w:val="0070C0"/>
@@ -6146,7 +5725,7 @@
         </mc:Choice>
         <mc:Fallback>
           <w:pict>
-            <v:rect id="shape_0" ID="Frame1" path="m0,0l-2147483645,0l-2147483645,-2147483646l0,-2147483646xe" stroked="f" o:allowincell="f" style="position:absolute;margin-left:213.65pt;margin-top:0.05pt;width:4.6pt;height:9.3pt;mso-wrap-style:square;v-text-anchor:top;mso-position-horizontal:center;mso-position-horizontal-relative:margin" wp14:anchorId="07B49E00">
+            <v:rect id="shape_0" stroked="f" o:allowincell="f" style="position:absolute;margin-left:213.65pt;margin-top:0.05pt;width:4.6pt;height:9.3pt;mso-wrap-style:square;v-text-anchor:top;mso-position-horizontal:center;mso-position-horizontal-relative:margin" wp14:anchorId="07B49E00">
               <v:fill o:detectmouseclick="t" on="false"/>
               <v:stroke color="#3465a4" joinstyle="round" endcap="flat"/>
               <v:textbox>
@@ -6307,7 +5886,7 @@
         </mc:Choice>
         <mc:Fallback>
           <w:pict>
-            <v:rect id="shape_0" ID="Frame1" path="m0,0l-2147483645,0l-2147483645,-2147483646l0,-2147483646xe" stroked="f" o:allowincell="f" style="position:absolute;margin-left:213.65pt;margin-top:0.05pt;width:4.6pt;height:9.3pt;mso-wrap-style:square;v-text-anchor:top;mso-position-horizontal:center;mso-position-horizontal-relative:margin" wp14:anchorId="07B49E00">
+            <v:rect id="shape_0" stroked="f" o:allowincell="f" style="position:absolute;margin-left:213.65pt;margin-top:0.05pt;width:4.6pt;height:9.3pt;mso-wrap-style:square;v-text-anchor:top;mso-position-horizontal:center;mso-position-horizontal-relative:margin" wp14:anchorId="07B49E00">
               <v:fill o:detectmouseclick="t" on="false"/>
               <v:stroke color="#3465a4" joinstyle="round" endcap="flat"/>
               <v:textbox>
@@ -6391,7 +5970,7 @@
       <mc:AlternateContent>
         <mc:Choice Requires="wps">
           <w:drawing>
-            <wp:anchor behindDoc="1" distT="0" distB="0" distL="0" distR="0" simplePos="0" locked="0" layoutInCell="0" allowOverlap="1" relativeHeight="19" wp14:anchorId="16546B0F">
+            <wp:anchor behindDoc="1" distT="0" distB="0" distL="0" distR="0" simplePos="0" locked="0" layoutInCell="0" allowOverlap="1" relativeHeight="17" wp14:anchorId="16546B0F">
               <wp:simplePos x="0" y="0"/>
               <wp:positionH relativeFrom="margin">
                 <wp:align>center</wp:align>
@@ -6459,7 +6038,7 @@
                               <w:rStyle w:val="PageNumber"/>
                               <w:color w:val="000000"/>
                             </w:rPr>
-                            <w:t>xi</w:t>
+                            <w:t>x</w:t>
                           </w:r>
                           <w:r>
                             <w:rPr>
@@ -6482,7 +6061,7 @@
         </mc:Choice>
         <mc:Fallback>
           <w:pict>
-            <v:rect id="shape_0" ID="Frame2" path="m0,0l-2147483645,0l-2147483645,-2147483646l0,-2147483646xe" stroked="f" o:allowincell="f" style="position:absolute;margin-left:213.15pt;margin-top:0.05pt;width:5.6pt;height:1.75pt;mso-wrap-style:square;v-text-anchor:top;mso-position-horizontal:center;mso-position-horizontal-relative:margin" wp14:anchorId="16546B0F">
+            <v:rect id="shape_0" stroked="f" o:allowincell="f" style="position:absolute;margin-left:213.15pt;margin-top:0.05pt;width:5.6pt;height:1.75pt;mso-wrap-style:square;v-text-anchor:top;mso-position-horizontal:center;mso-position-horizontal-relative:margin" wp14:anchorId="16546B0F">
               <v:fill o:detectmouseclick="t" on="false"/>
               <v:stroke color="#3465a4" joinstyle="round" endcap="flat"/>
               <v:textbox>
@@ -6518,7 +6097,7 @@
                         <w:rStyle w:val="PageNumber"/>
                         <w:color w:val="000000"/>
                       </w:rPr>
-                      <w:t>xi</w:t>
+                      <w:t>x</w:t>
                     </w:r>
                     <w:r>
                       <w:rPr>
@@ -6703,7 +6282,7 @@
 <w:hdr xmlns:o="urn:schemas-microsoft-com:office:office" xmlns:r="http://schemas.openxmlformats.org/officeDocument/2006/relationships" xmlns:v="urn:schemas-microsoft-com:vml" xmlns:w="http://schemas.openxmlformats.org/wordprocessingml/2006/main" xmlns:w10="urn:schemas-microsoft-com:office:word" xmlns:wp="http://schemas.openxmlformats.org/drawingml/2006/wordprocessingDrawing" xmlns:pic="http://schemas.openxmlformats.org/drawingml/2006/picture" xmlns:wps="http://schemas.microsoft.com/office/word/2010/wordprocessingShape" xmlns:wpg="http://schemas.microsoft.com/office/word/2010/wordprocessingGroup" xmlns:mc="http://schemas.openxmlformats.org/markup-compatibility/2006" xmlns:wp14="http://schemas.microsoft.com/office/word/2010/wordprocessingDrawing" xmlns:w14="http://schemas.microsoft.com/office/word/2010/wordml" xmlns:w15="http://schemas.microsoft.com/office/word/2012/wordml" mc:Ignorable="w14 wp14 w15">
   <w:p>
     <w:pPr>
-      <w:pStyle w:val="HeaderLeft"/>
+      <w:pStyle w:val="HeaderLeftuser"/>
       <w:rPr/>
     </w:pPr>
     <w:r>
@@ -6718,8 +6297,8 @@
   <w:abstractNum w:abstractNumId="1">
     <w:lvl w:ilvl="0">
       <w:start w:val="1"/>
+      <w:numFmt w:val="decimal"/>
       <w:pStyle w:val="Heading1"/>
-      <w:numFmt w:val="decimal"/>
       <w:lvlText w:val="%1."/>
       <w:lvlJc w:val="start"/>
       <w:pPr>
@@ -6729,16 +6308,16 @@
         <w:ind w:start="720" w:hanging="720"/>
       </w:pPr>
       <w:rPr>
-        <w:sz w:val="36"/>
         <w:b/>
         <w:kern w:val="2"/>
+        <w:sz w:val="36"/>
         <w:lang w:val="en-US" w:bidi="en-US"/>
       </w:rPr>
     </w:lvl>
     <w:lvl w:ilvl="1">
       <w:start w:val="1"/>
+      <w:numFmt w:val="decimal"/>
       <w:pStyle w:val="Heading2"/>
-      <w:numFmt w:val="decimal"/>
       <w:lvlText w:val="%1.%2."/>
       <w:lvlJc w:val="start"/>
       <w:pPr>
@@ -6751,8 +6330,8 @@
     </w:lvl>
     <w:lvl w:ilvl="2">
       <w:start w:val="1"/>
+      <w:numFmt w:val="decimal"/>
       <w:pStyle w:val="Heading3"/>
-      <w:numFmt w:val="decimal"/>
       <w:lvlText w:val="%1.%2.%3."/>
       <w:lvlJc w:val="start"/>
       <w:pPr>
@@ -6765,8 +6344,8 @@
     </w:lvl>
     <w:lvl w:ilvl="3">
       <w:start w:val="1"/>
+      <w:numFmt w:val="decimal"/>
       <w:pStyle w:val="Heading4"/>
-      <w:numFmt w:val="decimal"/>
       <w:lvlText w:val="%1.%2.%3.%4."/>
       <w:lvlJc w:val="start"/>
       <w:pPr>
@@ -6779,8 +6358,8 @@
     </w:lvl>
     <w:lvl w:ilvl="4">
       <w:start w:val="1"/>
+      <w:numFmt w:val="decimal"/>
       <w:pStyle w:val="Heading5"/>
-      <w:numFmt w:val="decimal"/>
       <w:lvlText w:val="%1.%2.%3.%4.%5."/>
       <w:lvlJc w:val="start"/>
       <w:pPr>
@@ -6793,8 +6372,8 @@
     </w:lvl>
     <w:lvl w:ilvl="5">
       <w:start w:val="1"/>
+      <w:numFmt w:val="decimal"/>
       <w:pStyle w:val="Heading6"/>
-      <w:numFmt w:val="decimal"/>
       <w:lvlText w:val="%1.%2.%3.%4.%5.%6."/>
       <w:lvlJc w:val="start"/>
       <w:pPr>
@@ -6807,8 +6386,8 @@
     </w:lvl>
     <w:lvl w:ilvl="6">
       <w:start w:val="1"/>
+      <w:numFmt w:val="decimal"/>
       <w:pStyle w:val="Heading7"/>
-      <w:numFmt w:val="decimal"/>
       <w:lvlText w:val="%1.%2.%3.%4.%5.%6.%7."/>
       <w:lvlJc w:val="start"/>
       <w:pPr>
@@ -6821,8 +6400,8 @@
     </w:lvl>
     <w:lvl w:ilvl="7">
       <w:start w:val="1"/>
+      <w:numFmt w:val="decimal"/>
       <w:pStyle w:val="Heading8"/>
-      <w:numFmt w:val="decimal"/>
       <w:lvlText w:val="%1.%2.%3.%4.%5.%6.%7.%8."/>
       <w:lvlJc w:val="start"/>
       <w:pPr>
@@ -6835,8 +6414,8 @@
     </w:lvl>
     <w:lvl w:ilvl="8">
       <w:start w:val="1"/>
+      <w:numFmt w:val="decimal"/>
       <w:pStyle w:val="Heading9"/>
-      <w:numFmt w:val="decimal"/>
       <w:lvlText w:val="%1.%2.%3.%4.%5.%6.%7.%8.%9."/>
       <w:lvlJc w:val="start"/>
       <w:pPr>
@@ -6861,9 +6440,9 @@
         <w:ind w:start="720" w:hanging="720"/>
       </w:pPr>
       <w:rPr>
-        <w:sz w:val="36"/>
         <w:b/>
         <w:kern w:val="2"/>
+        <w:sz w:val="36"/>
         <w:lang w:val="en-US" w:bidi="en-US"/>
       </w:rPr>
     </w:lvl>
@@ -7392,7 +6971,7 @@
       <w:kern w:val="0"/>
       <w:sz w:val="20"/>
       <w:szCs w:val="20"/>
-      <w:lang w:bidi="ar-SA" w:val="en-US" w:eastAsia="zh-CN"/>
+      <w:lang w:val="en-US" w:eastAsia="zh-CN" w:bidi="ar-SA"/>
     </w:rPr>
   </w:style>
   <w:style w:type="paragraph" w:styleId="Heading1">
@@ -8008,7 +7587,7 @@
       <w:kern w:val="0"/>
       <w:sz w:val="20"/>
       <w:szCs w:val="20"/>
-      <w:lang w:bidi="ar-SA" w:val="en-US" w:eastAsia="zh-CN"/>
+      <w:lang w:val="en-US" w:eastAsia="zh-CN" w:bidi="ar-SA"/>
     </w:rPr>
   </w:style>
   <w:style w:type="paragraph" w:styleId="BodyTextIndent">
@@ -8040,15 +7619,15 @@
       <w:bCs/>
     </w:rPr>
   </w:style>
-  <w:style w:type="paragraph" w:styleId="FrameContents" w:customStyle="1">
-    <w:name w:val="Frame Contents"/>
+  <w:style w:type="paragraph" w:styleId="FrameContentsuser" w:customStyle="1">
+    <w:name w:val="Frame Contents (user)"/>
     <w:basedOn w:val="Normal"/>
     <w:qFormat/>
     <w:pPr/>
     <w:rPr/>
   </w:style>
-  <w:style w:type="paragraph" w:styleId="HeaderLeft" w:customStyle="1">
-    <w:name w:val="Header Left"/>
+  <w:style w:type="paragraph" w:styleId="HeaderLeftuser" w:customStyle="1">
+    <w:name w:val="Header Left (user)"/>
     <w:basedOn w:val="Normal"/>
     <w:qFormat/>
     <w:pPr>
@@ -8061,8 +7640,8 @@
     </w:pPr>
     <w:rPr/>
   </w:style>
-  <w:style w:type="paragraph" w:styleId="FrameContentsuser" w:customStyle="1">
-    <w:name w:val="Frame Contents (user)"/>
+  <w:style w:type="paragraph" w:styleId="FrameContents" w:customStyle="1">
+    <w:name w:val="Frame Contents"/>
     <w:basedOn w:val="Normal"/>
     <w:qFormat/>
     <w:pPr/>

</xml_diff>

<commit_message>
Finished adding requirements for 3.1.8
</commit_message>
<xml_diff>
--- a/CS 401 - Group 2 - SRS Doc.docx
+++ b/CS 401 - Group 2 - SRS Doc.docx
@@ -156,14 +156,14 @@
     <w:tbl>
       <w:tblPr>
         <w:tblW w:w="8763" w:type="dxa"/>
-        <w:jc w:val="start"/>
+        <w:jc w:val="left"/>
         <w:tblInd w:w="-115" w:type="dxa"/>
         <w:tblLayout w:type="fixed"/>
         <w:tblCellMar>
           <w:top w:w="0" w:type="dxa"/>
-          <w:start w:w="99" w:type="dxa"/>
+          <w:left w:w="99" w:type="dxa"/>
           <w:bottom w:w="0" w:type="dxa"/>
-          <w:end w:w="108" w:type="dxa"/>
+          <w:right w:w="108" w:type="dxa"/>
         </w:tblCellMar>
         <w:tblLook w:firstRow="1" w:noVBand="1" w:lastRow="0" w:firstColumn="1" w:lastColumn="0" w:noHBand="0" w:val="04a0"/>
       </w:tblPr>
@@ -171,7 +171,7 @@
         <w:gridCol w:w="1275"/>
         <w:gridCol w:w="1083"/>
         <w:gridCol w:w="3812"/>
-        <w:gridCol w:w="2593"/>
+        <w:gridCol w:w="2592"/>
       </w:tblGrid>
       <w:tr>
         <w:trPr/>
@@ -180,7 +180,7 @@
             <w:tcW w:w="1275" w:type="dxa"/>
             <w:tcBorders>
               <w:top w:val="single" w:sz="6" w:space="0" w:color="000000"/>
-              <w:start w:val="single" w:sz="6" w:space="0" w:color="000000"/>
+              <w:left w:val="single" w:sz="6" w:space="0" w:color="000000"/>
               <w:bottom w:val="single" w:sz="6" w:space="0" w:color="000000"/>
             </w:tcBorders>
             <w:shd w:color="auto" w:fill="E5E5E5" w:val="clear"/>
@@ -209,7 +209,7 @@
             <w:tcW w:w="1083" w:type="dxa"/>
             <w:tcBorders>
               <w:top w:val="single" w:sz="6" w:space="0" w:color="000000"/>
-              <w:start w:val="single" w:sz="6" w:space="0" w:color="000000"/>
+              <w:left w:val="single" w:sz="6" w:space="0" w:color="000000"/>
               <w:bottom w:val="single" w:sz="6" w:space="0" w:color="000000"/>
             </w:tcBorders>
             <w:shd w:color="auto" w:fill="E5E5E5" w:val="clear"/>
@@ -238,7 +238,7 @@
             <w:tcW w:w="3812" w:type="dxa"/>
             <w:tcBorders>
               <w:top w:val="single" w:sz="6" w:space="0" w:color="000000"/>
-              <w:start w:val="single" w:sz="6" w:space="0" w:color="000000"/>
+              <w:left w:val="single" w:sz="6" w:space="0" w:color="000000"/>
               <w:bottom w:val="single" w:sz="6" w:space="0" w:color="000000"/>
             </w:tcBorders>
             <w:shd w:color="auto" w:fill="E5E5E5" w:val="clear"/>
@@ -264,12 +264,12 @@
         </w:tc>
         <w:tc>
           <w:tcPr>
-            <w:tcW w:w="2593" w:type="dxa"/>
+            <w:tcW w:w="2592" w:type="dxa"/>
             <w:tcBorders>
               <w:top w:val="single" w:sz="6" w:space="0" w:color="000000"/>
-              <w:start w:val="single" w:sz="6" w:space="0" w:color="000000"/>
+              <w:left w:val="single" w:sz="6" w:space="0" w:color="000000"/>
               <w:bottom w:val="single" w:sz="6" w:space="0" w:color="000000"/>
-              <w:end w:val="single" w:sz="6" w:space="0" w:color="000000"/>
+              <w:right w:val="single" w:sz="6" w:space="0" w:color="000000"/>
             </w:tcBorders>
             <w:shd w:color="auto" w:fill="E5E5E5" w:val="clear"/>
           </w:tcPr>
@@ -300,7 +300,7 @@
             <w:tcW w:w="1275" w:type="dxa"/>
             <w:tcBorders>
               <w:top w:val="single" w:sz="6" w:space="0" w:color="000000"/>
-              <w:start w:val="single" w:sz="6" w:space="0" w:color="000000"/>
+              <w:left w:val="single" w:sz="6" w:space="0" w:color="000000"/>
               <w:bottom w:val="single" w:sz="6" w:space="0" w:color="000000"/>
             </w:tcBorders>
             <w:shd w:color="auto" w:fill="E5E5E5" w:val="clear"/>
@@ -326,7 +326,7 @@
             <w:tcW w:w="1083" w:type="dxa"/>
             <w:tcBorders>
               <w:top w:val="single" w:sz="6" w:space="0" w:color="000000"/>
-              <w:start w:val="single" w:sz="6" w:space="0" w:color="000000"/>
+              <w:left w:val="single" w:sz="6" w:space="0" w:color="000000"/>
               <w:bottom w:val="single" w:sz="6" w:space="0" w:color="000000"/>
             </w:tcBorders>
             <w:shd w:color="auto" w:fill="E5E5E5" w:val="clear"/>
@@ -352,7 +352,7 @@
             <w:tcW w:w="3812" w:type="dxa"/>
             <w:tcBorders>
               <w:top w:val="single" w:sz="6" w:space="0" w:color="000000"/>
-              <w:start w:val="single" w:sz="6" w:space="0" w:color="000000"/>
+              <w:left w:val="single" w:sz="6" w:space="0" w:color="000000"/>
               <w:bottom w:val="single" w:sz="6" w:space="0" w:color="000000"/>
             </w:tcBorders>
             <w:shd w:color="auto" w:fill="E5E5E5" w:val="clear"/>
@@ -375,12 +375,12 @@
         </w:tc>
         <w:tc>
           <w:tcPr>
-            <w:tcW w:w="2593" w:type="dxa"/>
+            <w:tcW w:w="2592" w:type="dxa"/>
             <w:tcBorders>
               <w:top w:val="single" w:sz="6" w:space="0" w:color="000000"/>
-              <w:start w:val="single" w:sz="6" w:space="0" w:color="000000"/>
+              <w:left w:val="single" w:sz="6" w:space="0" w:color="000000"/>
               <w:bottom w:val="single" w:sz="6" w:space="0" w:color="000000"/>
-              <w:end w:val="single" w:sz="6" w:space="0" w:color="000000"/>
+              <w:right w:val="single" w:sz="6" w:space="0" w:color="000000"/>
             </w:tcBorders>
             <w:shd w:color="auto" w:fill="E5E5E5" w:val="clear"/>
           </w:tcPr>
@@ -408,7 +408,7 @@
             <w:tcW w:w="1275" w:type="dxa"/>
             <w:tcBorders>
               <w:top w:val="single" w:sz="6" w:space="0" w:color="000000"/>
-              <w:start w:val="single" w:sz="6" w:space="0" w:color="000000"/>
+              <w:left w:val="single" w:sz="6" w:space="0" w:color="000000"/>
               <w:bottom w:val="single" w:sz="6" w:space="0" w:color="000000"/>
             </w:tcBorders>
             <w:shd w:color="auto" w:fill="E5E5E5" w:val="clear"/>
@@ -419,7 +419,7 @@
               <w:snapToGrid w:val="false"/>
               <w:spacing w:before="40" w:after="40"/>
               <w:rPr>
-                <w:color w:val="000000"/>
+                <w:color w:themeColor="text1" w:val="000000"/>
                 <w:u w:val="single"/>
               </w:rPr>
             </w:pPr>
@@ -437,7 +437,7 @@
             <w:tcW w:w="1083" w:type="dxa"/>
             <w:tcBorders>
               <w:top w:val="single" w:sz="6" w:space="0" w:color="000000"/>
-              <w:start w:val="single" w:sz="6" w:space="0" w:color="000000"/>
+              <w:left w:val="single" w:sz="6" w:space="0" w:color="000000"/>
               <w:bottom w:val="single" w:sz="6" w:space="0" w:color="000000"/>
             </w:tcBorders>
             <w:shd w:color="auto" w:fill="E5E5E5" w:val="clear"/>
@@ -448,7 +448,7 @@
               <w:snapToGrid w:val="false"/>
               <w:spacing w:before="40" w:after="40"/>
               <w:rPr>
-                <w:color w:val="000000"/>
+                <w:color w:themeColor="text1" w:val="000000"/>
               </w:rPr>
             </w:pPr>
             <w:r>
@@ -464,7 +464,7 @@
             <w:tcW w:w="3812" w:type="dxa"/>
             <w:tcBorders>
               <w:top w:val="single" w:sz="6" w:space="0" w:color="000000"/>
-              <w:start w:val="single" w:sz="6" w:space="0" w:color="000000"/>
+              <w:left w:val="single" w:sz="6" w:space="0" w:color="000000"/>
               <w:bottom w:val="single" w:sz="6" w:space="0" w:color="000000"/>
             </w:tcBorders>
             <w:shd w:color="auto" w:fill="E5E5E5" w:val="clear"/>
@@ -475,7 +475,7 @@
               <w:snapToGrid w:val="false"/>
               <w:spacing w:before="40" w:after="40"/>
               <w:rPr>
-                <w:color w:val="000000"/>
+                <w:color w:themeColor="text1" w:val="000000"/>
               </w:rPr>
             </w:pPr>
             <w:r>
@@ -488,12 +488,12 @@
         </w:tc>
         <w:tc>
           <w:tcPr>
-            <w:tcW w:w="2593" w:type="dxa"/>
+            <w:tcW w:w="2592" w:type="dxa"/>
             <w:tcBorders>
               <w:top w:val="single" w:sz="6" w:space="0" w:color="000000"/>
-              <w:start w:val="single" w:sz="6" w:space="0" w:color="000000"/>
+              <w:left w:val="single" w:sz="6" w:space="0" w:color="000000"/>
               <w:bottom w:val="single" w:sz="6" w:space="0" w:color="000000"/>
-              <w:end w:val="single" w:sz="6" w:space="0" w:color="000000"/>
+              <w:right w:val="single" w:sz="6" w:space="0" w:color="000000"/>
             </w:tcBorders>
             <w:shd w:color="auto" w:fill="E5E5E5" w:val="clear"/>
           </w:tcPr>
@@ -503,7 +503,7 @@
               <w:snapToGrid w:val="false"/>
               <w:spacing w:before="40" w:after="40"/>
               <w:rPr>
-                <w:color w:val="000000"/>
+                <w:color w:themeColor="text1" w:val="000000"/>
               </w:rPr>
             </w:pPr>
             <w:r>
@@ -522,7 +522,7 @@
             <w:tcW w:w="1275" w:type="dxa"/>
             <w:tcBorders>
               <w:top w:val="single" w:sz="6" w:space="0" w:color="000000"/>
-              <w:start w:val="single" w:sz="6" w:space="0" w:color="000000"/>
+              <w:left w:val="single" w:sz="6" w:space="0" w:color="000000"/>
               <w:bottom w:val="single" w:sz="6" w:space="0" w:color="000000"/>
             </w:tcBorders>
             <w:shd w:color="auto" w:fill="E5E5E5" w:val="clear"/>
@@ -533,7 +533,7 @@
               <w:snapToGrid w:val="false"/>
               <w:spacing w:before="40" w:after="40"/>
               <w:rPr>
-                <w:color w:val="000000"/>
+                <w:color w:themeColor="text1" w:val="000000"/>
                 <w:u w:val="single"/>
               </w:rPr>
             </w:pPr>
@@ -551,7 +551,7 @@
             <w:tcW w:w="1083" w:type="dxa"/>
             <w:tcBorders>
               <w:top w:val="single" w:sz="6" w:space="0" w:color="000000"/>
-              <w:start w:val="single" w:sz="6" w:space="0" w:color="000000"/>
+              <w:left w:val="single" w:sz="6" w:space="0" w:color="000000"/>
               <w:bottom w:val="single" w:sz="6" w:space="0" w:color="000000"/>
             </w:tcBorders>
             <w:shd w:color="auto" w:fill="E5E5E5" w:val="clear"/>
@@ -562,7 +562,7 @@
               <w:snapToGrid w:val="false"/>
               <w:spacing w:before="40" w:after="40"/>
               <w:rPr>
-                <w:color w:val="000000"/>
+                <w:color w:themeColor="text1" w:val="000000"/>
               </w:rPr>
             </w:pPr>
             <w:r>
@@ -578,7 +578,7 @@
             <w:tcW w:w="3812" w:type="dxa"/>
             <w:tcBorders>
               <w:top w:val="single" w:sz="6" w:space="0" w:color="000000"/>
-              <w:start w:val="single" w:sz="6" w:space="0" w:color="000000"/>
+              <w:left w:val="single" w:sz="6" w:space="0" w:color="000000"/>
               <w:bottom w:val="single" w:sz="6" w:space="0" w:color="000000"/>
             </w:tcBorders>
             <w:shd w:color="auto" w:fill="E5E5E5" w:val="clear"/>
@@ -589,7 +589,7 @@
               <w:snapToGrid w:val="false"/>
               <w:spacing w:before="40" w:after="40"/>
               <w:rPr>
-                <w:color w:val="000000"/>
+                <w:color w:themeColor="text1" w:val="000000"/>
               </w:rPr>
             </w:pPr>
             <w:r>
@@ -602,12 +602,12 @@
         </w:tc>
         <w:tc>
           <w:tcPr>
-            <w:tcW w:w="2593" w:type="dxa"/>
+            <w:tcW w:w="2592" w:type="dxa"/>
             <w:tcBorders>
               <w:top w:val="single" w:sz="6" w:space="0" w:color="000000"/>
-              <w:start w:val="single" w:sz="6" w:space="0" w:color="000000"/>
+              <w:left w:val="single" w:sz="6" w:space="0" w:color="000000"/>
               <w:bottom w:val="single" w:sz="6" w:space="0" w:color="000000"/>
-              <w:end w:val="single" w:sz="6" w:space="0" w:color="000000"/>
+              <w:right w:val="single" w:sz="6" w:space="0" w:color="000000"/>
             </w:tcBorders>
             <w:shd w:color="auto" w:fill="E5E5E5" w:val="clear"/>
           </w:tcPr>
@@ -617,7 +617,7 @@
               <w:snapToGrid w:val="false"/>
               <w:spacing w:before="40" w:after="40"/>
               <w:rPr>
-                <w:color w:val="000000"/>
+                <w:color w:themeColor="text1" w:val="000000"/>
               </w:rPr>
             </w:pPr>
             <w:r>
@@ -636,7 +636,7 @@
             <w:tcW w:w="1275" w:type="dxa"/>
             <w:tcBorders>
               <w:top w:val="single" w:sz="6" w:space="0" w:color="000000"/>
-              <w:start w:val="single" w:sz="6" w:space="0" w:color="000000"/>
+              <w:left w:val="single" w:sz="6" w:space="0" w:color="000000"/>
               <w:bottom w:val="single" w:sz="6" w:space="0" w:color="000000"/>
             </w:tcBorders>
             <w:shd w:color="auto" w:fill="E5E5E5" w:val="clear"/>
@@ -665,7 +665,7 @@
             <w:tcW w:w="1083" w:type="dxa"/>
             <w:tcBorders>
               <w:top w:val="single" w:sz="6" w:space="0" w:color="000000"/>
-              <w:start w:val="single" w:sz="6" w:space="0" w:color="000000"/>
+              <w:left w:val="single" w:sz="6" w:space="0" w:color="000000"/>
               <w:bottom w:val="single" w:sz="6" w:space="0" w:color="000000"/>
             </w:tcBorders>
             <w:shd w:color="auto" w:fill="E5E5E5" w:val="clear"/>
@@ -692,7 +692,7 @@
             <w:tcW w:w="3812" w:type="dxa"/>
             <w:tcBorders>
               <w:top w:val="single" w:sz="6" w:space="0" w:color="000000"/>
-              <w:start w:val="single" w:sz="6" w:space="0" w:color="000000"/>
+              <w:left w:val="single" w:sz="6" w:space="0" w:color="000000"/>
               <w:bottom w:val="single" w:sz="6" w:space="0" w:color="000000"/>
             </w:tcBorders>
             <w:shd w:color="auto" w:fill="E5E5E5" w:val="clear"/>
@@ -716,12 +716,12 @@
         </w:tc>
         <w:tc>
           <w:tcPr>
-            <w:tcW w:w="2593" w:type="dxa"/>
+            <w:tcW w:w="2592" w:type="dxa"/>
             <w:tcBorders>
               <w:top w:val="single" w:sz="6" w:space="0" w:color="000000"/>
-              <w:start w:val="single" w:sz="6" w:space="0" w:color="000000"/>
+              <w:left w:val="single" w:sz="6" w:space="0" w:color="000000"/>
               <w:bottom w:val="single" w:sz="6" w:space="0" w:color="000000"/>
-              <w:end w:val="single" w:sz="6" w:space="0" w:color="000000"/>
+              <w:right w:val="single" w:sz="6" w:space="0" w:color="000000"/>
             </w:tcBorders>
             <w:shd w:color="auto" w:fill="E5E5E5" w:val="clear"/>
           </w:tcPr>
@@ -750,7 +750,7 @@
             <w:tcW w:w="1275" w:type="dxa"/>
             <w:tcBorders>
               <w:top w:val="single" w:sz="6" w:space="0" w:color="000000"/>
-              <w:start w:val="single" w:sz="6" w:space="0" w:color="000000"/>
+              <w:left w:val="single" w:sz="6" w:space="0" w:color="000000"/>
               <w:bottom w:val="single" w:sz="6" w:space="0" w:color="000000"/>
             </w:tcBorders>
             <w:shd w:color="auto" w:fill="E5E5E5" w:val="clear"/>
@@ -779,7 +779,7 @@
             <w:tcW w:w="1083" w:type="dxa"/>
             <w:tcBorders>
               <w:top w:val="single" w:sz="6" w:space="0" w:color="000000"/>
-              <w:start w:val="single" w:sz="6" w:space="0" w:color="000000"/>
+              <w:left w:val="single" w:sz="6" w:space="0" w:color="000000"/>
               <w:bottom w:val="single" w:sz="6" w:space="0" w:color="000000"/>
             </w:tcBorders>
             <w:shd w:color="auto" w:fill="E5E5E5" w:val="clear"/>
@@ -806,7 +806,7 @@
             <w:tcW w:w="3812" w:type="dxa"/>
             <w:tcBorders>
               <w:top w:val="single" w:sz="6" w:space="0" w:color="000000"/>
-              <w:start w:val="single" w:sz="6" w:space="0" w:color="000000"/>
+              <w:left w:val="single" w:sz="6" w:space="0" w:color="000000"/>
               <w:bottom w:val="single" w:sz="6" w:space="0" w:color="000000"/>
             </w:tcBorders>
             <w:shd w:color="auto" w:fill="E5E5E5" w:val="clear"/>
@@ -830,12 +830,12 @@
         </w:tc>
         <w:tc>
           <w:tcPr>
-            <w:tcW w:w="2593" w:type="dxa"/>
+            <w:tcW w:w="2592" w:type="dxa"/>
             <w:tcBorders>
               <w:top w:val="single" w:sz="6" w:space="0" w:color="000000"/>
-              <w:start w:val="single" w:sz="6" w:space="0" w:color="000000"/>
+              <w:left w:val="single" w:sz="6" w:space="0" w:color="000000"/>
               <w:bottom w:val="single" w:sz="6" w:space="0" w:color="000000"/>
-              <w:end w:val="single" w:sz="6" w:space="0" w:color="000000"/>
+              <w:right w:val="single" w:sz="6" w:space="0" w:color="000000"/>
             </w:tcBorders>
             <w:shd w:color="auto" w:fill="E5E5E5" w:val="clear"/>
           </w:tcPr>
@@ -864,7 +864,7 @@
             <w:tcW w:w="1275" w:type="dxa"/>
             <w:tcBorders>
               <w:top w:val="single" w:sz="6" w:space="0" w:color="000000"/>
-              <w:start w:val="single" w:sz="6" w:space="0" w:color="000000"/>
+              <w:left w:val="single" w:sz="6" w:space="0" w:color="000000"/>
               <w:bottom w:val="single" w:sz="6" w:space="0" w:color="000000"/>
             </w:tcBorders>
             <w:shd w:color="auto" w:fill="E5E5E5" w:val="clear"/>
@@ -893,7 +893,7 @@
             <w:tcW w:w="1083" w:type="dxa"/>
             <w:tcBorders>
               <w:top w:val="single" w:sz="6" w:space="0" w:color="000000"/>
-              <w:start w:val="single" w:sz="6" w:space="0" w:color="000000"/>
+              <w:left w:val="single" w:sz="6" w:space="0" w:color="000000"/>
               <w:bottom w:val="single" w:sz="6" w:space="0" w:color="000000"/>
             </w:tcBorders>
             <w:shd w:color="auto" w:fill="E5E5E5" w:val="clear"/>
@@ -920,7 +920,7 @@
             <w:tcW w:w="3812" w:type="dxa"/>
             <w:tcBorders>
               <w:top w:val="single" w:sz="6" w:space="0" w:color="000000"/>
-              <w:start w:val="single" w:sz="6" w:space="0" w:color="000000"/>
+              <w:left w:val="single" w:sz="6" w:space="0" w:color="000000"/>
               <w:bottom w:val="single" w:sz="6" w:space="0" w:color="000000"/>
             </w:tcBorders>
             <w:shd w:color="auto" w:fill="E5E5E5" w:val="clear"/>
@@ -944,12 +944,12 @@
         </w:tc>
         <w:tc>
           <w:tcPr>
-            <w:tcW w:w="2593" w:type="dxa"/>
+            <w:tcW w:w="2592" w:type="dxa"/>
             <w:tcBorders>
               <w:top w:val="single" w:sz="6" w:space="0" w:color="000000"/>
-              <w:start w:val="single" w:sz="6" w:space="0" w:color="000000"/>
+              <w:left w:val="single" w:sz="6" w:space="0" w:color="000000"/>
               <w:bottom w:val="single" w:sz="6" w:space="0" w:color="000000"/>
-              <w:end w:val="single" w:sz="6" w:space="0" w:color="000000"/>
+              <w:right w:val="single" w:sz="6" w:space="0" w:color="000000"/>
             </w:tcBorders>
             <w:shd w:color="auto" w:fill="E5E5E5" w:val="clear"/>
           </w:tcPr>
@@ -966,13 +966,7 @@
               <w:rPr>
                 <w:color w:val="000000"/>
               </w:rPr>
-              <w:t>Manny Gonzale</w:t>
-            </w:r>
-            <w:r>
-              <w:rPr>
-                <w:color w:val="000000"/>
-              </w:rPr>
-              <w:t>z</w:t>
+              <w:t>Manny Gonzalez</w:t>
             </w:r>
           </w:p>
         </w:tc>
@@ -984,7 +978,7 @@
             <w:tcW w:w="1275" w:type="dxa"/>
             <w:tcBorders>
               <w:top w:val="single" w:sz="6" w:space="0" w:color="000000"/>
-              <w:start w:val="single" w:sz="6" w:space="0" w:color="000000"/>
+              <w:left w:val="single" w:sz="6" w:space="0" w:color="000000"/>
               <w:bottom w:val="single" w:sz="6" w:space="0" w:color="000000"/>
             </w:tcBorders>
             <w:shd w:color="auto" w:fill="E5E5E5" w:val="clear"/>
@@ -1013,7 +1007,7 @@
             <w:tcW w:w="1083" w:type="dxa"/>
             <w:tcBorders>
               <w:top w:val="single" w:sz="6" w:space="0" w:color="000000"/>
-              <w:start w:val="single" w:sz="6" w:space="0" w:color="000000"/>
+              <w:left w:val="single" w:sz="6" w:space="0" w:color="000000"/>
               <w:bottom w:val="single" w:sz="6" w:space="0" w:color="000000"/>
             </w:tcBorders>
             <w:shd w:color="auto" w:fill="E5E5E5" w:val="clear"/>
@@ -1040,7 +1034,7 @@
             <w:tcW w:w="3812" w:type="dxa"/>
             <w:tcBorders>
               <w:top w:val="single" w:sz="6" w:space="0" w:color="000000"/>
-              <w:start w:val="single" w:sz="6" w:space="0" w:color="000000"/>
+              <w:left w:val="single" w:sz="6" w:space="0" w:color="000000"/>
               <w:bottom w:val="single" w:sz="6" w:space="0" w:color="000000"/>
             </w:tcBorders>
             <w:shd w:color="auto" w:fill="E5E5E5" w:val="clear"/>
@@ -1064,12 +1058,12 @@
         </w:tc>
         <w:tc>
           <w:tcPr>
-            <w:tcW w:w="2593" w:type="dxa"/>
+            <w:tcW w:w="2592" w:type="dxa"/>
             <w:tcBorders>
               <w:top w:val="single" w:sz="6" w:space="0" w:color="000000"/>
-              <w:start w:val="single" w:sz="6" w:space="0" w:color="000000"/>
+              <w:left w:val="single" w:sz="6" w:space="0" w:color="000000"/>
               <w:bottom w:val="single" w:sz="6" w:space="0" w:color="000000"/>
-              <w:end w:val="single" w:sz="6" w:space="0" w:color="000000"/>
+              <w:right w:val="single" w:sz="6" w:space="0" w:color="000000"/>
             </w:tcBorders>
             <w:shd w:color="auto" w:fill="E5E5E5" w:val="clear"/>
           </w:tcPr>
@@ -1098,7 +1092,7 @@
             <w:tcW w:w="1275" w:type="dxa"/>
             <w:tcBorders>
               <w:top w:val="single" w:sz="6" w:space="0" w:color="000000"/>
-              <w:start w:val="single" w:sz="6" w:space="0" w:color="000000"/>
+              <w:left w:val="single" w:sz="6" w:space="0" w:color="000000"/>
               <w:bottom w:val="single" w:sz="6" w:space="0" w:color="000000"/>
             </w:tcBorders>
             <w:shd w:color="auto" w:fill="E5E5E5" w:val="clear"/>
@@ -1127,7 +1121,7 @@
             <w:tcW w:w="1083" w:type="dxa"/>
             <w:tcBorders>
               <w:top w:val="single" w:sz="6" w:space="0" w:color="000000"/>
-              <w:start w:val="single" w:sz="6" w:space="0" w:color="000000"/>
+              <w:left w:val="single" w:sz="6" w:space="0" w:color="000000"/>
               <w:bottom w:val="single" w:sz="6" w:space="0" w:color="000000"/>
             </w:tcBorders>
             <w:shd w:color="auto" w:fill="E5E5E5" w:val="clear"/>
@@ -1154,7 +1148,7 @@
             <w:tcW w:w="3812" w:type="dxa"/>
             <w:tcBorders>
               <w:top w:val="single" w:sz="6" w:space="0" w:color="000000"/>
-              <w:start w:val="single" w:sz="6" w:space="0" w:color="000000"/>
+              <w:left w:val="single" w:sz="6" w:space="0" w:color="000000"/>
               <w:bottom w:val="single" w:sz="6" w:space="0" w:color="000000"/>
             </w:tcBorders>
             <w:shd w:color="auto" w:fill="E5E5E5" w:val="clear"/>
@@ -1178,12 +1172,12 @@
         </w:tc>
         <w:tc>
           <w:tcPr>
-            <w:tcW w:w="2593" w:type="dxa"/>
+            <w:tcW w:w="2592" w:type="dxa"/>
             <w:tcBorders>
               <w:top w:val="single" w:sz="6" w:space="0" w:color="000000"/>
-              <w:start w:val="single" w:sz="6" w:space="0" w:color="000000"/>
+              <w:left w:val="single" w:sz="6" w:space="0" w:color="000000"/>
               <w:bottom w:val="single" w:sz="6" w:space="0" w:color="000000"/>
-              <w:end w:val="single" w:sz="6" w:space="0" w:color="000000"/>
+              <w:right w:val="single" w:sz="6" w:space="0" w:color="000000"/>
             </w:tcBorders>
             <w:shd w:color="auto" w:fill="E5E5E5" w:val="clear"/>
           </w:tcPr>
@@ -1212,7 +1206,7 @@
             <w:tcW w:w="1275" w:type="dxa"/>
             <w:tcBorders>
               <w:top w:val="single" w:sz="6" w:space="0" w:color="000000"/>
-              <w:start w:val="single" w:sz="6" w:space="0" w:color="000000"/>
+              <w:left w:val="single" w:sz="6" w:space="0" w:color="000000"/>
               <w:bottom w:val="single" w:sz="6" w:space="0" w:color="000000"/>
             </w:tcBorders>
             <w:shd w:color="auto" w:fill="E5E5E5" w:val="clear"/>
@@ -1240,7 +1234,7 @@
             <w:tcW w:w="1083" w:type="dxa"/>
             <w:tcBorders>
               <w:top w:val="single" w:sz="6" w:space="0" w:color="000000"/>
-              <w:start w:val="single" w:sz="6" w:space="0" w:color="000000"/>
+              <w:left w:val="single" w:sz="6" w:space="0" w:color="000000"/>
               <w:bottom w:val="single" w:sz="6" w:space="0" w:color="000000"/>
             </w:tcBorders>
             <w:shd w:color="auto" w:fill="E5E5E5" w:val="clear"/>
@@ -1266,7 +1260,7 @@
             <w:tcW w:w="3812" w:type="dxa"/>
             <w:tcBorders>
               <w:top w:val="single" w:sz="6" w:space="0" w:color="000000"/>
-              <w:start w:val="single" w:sz="6" w:space="0" w:color="000000"/>
+              <w:left w:val="single" w:sz="6" w:space="0" w:color="000000"/>
               <w:bottom w:val="single" w:sz="6" w:space="0" w:color="000000"/>
             </w:tcBorders>
             <w:shd w:color="auto" w:fill="E5E5E5" w:val="clear"/>
@@ -1289,12 +1283,12 @@
         </w:tc>
         <w:tc>
           <w:tcPr>
-            <w:tcW w:w="2593" w:type="dxa"/>
+            <w:tcW w:w="2592" w:type="dxa"/>
             <w:tcBorders>
               <w:top w:val="single" w:sz="6" w:space="0" w:color="000000"/>
-              <w:start w:val="single" w:sz="6" w:space="0" w:color="000000"/>
+              <w:left w:val="single" w:sz="6" w:space="0" w:color="000000"/>
               <w:bottom w:val="single" w:sz="6" w:space="0" w:color="000000"/>
-              <w:end w:val="single" w:sz="6" w:space="0" w:color="000000"/>
+              <w:right w:val="single" w:sz="6" w:space="0" w:color="000000"/>
             </w:tcBorders>
             <w:shd w:color="auto" w:fill="E5E5E5" w:val="clear"/>
           </w:tcPr>
@@ -1322,7 +1316,7 @@
             <w:tcW w:w="1275" w:type="dxa"/>
             <w:tcBorders>
               <w:top w:val="single" w:sz="6" w:space="0" w:color="000000"/>
-              <w:start w:val="single" w:sz="6" w:space="0" w:color="000000"/>
+              <w:left w:val="single" w:sz="6" w:space="0" w:color="000000"/>
               <w:bottom w:val="single" w:sz="6" w:space="0" w:color="000000"/>
             </w:tcBorders>
             <w:shd w:color="auto" w:fill="E5E5E5" w:val="clear"/>
@@ -1350,7 +1344,7 @@
             <w:tcW w:w="1083" w:type="dxa"/>
             <w:tcBorders>
               <w:top w:val="single" w:sz="6" w:space="0" w:color="000000"/>
-              <w:start w:val="single" w:sz="6" w:space="0" w:color="000000"/>
+              <w:left w:val="single" w:sz="6" w:space="0" w:color="000000"/>
               <w:bottom w:val="single" w:sz="6" w:space="0" w:color="000000"/>
             </w:tcBorders>
             <w:shd w:color="auto" w:fill="E5E5E5" w:val="clear"/>
@@ -1376,7 +1370,7 @@
             <w:tcW w:w="3812" w:type="dxa"/>
             <w:tcBorders>
               <w:top w:val="single" w:sz="6" w:space="0" w:color="000000"/>
-              <w:start w:val="single" w:sz="6" w:space="0" w:color="000000"/>
+              <w:left w:val="single" w:sz="6" w:space="0" w:color="000000"/>
               <w:bottom w:val="single" w:sz="6" w:space="0" w:color="000000"/>
             </w:tcBorders>
             <w:shd w:color="auto" w:fill="E5E5E5" w:val="clear"/>
@@ -1399,12 +1393,12 @@
         </w:tc>
         <w:tc>
           <w:tcPr>
-            <w:tcW w:w="2593" w:type="dxa"/>
+            <w:tcW w:w="2592" w:type="dxa"/>
             <w:tcBorders>
               <w:top w:val="single" w:sz="6" w:space="0" w:color="000000"/>
-              <w:start w:val="single" w:sz="6" w:space="0" w:color="000000"/>
+              <w:left w:val="single" w:sz="6" w:space="0" w:color="000000"/>
               <w:bottom w:val="single" w:sz="6" w:space="0" w:color="000000"/>
-              <w:end w:val="single" w:sz="6" w:space="0" w:color="000000"/>
+              <w:right w:val="single" w:sz="6" w:space="0" w:color="000000"/>
             </w:tcBorders>
             <w:shd w:color="auto" w:fill="E5E5E5" w:val="clear"/>
           </w:tcPr>
@@ -1432,7 +1426,7 @@
             <w:tcW w:w="1275" w:type="dxa"/>
             <w:tcBorders>
               <w:top w:val="single" w:sz="6" w:space="0" w:color="000000"/>
-              <w:start w:val="single" w:sz="6" w:space="0" w:color="000000"/>
+              <w:left w:val="single" w:sz="6" w:space="0" w:color="000000"/>
               <w:bottom w:val="single" w:sz="6" w:space="0" w:color="000000"/>
             </w:tcBorders>
             <w:shd w:color="auto" w:fill="E5E5E5" w:val="clear"/>
@@ -1460,7 +1454,7 @@
             <w:tcW w:w="1083" w:type="dxa"/>
             <w:tcBorders>
               <w:top w:val="single" w:sz="6" w:space="0" w:color="000000"/>
-              <w:start w:val="single" w:sz="6" w:space="0" w:color="000000"/>
+              <w:left w:val="single" w:sz="6" w:space="0" w:color="000000"/>
               <w:bottom w:val="single" w:sz="6" w:space="0" w:color="000000"/>
             </w:tcBorders>
             <w:shd w:color="auto" w:fill="E5E5E5" w:val="clear"/>
@@ -1486,7 +1480,7 @@
             <w:tcW w:w="3812" w:type="dxa"/>
             <w:tcBorders>
               <w:top w:val="single" w:sz="6" w:space="0" w:color="000000"/>
-              <w:start w:val="single" w:sz="6" w:space="0" w:color="000000"/>
+              <w:left w:val="single" w:sz="6" w:space="0" w:color="000000"/>
               <w:bottom w:val="single" w:sz="6" w:space="0" w:color="000000"/>
             </w:tcBorders>
             <w:shd w:color="auto" w:fill="E5E5E5" w:val="clear"/>
@@ -1509,12 +1503,12 @@
         </w:tc>
         <w:tc>
           <w:tcPr>
-            <w:tcW w:w="2593" w:type="dxa"/>
+            <w:tcW w:w="2592" w:type="dxa"/>
             <w:tcBorders>
               <w:top w:val="single" w:sz="6" w:space="0" w:color="000000"/>
-              <w:start w:val="single" w:sz="6" w:space="0" w:color="000000"/>
+              <w:left w:val="single" w:sz="6" w:space="0" w:color="000000"/>
               <w:bottom w:val="single" w:sz="6" w:space="0" w:color="000000"/>
-              <w:end w:val="single" w:sz="6" w:space="0" w:color="000000"/>
+              <w:right w:val="single" w:sz="6" w:space="0" w:color="000000"/>
             </w:tcBorders>
             <w:shd w:color="auto" w:fill="E5E5E5" w:val="clear"/>
           </w:tcPr>
@@ -1542,7 +1536,7 @@
             <w:tcW w:w="1275" w:type="dxa"/>
             <w:tcBorders>
               <w:top w:val="single" w:sz="6" w:space="0" w:color="000000"/>
-              <w:start w:val="single" w:sz="6" w:space="0" w:color="000000"/>
+              <w:left w:val="single" w:sz="6" w:space="0" w:color="000000"/>
               <w:bottom w:val="single" w:sz="6" w:space="0" w:color="000000"/>
             </w:tcBorders>
             <w:shd w:color="auto" w:fill="E5E5E5" w:val="clear"/>
@@ -1570,7 +1564,7 @@
             <w:tcW w:w="1083" w:type="dxa"/>
             <w:tcBorders>
               <w:top w:val="single" w:sz="6" w:space="0" w:color="000000"/>
-              <w:start w:val="single" w:sz="6" w:space="0" w:color="000000"/>
+              <w:left w:val="single" w:sz="6" w:space="0" w:color="000000"/>
               <w:bottom w:val="single" w:sz="6" w:space="0" w:color="000000"/>
             </w:tcBorders>
             <w:shd w:color="auto" w:fill="E5E5E5" w:val="clear"/>
@@ -1596,7 +1590,7 @@
             <w:tcW w:w="3812" w:type="dxa"/>
             <w:tcBorders>
               <w:top w:val="single" w:sz="6" w:space="0" w:color="000000"/>
-              <w:start w:val="single" w:sz="6" w:space="0" w:color="000000"/>
+              <w:left w:val="single" w:sz="6" w:space="0" w:color="000000"/>
               <w:bottom w:val="single" w:sz="6" w:space="0" w:color="000000"/>
             </w:tcBorders>
             <w:shd w:color="auto" w:fill="E5E5E5" w:val="clear"/>
@@ -1619,12 +1613,12 @@
         </w:tc>
         <w:tc>
           <w:tcPr>
-            <w:tcW w:w="2593" w:type="dxa"/>
+            <w:tcW w:w="2592" w:type="dxa"/>
             <w:tcBorders>
               <w:top w:val="single" w:sz="6" w:space="0" w:color="000000"/>
-              <w:start w:val="single" w:sz="6" w:space="0" w:color="000000"/>
+              <w:left w:val="single" w:sz="6" w:space="0" w:color="000000"/>
               <w:bottom w:val="single" w:sz="6" w:space="0" w:color="000000"/>
-              <w:end w:val="single" w:sz="6" w:space="0" w:color="000000"/>
+              <w:right w:val="single" w:sz="6" w:space="0" w:color="000000"/>
             </w:tcBorders>
             <w:shd w:color="auto" w:fill="E5E5E5" w:val="clear"/>
           </w:tcPr>
@@ -1652,7 +1646,7 @@
             <w:tcW w:w="1275" w:type="dxa"/>
             <w:tcBorders>
               <w:top w:val="single" w:sz="6" w:space="0" w:color="000000"/>
-              <w:start w:val="single" w:sz="6" w:space="0" w:color="000000"/>
+              <w:left w:val="single" w:sz="6" w:space="0" w:color="000000"/>
               <w:bottom w:val="single" w:sz="6" w:space="0" w:color="000000"/>
             </w:tcBorders>
             <w:shd w:color="auto" w:fill="E5E5E5" w:val="clear"/>
@@ -1680,7 +1674,7 @@
             <w:tcW w:w="1083" w:type="dxa"/>
             <w:tcBorders>
               <w:top w:val="single" w:sz="6" w:space="0" w:color="000000"/>
-              <w:start w:val="single" w:sz="6" w:space="0" w:color="000000"/>
+              <w:left w:val="single" w:sz="6" w:space="0" w:color="000000"/>
               <w:bottom w:val="single" w:sz="6" w:space="0" w:color="000000"/>
             </w:tcBorders>
             <w:shd w:color="auto" w:fill="E5E5E5" w:val="clear"/>
@@ -1706,7 +1700,7 @@
             <w:tcW w:w="3812" w:type="dxa"/>
             <w:tcBorders>
               <w:top w:val="single" w:sz="6" w:space="0" w:color="000000"/>
-              <w:start w:val="single" w:sz="6" w:space="0" w:color="000000"/>
+              <w:left w:val="single" w:sz="6" w:space="0" w:color="000000"/>
               <w:bottom w:val="single" w:sz="6" w:space="0" w:color="000000"/>
             </w:tcBorders>
             <w:shd w:color="auto" w:fill="E5E5E5" w:val="clear"/>
@@ -1729,12 +1723,12 @@
         </w:tc>
         <w:tc>
           <w:tcPr>
-            <w:tcW w:w="2593" w:type="dxa"/>
+            <w:tcW w:w="2592" w:type="dxa"/>
             <w:tcBorders>
               <w:top w:val="single" w:sz="6" w:space="0" w:color="000000"/>
-              <w:start w:val="single" w:sz="6" w:space="0" w:color="000000"/>
+              <w:left w:val="single" w:sz="6" w:space="0" w:color="000000"/>
               <w:bottom w:val="single" w:sz="6" w:space="0" w:color="000000"/>
-              <w:end w:val="single" w:sz="6" w:space="0" w:color="000000"/>
+              <w:right w:val="single" w:sz="6" w:space="0" w:color="000000"/>
             </w:tcBorders>
             <w:shd w:color="auto" w:fill="E5E5E5" w:val="clear"/>
           </w:tcPr>
@@ -1762,7 +1756,7 @@
             <w:tcW w:w="1275" w:type="dxa"/>
             <w:tcBorders>
               <w:top w:val="single" w:sz="6" w:space="0" w:color="000000"/>
-              <w:start w:val="single" w:sz="6" w:space="0" w:color="000000"/>
+              <w:left w:val="single" w:sz="6" w:space="0" w:color="000000"/>
               <w:bottom w:val="single" w:sz="6" w:space="0" w:color="000000"/>
             </w:tcBorders>
             <w:shd w:color="auto" w:fill="E5E5E5" w:val="clear"/>
@@ -1790,7 +1784,7 @@
             <w:tcW w:w="1083" w:type="dxa"/>
             <w:tcBorders>
               <w:top w:val="single" w:sz="6" w:space="0" w:color="000000"/>
-              <w:start w:val="single" w:sz="6" w:space="0" w:color="000000"/>
+              <w:left w:val="single" w:sz="6" w:space="0" w:color="000000"/>
               <w:bottom w:val="single" w:sz="6" w:space="0" w:color="000000"/>
             </w:tcBorders>
             <w:shd w:color="auto" w:fill="E5E5E5" w:val="clear"/>
@@ -1816,7 +1810,7 @@
             <w:tcW w:w="3812" w:type="dxa"/>
             <w:tcBorders>
               <w:top w:val="single" w:sz="6" w:space="0" w:color="000000"/>
-              <w:start w:val="single" w:sz="6" w:space="0" w:color="000000"/>
+              <w:left w:val="single" w:sz="6" w:space="0" w:color="000000"/>
               <w:bottom w:val="single" w:sz="6" w:space="0" w:color="000000"/>
             </w:tcBorders>
             <w:shd w:color="auto" w:fill="E5E5E5" w:val="clear"/>
@@ -1839,12 +1833,12 @@
         </w:tc>
         <w:tc>
           <w:tcPr>
-            <w:tcW w:w="2593" w:type="dxa"/>
+            <w:tcW w:w="2592" w:type="dxa"/>
             <w:tcBorders>
               <w:top w:val="single" w:sz="6" w:space="0" w:color="000000"/>
-              <w:start w:val="single" w:sz="6" w:space="0" w:color="000000"/>
+              <w:left w:val="single" w:sz="6" w:space="0" w:color="000000"/>
               <w:bottom w:val="single" w:sz="6" w:space="0" w:color="000000"/>
-              <w:end w:val="single" w:sz="6" w:space="0" w:color="000000"/>
+              <w:right w:val="single" w:sz="6" w:space="0" w:color="000000"/>
             </w:tcBorders>
             <w:shd w:color="auto" w:fill="E5E5E5" w:val="clear"/>
           </w:tcPr>
@@ -1872,7 +1866,7 @@
             <w:tcW w:w="1275" w:type="dxa"/>
             <w:tcBorders>
               <w:top w:val="single" w:sz="6" w:space="0" w:color="000000"/>
-              <w:start w:val="single" w:sz="6" w:space="0" w:color="000000"/>
+              <w:left w:val="single" w:sz="6" w:space="0" w:color="000000"/>
               <w:bottom w:val="single" w:sz="6" w:space="0" w:color="000000"/>
             </w:tcBorders>
             <w:shd w:color="auto" w:fill="E5E5E5" w:val="clear"/>
@@ -1900,7 +1894,7 @@
             <w:tcW w:w="1083" w:type="dxa"/>
             <w:tcBorders>
               <w:top w:val="single" w:sz="6" w:space="0" w:color="000000"/>
-              <w:start w:val="single" w:sz="6" w:space="0" w:color="000000"/>
+              <w:left w:val="single" w:sz="6" w:space="0" w:color="000000"/>
               <w:bottom w:val="single" w:sz="6" w:space="0" w:color="000000"/>
             </w:tcBorders>
             <w:shd w:color="auto" w:fill="E5E5E5" w:val="clear"/>
@@ -1926,7 +1920,7 @@
             <w:tcW w:w="3812" w:type="dxa"/>
             <w:tcBorders>
               <w:top w:val="single" w:sz="6" w:space="0" w:color="000000"/>
-              <w:start w:val="single" w:sz="6" w:space="0" w:color="000000"/>
+              <w:left w:val="single" w:sz="6" w:space="0" w:color="000000"/>
               <w:bottom w:val="single" w:sz="6" w:space="0" w:color="000000"/>
             </w:tcBorders>
             <w:shd w:color="auto" w:fill="E5E5E5" w:val="clear"/>
@@ -1949,12 +1943,12 @@
         </w:tc>
         <w:tc>
           <w:tcPr>
-            <w:tcW w:w="2593" w:type="dxa"/>
+            <w:tcW w:w="2592" w:type="dxa"/>
             <w:tcBorders>
               <w:top w:val="single" w:sz="6" w:space="0" w:color="000000"/>
-              <w:start w:val="single" w:sz="6" w:space="0" w:color="000000"/>
+              <w:left w:val="single" w:sz="6" w:space="0" w:color="000000"/>
               <w:bottom w:val="single" w:sz="6" w:space="0" w:color="000000"/>
-              <w:end w:val="single" w:sz="6" w:space="0" w:color="000000"/>
+              <w:right w:val="single" w:sz="6" w:space="0" w:color="000000"/>
             </w:tcBorders>
             <w:shd w:color="auto" w:fill="E5E5E5" w:val="clear"/>
           </w:tcPr>
@@ -1982,7 +1976,7 @@
             <w:tcW w:w="1275" w:type="dxa"/>
             <w:tcBorders>
               <w:top w:val="single" w:sz="6" w:space="0" w:color="000000"/>
-              <w:start w:val="single" w:sz="6" w:space="0" w:color="000000"/>
+              <w:left w:val="single" w:sz="6" w:space="0" w:color="000000"/>
               <w:bottom w:val="single" w:sz="6" w:space="0" w:color="000000"/>
             </w:tcBorders>
             <w:shd w:color="auto" w:fill="E5E5E5" w:val="clear"/>
@@ -2010,7 +2004,7 @@
             <w:tcW w:w="1083" w:type="dxa"/>
             <w:tcBorders>
               <w:top w:val="single" w:sz="6" w:space="0" w:color="000000"/>
-              <w:start w:val="single" w:sz="6" w:space="0" w:color="000000"/>
+              <w:left w:val="single" w:sz="6" w:space="0" w:color="000000"/>
               <w:bottom w:val="single" w:sz="6" w:space="0" w:color="000000"/>
             </w:tcBorders>
             <w:shd w:color="auto" w:fill="E5E5E5" w:val="clear"/>
@@ -2036,7 +2030,7 @@
             <w:tcW w:w="3812" w:type="dxa"/>
             <w:tcBorders>
               <w:top w:val="single" w:sz="6" w:space="0" w:color="000000"/>
-              <w:start w:val="single" w:sz="6" w:space="0" w:color="000000"/>
+              <w:left w:val="single" w:sz="6" w:space="0" w:color="000000"/>
               <w:bottom w:val="single" w:sz="6" w:space="0" w:color="000000"/>
             </w:tcBorders>
             <w:shd w:color="auto" w:fill="E5E5E5" w:val="clear"/>
@@ -2059,12 +2053,12 @@
         </w:tc>
         <w:tc>
           <w:tcPr>
-            <w:tcW w:w="2593" w:type="dxa"/>
+            <w:tcW w:w="2592" w:type="dxa"/>
             <w:tcBorders>
               <w:top w:val="single" w:sz="6" w:space="0" w:color="000000"/>
-              <w:start w:val="single" w:sz="6" w:space="0" w:color="000000"/>
+              <w:left w:val="single" w:sz="6" w:space="0" w:color="000000"/>
               <w:bottom w:val="single" w:sz="6" w:space="0" w:color="000000"/>
-              <w:end w:val="single" w:sz="6" w:space="0" w:color="000000"/>
+              <w:right w:val="single" w:sz="6" w:space="0" w:color="000000"/>
             </w:tcBorders>
             <w:shd w:color="auto" w:fill="E5E5E5" w:val="clear"/>
           </w:tcPr>
@@ -2092,7 +2086,7 @@
             <w:tcW w:w="1275" w:type="dxa"/>
             <w:tcBorders>
               <w:top w:val="single" w:sz="6" w:space="0" w:color="000000"/>
-              <w:start w:val="single" w:sz="6" w:space="0" w:color="000000"/>
+              <w:left w:val="single" w:sz="6" w:space="0" w:color="000000"/>
               <w:bottom w:val="single" w:sz="6" w:space="0" w:color="000000"/>
             </w:tcBorders>
             <w:shd w:color="auto" w:fill="E5E5E5" w:val="clear"/>
@@ -2120,7 +2114,7 @@
             <w:tcW w:w="1083" w:type="dxa"/>
             <w:tcBorders>
               <w:top w:val="single" w:sz="6" w:space="0" w:color="000000"/>
-              <w:start w:val="single" w:sz="6" w:space="0" w:color="000000"/>
+              <w:left w:val="single" w:sz="6" w:space="0" w:color="000000"/>
               <w:bottom w:val="single" w:sz="6" w:space="0" w:color="000000"/>
             </w:tcBorders>
             <w:shd w:color="auto" w:fill="E5E5E5" w:val="clear"/>
@@ -2146,7 +2140,7 @@
             <w:tcW w:w="3812" w:type="dxa"/>
             <w:tcBorders>
               <w:top w:val="single" w:sz="6" w:space="0" w:color="000000"/>
-              <w:start w:val="single" w:sz="6" w:space="0" w:color="000000"/>
+              <w:left w:val="single" w:sz="6" w:space="0" w:color="000000"/>
               <w:bottom w:val="single" w:sz="6" w:space="0" w:color="000000"/>
             </w:tcBorders>
             <w:shd w:color="auto" w:fill="E5E5E5" w:val="clear"/>
@@ -2169,12 +2163,12 @@
         </w:tc>
         <w:tc>
           <w:tcPr>
-            <w:tcW w:w="2593" w:type="dxa"/>
+            <w:tcW w:w="2592" w:type="dxa"/>
             <w:tcBorders>
               <w:top w:val="single" w:sz="6" w:space="0" w:color="000000"/>
-              <w:start w:val="single" w:sz="6" w:space="0" w:color="000000"/>
+              <w:left w:val="single" w:sz="6" w:space="0" w:color="000000"/>
               <w:bottom w:val="single" w:sz="6" w:space="0" w:color="000000"/>
-              <w:end w:val="single" w:sz="6" w:space="0" w:color="000000"/>
+              <w:right w:val="single" w:sz="6" w:space="0" w:color="000000"/>
             </w:tcBorders>
             <w:shd w:color="auto" w:fill="E5E5E5" w:val="clear"/>
           </w:tcPr>
@@ -2202,7 +2196,7 @@
             <w:tcW w:w="1275" w:type="dxa"/>
             <w:tcBorders>
               <w:top w:val="single" w:sz="6" w:space="0" w:color="000000"/>
-              <w:start w:val="single" w:sz="6" w:space="0" w:color="000000"/>
+              <w:left w:val="single" w:sz="6" w:space="0" w:color="000000"/>
               <w:bottom w:val="single" w:sz="6" w:space="0" w:color="000000"/>
             </w:tcBorders>
             <w:shd w:color="auto" w:fill="E5E5E5" w:val="clear"/>
@@ -2230,7 +2224,7 @@
             <w:tcW w:w="1083" w:type="dxa"/>
             <w:tcBorders>
               <w:top w:val="single" w:sz="6" w:space="0" w:color="000000"/>
-              <w:start w:val="single" w:sz="6" w:space="0" w:color="000000"/>
+              <w:left w:val="single" w:sz="6" w:space="0" w:color="000000"/>
               <w:bottom w:val="single" w:sz="6" w:space="0" w:color="000000"/>
             </w:tcBorders>
             <w:shd w:color="auto" w:fill="E5E5E5" w:val="clear"/>
@@ -2256,7 +2250,7 @@
             <w:tcW w:w="3812" w:type="dxa"/>
             <w:tcBorders>
               <w:top w:val="single" w:sz="6" w:space="0" w:color="000000"/>
-              <w:start w:val="single" w:sz="6" w:space="0" w:color="000000"/>
+              <w:left w:val="single" w:sz="6" w:space="0" w:color="000000"/>
               <w:bottom w:val="single" w:sz="6" w:space="0" w:color="000000"/>
             </w:tcBorders>
             <w:shd w:color="auto" w:fill="E5E5E5" w:val="clear"/>
@@ -2279,12 +2273,12 @@
         </w:tc>
         <w:tc>
           <w:tcPr>
-            <w:tcW w:w="2593" w:type="dxa"/>
+            <w:tcW w:w="2592" w:type="dxa"/>
             <w:tcBorders>
               <w:top w:val="single" w:sz="6" w:space="0" w:color="000000"/>
-              <w:start w:val="single" w:sz="6" w:space="0" w:color="000000"/>
+              <w:left w:val="single" w:sz="6" w:space="0" w:color="000000"/>
               <w:bottom w:val="single" w:sz="6" w:space="0" w:color="000000"/>
-              <w:end w:val="single" w:sz="6" w:space="0" w:color="000000"/>
+              <w:right w:val="single" w:sz="6" w:space="0" w:color="000000"/>
             </w:tcBorders>
             <w:shd w:color="auto" w:fill="E5E5E5" w:val="clear"/>
           </w:tcPr>
@@ -2421,6 +2415,13 @@
             </w:r>
             <w:r>
               <w:rPr>
+                <w:rStyle w:val="IndexLink"/>
+                <w:vanish/>
+              </w:rPr>
+              <w:t>Purpose</w:t>
+            </w:r>
+            <w:r>
+              <w:rPr>
                 <w:webHidden/>
               </w:rPr>
               <w:fldChar w:fldCharType="begin"/>
@@ -2441,7 +2442,6 @@
               <w:rPr>
                 <w:rStyle w:val="IndexLink"/>
               </w:rPr>
-              <w:t>Purpose</w:t>
               <w:tab/>
               <w:t>iv</w:t>
             </w:r>
@@ -2494,6 +2494,13 @@
             </w:r>
             <w:r>
               <w:rPr>
+                <w:rStyle w:val="IndexLink"/>
+                <w:vanish/>
+              </w:rPr>
+              <w:t>Scope</w:t>
+            </w:r>
+            <w:r>
+              <w:rPr>
                 <w:webHidden/>
               </w:rPr>
               <w:fldChar w:fldCharType="begin"/>
@@ -2514,7 +2521,6 @@
               <w:rPr>
                 <w:rStyle w:val="IndexLink"/>
               </w:rPr>
-              <w:t>Scope</w:t>
               <w:tab/>
               <w:t>iv</w:t>
             </w:r>
@@ -2567,6 +2573,13 @@
             </w:r>
             <w:r>
               <w:rPr>
+                <w:rStyle w:val="IndexLink"/>
+                <w:vanish/>
+              </w:rPr>
+              <w:t>Definitions, Acronyms, Abbreviations</w:t>
+            </w:r>
+            <w:r>
+              <w:rPr>
                 <w:webHidden/>
               </w:rPr>
               <w:fldChar w:fldCharType="begin"/>
@@ -2587,7 +2600,6 @@
               <w:rPr>
                 <w:rStyle w:val="IndexLink"/>
               </w:rPr>
-              <w:t>Definitions, Acronyms, Abbreviations</w:t>
               <w:tab/>
               <w:t>iv</w:t>
             </w:r>
@@ -2640,6 +2652,13 @@
             </w:r>
             <w:r>
               <w:rPr>
+                <w:rStyle w:val="IndexLink"/>
+                <w:vanish/>
+              </w:rPr>
+              <w:t>References</w:t>
+            </w:r>
+            <w:r>
+              <w:rPr>
                 <w:webHidden/>
               </w:rPr>
               <w:fldChar w:fldCharType="begin"/>
@@ -2660,7 +2679,6 @@
               <w:rPr>
                 <w:rStyle w:val="IndexLink"/>
               </w:rPr>
-              <w:t>References</w:t>
               <w:tab/>
               <w:t>v</w:t>
             </w:r>
@@ -2713,6 +2731,13 @@
             </w:r>
             <w:r>
               <w:rPr>
+                <w:rStyle w:val="IndexLink"/>
+                <w:vanish/>
+              </w:rPr>
+              <w:t>Overview</w:t>
+            </w:r>
+            <w:r>
+              <w:rPr>
                 <w:webHidden/>
               </w:rPr>
               <w:fldChar w:fldCharType="begin"/>
@@ -2733,7 +2758,6 @@
               <w:rPr>
                 <w:rStyle w:val="IndexLink"/>
               </w:rPr>
-              <w:t>Overview</w:t>
               <w:tab/>
               <w:t>v</w:t>
             </w:r>
@@ -2789,6 +2813,13 @@
             </w:r>
             <w:r>
               <w:rPr>
+                <w:rStyle w:val="IndexLink"/>
+                <w:vanish/>
+              </w:rPr>
+              <w:t>Overall Description</w:t>
+            </w:r>
+            <w:r>
+              <w:rPr>
                 <w:webHidden/>
               </w:rPr>
               <w:fldChar w:fldCharType="begin"/>
@@ -2809,7 +2840,6 @@
               <w:rPr>
                 <w:rStyle w:val="IndexLink"/>
               </w:rPr>
-              <w:t>Overall Description</w:t>
               <w:tab/>
               <w:t>vi</w:t>
             </w:r>
@@ -2862,6 +2892,13 @@
             </w:r>
             <w:r>
               <w:rPr>
+                <w:rStyle w:val="IndexLink"/>
+                <w:vanish/>
+              </w:rPr>
+              <w:t>Product Perspective</w:t>
+            </w:r>
+            <w:r>
+              <w:rPr>
                 <w:webHidden/>
               </w:rPr>
               <w:fldChar w:fldCharType="begin"/>
@@ -2882,7 +2919,6 @@
               <w:rPr>
                 <w:rStyle w:val="IndexLink"/>
               </w:rPr>
-              <w:t>Product Perspective</w:t>
               <w:tab/>
               <w:t>vi</w:t>
             </w:r>
@@ -2935,6 +2971,13 @@
             </w:r>
             <w:r>
               <w:rPr>
+                <w:rStyle w:val="IndexLink"/>
+                <w:vanish/>
+              </w:rPr>
+              <w:t>Product Architecture</w:t>
+            </w:r>
+            <w:r>
+              <w:rPr>
                 <w:webHidden/>
               </w:rPr>
               <w:fldChar w:fldCharType="begin"/>
@@ -2955,7 +2998,6 @@
               <w:rPr>
                 <w:rStyle w:val="IndexLink"/>
               </w:rPr>
-              <w:t>Product Architecture</w:t>
               <w:tab/>
               <w:t>vi</w:t>
             </w:r>
@@ -3008,6 +3050,13 @@
             </w:r>
             <w:r>
               <w:rPr>
+                <w:rStyle w:val="IndexLink"/>
+                <w:vanish/>
+              </w:rPr>
+              <w:t>Product Functionality/Features</w:t>
+            </w:r>
+            <w:r>
+              <w:rPr>
                 <w:webHidden/>
               </w:rPr>
               <w:fldChar w:fldCharType="begin"/>
@@ -3028,7 +3077,6 @@
               <w:rPr>
                 <w:rStyle w:val="IndexLink"/>
               </w:rPr>
-              <w:t>Product Functionality/Features</w:t>
               <w:tab/>
               <w:t>vi</w:t>
             </w:r>
@@ -3081,6 +3129,13 @@
             </w:r>
             <w:r>
               <w:rPr>
+                <w:rStyle w:val="IndexLink"/>
+                <w:vanish/>
+              </w:rPr>
+              <w:t>Constraints</w:t>
+            </w:r>
+            <w:r>
+              <w:rPr>
                 <w:webHidden/>
               </w:rPr>
               <w:fldChar w:fldCharType="begin"/>
@@ -3101,7 +3156,6 @@
               <w:rPr>
                 <w:rStyle w:val="IndexLink"/>
               </w:rPr>
-              <w:t>Constraints</w:t>
               <w:tab/>
               <w:t>vi</w:t>
             </w:r>
@@ -3154,6 +3208,13 @@
             </w:r>
             <w:r>
               <w:rPr>
+                <w:rStyle w:val="IndexLink"/>
+                <w:vanish/>
+              </w:rPr>
+              <w:t>Assumptions and Dependencies</w:t>
+            </w:r>
+            <w:r>
+              <w:rPr>
                 <w:webHidden/>
               </w:rPr>
               <w:fldChar w:fldCharType="begin"/>
@@ -3174,7 +3235,6 @@
               <w:rPr>
                 <w:rStyle w:val="IndexLink"/>
               </w:rPr>
-              <w:t>Assumptions and Dependencies</w:t>
               <w:tab/>
               <w:t>vi</w:t>
             </w:r>
@@ -3230,6 +3290,13 @@
             </w:r>
             <w:r>
               <w:rPr>
+                <w:rStyle w:val="IndexLink"/>
+                <w:vanish/>
+              </w:rPr>
+              <w:t>Specific Requirements</w:t>
+            </w:r>
+            <w:r>
+              <w:rPr>
                 <w:webHidden/>
               </w:rPr>
               <w:fldChar w:fldCharType="begin"/>
@@ -3250,7 +3317,6 @@
               <w:rPr>
                 <w:rStyle w:val="IndexLink"/>
               </w:rPr>
-              <w:t>Specific Requirements</w:t>
               <w:tab/>
               <w:t>viii</w:t>
             </w:r>
@@ -3303,6 +3369,13 @@
             </w:r>
             <w:r>
               <w:rPr>
+                <w:rStyle w:val="IndexLink"/>
+                <w:vanish/>
+              </w:rPr>
+              <w:t>Functional Requirements</w:t>
+            </w:r>
+            <w:r>
+              <w:rPr>
                 <w:webHidden/>
               </w:rPr>
               <w:fldChar w:fldCharType="begin"/>
@@ -3323,7 +3396,6 @@
               <w:rPr>
                 <w:rStyle w:val="IndexLink"/>
               </w:rPr>
-              <w:t>Functional Requirements</w:t>
               <w:tab/>
               <w:t>viii</w:t>
             </w:r>
@@ -3375,6 +3447,13 @@
             </w:r>
             <w:r>
               <w:rPr>
+                <w:rStyle w:val="IndexLink"/>
+                <w:vanish/>
+              </w:rPr>
+              <w:t>Common Requirements:</w:t>
+            </w:r>
+            <w:r>
+              <w:rPr>
                 <w:webHidden/>
               </w:rPr>
               <w:fldChar w:fldCharType="begin"/>
@@ -3395,7 +3474,6 @@
               <w:rPr>
                 <w:rStyle w:val="IndexLink"/>
               </w:rPr>
-              <w:t>Common Requirements:</w:t>
               <w:tab/>
               <w:t>viii</w:t>
             </w:r>
@@ -3447,6 +3525,13 @@
             </w:r>
             <w:r>
               <w:rPr>
+                <w:rStyle w:val="IndexLink"/>
+                <w:vanish/>
+              </w:rPr>
+              <w:t>Users Module Requirements:</w:t>
+            </w:r>
+            <w:r>
+              <w:rPr>
                 <w:webHidden/>
               </w:rPr>
               <w:fldChar w:fldCharType="begin"/>
@@ -3467,7 +3552,6 @@
               <w:rPr>
                 <w:rStyle w:val="IndexLink"/>
               </w:rPr>
-              <w:t>Users Module Requirements:</w:t>
               <w:tab/>
               <w:t>viii</w:t>
             </w:r>
@@ -3519,6 +3603,13 @@
             </w:r>
             <w:r>
               <w:rPr>
+                <w:rStyle w:val="IndexLink"/>
+                <w:vanish/>
+              </w:rPr>
+              <w:t>Datastore Module Requirements:</w:t>
+            </w:r>
+            <w:r>
+              <w:rPr>
                 <w:webHidden/>
               </w:rPr>
               <w:fldChar w:fldCharType="begin"/>
@@ -3539,7 +3630,6 @@
               <w:rPr>
                 <w:rStyle w:val="IndexLink"/>
               </w:rPr>
-              <w:t>Datastore Module Requirements:</w:t>
               <w:tab/>
               <w:t>viii</w:t>
             </w:r>
@@ -3591,6 +3681,13 @@
             </w:r>
             <w:r>
               <w:rPr>
+                <w:rStyle w:val="IndexLink"/>
+                <w:vanish/>
+              </w:rPr>
+              <w:t>Network Module Requirements:</w:t>
+            </w:r>
+            <w:r>
+              <w:rPr>
                 <w:webHidden/>
               </w:rPr>
               <w:fldChar w:fldCharType="begin"/>
@@ -3611,7 +3708,6 @@
               <w:rPr>
                 <w:rStyle w:val="IndexLink"/>
               </w:rPr>
-              <w:t>Network Module Requirements:</w:t>
               <w:tab/>
               <w:t>viii</w:t>
             </w:r>
@@ -3663,6 +3759,13 @@
             </w:r>
             <w:r>
               <w:rPr>
+                <w:rStyle w:val="IndexLink"/>
+                <w:vanish/>
+              </w:rPr>
+              <w:t>GUI Module Requirements:</w:t>
+            </w:r>
+            <w:r>
+              <w:rPr>
                 <w:webHidden/>
               </w:rPr>
               <w:fldChar w:fldCharType="begin"/>
@@ -3683,7 +3786,6 @@
               <w:rPr>
                 <w:rStyle w:val="IndexLink"/>
               </w:rPr>
-              <w:t>GUI Module Requirements:</w:t>
               <w:tab/>
               <w:t>viii</w:t>
             </w:r>
@@ -3735,6 +3837,13 @@
             </w:r>
             <w:r>
               <w:rPr>
+                <w:rStyle w:val="IndexLink"/>
+                <w:vanish/>
+              </w:rPr>
+              <w:t>Lobby Module Requirements:</w:t>
+            </w:r>
+            <w:r>
+              <w:rPr>
                 <w:webHidden/>
               </w:rPr>
               <w:fldChar w:fldCharType="begin"/>
@@ -3755,7 +3864,6 @@
               <w:rPr>
                 <w:rStyle w:val="IndexLink"/>
               </w:rPr>
-              <w:t>Lobby Module Requirements:</w:t>
               <w:tab/>
               <w:t>viii</w:t>
             </w:r>
@@ -3807,6 +3915,13 @@
             </w:r>
             <w:r>
               <w:rPr>
+                <w:rStyle w:val="IndexLink"/>
+                <w:vanish/>
+              </w:rPr>
+              <w:t>Table Module Requirements:</w:t>
+            </w:r>
+            <w:r>
+              <w:rPr>
                 <w:webHidden/>
               </w:rPr>
               <w:fldChar w:fldCharType="begin"/>
@@ -3827,7 +3942,6 @@
               <w:rPr>
                 <w:rStyle w:val="IndexLink"/>
               </w:rPr>
-              <w:t>Table Module Requirements:</w:t>
               <w:tab/>
               <w:t>viii</w:t>
             </w:r>
@@ -3879,6 +3993,13 @@
             </w:r>
             <w:r>
               <w:rPr>
+                <w:rStyle w:val="IndexLink"/>
+                <w:vanish/>
+              </w:rPr>
+              <w:t>Game Module Requirements:</w:t>
+            </w:r>
+            <w:r>
+              <w:rPr>
                 <w:webHidden/>
               </w:rPr>
               <w:fldChar w:fldCharType="begin"/>
@@ -3899,7 +4020,6 @@
               <w:rPr>
                 <w:rStyle w:val="IndexLink"/>
               </w:rPr>
-              <w:t>Game Module Requirements:</w:t>
               <w:tab/>
               <w:t>viii</w:t>
             </w:r>
@@ -3952,6 +4072,13 @@
             </w:r>
             <w:r>
               <w:rPr>
+                <w:rStyle w:val="IndexLink"/>
+                <w:vanish/>
+              </w:rPr>
+              <w:t>External Interface Requirements</w:t>
+            </w:r>
+            <w:r>
+              <w:rPr>
                 <w:webHidden/>
               </w:rPr>
               <w:fldChar w:fldCharType="begin"/>
@@ -3972,7 +4099,6 @@
               <w:rPr>
                 <w:rStyle w:val="IndexLink"/>
               </w:rPr>
-              <w:t>External Interface Requirements</w:t>
               <w:tab/>
               <w:t>ix</w:t>
             </w:r>
@@ -4025,6 +4151,13 @@
             </w:r>
             <w:r>
               <w:rPr>
+                <w:rStyle w:val="IndexLink"/>
+                <w:vanish/>
+              </w:rPr>
+              <w:t>Internal Interface Requirements</w:t>
+            </w:r>
+            <w:r>
+              <w:rPr>
                 <w:webHidden/>
               </w:rPr>
               <w:fldChar w:fldCharType="begin"/>
@@ -4045,7 +4178,6 @@
               <w:rPr>
                 <w:rStyle w:val="IndexLink"/>
               </w:rPr>
-              <w:t>Internal Interface Requirements</w:t>
               <w:tab/>
               <w:t>ix</w:t>
             </w:r>
@@ -4101,6 +4233,13 @@
             </w:r>
             <w:r>
               <w:rPr>
+                <w:rStyle w:val="IndexLink"/>
+                <w:vanish/>
+              </w:rPr>
+              <w:t>Non-Functional Requirements</w:t>
+            </w:r>
+            <w:r>
+              <w:rPr>
                 <w:webHidden/>
               </w:rPr>
               <w:fldChar w:fldCharType="begin"/>
@@ -4121,7 +4260,6 @@
               <w:rPr>
                 <w:rStyle w:val="IndexLink"/>
               </w:rPr>
-              <w:t>Non-Functional Requirements</w:t>
               <w:tab/>
               <w:t>x</w:t>
             </w:r>
@@ -4174,6 +4312,13 @@
             </w:r>
             <w:r>
               <w:rPr>
+                <w:rStyle w:val="IndexLink"/>
+                <w:vanish/>
+              </w:rPr>
+              <w:t>Security and Privacy Requirements</w:t>
+            </w:r>
+            <w:r>
+              <w:rPr>
                 <w:webHidden/>
               </w:rPr>
               <w:fldChar w:fldCharType="begin"/>
@@ -4194,7 +4339,6 @@
               <w:rPr>
                 <w:rStyle w:val="IndexLink"/>
               </w:rPr>
-              <w:t>Security and Privacy Requirements</w:t>
               <w:tab/>
               <w:t>x</w:t>
             </w:r>
@@ -4247,6 +4391,13 @@
             </w:r>
             <w:r>
               <w:rPr>
+                <w:rStyle w:val="IndexLink"/>
+                <w:vanish/>
+              </w:rPr>
+              <w:t>Environmental Requirements</w:t>
+            </w:r>
+            <w:r>
+              <w:rPr>
                 <w:webHidden/>
               </w:rPr>
               <w:fldChar w:fldCharType="begin"/>
@@ -4267,7 +4418,6 @@
               <w:rPr>
                 <w:rStyle w:val="IndexLink"/>
               </w:rPr>
-              <w:t>Environmental Requirements</w:t>
               <w:tab/>
               <w:t>x</w:t>
             </w:r>
@@ -4320,6 +4470,13 @@
             </w:r>
             <w:r>
               <w:rPr>
+                <w:rStyle w:val="IndexLink"/>
+                <w:vanish/>
+              </w:rPr>
+              <w:t>Performance Requirements</w:t>
+            </w:r>
+            <w:r>
+              <w:rPr>
                 <w:webHidden/>
               </w:rPr>
               <w:fldChar w:fldCharType="begin"/>
@@ -4340,7 +4497,6 @@
               <w:rPr>
                 <w:rStyle w:val="IndexLink"/>
               </w:rPr>
-              <w:t>Performance Requirements</w:t>
               <w:tab/>
               <w:t>x</w:t>
             </w:r>
@@ -4481,7 +4637,7 @@
     <w:p>
       <w:pPr>
         <w:pStyle w:val="Paragraph3"/>
-        <w:ind w:hanging="720" w:start="2160"/>
+        <w:ind w:hanging="720" w:left="2160"/>
         <w:rPr>
           <w:color w:val="0070C0"/>
         </w:rPr>
@@ -4496,7 +4652,7 @@
     <w:p>
       <w:pPr>
         <w:pStyle w:val="Paragraph3"/>
-        <w:ind w:hanging="720" w:start="2160"/>
+        <w:ind w:hanging="720" w:left="2160"/>
         <w:rPr>
           <w:color w:val="0070C0"/>
         </w:rPr>
@@ -4511,7 +4667,7 @@
     <w:p>
       <w:pPr>
         <w:pStyle w:val="Paragraph3"/>
-        <w:ind w:hanging="720" w:start="2160"/>
+        <w:ind w:hanging="720" w:left="2160"/>
         <w:rPr>
           <w:color w:val="0070C0"/>
         </w:rPr>
@@ -4526,7 +4682,7 @@
     <w:p>
       <w:pPr>
         <w:pStyle w:val="Paragraph3"/>
-        <w:ind w:hanging="720" w:start="2160"/>
+        <w:ind w:hanging="720" w:left="2160"/>
         <w:rPr>
           <w:color w:val="0070C0"/>
         </w:rPr>
@@ -4541,7 +4697,7 @@
     <w:p>
       <w:pPr>
         <w:pStyle w:val="Paragraph3"/>
-        <w:ind w:hanging="720" w:start="2160"/>
+        <w:ind w:hanging="720" w:left="2160"/>
         <w:rPr>
           <w:color w:val="0070C0"/>
         </w:rPr>
@@ -4556,7 +4712,7 @@
     <w:p>
       <w:pPr>
         <w:pStyle w:val="Paragraph3"/>
-        <w:ind w:hanging="720" w:start="2160"/>
+        <w:ind w:hanging="720" w:left="2160"/>
         <w:rPr>
           <w:color w:val="0070C0"/>
         </w:rPr>
@@ -4571,7 +4727,7 @@
     <w:p>
       <w:pPr>
         <w:pStyle w:val="Paragraph3"/>
-        <w:ind w:hanging="720" w:start="2160"/>
+        <w:ind w:hanging="720" w:left="2160"/>
         <w:rPr>
           <w:color w:val="0070C0"/>
         </w:rPr>
@@ -4586,7 +4742,7 @@
     <w:p>
       <w:pPr>
         <w:pStyle w:val="Paragraph3"/>
-        <w:ind w:hanging="720" w:start="2160"/>
+        <w:ind w:hanging="720" w:left="2160"/>
         <w:rPr>
           <w:color w:val="0070C0"/>
         </w:rPr>
@@ -4601,7 +4757,7 @@
     <w:p>
       <w:pPr>
         <w:pStyle w:val="Paragraph3"/>
-        <w:ind w:hanging="720" w:start="2160"/>
+        <w:ind w:hanging="720" w:left="2160"/>
         <w:rPr>
           <w:color w:val="0070C0"/>
         </w:rPr>
@@ -4616,7 +4772,7 @@
     <w:p>
       <w:pPr>
         <w:pStyle w:val="Paragraph3"/>
-        <w:ind w:hanging="720" w:start="2160"/>
+        <w:ind w:hanging="720" w:left="2160"/>
         <w:rPr>
           <w:color w:val="0070C0"/>
         </w:rPr>
@@ -4631,7 +4787,7 @@
     <w:p>
       <w:pPr>
         <w:pStyle w:val="Paragraph3"/>
-        <w:ind w:hanging="720" w:start="2160"/>
+        <w:ind w:hanging="720" w:left="2160"/>
         <w:rPr>
           <w:color w:val="0070C0"/>
         </w:rPr>
@@ -4646,7 +4802,7 @@
     <w:p>
       <w:pPr>
         <w:pStyle w:val="Paragraph3"/>
-        <w:ind w:hanging="720" w:start="2160"/>
+        <w:ind w:hanging="720" w:left="2160"/>
         <w:rPr>
           <w:color w:val="0070C0"/>
         </w:rPr>
@@ -4661,7 +4817,7 @@
     <w:p>
       <w:pPr>
         <w:pStyle w:val="Paragraph3"/>
-        <w:ind w:hanging="720" w:start="2160"/>
+        <w:ind w:hanging="720" w:left="2160"/>
         <w:rPr>
           <w:color w:val="0070C0"/>
         </w:rPr>
@@ -4676,7 +4832,7 @@
     <w:p>
       <w:pPr>
         <w:pStyle w:val="Paragraph3"/>
-        <w:ind w:hanging="720" w:start="2160"/>
+        <w:ind w:hanging="720" w:left="2160"/>
         <w:rPr>
           <w:color w:val="0070C0"/>
         </w:rPr>
@@ -4691,7 +4847,7 @@
     <w:p>
       <w:pPr>
         <w:pStyle w:val="Paragraph3"/>
-        <w:ind w:hanging="720" w:start="2160"/>
+        <w:ind w:hanging="720" w:left="2160"/>
         <w:rPr>
           <w:color w:val="0070C0"/>
         </w:rPr>
@@ -4706,7 +4862,7 @@
     <w:p>
       <w:pPr>
         <w:pStyle w:val="Paragraph3"/>
-        <w:ind w:hanging="720" w:start="2160"/>
+        <w:ind w:hanging="720" w:left="2160"/>
         <w:rPr>
           <w:color w:val="0070C0"/>
         </w:rPr>
@@ -4721,7 +4877,7 @@
     <w:p>
       <w:pPr>
         <w:pStyle w:val="Paragraph3"/>
-        <w:ind w:hanging="720" w:start="2160"/>
+        <w:ind w:hanging="720" w:left="2160"/>
         <w:rPr>
           <w:color w:val="0070C0"/>
         </w:rPr>
@@ -4736,7 +4892,7 @@
     <w:p>
       <w:pPr>
         <w:pStyle w:val="Paragraph3"/>
-        <w:ind w:hanging="720" w:start="2160"/>
+        <w:ind w:hanging="720" w:left="2160"/>
         <w:rPr>
           <w:color w:val="0070C0"/>
         </w:rPr>
@@ -4751,7 +4907,7 @@
     <w:p>
       <w:pPr>
         <w:pStyle w:val="Paragraph3"/>
-        <w:ind w:hanging="720" w:start="2160"/>
+        <w:ind w:hanging="720" w:left="2160"/>
         <w:rPr>
           <w:color w:val="0070C0"/>
         </w:rPr>
@@ -4766,7 +4922,7 @@
     <w:p>
       <w:pPr>
         <w:pStyle w:val="Paragraph3"/>
-        <w:ind w:hanging="720" w:start="2160"/>
+        <w:ind w:hanging="720" w:left="2160"/>
         <w:rPr>
           <w:color w:val="0070C0"/>
         </w:rPr>
@@ -4781,7 +4937,7 @@
     <w:p>
       <w:pPr>
         <w:pStyle w:val="Paragraph3"/>
-        <w:ind w:hanging="720" w:start="2160"/>
+        <w:ind w:hanging="720" w:left="2160"/>
         <w:rPr>
           <w:color w:val="0070C0"/>
         </w:rPr>
@@ -4796,7 +4952,7 @@
     <w:p>
       <w:pPr>
         <w:pStyle w:val="Paragraph3"/>
-        <w:ind w:hanging="720" w:start="2160"/>
+        <w:ind w:hanging="720" w:left="2160"/>
         <w:rPr>
           <w:color w:val="0070C0"/>
         </w:rPr>
@@ -4811,7 +4967,7 @@
     <w:p>
       <w:pPr>
         <w:pStyle w:val="Paragraph3"/>
-        <w:ind w:hanging="720" w:start="2160"/>
+        <w:ind w:hanging="720" w:left="2160"/>
         <w:rPr>
           <w:color w:val="0070C0"/>
         </w:rPr>
@@ -4826,7 +4982,7 @@
     <w:p>
       <w:pPr>
         <w:pStyle w:val="Paragraph3"/>
-        <w:ind w:hanging="720" w:start="2160"/>
+        <w:ind w:hanging="720" w:left="2160"/>
         <w:rPr>
           <w:color w:val="0070C0"/>
         </w:rPr>
@@ -4841,7 +4997,7 @@
     <w:p>
       <w:pPr>
         <w:pStyle w:val="Paragraph3"/>
-        <w:ind w:hanging="720" w:start="2160"/>
+        <w:ind w:hanging="720" w:left="2160"/>
         <w:rPr>
           <w:color w:val="0070C0"/>
         </w:rPr>
@@ -4856,7 +5012,7 @@
     <w:p>
       <w:pPr>
         <w:pStyle w:val="Paragraph3"/>
-        <w:ind w:hanging="720" w:start="2160"/>
+        <w:ind w:hanging="720" w:left="2160"/>
         <w:rPr>
           <w:color w:val="0070C0"/>
         </w:rPr>
@@ -4871,7 +5027,7 @@
     <w:p>
       <w:pPr>
         <w:pStyle w:val="Paragraph3"/>
-        <w:ind w:hanging="720" w:start="2160"/>
+        <w:ind w:hanging="720" w:left="2160"/>
         <w:rPr>
           <w:color w:val="0070C0"/>
         </w:rPr>
@@ -4886,7 +5042,7 @@
     <w:p>
       <w:pPr>
         <w:pStyle w:val="Paragraph3"/>
-        <w:ind w:hanging="720" w:start="2160"/>
+        <w:ind w:hanging="720" w:left="2160"/>
         <w:rPr>
           <w:color w:val="0070C0"/>
         </w:rPr>
@@ -4901,7 +5057,7 @@
     <w:p>
       <w:pPr>
         <w:pStyle w:val="Paragraph3"/>
-        <w:ind w:hanging="720" w:start="2160"/>
+        <w:ind w:hanging="720" w:left="2160"/>
         <w:rPr>
           <w:color w:val="0070C0"/>
         </w:rPr>
@@ -4916,7 +5072,7 @@
     <w:p>
       <w:pPr>
         <w:pStyle w:val="Paragraph3"/>
-        <w:ind w:hanging="720" w:start="2160"/>
+        <w:ind w:hanging="720" w:left="2160"/>
         <w:rPr>
           <w:color w:val="0070C0"/>
         </w:rPr>
@@ -4931,7 +5087,7 @@
     <w:p>
       <w:pPr>
         <w:pStyle w:val="Paragraph3"/>
-        <w:ind w:hanging="720" w:start="2160"/>
+        <w:ind w:hanging="720" w:left="2160"/>
         <w:rPr>
           <w:color w:val="0070C0"/>
         </w:rPr>
@@ -4946,7 +5102,7 @@
     <w:p>
       <w:pPr>
         <w:pStyle w:val="Paragraph3"/>
-        <w:ind w:hanging="720" w:start="2160"/>
+        <w:ind w:hanging="720" w:left="2160"/>
         <w:rPr>
           <w:color w:val="7030A0"/>
         </w:rPr>
@@ -4961,7 +5117,7 @@
     <w:p>
       <w:pPr>
         <w:pStyle w:val="Paragraph3"/>
-        <w:ind w:firstLine="720" w:start="720"/>
+        <w:ind w:firstLine="720" w:left="720"/>
         <w:rPr>
           <w:color w:val="7030A0"/>
         </w:rPr>
@@ -5047,7 +5203,7 @@
           <wp:inline distT="0" distB="0" distL="0" distR="0">
             <wp:extent cx="5484495" cy="6080760"/>
             <wp:effectExtent l="0" t="0" r="0" b="0"/>
-            <wp:docPr id="3" name="Picture 4"/>
+            <wp:docPr id="3" name="Picture 4" descr=""/>
             <wp:cNvGraphicFramePr>
               <a:graphicFrameLocks xmlns:a="http://schemas.openxmlformats.org/drawingml/2006/main" noChangeAspect="1"/>
             </wp:cNvGraphicFramePr>
@@ -5055,7 +5211,7 @@
               <a:graphicData uri="http://schemas.openxmlformats.org/drawingml/2006/picture">
                 <pic:pic xmlns:pic="http://schemas.openxmlformats.org/drawingml/2006/picture">
                   <pic:nvPicPr>
-                    <pic:cNvPr id="3" name="Picture 4"/>
+                    <pic:cNvPr id="3" name="Picture 4" descr=""/>
                     <pic:cNvPicPr>
                       <a:picLocks noChangeAspect="1" noChangeArrowheads="1"/>
                     </pic:cNvPicPr>
@@ -5134,7 +5290,7 @@
     <w:p>
       <w:pPr>
         <w:pStyle w:val="Normal"/>
-        <w:ind w:start="1440"/>
+        <w:ind w:left="1440"/>
         <w:rPr>
           <w:color w:val="0070C0"/>
         </w:rPr>
@@ -5181,7 +5337,7 @@
     <w:p>
       <w:pPr>
         <w:pStyle w:val="Normal"/>
-        <w:ind w:start="1440"/>
+        <w:ind w:left="1440"/>
         <w:rPr>
           <w:color w:val="0070C0"/>
         </w:rPr>
@@ -5242,7 +5398,7 @@
     <w:p>
       <w:pPr>
         <w:pStyle w:val="Normal"/>
-        <w:ind w:start="1440"/>
+        <w:ind w:left="1440"/>
         <w:rPr>
           <w:color w:val="2A6099"/>
         </w:rPr>
@@ -5257,7 +5413,7 @@
     <w:p>
       <w:pPr>
         <w:pStyle w:val="Normal"/>
-        <w:ind w:start="1440"/>
+        <w:ind w:left="1440"/>
         <w:rPr>
           <w:color w:val="2A6099"/>
         </w:rPr>
@@ -5272,7 +5428,7 @@
     <w:p>
       <w:pPr>
         <w:pStyle w:val="Normal"/>
-        <w:ind w:start="1440"/>
+        <w:ind w:left="1440"/>
         <w:rPr>
           <w:color w:val="2A6099"/>
         </w:rPr>
@@ -5645,7 +5801,7 @@
     <w:p>
       <w:pPr>
         <w:pStyle w:val="Paragraph2"/>
-        <w:ind w:start="0"/>
+        <w:ind w:left="0"/>
         <w:rPr/>
       </w:pPr>
       <w:r>
@@ -5671,7 +5827,7 @@
     <w:p>
       <w:pPr>
         <w:pStyle w:val="Paragraph2"/>
-        <w:ind w:start="0"/>
+        <w:ind w:left="0"/>
         <w:rPr/>
       </w:pPr>
       <w:r>
@@ -5988,32 +6144,21 @@
         <w:rPr>
           <w:color w:val="00B0F0"/>
         </w:rPr>
-        <w:t xml:space="preserve">3.1.8.12 If a player has a blackjack and wins, player gets </w:t>
-      </w:r>
-      <w:r>
+        <w:t>3.1.8.12 If a player has a blackjack and wins, player gets 1.5x their bet</w:t>
+      </w:r>
+    </w:p>
+    <w:p>
+      <w:pPr>
+        <w:pStyle w:val="Paragraph2"/>
         <w:rPr>
           <w:color w:val="00B0F0"/>
         </w:rPr>
-        <w:t>1.5x</w:t>
-      </w:r>
+      </w:pPr>
       <w:r>
         <w:rPr>
           <w:color w:val="00B0F0"/>
         </w:rPr>
-        <w:t xml:space="preserve"> their bet</w:t>
-      </w:r>
-    </w:p>
-    <w:p>
-      <w:pPr>
-        <w:pStyle w:val="Paragraph2"/>
-        <w:rPr>
-          <w:color w:val="00B0F0"/>
-        </w:rPr>
-      </w:pPr>
-      <w:r>
-        <w:rPr>
-          <w:color w:val="00B0F0"/>
-        </w:rPr>
+        <w:t>3.1.8.13 Dealer must hit if their hand value is under 17</w:t>
       </w:r>
     </w:p>
     <w:p>
@@ -6091,7 +6236,7 @@
     <w:p>
       <w:pPr>
         <w:pStyle w:val="Normal"/>
-        <w:ind w:start="1440"/>
+        <w:ind w:left="1440"/>
         <w:rPr>
           <w:color w:val="0070C0"/>
         </w:rPr>
@@ -6106,7 +6251,7 @@
     <w:p>
       <w:pPr>
         <w:pStyle w:val="Normal"/>
-        <w:ind w:start="1440"/>
+        <w:ind w:left="1440"/>
         <w:rPr>
           <w:color w:val="0070C0"/>
         </w:rPr>
@@ -6167,7 +6312,7 @@
     <w:p>
       <w:pPr>
         <w:pStyle w:val="Normal"/>
-        <w:ind w:firstLine="720" w:start="720"/>
+        <w:ind w:firstLine="720" w:left="720"/>
         <w:rPr>
           <w:color w:val="7030A0"/>
         </w:rPr>
@@ -6197,7 +6342,7 @@
     <w:p>
       <w:pPr>
         <w:pStyle w:val="Normal"/>
-        <w:ind w:start="1440"/>
+        <w:ind w:left="1440"/>
         <w:rPr>
           <w:color w:val="7030A0"/>
         </w:rPr>
@@ -6213,7 +6358,7 @@
     <w:p>
       <w:pPr>
         <w:pStyle w:val="Normal"/>
-        <w:ind w:start="1440"/>
+        <w:ind w:left="1440"/>
         <w:rPr>
           <w:color w:val="7030A0"/>
         </w:rPr>
@@ -6242,7 +6387,7 @@
     <w:p>
       <w:pPr>
         <w:pStyle w:val="Normal"/>
-        <w:ind w:start="1440"/>
+        <w:ind w:left="1440"/>
         <w:rPr>
           <w:color w:val="7030A0"/>
         </w:rPr>
@@ -6272,7 +6417,7 @@
     <w:p>
       <w:pPr>
         <w:pStyle w:val="Normal"/>
-        <w:ind w:start="1440"/>
+        <w:ind w:left="1440"/>
         <w:rPr>
           <w:color w:val="7030A0"/>
         </w:rPr>
@@ -6302,7 +6447,7 @@
     <w:p>
       <w:pPr>
         <w:pStyle w:val="Normal"/>
-        <w:ind w:start="1440"/>
+        <w:ind w:left="1440"/>
         <w:rPr>
           <w:color w:val="7030A0"/>
         </w:rPr>
@@ -6334,7 +6479,7 @@
     <w:p>
       <w:pPr>
         <w:pStyle w:val="Normal"/>
-        <w:ind w:start="1440"/>
+        <w:ind w:left="1440"/>
         <w:rPr>
           <w:color w:val="0070C0"/>
         </w:rPr>
@@ -6353,7 +6498,7 @@
           <w:ilvl w:val="0"/>
           <w:numId w:val="0"/>
         </w:numPr>
-        <w:ind w:hanging="0" w:start="0"/>
+        <w:ind w:hanging="0" w:left="0"/>
         <w:rPr>
           <w:color w:val="7030A0"/>
         </w:rPr>
@@ -6523,7 +6668,7 @@
       <mc:AlternateContent>
         <mc:Choice Requires="wps">
           <w:drawing>
-            <wp:anchor behindDoc="1" distT="0" distB="0" distL="0" distR="0" simplePos="0" locked="0" layoutInCell="0" allowOverlap="1" relativeHeight="3" wp14:anchorId="07B49E00">
+            <wp:anchor behindDoc="1" distT="0" distB="0" distL="0" distR="0" simplePos="0" locked="0" layoutInCell="0" allowOverlap="1" relativeHeight="2" wp14:anchorId="07B49E00">
               <wp:simplePos x="0" y="0"/>
               <wp:positionH relativeFrom="margin">
                 <wp:align>center</wp:align>
@@ -6684,7 +6829,7 @@
       <mc:AlternateContent>
         <mc:Choice Requires="wps">
           <w:drawing>
-            <wp:anchor behindDoc="1" distT="0" distB="0" distL="0" distR="0" simplePos="0" locked="0" layoutInCell="0" allowOverlap="1" relativeHeight="3" wp14:anchorId="07B49E00">
+            <wp:anchor behindDoc="1" distT="0" distB="0" distL="0" distR="0" simplePos="0" locked="0" layoutInCell="0" allowOverlap="1" relativeHeight="2" wp14:anchorId="07B49E00">
               <wp:simplePos x="0" y="0"/>
               <wp:positionH relativeFrom="margin">
                 <wp:align>center</wp:align>
@@ -7171,7 +7316,7 @@
 <w:hdr xmlns:o="urn:schemas-microsoft-com:office:office" xmlns:r="http://schemas.openxmlformats.org/officeDocument/2006/relationships" xmlns:v="urn:schemas-microsoft-com:vml" xmlns:w="http://schemas.openxmlformats.org/wordprocessingml/2006/main" xmlns:w10="urn:schemas-microsoft-com:office:word" xmlns:wp="http://schemas.openxmlformats.org/drawingml/2006/wordprocessingDrawing" xmlns:pic="http://schemas.openxmlformats.org/drawingml/2006/picture" xmlns:wps="http://schemas.microsoft.com/office/word/2010/wordprocessingShape" xmlns:wpg="http://schemas.microsoft.com/office/word/2010/wordprocessingGroup" xmlns:mc="http://schemas.openxmlformats.org/markup-compatibility/2006" xmlns:wp14="http://schemas.microsoft.com/office/word/2010/wordprocessingDrawing" xmlns:w14="http://schemas.microsoft.com/office/word/2010/wordml" xmlns:w15="http://schemas.microsoft.com/office/word/2012/wordml" mc:Ignorable="w14 wp14 w15">
   <w:p>
     <w:pPr>
-      <w:pStyle w:val="HeaderLeft"/>
+      <w:pStyle w:val="HeaderLeftuser"/>
       <w:rPr/>
     </w:pPr>
     <w:r>
@@ -7189,12 +7334,12 @@
       <w:pStyle w:val="Heading1"/>
       <w:numFmt w:val="decimal"/>
       <w:lvlText w:val="%1."/>
-      <w:lvlJc w:val="start"/>
+      <w:lvlJc w:val="left"/>
       <w:pPr>
         <w:tabs>
           <w:tab w:val="num" w:pos="720"/>
         </w:tabs>
-        <w:ind w:start="720" w:hanging="720"/>
+        <w:ind w:left="720" w:hanging="720"/>
       </w:pPr>
       <w:rPr>
         <w:sz w:val="36"/>
@@ -7208,12 +7353,12 @@
       <w:pStyle w:val="Heading2"/>
       <w:numFmt w:val="decimal"/>
       <w:lvlText w:val="%1.%2."/>
-      <w:lvlJc w:val="start"/>
+      <w:lvlJc w:val="left"/>
       <w:pPr>
         <w:tabs>
           <w:tab w:val="num" w:pos="720"/>
         </w:tabs>
-        <w:ind w:start="1440" w:hanging="720"/>
+        <w:ind w:left="1440" w:hanging="720"/>
       </w:pPr>
       <w:rPr/>
     </w:lvl>
@@ -7222,12 +7367,12 @@
       <w:pStyle w:val="Heading3"/>
       <w:numFmt w:val="decimal"/>
       <w:lvlText w:val="%1.%2.%3."/>
-      <w:lvlJc w:val="start"/>
+      <w:lvlJc w:val="left"/>
       <w:pPr>
         <w:tabs>
           <w:tab w:val="num" w:pos="720"/>
         </w:tabs>
-        <w:ind w:start="2160" w:hanging="720"/>
+        <w:ind w:left="2160" w:hanging="720"/>
       </w:pPr>
       <w:rPr/>
     </w:lvl>
@@ -7236,12 +7381,12 @@
       <w:pStyle w:val="Heading4"/>
       <w:numFmt w:val="decimal"/>
       <w:lvlText w:val="%1.%2.%3.%4."/>
-      <w:lvlJc w:val="start"/>
+      <w:lvlJc w:val="left"/>
       <w:pPr>
         <w:tabs>
           <w:tab w:val="num" w:pos="720"/>
         </w:tabs>
-        <w:ind w:start="2880" w:hanging="720"/>
+        <w:ind w:left="2880" w:hanging="720"/>
       </w:pPr>
       <w:rPr/>
     </w:lvl>
@@ -7250,12 +7395,12 @@
       <w:pStyle w:val="Heading5"/>
       <w:numFmt w:val="decimal"/>
       <w:lvlText w:val="%1.%2.%3.%4.%5."/>
-      <w:lvlJc w:val="start"/>
+      <w:lvlJc w:val="left"/>
       <w:pPr>
         <w:tabs>
           <w:tab w:val="num" w:pos="720"/>
         </w:tabs>
-        <w:ind w:start="3600" w:hanging="720"/>
+        <w:ind w:left="3600" w:hanging="720"/>
       </w:pPr>
       <w:rPr/>
     </w:lvl>
@@ -7264,12 +7409,12 @@
       <w:pStyle w:val="Heading6"/>
       <w:numFmt w:val="decimal"/>
       <w:lvlText w:val="%1.%2.%3.%4.%5.%6."/>
-      <w:lvlJc w:val="start"/>
+      <w:lvlJc w:val="left"/>
       <w:pPr>
         <w:tabs>
           <w:tab w:val="num" w:pos="720"/>
         </w:tabs>
-        <w:ind w:start="4320" w:hanging="720"/>
+        <w:ind w:left="4320" w:hanging="720"/>
       </w:pPr>
       <w:rPr/>
     </w:lvl>
@@ -7278,12 +7423,12 @@
       <w:pStyle w:val="Heading7"/>
       <w:numFmt w:val="decimal"/>
       <w:lvlText w:val="%1.%2.%3.%4.%5.%6.%7."/>
-      <w:lvlJc w:val="start"/>
+      <w:lvlJc w:val="left"/>
       <w:pPr>
         <w:tabs>
           <w:tab w:val="num" w:pos="720"/>
         </w:tabs>
-        <w:ind w:start="5040" w:hanging="720"/>
+        <w:ind w:left="5040" w:hanging="720"/>
       </w:pPr>
       <w:rPr/>
     </w:lvl>
@@ -7292,12 +7437,12 @@
       <w:pStyle w:val="Heading8"/>
       <w:numFmt w:val="decimal"/>
       <w:lvlText w:val="%1.%2.%3.%4.%5.%6.%7.%8."/>
-      <w:lvlJc w:val="start"/>
+      <w:lvlJc w:val="left"/>
       <w:pPr>
         <w:tabs>
           <w:tab w:val="num" w:pos="720"/>
         </w:tabs>
-        <w:ind w:start="5760" w:hanging="720"/>
+        <w:ind w:left="5760" w:hanging="720"/>
       </w:pPr>
       <w:rPr/>
     </w:lvl>
@@ -7306,12 +7451,12 @@
       <w:pStyle w:val="Heading9"/>
       <w:numFmt w:val="decimal"/>
       <w:lvlText w:val="%1.%2.%3.%4.%5.%6.%7.%8.%9."/>
-      <w:lvlJc w:val="start"/>
+      <w:lvlJc w:val="left"/>
       <w:pPr>
         <w:tabs>
           <w:tab w:val="num" w:pos="720"/>
         </w:tabs>
-        <w:ind w:start="6480" w:hanging="720"/>
+        <w:ind w:left="6480" w:hanging="720"/>
       </w:pPr>
       <w:rPr/>
     </w:lvl>
@@ -7321,12 +7466,12 @@
       <w:start w:val="1"/>
       <w:numFmt w:val="decimal"/>
       <w:lvlText w:val="%1."/>
-      <w:lvlJc w:val="start"/>
+      <w:lvlJc w:val="left"/>
       <w:pPr>
         <w:tabs>
           <w:tab w:val="num" w:pos="720"/>
         </w:tabs>
-        <w:ind w:start="720" w:hanging="720"/>
+        <w:ind w:left="720" w:hanging="720"/>
       </w:pPr>
       <w:rPr>
         <w:sz w:val="36"/>
@@ -7339,12 +7484,12 @@
       <w:start w:val="1"/>
       <w:numFmt w:val="decimal"/>
       <w:lvlText w:val="%1.%2."/>
-      <w:lvlJc w:val="start"/>
+      <w:lvlJc w:val="left"/>
       <w:pPr>
         <w:tabs>
           <w:tab w:val="num" w:pos="720"/>
         </w:tabs>
-        <w:ind w:start="1440" w:hanging="720"/>
+        <w:ind w:left="1440" w:hanging="720"/>
       </w:pPr>
       <w:rPr/>
     </w:lvl>
@@ -7352,12 +7497,12 @@
       <w:start w:val="1"/>
       <w:numFmt w:val="decimal"/>
       <w:lvlText w:val="%1.%2.%3."/>
-      <w:lvlJc w:val="start"/>
+      <w:lvlJc w:val="left"/>
       <w:pPr>
         <w:tabs>
           <w:tab w:val="num" w:pos="720"/>
         </w:tabs>
-        <w:ind w:start="2160" w:hanging="720"/>
+        <w:ind w:left="2160" w:hanging="720"/>
       </w:pPr>
       <w:rPr/>
     </w:lvl>
@@ -7365,12 +7510,12 @@
       <w:start w:val="1"/>
       <w:numFmt w:val="decimal"/>
       <w:lvlText w:val="%1.%2.%3.%4."/>
-      <w:lvlJc w:val="start"/>
+      <w:lvlJc w:val="left"/>
       <w:pPr>
         <w:tabs>
           <w:tab w:val="num" w:pos="720"/>
         </w:tabs>
-        <w:ind w:start="2880" w:hanging="720"/>
+        <w:ind w:left="2880" w:hanging="720"/>
       </w:pPr>
       <w:rPr/>
     </w:lvl>
@@ -7378,12 +7523,12 @@
       <w:start w:val="1"/>
       <w:numFmt w:val="decimal"/>
       <w:lvlText w:val="%1.%2.%3.%4.%5."/>
-      <w:lvlJc w:val="start"/>
+      <w:lvlJc w:val="left"/>
       <w:pPr>
         <w:tabs>
           <w:tab w:val="num" w:pos="720"/>
         </w:tabs>
-        <w:ind w:start="3600" w:hanging="720"/>
+        <w:ind w:left="3600" w:hanging="720"/>
       </w:pPr>
       <w:rPr/>
     </w:lvl>
@@ -7391,12 +7536,12 @@
       <w:start w:val="1"/>
       <w:numFmt w:val="decimal"/>
       <w:lvlText w:val="%1.%2.%3.%4.%5.%6."/>
-      <w:lvlJc w:val="start"/>
+      <w:lvlJc w:val="left"/>
       <w:pPr>
         <w:tabs>
           <w:tab w:val="num" w:pos="720"/>
         </w:tabs>
-        <w:ind w:start="4320" w:hanging="720"/>
+        <w:ind w:left="4320" w:hanging="720"/>
       </w:pPr>
       <w:rPr/>
     </w:lvl>
@@ -7404,12 +7549,12 @@
       <w:start w:val="1"/>
       <w:numFmt w:val="decimal"/>
       <w:lvlText w:val="%1.%2.%3.%4.%5.%6.%7."/>
-      <w:lvlJc w:val="start"/>
+      <w:lvlJc w:val="left"/>
       <w:pPr>
         <w:tabs>
           <w:tab w:val="num" w:pos="720"/>
         </w:tabs>
-        <w:ind w:start="5040" w:hanging="720"/>
+        <w:ind w:left="5040" w:hanging="720"/>
       </w:pPr>
       <w:rPr/>
     </w:lvl>
@@ -7417,12 +7562,12 @@
       <w:start w:val="1"/>
       <w:numFmt w:val="decimal"/>
       <w:lvlText w:val="%1.%2.%3.%4.%5.%6.%7.%8."/>
-      <w:lvlJc w:val="start"/>
+      <w:lvlJc w:val="left"/>
       <w:pPr>
         <w:tabs>
           <w:tab w:val="num" w:pos="720"/>
         </w:tabs>
-        <w:ind w:start="5760" w:hanging="720"/>
+        <w:ind w:left="5760" w:hanging="720"/>
       </w:pPr>
       <w:rPr/>
     </w:lvl>
@@ -7430,12 +7575,12 @@
       <w:start w:val="1"/>
       <w:numFmt w:val="decimal"/>
       <w:lvlText w:val="%1.%2.%3.%4.%5.%6.%7.%8.%9."/>
-      <w:lvlJc w:val="start"/>
+      <w:lvlJc w:val="left"/>
       <w:pPr>
         <w:tabs>
           <w:tab w:val="num" w:pos="720"/>
         </w:tabs>
-        <w:ind w:start="6480" w:hanging="720"/>
+        <w:ind w:left="6480" w:hanging="720"/>
       </w:pPr>
       <w:rPr/>
     </w:lvl>
@@ -7852,7 +7997,7 @@
       <w:suppressAutoHyphens w:val="true"/>
       <w:bidi w:val="0"/>
       <w:spacing w:before="0" w:after="0"/>
-      <w:jc w:val="start"/>
+      <w:jc w:val="left"/>
     </w:pPr>
     <w:rPr>
       <w:rFonts w:ascii="Times New Roman" w:hAnsi="Times New Roman" w:eastAsia="Times New Roman" w:cs="Times New Roman"/>
@@ -7860,7 +8005,7 @@
       <w:kern w:val="0"/>
       <w:sz w:val="20"/>
       <w:szCs w:val="20"/>
-      <w:lang w:bidi="ar-SA" w:val="en-US" w:eastAsia="zh-CN"/>
+      <w:lang w:val="en-US" w:eastAsia="zh-CN" w:bidi="ar-SA"/>
     </w:rPr>
   </w:style>
   <w:style w:type="paragraph" w:styleId="Heading1">
@@ -8201,7 +8346,7 @@
     <w:basedOn w:val="Paragraph1"/>
     <w:qFormat/>
     <w:pPr>
-      <w:ind w:start="2880"/>
+      <w:ind w:left="2880"/>
     </w:pPr>
     <w:rPr/>
   </w:style>
@@ -8223,7 +8368,7 @@
     <w:basedOn w:val="Normal"/>
     <w:qFormat/>
     <w:pPr>
-      <w:ind w:start="3600"/>
+      <w:ind w:left="3600"/>
     </w:pPr>
     <w:rPr/>
   </w:style>
@@ -8267,7 +8412,7 @@
         <w:tab w:val="clear" w:pos="720"/>
         <w:tab w:val="right" w:pos="8640" w:leader="dot"/>
       </w:tabs>
-      <w:ind w:start="200"/>
+      <w:ind w:left="200"/>
     </w:pPr>
     <w:rPr>
       <w:smallCaps/>
@@ -8283,7 +8428,7 @@
         <w:tab w:val="clear" w:pos="720"/>
         <w:tab w:val="right" w:pos="8640" w:leader="dot"/>
       </w:tabs>
-      <w:ind w:start="400"/>
+      <w:ind w:left="400"/>
     </w:pPr>
     <w:rPr>
       <w:i/>
@@ -8294,7 +8439,7 @@
     <w:basedOn w:val="Paragraph1"/>
     <w:qFormat/>
     <w:pPr>
-      <w:ind w:start="1440"/>
+      <w:ind w:left="1440"/>
     </w:pPr>
     <w:rPr/>
   </w:style>
@@ -8303,7 +8448,7 @@
     <w:basedOn w:val="Paragraph1"/>
     <w:qFormat/>
     <w:pPr>
-      <w:ind w:start="2160"/>
+      <w:ind w:left="2160"/>
     </w:pPr>
     <w:rPr/>
   </w:style>
@@ -8353,7 +8498,7 @@
         <w:tab w:val="clear" w:pos="720"/>
         <w:tab w:val="right" w:pos="8640" w:leader="dot"/>
       </w:tabs>
-      <w:ind w:start="600"/>
+      <w:ind w:left="600"/>
     </w:pPr>
     <w:rPr>
       <w:sz w:val="18"/>
@@ -8368,7 +8513,7 @@
         <w:tab w:val="clear" w:pos="720"/>
         <w:tab w:val="right" w:pos="8640" w:leader="dot"/>
       </w:tabs>
-      <w:ind w:start="800"/>
+      <w:ind w:left="800"/>
     </w:pPr>
     <w:rPr>
       <w:sz w:val="18"/>
@@ -8383,7 +8528,7 @@
         <w:tab w:val="clear" w:pos="720"/>
         <w:tab w:val="right" w:pos="8640" w:leader="dot"/>
       </w:tabs>
-      <w:ind w:start="1000"/>
+      <w:ind w:left="1000"/>
     </w:pPr>
     <w:rPr>
       <w:sz w:val="18"/>
@@ -8398,7 +8543,7 @@
         <w:tab w:val="clear" w:pos="720"/>
         <w:tab w:val="right" w:pos="8640" w:leader="dot"/>
       </w:tabs>
-      <w:ind w:start="1200"/>
+      <w:ind w:left="1200"/>
     </w:pPr>
     <w:rPr>
       <w:sz w:val="18"/>
@@ -8413,7 +8558,7 @@
         <w:tab w:val="clear" w:pos="720"/>
         <w:tab w:val="right" w:pos="8640" w:leader="dot"/>
       </w:tabs>
-      <w:ind w:start="1400"/>
+      <w:ind w:left="1400"/>
     </w:pPr>
     <w:rPr>
       <w:sz w:val="18"/>
@@ -8428,7 +8573,7 @@
         <w:tab w:val="clear" w:pos="720"/>
         <w:tab w:val="right" w:pos="8640" w:leader="dot"/>
       </w:tabs>
-      <w:ind w:start="1600"/>
+      <w:ind w:left="1600"/>
     </w:pPr>
     <w:rPr>
       <w:sz w:val="18"/>
@@ -8472,7 +8617,7 @@
       <w:suppressAutoHyphens w:val="true"/>
       <w:bidi w:val="0"/>
       <w:spacing w:before="40" w:after="40"/>
-      <w:jc w:val="start"/>
+      <w:jc w:val="left"/>
     </w:pPr>
     <w:rPr>
       <w:rFonts w:ascii="Times New Roman" w:hAnsi="Times New Roman" w:eastAsia="Times New Roman" w:cs="Times New Roman"/>
@@ -8480,14 +8625,14 @@
       <w:kern w:val="0"/>
       <w:sz w:val="20"/>
       <w:szCs w:val="20"/>
-      <w:lang w:bidi="ar-SA" w:val="en-US" w:eastAsia="zh-CN"/>
+      <w:lang w:val="en-US" w:eastAsia="zh-CN" w:bidi="ar-SA"/>
     </w:rPr>
   </w:style>
   <w:style w:type="paragraph" w:styleId="BodyTextIndent">
     <w:name w:val="Body Text Indent"/>
     <w:basedOn w:val="Normal"/>
     <w:pPr>
-      <w:ind w:start="1440"/>
+      <w:ind w:left="1440"/>
     </w:pPr>
     <w:rPr/>
   </w:style>
@@ -8512,15 +8657,15 @@
       <w:bCs/>
     </w:rPr>
   </w:style>
-  <w:style w:type="paragraph" w:styleId="FrameContents" w:customStyle="1">
-    <w:name w:val="Frame Contents"/>
+  <w:style w:type="paragraph" w:styleId="FrameContentsuser" w:customStyle="1">
+    <w:name w:val="Frame Contents (user)"/>
     <w:basedOn w:val="Normal"/>
     <w:qFormat/>
     <w:pPr/>
     <w:rPr/>
   </w:style>
-  <w:style w:type="paragraph" w:styleId="HeaderLeft" w:customStyle="1">
-    <w:name w:val="Header Left"/>
+  <w:style w:type="paragraph" w:styleId="HeaderLeftuser" w:customStyle="1">
+    <w:name w:val="Header Left (user)"/>
     <w:basedOn w:val="Normal"/>
     <w:qFormat/>
     <w:pPr>
@@ -8533,8 +8678,8 @@
     </w:pPr>
     <w:rPr/>
   </w:style>
-  <w:style w:type="paragraph" w:styleId="FrameContentsuser" w:customStyle="1">
-    <w:name w:val="Frame Contents (user)"/>
+  <w:style w:type="paragraph" w:styleId="FrameContents" w:customStyle="1">
+    <w:name w:val="Frame Contents"/>
     <w:basedOn w:val="Normal"/>
     <w:qFormat/>
     <w:pPr/>

</xml_diff>

<commit_message>
Added Changes to Module 3.1.6 and 3.1.7
</commit_message>
<xml_diff>
--- a/CS 401 - Group 2 - SRS Doc.docx
+++ b/CS 401 - Group 2 - SRS Doc.docx
@@ -83,13 +83,50 @@
     </w:p>
     <w:p>
       <w:pPr>
+        <w:pStyle w:val="Subtitle"/>
+        <w:spacing w:before="0" w:after="720"/>
+        <w:rPr>
+          <w:b/>
+          <w:i w:val="false"/>
+          <w:i w:val="false"/>
+          <w:iCs/>
+          <w:color w:val="000000"/>
+          <w:sz w:val="24"/>
+          <w:szCs w:val="24"/>
+        </w:rPr>
+      </w:pPr>
+      <w:r>
+        <w:rPr>
+          <w:i w:val="false"/>
+          <w:iCs/>
+          <w:color w:val="000000"/>
+          <w:sz w:val="24"/>
+          <w:szCs w:val="24"/>
+        </w:rPr>
+        <w:t>Blake Fitzpatrick, Manny Gonzales, Nick Vu, Paul Cooper</w:t>
+      </w:r>
+      <w:r>
+        <w:rPr>
+          <w:b/>
+          <w:i w:val="false"/>
+          <w:iCs/>
+          <w:color w:val="000000"/>
+          <w:sz w:val="24"/>
+          <w:szCs w:val="24"/>
+        </w:rPr>
+        <w:br/>
+        <w:br/>
+      </w:r>
+    </w:p>
+    <w:p>
+      <w:pPr>
         <w:sectPr>
-          <w:headerReference w:type="even" r:id="rId2"/>
-          <w:headerReference w:type="default" r:id="rId3"/>
-          <w:headerReference w:type="first" r:id="rId4"/>
-          <w:footerReference w:type="even" r:id="rId5"/>
-          <w:footerReference w:type="default" r:id="rId6"/>
-          <w:footerReference w:type="first" r:id="rId7"/>
+          <w:headerReference w:type="even" r:id="rId3"/>
+          <w:headerReference w:type="default" r:id="rId4"/>
+          <w:headerReference w:type="first" r:id="rId5"/>
+          <w:footerReference w:type="even" r:id="rId6"/>
+          <w:footerReference w:type="default" r:id="rId7"/>
+          <w:footerReference w:type="first" r:id="rId8"/>
           <w:type w:val="nextPage"/>
           <w:pgSz w:w="12240" w:h="15840"/>
           <w:pgMar w:left="1800" w:right="1800" w:gutter="0" w:header="720" w:top="1440" w:footer="1080" w:bottom="1800"/>
@@ -111,16 +148,22 @@
           <w:szCs w:val="24"/>
         </w:rPr>
       </w:pPr>
-      <w:r>
-        <w:rPr>
-          <w:i w:val="false"/>
-          <w:iCs/>
-          <w:color w:val="000000"/>
-          <w:sz w:val="24"/>
-          <w:szCs w:val="24"/>
-        </w:rPr>
-        <w:t>Blake Fitzpatrick, Manny Gonzales, Nick Vu, Paul Cooper</w:t>
-      </w:r>
+      <w:hyperlink r:id="rId2">
+        <w:r>
+          <w:rPr>
+            <w:rStyle w:val="Hyperlink"/>
+            <w:b/>
+            <w:bCs/>
+            <w:i w:val="false"/>
+            <w:iCs/>
+            <w:color w:val="000000"/>
+            <w:sz w:val="24"/>
+            <w:szCs w:val="24"/>
+            <w:u w:val="none"/>
+          </w:rPr>
+          <w:t>https://github.com/eb-heavybarrel/CS401_Blackjack</w:t>
+        </w:r>
+      </w:hyperlink>
     </w:p>
     <w:p>
       <w:pPr>
@@ -966,7 +1009,13 @@
               <w:rPr>
                 <w:color w:val="000000"/>
               </w:rPr>
-              <w:t>Manny Gonzalez</w:t>
+              <w:t xml:space="preserve">Manny Gonzalez </w:t>
+            </w:r>
+            <w:r>
+              <w:rPr>
+                <w:color w:val="000000"/>
+              </w:rPr>
+              <w:t>Cashun</w:t>
             </w:r>
           </w:p>
         </w:tc>
@@ -1226,6 +1275,7 @@
                 <w:color w:val="000000"/>
                 <w:u w:val="single"/>
               </w:rPr>
+              <w:t>3/04/2026</w:t>
             </w:r>
           </w:p>
         </w:tc>
@@ -1252,6 +1302,7 @@
               <w:rPr>
                 <w:color w:val="000000"/>
               </w:rPr>
+              <w:t>1.6.1</w:t>
             </w:r>
           </w:p>
         </w:tc>
@@ -1278,6 +1329,7 @@
               <w:rPr>
                 <w:color w:val="000000"/>
               </w:rPr>
+              <w:t xml:space="preserve">Added requirements to modules 3.1.6 and 3.1.7. </w:t>
             </w:r>
           </w:p>
         </w:tc>
@@ -1305,6 +1357,7 @@
               <w:rPr>
                 <w:color w:val="000000"/>
               </w:rPr>
+              <w:t>Manuel Gonzalez Cashun</w:t>
             </w:r>
           </w:p>
         </w:tc>
@@ -2303,12 +2356,12 @@
     <w:p>
       <w:pPr>
         <w:sectPr>
-          <w:headerReference w:type="even" r:id="rId8"/>
-          <w:headerReference w:type="default" r:id="rId9"/>
-          <w:headerReference w:type="first" r:id="rId10"/>
-          <w:footerReference w:type="even" r:id="rId11"/>
-          <w:footerReference w:type="default" r:id="rId12"/>
-          <w:footerReference w:type="first" r:id="rId13"/>
+          <w:headerReference w:type="even" r:id="rId9"/>
+          <w:headerReference w:type="default" r:id="rId10"/>
+          <w:headerReference w:type="first" r:id="rId11"/>
+          <w:footerReference w:type="even" r:id="rId12"/>
+          <w:footerReference w:type="default" r:id="rId13"/>
+          <w:footerReference w:type="first" r:id="rId14"/>
           <w:type w:val="nextPage"/>
           <w:pgSz w:w="12240" w:h="15840"/>
           <w:pgMar w:left="1800" w:right="1800" w:gutter="0" w:header="720" w:top="1440" w:footer="1080" w:bottom="1800"/>
@@ -2416,9 +2469,16 @@
             <w:r>
               <w:rPr>
                 <w:rStyle w:val="IndexLink"/>
+                <w:vanish w:val="false"/>
+              </w:rPr>
+              <w:t>Purpose</w:t>
+            </w:r>
+            <w:r>
+              <w:rPr>
+                <w:rStyle w:val="IndexLink"/>
                 <w:vanish/>
               </w:rPr>
-              <w:t>Purpose</w:t>
+              <w:tab/>
             </w:r>
             <w:r>
               <w:rPr>
@@ -2442,7 +2502,6 @@
               <w:rPr>
                 <w:rStyle w:val="IndexLink"/>
               </w:rPr>
-              <w:tab/>
               <w:t>iv</w:t>
             </w:r>
             <w:r>
@@ -2495,9 +2554,16 @@
             <w:r>
               <w:rPr>
                 <w:rStyle w:val="IndexLink"/>
+                <w:vanish w:val="false"/>
+              </w:rPr>
+              <w:t>Scope</w:t>
+            </w:r>
+            <w:r>
+              <w:rPr>
+                <w:rStyle w:val="IndexLink"/>
                 <w:vanish/>
               </w:rPr>
-              <w:t>Scope</w:t>
+              <w:tab/>
             </w:r>
             <w:r>
               <w:rPr>
@@ -2521,7 +2587,6 @@
               <w:rPr>
                 <w:rStyle w:val="IndexLink"/>
               </w:rPr>
-              <w:tab/>
               <w:t>iv</w:t>
             </w:r>
             <w:r>
@@ -2574,9 +2639,16 @@
             <w:r>
               <w:rPr>
                 <w:rStyle w:val="IndexLink"/>
+                <w:vanish w:val="false"/>
+              </w:rPr>
+              <w:t>Definitions, Acronyms, Abbreviations</w:t>
+            </w:r>
+            <w:r>
+              <w:rPr>
+                <w:rStyle w:val="IndexLink"/>
                 <w:vanish/>
               </w:rPr>
-              <w:t>Definitions, Acronyms, Abbreviations</w:t>
+              <w:tab/>
             </w:r>
             <w:r>
               <w:rPr>
@@ -2600,7 +2672,6 @@
               <w:rPr>
                 <w:rStyle w:val="IndexLink"/>
               </w:rPr>
-              <w:tab/>
               <w:t>iv</w:t>
             </w:r>
             <w:r>
@@ -2653,9 +2724,16 @@
             <w:r>
               <w:rPr>
                 <w:rStyle w:val="IndexLink"/>
+                <w:vanish w:val="false"/>
+              </w:rPr>
+              <w:t>References</w:t>
+            </w:r>
+            <w:r>
+              <w:rPr>
+                <w:rStyle w:val="IndexLink"/>
                 <w:vanish/>
               </w:rPr>
-              <w:t>References</w:t>
+              <w:tab/>
             </w:r>
             <w:r>
               <w:rPr>
@@ -2679,7 +2757,6 @@
               <w:rPr>
                 <w:rStyle w:val="IndexLink"/>
               </w:rPr>
-              <w:tab/>
               <w:t>v</w:t>
             </w:r>
             <w:r>
@@ -2732,9 +2809,16 @@
             <w:r>
               <w:rPr>
                 <w:rStyle w:val="IndexLink"/>
+                <w:vanish w:val="false"/>
+              </w:rPr>
+              <w:t>Overview</w:t>
+            </w:r>
+            <w:r>
+              <w:rPr>
+                <w:rStyle w:val="IndexLink"/>
                 <w:vanish/>
               </w:rPr>
-              <w:t>Overview</w:t>
+              <w:tab/>
             </w:r>
             <w:r>
               <w:rPr>
@@ -2758,7 +2842,6 @@
               <w:rPr>
                 <w:rStyle w:val="IndexLink"/>
               </w:rPr>
-              <w:tab/>
               <w:t>v</w:t>
             </w:r>
             <w:r>
@@ -2814,9 +2897,16 @@
             <w:r>
               <w:rPr>
                 <w:rStyle w:val="IndexLink"/>
+                <w:vanish w:val="false"/>
+              </w:rPr>
+              <w:t>Overall Description</w:t>
+            </w:r>
+            <w:r>
+              <w:rPr>
+                <w:rStyle w:val="IndexLink"/>
                 <w:vanish/>
               </w:rPr>
-              <w:t>Overall Description</w:t>
+              <w:tab/>
             </w:r>
             <w:r>
               <w:rPr>
@@ -2840,7 +2930,6 @@
               <w:rPr>
                 <w:rStyle w:val="IndexLink"/>
               </w:rPr>
-              <w:tab/>
               <w:t>vi</w:t>
             </w:r>
             <w:r>
@@ -2893,9 +2982,16 @@
             <w:r>
               <w:rPr>
                 <w:rStyle w:val="IndexLink"/>
+                <w:vanish w:val="false"/>
+              </w:rPr>
+              <w:t>Product Perspective</w:t>
+            </w:r>
+            <w:r>
+              <w:rPr>
+                <w:rStyle w:val="IndexLink"/>
                 <w:vanish/>
               </w:rPr>
-              <w:t>Product Perspective</w:t>
+              <w:tab/>
             </w:r>
             <w:r>
               <w:rPr>
@@ -2919,7 +3015,6 @@
               <w:rPr>
                 <w:rStyle w:val="IndexLink"/>
               </w:rPr>
-              <w:tab/>
               <w:t>vi</w:t>
             </w:r>
             <w:r>
@@ -2972,9 +3067,16 @@
             <w:r>
               <w:rPr>
                 <w:rStyle w:val="IndexLink"/>
+                <w:vanish w:val="false"/>
+              </w:rPr>
+              <w:t>Product Architecture</w:t>
+            </w:r>
+            <w:r>
+              <w:rPr>
+                <w:rStyle w:val="IndexLink"/>
                 <w:vanish/>
               </w:rPr>
-              <w:t>Product Architecture</w:t>
+              <w:tab/>
             </w:r>
             <w:r>
               <w:rPr>
@@ -2998,7 +3100,6 @@
               <w:rPr>
                 <w:rStyle w:val="IndexLink"/>
               </w:rPr>
-              <w:tab/>
               <w:t>vi</w:t>
             </w:r>
             <w:r>
@@ -3051,9 +3152,16 @@
             <w:r>
               <w:rPr>
                 <w:rStyle w:val="IndexLink"/>
+                <w:vanish w:val="false"/>
+              </w:rPr>
+              <w:t>Product Functionality/Features</w:t>
+            </w:r>
+            <w:r>
+              <w:rPr>
+                <w:rStyle w:val="IndexLink"/>
                 <w:vanish/>
               </w:rPr>
-              <w:t>Product Functionality/Features</w:t>
+              <w:tab/>
             </w:r>
             <w:r>
               <w:rPr>
@@ -3077,7 +3185,6 @@
               <w:rPr>
                 <w:rStyle w:val="IndexLink"/>
               </w:rPr>
-              <w:tab/>
               <w:t>vi</w:t>
             </w:r>
             <w:r>
@@ -3130,9 +3237,16 @@
             <w:r>
               <w:rPr>
                 <w:rStyle w:val="IndexLink"/>
+                <w:vanish w:val="false"/>
+              </w:rPr>
+              <w:t>Constraints</w:t>
+            </w:r>
+            <w:r>
+              <w:rPr>
+                <w:rStyle w:val="IndexLink"/>
                 <w:vanish/>
               </w:rPr>
-              <w:t>Constraints</w:t>
+              <w:tab/>
             </w:r>
             <w:r>
               <w:rPr>
@@ -3156,7 +3270,6 @@
               <w:rPr>
                 <w:rStyle w:val="IndexLink"/>
               </w:rPr>
-              <w:tab/>
               <w:t>vi</w:t>
             </w:r>
             <w:r>
@@ -3209,9 +3322,16 @@
             <w:r>
               <w:rPr>
                 <w:rStyle w:val="IndexLink"/>
+                <w:vanish w:val="false"/>
+              </w:rPr>
+              <w:t>Assumptions and Dependencies</w:t>
+            </w:r>
+            <w:r>
+              <w:rPr>
+                <w:rStyle w:val="IndexLink"/>
                 <w:vanish/>
               </w:rPr>
-              <w:t>Assumptions and Dependencies</w:t>
+              <w:tab/>
             </w:r>
             <w:r>
               <w:rPr>
@@ -3235,7 +3355,6 @@
               <w:rPr>
                 <w:rStyle w:val="IndexLink"/>
               </w:rPr>
-              <w:tab/>
               <w:t>vi</w:t>
             </w:r>
             <w:r>
@@ -3291,9 +3410,16 @@
             <w:r>
               <w:rPr>
                 <w:rStyle w:val="IndexLink"/>
+                <w:vanish w:val="false"/>
+              </w:rPr>
+              <w:t>Specific Requirements</w:t>
+            </w:r>
+            <w:r>
+              <w:rPr>
+                <w:rStyle w:val="IndexLink"/>
                 <w:vanish/>
               </w:rPr>
-              <w:t>Specific Requirements</w:t>
+              <w:tab/>
             </w:r>
             <w:r>
               <w:rPr>
@@ -3317,7 +3443,6 @@
               <w:rPr>
                 <w:rStyle w:val="IndexLink"/>
               </w:rPr>
-              <w:tab/>
               <w:t>viii</w:t>
             </w:r>
             <w:r>
@@ -3370,9 +3495,16 @@
             <w:r>
               <w:rPr>
                 <w:rStyle w:val="IndexLink"/>
+                <w:vanish w:val="false"/>
+              </w:rPr>
+              <w:t>Functional Requirements</w:t>
+            </w:r>
+            <w:r>
+              <w:rPr>
+                <w:rStyle w:val="IndexLink"/>
                 <w:vanish/>
               </w:rPr>
-              <w:t>Functional Requirements</w:t>
+              <w:tab/>
             </w:r>
             <w:r>
               <w:rPr>
@@ -3396,7 +3528,6 @@
               <w:rPr>
                 <w:rStyle w:val="IndexLink"/>
               </w:rPr>
-              <w:tab/>
               <w:t>viii</w:t>
             </w:r>
             <w:r>
@@ -3448,9 +3579,16 @@
             <w:r>
               <w:rPr>
                 <w:rStyle w:val="IndexLink"/>
+                <w:vanish w:val="false"/>
+              </w:rPr>
+              <w:t>Common Requirements:</w:t>
+            </w:r>
+            <w:r>
+              <w:rPr>
+                <w:rStyle w:val="IndexLink"/>
                 <w:vanish/>
               </w:rPr>
-              <w:t>Common Requirements:</w:t>
+              <w:tab/>
             </w:r>
             <w:r>
               <w:rPr>
@@ -3474,7 +3612,6 @@
               <w:rPr>
                 <w:rStyle w:val="IndexLink"/>
               </w:rPr>
-              <w:tab/>
               <w:t>viii</w:t>
             </w:r>
             <w:r>
@@ -3526,9 +3663,16 @@
             <w:r>
               <w:rPr>
                 <w:rStyle w:val="IndexLink"/>
+                <w:vanish w:val="false"/>
+              </w:rPr>
+              <w:t>Users Module Requirements:</w:t>
+            </w:r>
+            <w:r>
+              <w:rPr>
+                <w:rStyle w:val="IndexLink"/>
                 <w:vanish/>
               </w:rPr>
-              <w:t>Users Module Requirements:</w:t>
+              <w:tab/>
             </w:r>
             <w:r>
               <w:rPr>
@@ -3552,7 +3696,6 @@
               <w:rPr>
                 <w:rStyle w:val="IndexLink"/>
               </w:rPr>
-              <w:tab/>
               <w:t>viii</w:t>
             </w:r>
             <w:r>
@@ -3604,9 +3747,16 @@
             <w:r>
               <w:rPr>
                 <w:rStyle w:val="IndexLink"/>
+                <w:vanish w:val="false"/>
+              </w:rPr>
+              <w:t>Datastore Module Requirements:</w:t>
+            </w:r>
+            <w:r>
+              <w:rPr>
+                <w:rStyle w:val="IndexLink"/>
                 <w:vanish/>
               </w:rPr>
-              <w:t>Datastore Module Requirements:</w:t>
+              <w:tab/>
             </w:r>
             <w:r>
               <w:rPr>
@@ -3630,7 +3780,6 @@
               <w:rPr>
                 <w:rStyle w:val="IndexLink"/>
               </w:rPr>
-              <w:tab/>
               <w:t>viii</w:t>
             </w:r>
             <w:r>
@@ -3682,9 +3831,16 @@
             <w:r>
               <w:rPr>
                 <w:rStyle w:val="IndexLink"/>
+                <w:vanish w:val="false"/>
+              </w:rPr>
+              <w:t>Network Module Requirements:</w:t>
+            </w:r>
+            <w:r>
+              <w:rPr>
+                <w:rStyle w:val="IndexLink"/>
                 <w:vanish/>
               </w:rPr>
-              <w:t>Network Module Requirements:</w:t>
+              <w:tab/>
             </w:r>
             <w:r>
               <w:rPr>
@@ -3708,7 +3864,6 @@
               <w:rPr>
                 <w:rStyle w:val="IndexLink"/>
               </w:rPr>
-              <w:tab/>
               <w:t>viii</w:t>
             </w:r>
             <w:r>
@@ -3760,9 +3915,16 @@
             <w:r>
               <w:rPr>
                 <w:rStyle w:val="IndexLink"/>
+                <w:vanish w:val="false"/>
+              </w:rPr>
+              <w:t>GUI Module Requirements:</w:t>
+            </w:r>
+            <w:r>
+              <w:rPr>
+                <w:rStyle w:val="IndexLink"/>
                 <w:vanish/>
               </w:rPr>
-              <w:t>GUI Module Requirements:</w:t>
+              <w:tab/>
             </w:r>
             <w:r>
               <w:rPr>
@@ -3786,7 +3948,6 @@
               <w:rPr>
                 <w:rStyle w:val="IndexLink"/>
               </w:rPr>
-              <w:tab/>
               <w:t>viii</w:t>
             </w:r>
             <w:r>
@@ -3838,9 +3999,16 @@
             <w:r>
               <w:rPr>
                 <w:rStyle w:val="IndexLink"/>
+                <w:vanish w:val="false"/>
+              </w:rPr>
+              <w:t>Lobby Module Requirements:</w:t>
+            </w:r>
+            <w:r>
+              <w:rPr>
+                <w:rStyle w:val="IndexLink"/>
                 <w:vanish/>
               </w:rPr>
-              <w:t>Lobby Module Requirements:</w:t>
+              <w:tab/>
             </w:r>
             <w:r>
               <w:rPr>
@@ -3864,7 +4032,6 @@
               <w:rPr>
                 <w:rStyle w:val="IndexLink"/>
               </w:rPr>
-              <w:tab/>
               <w:t>viii</w:t>
             </w:r>
             <w:r>
@@ -3916,9 +4083,16 @@
             <w:r>
               <w:rPr>
                 <w:rStyle w:val="IndexLink"/>
+                <w:vanish w:val="false"/>
+              </w:rPr>
+              <w:t>Table Module Requirements:</w:t>
+            </w:r>
+            <w:r>
+              <w:rPr>
+                <w:rStyle w:val="IndexLink"/>
                 <w:vanish/>
               </w:rPr>
-              <w:t>Table Module Requirements:</w:t>
+              <w:tab/>
             </w:r>
             <w:r>
               <w:rPr>
@@ -3942,7 +4116,6 @@
               <w:rPr>
                 <w:rStyle w:val="IndexLink"/>
               </w:rPr>
-              <w:tab/>
               <w:t>viii</w:t>
             </w:r>
             <w:r>
@@ -3994,9 +4167,16 @@
             <w:r>
               <w:rPr>
                 <w:rStyle w:val="IndexLink"/>
+                <w:vanish w:val="false"/>
+              </w:rPr>
+              <w:t>Game Module Requirements:</w:t>
+            </w:r>
+            <w:r>
+              <w:rPr>
+                <w:rStyle w:val="IndexLink"/>
                 <w:vanish/>
               </w:rPr>
-              <w:t>Game Module Requirements:</w:t>
+              <w:tab/>
             </w:r>
             <w:r>
               <w:rPr>
@@ -4020,7 +4200,6 @@
               <w:rPr>
                 <w:rStyle w:val="IndexLink"/>
               </w:rPr>
-              <w:tab/>
               <w:t>viii</w:t>
             </w:r>
             <w:r>
@@ -4073,9 +4252,16 @@
             <w:r>
               <w:rPr>
                 <w:rStyle w:val="IndexLink"/>
+                <w:vanish w:val="false"/>
+              </w:rPr>
+              <w:t>External Interface Requirements</w:t>
+            </w:r>
+            <w:r>
+              <w:rPr>
+                <w:rStyle w:val="IndexLink"/>
                 <w:vanish/>
               </w:rPr>
-              <w:t>External Interface Requirements</w:t>
+              <w:tab/>
             </w:r>
             <w:r>
               <w:rPr>
@@ -4099,7 +4285,6 @@
               <w:rPr>
                 <w:rStyle w:val="IndexLink"/>
               </w:rPr>
-              <w:tab/>
               <w:t>ix</w:t>
             </w:r>
             <w:r>
@@ -4152,9 +4337,16 @@
             <w:r>
               <w:rPr>
                 <w:rStyle w:val="IndexLink"/>
+                <w:vanish w:val="false"/>
+              </w:rPr>
+              <w:t>Internal Interface Requirements</w:t>
+            </w:r>
+            <w:r>
+              <w:rPr>
+                <w:rStyle w:val="IndexLink"/>
                 <w:vanish/>
               </w:rPr>
-              <w:t>Internal Interface Requirements</w:t>
+              <w:tab/>
             </w:r>
             <w:r>
               <w:rPr>
@@ -4178,7 +4370,6 @@
               <w:rPr>
                 <w:rStyle w:val="IndexLink"/>
               </w:rPr>
-              <w:tab/>
               <w:t>ix</w:t>
             </w:r>
             <w:r>
@@ -4234,9 +4425,16 @@
             <w:r>
               <w:rPr>
                 <w:rStyle w:val="IndexLink"/>
+                <w:vanish w:val="false"/>
+              </w:rPr>
+              <w:t>Non-Functional Requirements</w:t>
+            </w:r>
+            <w:r>
+              <w:rPr>
+                <w:rStyle w:val="IndexLink"/>
                 <w:vanish/>
               </w:rPr>
-              <w:t>Non-Functional Requirements</w:t>
+              <w:tab/>
             </w:r>
             <w:r>
               <w:rPr>
@@ -4260,7 +4458,6 @@
               <w:rPr>
                 <w:rStyle w:val="IndexLink"/>
               </w:rPr>
-              <w:tab/>
               <w:t>x</w:t>
             </w:r>
             <w:r>
@@ -4313,9 +4510,16 @@
             <w:r>
               <w:rPr>
                 <w:rStyle w:val="IndexLink"/>
+                <w:vanish w:val="false"/>
+              </w:rPr>
+              <w:t>Security and Privacy Requirements</w:t>
+            </w:r>
+            <w:r>
+              <w:rPr>
+                <w:rStyle w:val="IndexLink"/>
                 <w:vanish/>
               </w:rPr>
-              <w:t>Security and Privacy Requirements</w:t>
+              <w:tab/>
             </w:r>
             <w:r>
               <w:rPr>
@@ -4339,7 +4543,6 @@
               <w:rPr>
                 <w:rStyle w:val="IndexLink"/>
               </w:rPr>
-              <w:tab/>
               <w:t>x</w:t>
             </w:r>
             <w:r>
@@ -4392,9 +4595,16 @@
             <w:r>
               <w:rPr>
                 <w:rStyle w:val="IndexLink"/>
+                <w:vanish w:val="false"/>
+              </w:rPr>
+              <w:t>Environmental Requirements</w:t>
+            </w:r>
+            <w:r>
+              <w:rPr>
+                <w:rStyle w:val="IndexLink"/>
                 <w:vanish/>
               </w:rPr>
-              <w:t>Environmental Requirements</w:t>
+              <w:tab/>
             </w:r>
             <w:r>
               <w:rPr>
@@ -4418,7 +4628,6 @@
               <w:rPr>
                 <w:rStyle w:val="IndexLink"/>
               </w:rPr>
-              <w:tab/>
               <w:t>x</w:t>
             </w:r>
             <w:r>
@@ -4471,9 +4680,16 @@
             <w:r>
               <w:rPr>
                 <w:rStyle w:val="IndexLink"/>
+                <w:vanish w:val="false"/>
+              </w:rPr>
+              <w:t>Performance Requirements</w:t>
+            </w:r>
+            <w:r>
+              <w:rPr>
+                <w:rStyle w:val="IndexLink"/>
                 <w:vanish/>
               </w:rPr>
-              <w:t>Performance Requirements</w:t>
+              <w:tab/>
             </w:r>
             <w:r>
               <w:rPr>
@@ -4497,7 +4713,6 @@
               <w:rPr>
                 <w:rStyle w:val="IndexLink"/>
               </w:rPr>
-              <w:tab/>
               <w:t>x</w:t>
             </w:r>
             <w:r>
@@ -5217,7 +5432,7 @@
                     </pic:cNvPicPr>
                   </pic:nvPicPr>
                   <pic:blipFill>
-                    <a:blip r:embed="rId14"/>
+                    <a:blip r:embed="rId15"/>
                     <a:stretch>
                       <a:fillRect/>
                     </a:stretch>
@@ -5912,6 +6127,62 @@
       <w:pPr>
         <w:pStyle w:val="Paragraph2"/>
         <w:rPr>
+          <w:color w:val="729FCF"/>
+        </w:rPr>
+      </w:pPr>
+      <w:r>
+        <w:rPr>
+          <w:color w:val="729FCF"/>
+        </w:rPr>
+        <w:t>3.1.6.1 Players will be sent to the lobby after logging in.</w:t>
+      </w:r>
+    </w:p>
+    <w:p>
+      <w:pPr>
+        <w:pStyle w:val="Paragraph2"/>
+        <w:rPr>
+          <w:color w:val="729FCF"/>
+        </w:rPr>
+      </w:pPr>
+      <w:r>
+        <w:rPr>
+          <w:color w:val="729FCF"/>
+        </w:rPr>
+        <w:t>3.1.6.2 Players will be able to deposit and withdraw money from the lobby.</w:t>
+      </w:r>
+    </w:p>
+    <w:p>
+      <w:pPr>
+        <w:pStyle w:val="Paragraph2"/>
+        <w:rPr>
+          <w:color w:val="729FCF"/>
+        </w:rPr>
+      </w:pPr>
+      <w:r>
+        <w:rPr>
+          <w:color w:val="729FCF"/>
+        </w:rPr>
+        <w:t>3.1.6.3 Players will be able to join any open table from the lobby</w:t>
+      </w:r>
+    </w:p>
+    <w:p>
+      <w:pPr>
+        <w:pStyle w:val="Paragraph2"/>
+        <w:rPr>
+          <w:color w:val="729FCF"/>
+        </w:rPr>
+      </w:pPr>
+      <w:r>
+        <w:rPr>
+          <w:color w:val="729FCF"/>
+        </w:rPr>
+        <w:t>3.1.6.4 Players will be able to see table options and rules from the lobby.</w:t>
+      </w:r>
+    </w:p>
+    <w:p>
+      <w:pPr>
+        <w:pStyle w:val="Paragraph2"/>
+        <w:rPr>
           <w:color w:val="7030A0"/>
         </w:rPr>
       </w:pPr>
@@ -5941,13 +6212,104 @@
       <w:pPr>
         <w:pStyle w:val="Paragraph2"/>
         <w:rPr>
-          <w:color w:val="7030A0"/>
-        </w:rPr>
-      </w:pPr>
-      <w:r>
-        <w:rPr>
-          <w:color w:val="7030A0"/>
-        </w:rPr>
+          <w:color w:val="729FCF"/>
+        </w:rPr>
+      </w:pPr>
+      <w:r>
+        <w:rPr>
+          <w:color w:val="729FCF"/>
+        </w:rPr>
+        <w:t>3.1.7.1 Tables are created whenever a dealer joins the server</w:t>
+      </w:r>
+    </w:p>
+    <w:p>
+      <w:pPr>
+        <w:pStyle w:val="Paragraph2"/>
+        <w:rPr>
+          <w:color w:val="729FCF"/>
+        </w:rPr>
+      </w:pPr>
+      <w:r>
+        <w:rPr>
+          <w:color w:val="729FCF"/>
+        </w:rPr>
+        <w:t>3.1.7.2 Tables are opened whenever the dealer finalizes the table options</w:t>
+      </w:r>
+    </w:p>
+    <w:p>
+      <w:pPr>
+        <w:pStyle w:val="Paragraph2"/>
+        <w:rPr>
+          <w:color w:val="729FCF"/>
+        </w:rPr>
+      </w:pPr>
+      <w:r>
+        <w:rPr>
+          <w:color w:val="729FCF"/>
+        </w:rPr>
+        <w:t>3.1.7.3 Table options are as followed: setting betting limits, setting shoe size, setting the turn timer.</w:t>
+      </w:r>
+    </w:p>
+    <w:p>
+      <w:pPr>
+        <w:pStyle w:val="Paragraph2"/>
+        <w:rPr>
+          <w:color w:val="729FCF"/>
+        </w:rPr>
+      </w:pPr>
+      <w:r>
+        <w:rPr>
+          <w:color w:val="729FCF"/>
+        </w:rPr>
+        <w:t>3.1.7.4 Players must have the minimum bet in order to join the table</w:t>
+      </w:r>
+    </w:p>
+    <w:p>
+      <w:pPr>
+        <w:pStyle w:val="Paragraph2"/>
+        <w:rPr>
+          <w:color w:val="729FCF"/>
+        </w:rPr>
+      </w:pPr>
+      <w:r>
+        <w:rPr>
+          <w:color w:val="729FCF"/>
+        </w:rPr>
+        <w:t xml:space="preserve">3.1.7.5 The dealer can close the table at any time. When the dealer sets the table to be closed, the game continues until the current round is complete. </w:t>
+      </w:r>
+    </w:p>
+    <w:p>
+      <w:pPr>
+        <w:pStyle w:val="Paragraph2"/>
+        <w:rPr>
+          <w:color w:val="729FCF"/>
+        </w:rPr>
+      </w:pPr>
+      <w:r>
+        <w:rPr>
+          <w:color w:val="729FCF"/>
+        </w:rPr>
+        <w:t xml:space="preserve">3.1.7.6 </w:t>
+      </w:r>
+      <w:r>
+        <w:rPr>
+          <w:color w:val="729FCF"/>
+        </w:rPr>
+        <w:t>Each table will have a maximum of 6 players and 1 dealer.</w:t>
+      </w:r>
+    </w:p>
+    <w:p>
+      <w:pPr>
+        <w:pStyle w:val="Paragraph2"/>
+        <w:rPr>
+          <w:color w:val="729FCF"/>
+        </w:rPr>
+      </w:pPr>
+      <w:r>
+        <w:rPr>
+          <w:color w:val="729FCF"/>
+        </w:rPr>
+        <w:t>3.1.7.7 Table will be locked from new players while the table is at max capacity.</w:t>
       </w:r>
     </w:p>
     <w:p>
@@ -6539,12 +6901,12 @@
     <w:p>
       <w:pPr>
         <w:sectPr>
-          <w:headerReference w:type="even" r:id="rId15"/>
-          <w:headerReference w:type="default" r:id="rId16"/>
-          <w:headerReference w:type="first" r:id="rId17"/>
-          <w:footerReference w:type="even" r:id="rId18"/>
-          <w:footerReference w:type="default" r:id="rId19"/>
-          <w:footerReference w:type="first" r:id="rId20"/>
+          <w:headerReference w:type="even" r:id="rId16"/>
+          <w:headerReference w:type="default" r:id="rId17"/>
+          <w:headerReference w:type="first" r:id="rId18"/>
+          <w:footerReference w:type="even" r:id="rId19"/>
+          <w:footerReference w:type="default" r:id="rId20"/>
+          <w:footerReference w:type="first" r:id="rId21"/>
           <w:type w:val="nextPage"/>
           <w:pgSz w:w="12240" w:h="15840"/>
           <w:pgMar w:left="1800" w:right="1800" w:gutter="0" w:header="720" w:top="1440" w:footer="1080" w:bottom="1800"/>
@@ -7004,7 +7366,7 @@
       <mc:AlternateContent>
         <mc:Choice Requires="wps">
           <w:drawing>
-            <wp:anchor behindDoc="1" distT="0" distB="0" distL="0" distR="0" simplePos="0" locked="0" layoutInCell="0" allowOverlap="1" relativeHeight="20" wp14:anchorId="16546B0F">
+            <wp:anchor behindDoc="1" distT="0" distB="0" distL="0" distR="0" simplePos="0" locked="0" layoutInCell="0" allowOverlap="1" relativeHeight="19" wp14:anchorId="16546B0F">
               <wp:simplePos x="0" y="0"/>
               <wp:positionH relativeFrom="margin">
                 <wp:align>center</wp:align>
@@ -7316,7 +7678,7 @@
 <w:hdr xmlns:o="urn:schemas-microsoft-com:office:office" xmlns:r="http://schemas.openxmlformats.org/officeDocument/2006/relationships" xmlns:v="urn:schemas-microsoft-com:vml" xmlns:w="http://schemas.openxmlformats.org/wordprocessingml/2006/main" xmlns:w10="urn:schemas-microsoft-com:office:word" xmlns:wp="http://schemas.openxmlformats.org/drawingml/2006/wordprocessingDrawing" xmlns:pic="http://schemas.openxmlformats.org/drawingml/2006/picture" xmlns:wps="http://schemas.microsoft.com/office/word/2010/wordprocessingShape" xmlns:wpg="http://schemas.microsoft.com/office/word/2010/wordprocessingGroup" xmlns:mc="http://schemas.openxmlformats.org/markup-compatibility/2006" xmlns:wp14="http://schemas.microsoft.com/office/word/2010/wordprocessingDrawing" xmlns:w14="http://schemas.microsoft.com/office/word/2010/wordml" xmlns:w15="http://schemas.microsoft.com/office/word/2012/wordml" mc:Ignorable="w14 wp14 w15">
   <w:p>
     <w:pPr>
-      <w:pStyle w:val="HeaderLeftuser"/>
+      <w:pStyle w:val="HeaderLeft"/>
       <w:rPr/>
     </w:pPr>
     <w:r>
@@ -8657,15 +9019,15 @@
       <w:bCs/>
     </w:rPr>
   </w:style>
-  <w:style w:type="paragraph" w:styleId="FrameContentsuser" w:customStyle="1">
-    <w:name w:val="Frame Contents (user)"/>
+  <w:style w:type="paragraph" w:styleId="FrameContents" w:customStyle="1">
+    <w:name w:val="Frame Contents"/>
     <w:basedOn w:val="Normal"/>
     <w:qFormat/>
     <w:pPr/>
     <w:rPr/>
   </w:style>
-  <w:style w:type="paragraph" w:styleId="HeaderLeftuser" w:customStyle="1">
-    <w:name w:val="Header Left (user)"/>
+  <w:style w:type="paragraph" w:styleId="HeaderLeft" w:customStyle="1">
+    <w:name w:val="Header Left"/>
     <w:basedOn w:val="Normal"/>
     <w:qFormat/>
     <w:pPr>
@@ -8678,8 +9040,8 @@
     </w:pPr>
     <w:rPr/>
   </w:style>
-  <w:style w:type="paragraph" w:styleId="FrameContents" w:customStyle="1">
-    <w:name w:val="Frame Contents"/>
+  <w:style w:type="paragraph" w:styleId="FrameContentsuser" w:customStyle="1">
+    <w:name w:val="Frame Contents (user)"/>
     <w:basedOn w:val="Normal"/>
     <w:qFormat/>
     <w:pPr/>

</xml_diff>

<commit_message>
Added requirements to 3.1.2, 3.1.3, 3.1.4, and 3.1.5. Reworked 3.2
</commit_message>
<xml_diff>
--- a/CS 401 - Group 2 - SRS Doc.docx
+++ b/CS 401 - Group 2 - SRS Doc.docx
@@ -63,7 +63,6 @@
         <w:pStyle w:val="Subtitle"/>
         <w:spacing w:before="0" w:after="720"/>
         <w:rPr>
-          <w:i w:val="false"/>
           <w:i w:val="false"/>
           <w:iCs/>
           <w:color w:val="000000"/>
@@ -85,27 +84,6 @@
       <w:pPr>
         <w:pStyle w:val="Subtitle"/>
         <w:spacing w:before="0" w:after="720"/>
-        <w:rPr>
-          <w:b/>
-          <w:i w:val="false"/>
-          <w:i w:val="false"/>
-          <w:iCs/>
-          <w:color w:val="000000"/>
-          <w:sz w:val="24"/>
-          <w:szCs w:val="24"/>
-        </w:rPr>
-      </w:pPr>
-      <w:r>
-        <w:rPr>
-          <w:i w:val="false"/>
-          <w:iCs/>
-          <w:color w:val="000000"/>
-          <w:sz w:val="24"/>
-          <w:szCs w:val="24"/>
-        </w:rPr>
-        <w:t>Blake Fitzpatrick, Manny Gonzales, Nick Vu, Paul Cooper</w:t>
-      </w:r>
-      <w:r>
         <w:rPr>
           <w:b/>
           <w:i w:val="false"/>
@@ -114,12 +92,42 @@
           <w:sz w:val="24"/>
           <w:szCs w:val="24"/>
         </w:rPr>
+      </w:pPr>
+      <w:r>
+        <w:rPr>
+          <w:i w:val="false"/>
+          <w:iCs/>
+          <w:color w:val="000000"/>
+          <w:sz w:val="24"/>
+          <w:szCs w:val="24"/>
+        </w:rPr>
+        <w:t>Blake Fitzpatrick, Manny Gonzales, Nick Vu, Paul Cooper</w:t>
+      </w:r>
+      <w:r>
+        <w:rPr>
+          <w:b/>
+          <w:i w:val="false"/>
+          <w:iCs/>
+          <w:color w:val="000000"/>
+          <w:sz w:val="24"/>
+          <w:szCs w:val="24"/>
+        </w:rPr>
         <w:br/>
         <w:br/>
       </w:r>
     </w:p>
     <w:p>
       <w:pPr>
+        <w:pStyle w:val="Subtitle"/>
+        <w:spacing w:before="0" w:after="720"/>
+        <w:rPr>
+          <w:b/>
+          <w:i w:val="false"/>
+          <w:iCs/>
+          <w:color w:val="000000"/>
+          <w:sz w:val="24"/>
+          <w:szCs w:val="24"/>
+        </w:rPr>
         <w:sectPr>
           <w:headerReference w:type="even" r:id="rId3"/>
           <w:headerReference w:type="default" r:id="rId4"/>
@@ -136,17 +144,6 @@
           <w:textDirection w:val="lrTb"/>
           <w:docGrid w:type="default" w:linePitch="360" w:charSpace="0"/>
         </w:sectPr>
-        <w:pStyle w:val="Subtitle"/>
-        <w:spacing w:before="0" w:after="720"/>
-        <w:rPr>
-          <w:b/>
-          <w:i w:val="false"/>
-          <w:i w:val="false"/>
-          <w:iCs/>
-          <w:color w:val="000000"/>
-          <w:sz w:val="24"/>
-          <w:szCs w:val="24"/>
-        </w:rPr>
       </w:pPr>
       <w:hyperlink r:id="rId2">
         <w:r>
@@ -214,7 +211,7 @@
         <w:gridCol w:w="1275"/>
         <w:gridCol w:w="1083"/>
         <w:gridCol w:w="3812"/>
-        <w:gridCol w:w="2592"/>
+        <w:gridCol w:w="2593"/>
       </w:tblGrid>
       <w:tr>
         <w:trPr/>
@@ -307,7 +304,7 @@
         </w:tc>
         <w:tc>
           <w:tcPr>
-            <w:tcW w:w="2592" w:type="dxa"/>
+            <w:tcW w:w="2593" w:type="dxa"/>
             <w:tcBorders>
               <w:top w:val="single" w:sz="6" w:space="0" w:color="000000"/>
               <w:left w:val="single" w:sz="6" w:space="0" w:color="000000"/>
@@ -418,7 +415,7 @@
         </w:tc>
         <w:tc>
           <w:tcPr>
-            <w:tcW w:w="2592" w:type="dxa"/>
+            <w:tcW w:w="2593" w:type="dxa"/>
             <w:tcBorders>
               <w:top w:val="single" w:sz="6" w:space="0" w:color="000000"/>
               <w:left w:val="single" w:sz="6" w:space="0" w:color="000000"/>
@@ -531,7 +528,7 @@
         </w:tc>
         <w:tc>
           <w:tcPr>
-            <w:tcW w:w="2592" w:type="dxa"/>
+            <w:tcW w:w="2593" w:type="dxa"/>
             <w:tcBorders>
               <w:top w:val="single" w:sz="6" w:space="0" w:color="000000"/>
               <w:left w:val="single" w:sz="6" w:space="0" w:color="000000"/>
@@ -645,7 +642,7 @@
         </w:tc>
         <w:tc>
           <w:tcPr>
-            <w:tcW w:w="2592" w:type="dxa"/>
+            <w:tcW w:w="2593" w:type="dxa"/>
             <w:tcBorders>
               <w:top w:val="single" w:sz="6" w:space="0" w:color="000000"/>
               <w:left w:val="single" w:sz="6" w:space="0" w:color="000000"/>
@@ -759,7 +756,7 @@
         </w:tc>
         <w:tc>
           <w:tcPr>
-            <w:tcW w:w="2592" w:type="dxa"/>
+            <w:tcW w:w="2593" w:type="dxa"/>
             <w:tcBorders>
               <w:top w:val="single" w:sz="6" w:space="0" w:color="000000"/>
               <w:left w:val="single" w:sz="6" w:space="0" w:color="000000"/>
@@ -873,7 +870,7 @@
         </w:tc>
         <w:tc>
           <w:tcPr>
-            <w:tcW w:w="2592" w:type="dxa"/>
+            <w:tcW w:w="2593" w:type="dxa"/>
             <w:tcBorders>
               <w:top w:val="single" w:sz="6" w:space="0" w:color="000000"/>
               <w:left w:val="single" w:sz="6" w:space="0" w:color="000000"/>
@@ -987,7 +984,7 @@
         </w:tc>
         <w:tc>
           <w:tcPr>
-            <w:tcW w:w="2592" w:type="dxa"/>
+            <w:tcW w:w="2593" w:type="dxa"/>
             <w:tcBorders>
               <w:top w:val="single" w:sz="6" w:space="0" w:color="000000"/>
               <w:left w:val="single" w:sz="6" w:space="0" w:color="000000"/>
@@ -1009,13 +1006,7 @@
               <w:rPr>
                 <w:color w:val="000000"/>
               </w:rPr>
-              <w:t xml:space="preserve">Manny Gonzalez </w:t>
-            </w:r>
-            <w:r>
-              <w:rPr>
-                <w:color w:val="000000"/>
-              </w:rPr>
-              <w:t>Cashun</w:t>
+              <w:t>Manny Gonzalez Cashun</w:t>
             </w:r>
           </w:p>
         </w:tc>
@@ -1107,7 +1098,7 @@
         </w:tc>
         <w:tc>
           <w:tcPr>
-            <w:tcW w:w="2592" w:type="dxa"/>
+            <w:tcW w:w="2593" w:type="dxa"/>
             <w:tcBorders>
               <w:top w:val="single" w:sz="6" w:space="0" w:color="000000"/>
               <w:left w:val="single" w:sz="6" w:space="0" w:color="000000"/>
@@ -1221,7 +1212,7 @@
         </w:tc>
         <w:tc>
           <w:tcPr>
-            <w:tcW w:w="2592" w:type="dxa"/>
+            <w:tcW w:w="2593" w:type="dxa"/>
             <w:tcBorders>
               <w:top w:val="single" w:sz="6" w:space="0" w:color="000000"/>
               <w:left w:val="single" w:sz="6" w:space="0" w:color="000000"/>
@@ -1329,13 +1320,13 @@
               <w:rPr>
                 <w:color w:val="000000"/>
               </w:rPr>
-              <w:t xml:space="preserve">Added requirements to modules 3.1.6 and 3.1.7. </w:t>
+              <w:t>Added requirements to modules 3.1.6 and 3.1.7.</w:t>
             </w:r>
           </w:p>
         </w:tc>
         <w:tc>
           <w:tcPr>
-            <w:tcW w:w="2592" w:type="dxa"/>
+            <w:tcW w:w="2593" w:type="dxa"/>
             <w:tcBorders>
               <w:top w:val="single" w:sz="6" w:space="0" w:color="000000"/>
               <w:left w:val="single" w:sz="6" w:space="0" w:color="000000"/>
@@ -1389,6 +1380,7 @@
                 <w:color w:val="000000"/>
                 <w:u w:val="single"/>
               </w:rPr>
+              <w:t>03/04/2026</w:t>
             </w:r>
           </w:p>
         </w:tc>
@@ -1415,6 +1407,7 @@
               <w:rPr>
                 <w:color w:val="000000"/>
               </w:rPr>
+              <w:t>1.7</w:t>
             </w:r>
           </w:p>
         </w:tc>
@@ -1441,12 +1434,13 @@
               <w:rPr>
                 <w:color w:val="000000"/>
               </w:rPr>
+              <w:t>Added requirements to 3.1.2, 3.1.3, 3.1.4, and 3.1.5. Reworked 3.2</w:t>
             </w:r>
           </w:p>
         </w:tc>
         <w:tc>
           <w:tcPr>
-            <w:tcW w:w="2592" w:type="dxa"/>
+            <w:tcW w:w="2593" w:type="dxa"/>
             <w:tcBorders>
               <w:top w:val="single" w:sz="6" w:space="0" w:color="000000"/>
               <w:left w:val="single" w:sz="6" w:space="0" w:color="000000"/>
@@ -1468,6 +1462,7 @@
               <w:rPr>
                 <w:color w:val="000000"/>
               </w:rPr>
+              <w:t>Nick Vu</w:t>
             </w:r>
           </w:p>
         </w:tc>
@@ -1556,7 +1551,7 @@
         </w:tc>
         <w:tc>
           <w:tcPr>
-            <w:tcW w:w="2592" w:type="dxa"/>
+            <w:tcW w:w="2593" w:type="dxa"/>
             <w:tcBorders>
               <w:top w:val="single" w:sz="6" w:space="0" w:color="000000"/>
               <w:left w:val="single" w:sz="6" w:space="0" w:color="000000"/>
@@ -1666,7 +1661,7 @@
         </w:tc>
         <w:tc>
           <w:tcPr>
-            <w:tcW w:w="2592" w:type="dxa"/>
+            <w:tcW w:w="2593" w:type="dxa"/>
             <w:tcBorders>
               <w:top w:val="single" w:sz="6" w:space="0" w:color="000000"/>
               <w:left w:val="single" w:sz="6" w:space="0" w:color="000000"/>
@@ -1776,7 +1771,7 @@
         </w:tc>
         <w:tc>
           <w:tcPr>
-            <w:tcW w:w="2592" w:type="dxa"/>
+            <w:tcW w:w="2593" w:type="dxa"/>
             <w:tcBorders>
               <w:top w:val="single" w:sz="6" w:space="0" w:color="000000"/>
               <w:left w:val="single" w:sz="6" w:space="0" w:color="000000"/>
@@ -1886,7 +1881,7 @@
         </w:tc>
         <w:tc>
           <w:tcPr>
-            <w:tcW w:w="2592" w:type="dxa"/>
+            <w:tcW w:w="2593" w:type="dxa"/>
             <w:tcBorders>
               <w:top w:val="single" w:sz="6" w:space="0" w:color="000000"/>
               <w:left w:val="single" w:sz="6" w:space="0" w:color="000000"/>
@@ -1996,7 +1991,7 @@
         </w:tc>
         <w:tc>
           <w:tcPr>
-            <w:tcW w:w="2592" w:type="dxa"/>
+            <w:tcW w:w="2593" w:type="dxa"/>
             <w:tcBorders>
               <w:top w:val="single" w:sz="6" w:space="0" w:color="000000"/>
               <w:left w:val="single" w:sz="6" w:space="0" w:color="000000"/>
@@ -2106,7 +2101,7 @@
         </w:tc>
         <w:tc>
           <w:tcPr>
-            <w:tcW w:w="2592" w:type="dxa"/>
+            <w:tcW w:w="2593" w:type="dxa"/>
             <w:tcBorders>
               <w:top w:val="single" w:sz="6" w:space="0" w:color="000000"/>
               <w:left w:val="single" w:sz="6" w:space="0" w:color="000000"/>
@@ -2216,7 +2211,7 @@
         </w:tc>
         <w:tc>
           <w:tcPr>
-            <w:tcW w:w="2592" w:type="dxa"/>
+            <w:tcW w:w="2593" w:type="dxa"/>
             <w:tcBorders>
               <w:top w:val="single" w:sz="6" w:space="0" w:color="000000"/>
               <w:left w:val="single" w:sz="6" w:space="0" w:color="000000"/>
@@ -2326,7 +2321,7 @@
         </w:tc>
         <w:tc>
           <w:tcPr>
-            <w:tcW w:w="2592" w:type="dxa"/>
+            <w:tcW w:w="2593" w:type="dxa"/>
             <w:tcBorders>
               <w:top w:val="single" w:sz="6" w:space="0" w:color="000000"/>
               <w:left w:val="single" w:sz="6" w:space="0" w:color="000000"/>
@@ -2355,6 +2350,11 @@
     </w:tbl>
     <w:p>
       <w:pPr>
+        <w:pStyle w:val="Normal"/>
+        <w:rPr>
+          <w:color w:val="000000"/>
+          <w:u w:val="single"/>
+        </w:rPr>
         <w:sectPr>
           <w:headerReference w:type="even" r:id="rId9"/>
           <w:headerReference w:type="default" r:id="rId10"/>
@@ -2370,11 +2370,6 @@
           <w:textDirection w:val="lrTb"/>
           <w:docGrid w:type="default" w:linePitch="360" w:charSpace="0"/>
         </w:sectPr>
-        <w:pStyle w:val="Normal"/>
-        <w:rPr>
-          <w:color w:val="000000"/>
-          <w:u w:val="single"/>
-        </w:rPr>
       </w:pPr>
       <w:r>
         <w:rPr>
@@ -2412,7 +2407,6 @@
             <w:pStyle w:val="TOC1"/>
             <w:tabs>
               <w:tab w:val="left" w:pos="400" w:leader="none"/>
-              <w:tab w:val="right" w:pos="8640" w:leader="dot"/>
             </w:tabs>
             <w:rPr>
               <w:rFonts w:ascii="Aptos" w:hAnsi="Aptos" w:eastAsia="" w:cs="" w:asciiTheme="minorHAnsi" w:cstheme="minorBidi" w:eastAsiaTheme="minorEastAsia" w:hAnsiTheme="minorHAnsi"/>
@@ -2472,35 +2466,30 @@
                 <w:vanish w:val="false"/>
               </w:rPr>
               <w:t>Purpose</w:t>
+              <w:tab/>
+            </w:r>
+            <w:r>
+              <w:rPr>
+                <w:webHidden/>
+              </w:rPr>
+              <w:fldChar w:fldCharType="begin"/>
+            </w:r>
+            <w:r>
+              <w:rPr>
+                <w:webHidden/>
+              </w:rPr>
+              <w:instrText xml:space="preserve">PAGEREF _Toc223529111 \h</w:instrText>
+            </w:r>
+            <w:r>
+              <w:rPr>
+                <w:webHidden/>
+              </w:rPr>
+              <w:fldChar w:fldCharType="separate"/>
             </w:r>
             <w:r>
               <w:rPr>
                 <w:rStyle w:val="IndexLink"/>
                 <w:vanish/>
-              </w:rPr>
-              <w:tab/>
-            </w:r>
-            <w:r>
-              <w:rPr>
-                <w:webHidden/>
-              </w:rPr>
-              <w:fldChar w:fldCharType="begin"/>
-            </w:r>
-            <w:r>
-              <w:rPr>
-                <w:webHidden/>
-              </w:rPr>
-              <w:instrText xml:space="preserve">PAGEREF _Toc223529111 \h</w:instrText>
-            </w:r>
-            <w:r>
-              <w:rPr>
-                <w:webHidden/>
-              </w:rPr>
-              <w:fldChar w:fldCharType="separate"/>
-            </w:r>
-            <w:r>
-              <w:rPr>
-                <w:rStyle w:val="IndexLink"/>
               </w:rPr>
               <w:t>iv</w:t>
             </w:r>
@@ -2517,7 +2506,6 @@
             <w:pStyle w:val="TOC2"/>
             <w:tabs>
               <w:tab w:val="left" w:pos="800" w:leader="none"/>
-              <w:tab w:val="right" w:pos="8640" w:leader="dot"/>
             </w:tabs>
             <w:rPr>
               <w:rFonts w:ascii="Aptos" w:hAnsi="Aptos" w:eastAsia="" w:cs="" w:asciiTheme="minorHAnsi" w:cstheme="minorBidi" w:eastAsiaTheme="minorEastAsia" w:hAnsiTheme="minorHAnsi"/>
@@ -2557,35 +2545,30 @@
                 <w:vanish w:val="false"/>
               </w:rPr>
               <w:t>Scope</w:t>
+              <w:tab/>
+            </w:r>
+            <w:r>
+              <w:rPr>
+                <w:webHidden/>
+              </w:rPr>
+              <w:fldChar w:fldCharType="begin"/>
+            </w:r>
+            <w:r>
+              <w:rPr>
+                <w:webHidden/>
+              </w:rPr>
+              <w:instrText xml:space="preserve">PAGEREF _Toc223529112 \h</w:instrText>
+            </w:r>
+            <w:r>
+              <w:rPr>
+                <w:webHidden/>
+              </w:rPr>
+              <w:fldChar w:fldCharType="separate"/>
             </w:r>
             <w:r>
               <w:rPr>
                 <w:rStyle w:val="IndexLink"/>
                 <w:vanish/>
-              </w:rPr>
-              <w:tab/>
-            </w:r>
-            <w:r>
-              <w:rPr>
-                <w:webHidden/>
-              </w:rPr>
-              <w:fldChar w:fldCharType="begin"/>
-            </w:r>
-            <w:r>
-              <w:rPr>
-                <w:webHidden/>
-              </w:rPr>
-              <w:instrText xml:space="preserve">PAGEREF _Toc223529112 \h</w:instrText>
-            </w:r>
-            <w:r>
-              <w:rPr>
-                <w:webHidden/>
-              </w:rPr>
-              <w:fldChar w:fldCharType="separate"/>
-            </w:r>
-            <w:r>
-              <w:rPr>
-                <w:rStyle w:val="IndexLink"/>
               </w:rPr>
               <w:t>iv</w:t>
             </w:r>
@@ -2602,7 +2585,6 @@
             <w:pStyle w:val="TOC2"/>
             <w:tabs>
               <w:tab w:val="left" w:pos="800" w:leader="none"/>
-              <w:tab w:val="right" w:pos="8640" w:leader="dot"/>
             </w:tabs>
             <w:rPr>
               <w:rFonts w:ascii="Aptos" w:hAnsi="Aptos" w:eastAsia="" w:cs="" w:asciiTheme="minorHAnsi" w:cstheme="minorBidi" w:eastAsiaTheme="minorEastAsia" w:hAnsiTheme="minorHAnsi"/>
@@ -2642,35 +2624,30 @@
                 <w:vanish w:val="false"/>
               </w:rPr>
               <w:t>Definitions, Acronyms, Abbreviations</w:t>
+              <w:tab/>
+            </w:r>
+            <w:r>
+              <w:rPr>
+                <w:webHidden/>
+              </w:rPr>
+              <w:fldChar w:fldCharType="begin"/>
+            </w:r>
+            <w:r>
+              <w:rPr>
+                <w:webHidden/>
+              </w:rPr>
+              <w:instrText xml:space="preserve">PAGEREF _Toc223529113 \h</w:instrText>
+            </w:r>
+            <w:r>
+              <w:rPr>
+                <w:webHidden/>
+              </w:rPr>
+              <w:fldChar w:fldCharType="separate"/>
             </w:r>
             <w:r>
               <w:rPr>
                 <w:rStyle w:val="IndexLink"/>
                 <w:vanish/>
-              </w:rPr>
-              <w:tab/>
-            </w:r>
-            <w:r>
-              <w:rPr>
-                <w:webHidden/>
-              </w:rPr>
-              <w:fldChar w:fldCharType="begin"/>
-            </w:r>
-            <w:r>
-              <w:rPr>
-                <w:webHidden/>
-              </w:rPr>
-              <w:instrText xml:space="preserve">PAGEREF _Toc223529113 \h</w:instrText>
-            </w:r>
-            <w:r>
-              <w:rPr>
-                <w:webHidden/>
-              </w:rPr>
-              <w:fldChar w:fldCharType="separate"/>
-            </w:r>
-            <w:r>
-              <w:rPr>
-                <w:rStyle w:val="IndexLink"/>
               </w:rPr>
               <w:t>iv</w:t>
             </w:r>
@@ -2687,7 +2664,6 @@
             <w:pStyle w:val="TOC2"/>
             <w:tabs>
               <w:tab w:val="left" w:pos="800" w:leader="none"/>
-              <w:tab w:val="right" w:pos="8640" w:leader="dot"/>
             </w:tabs>
             <w:rPr>
               <w:rFonts w:ascii="Aptos" w:hAnsi="Aptos" w:eastAsia="" w:cs="" w:asciiTheme="minorHAnsi" w:cstheme="minorBidi" w:eastAsiaTheme="minorEastAsia" w:hAnsiTheme="minorHAnsi"/>
@@ -2727,35 +2703,30 @@
                 <w:vanish w:val="false"/>
               </w:rPr>
               <w:t>References</w:t>
+              <w:tab/>
+            </w:r>
+            <w:r>
+              <w:rPr>
+                <w:webHidden/>
+              </w:rPr>
+              <w:fldChar w:fldCharType="begin"/>
+            </w:r>
+            <w:r>
+              <w:rPr>
+                <w:webHidden/>
+              </w:rPr>
+              <w:instrText xml:space="preserve">PAGEREF _Toc223529114 \h</w:instrText>
+            </w:r>
+            <w:r>
+              <w:rPr>
+                <w:webHidden/>
+              </w:rPr>
+              <w:fldChar w:fldCharType="separate"/>
             </w:r>
             <w:r>
               <w:rPr>
                 <w:rStyle w:val="IndexLink"/>
                 <w:vanish/>
-              </w:rPr>
-              <w:tab/>
-            </w:r>
-            <w:r>
-              <w:rPr>
-                <w:webHidden/>
-              </w:rPr>
-              <w:fldChar w:fldCharType="begin"/>
-            </w:r>
-            <w:r>
-              <w:rPr>
-                <w:webHidden/>
-              </w:rPr>
-              <w:instrText xml:space="preserve">PAGEREF _Toc223529114 \h</w:instrText>
-            </w:r>
-            <w:r>
-              <w:rPr>
-                <w:webHidden/>
-              </w:rPr>
-              <w:fldChar w:fldCharType="separate"/>
-            </w:r>
-            <w:r>
-              <w:rPr>
-                <w:rStyle w:val="IndexLink"/>
               </w:rPr>
               <w:t>v</w:t>
             </w:r>
@@ -2772,7 +2743,6 @@
             <w:pStyle w:val="TOC2"/>
             <w:tabs>
               <w:tab w:val="left" w:pos="800" w:leader="none"/>
-              <w:tab w:val="right" w:pos="8640" w:leader="dot"/>
             </w:tabs>
             <w:rPr>
               <w:rFonts w:ascii="Aptos" w:hAnsi="Aptos" w:eastAsia="" w:cs="" w:asciiTheme="minorHAnsi" w:cstheme="minorBidi" w:eastAsiaTheme="minorEastAsia" w:hAnsiTheme="minorHAnsi"/>
@@ -2812,35 +2782,30 @@
                 <w:vanish w:val="false"/>
               </w:rPr>
               <w:t>Overview</w:t>
+              <w:tab/>
+            </w:r>
+            <w:r>
+              <w:rPr>
+                <w:webHidden/>
+              </w:rPr>
+              <w:fldChar w:fldCharType="begin"/>
+            </w:r>
+            <w:r>
+              <w:rPr>
+                <w:webHidden/>
+              </w:rPr>
+              <w:instrText xml:space="preserve">PAGEREF _Toc223529115 \h</w:instrText>
+            </w:r>
+            <w:r>
+              <w:rPr>
+                <w:webHidden/>
+              </w:rPr>
+              <w:fldChar w:fldCharType="separate"/>
             </w:r>
             <w:r>
               <w:rPr>
                 <w:rStyle w:val="IndexLink"/>
                 <w:vanish/>
-              </w:rPr>
-              <w:tab/>
-            </w:r>
-            <w:r>
-              <w:rPr>
-                <w:webHidden/>
-              </w:rPr>
-              <w:fldChar w:fldCharType="begin"/>
-            </w:r>
-            <w:r>
-              <w:rPr>
-                <w:webHidden/>
-              </w:rPr>
-              <w:instrText xml:space="preserve">PAGEREF _Toc223529115 \h</w:instrText>
-            </w:r>
-            <w:r>
-              <w:rPr>
-                <w:webHidden/>
-              </w:rPr>
-              <w:fldChar w:fldCharType="separate"/>
-            </w:r>
-            <w:r>
-              <w:rPr>
-                <w:rStyle w:val="IndexLink"/>
               </w:rPr>
               <w:t>v</w:t>
             </w:r>
@@ -2857,7 +2822,6 @@
             <w:pStyle w:val="TOC1"/>
             <w:tabs>
               <w:tab w:val="left" w:pos="400" w:leader="none"/>
-              <w:tab w:val="right" w:pos="8640" w:leader="dot"/>
             </w:tabs>
             <w:rPr>
               <w:rFonts w:ascii="Aptos" w:hAnsi="Aptos" w:eastAsia="" w:cs="" w:asciiTheme="minorHAnsi" w:cstheme="minorBidi" w:eastAsiaTheme="minorEastAsia" w:hAnsiTheme="minorHAnsi"/>
@@ -2900,35 +2864,30 @@
                 <w:vanish w:val="false"/>
               </w:rPr>
               <w:t>Overall Description</w:t>
+              <w:tab/>
+            </w:r>
+            <w:r>
+              <w:rPr>
+                <w:webHidden/>
+              </w:rPr>
+              <w:fldChar w:fldCharType="begin"/>
+            </w:r>
+            <w:r>
+              <w:rPr>
+                <w:webHidden/>
+              </w:rPr>
+              <w:instrText xml:space="preserve">PAGEREF _Toc223529116 \h</w:instrText>
+            </w:r>
+            <w:r>
+              <w:rPr>
+                <w:webHidden/>
+              </w:rPr>
+              <w:fldChar w:fldCharType="separate"/>
             </w:r>
             <w:r>
               <w:rPr>
                 <w:rStyle w:val="IndexLink"/>
                 <w:vanish/>
-              </w:rPr>
-              <w:tab/>
-            </w:r>
-            <w:r>
-              <w:rPr>
-                <w:webHidden/>
-              </w:rPr>
-              <w:fldChar w:fldCharType="begin"/>
-            </w:r>
-            <w:r>
-              <w:rPr>
-                <w:webHidden/>
-              </w:rPr>
-              <w:instrText xml:space="preserve">PAGEREF _Toc223529116 \h</w:instrText>
-            </w:r>
-            <w:r>
-              <w:rPr>
-                <w:webHidden/>
-              </w:rPr>
-              <w:fldChar w:fldCharType="separate"/>
-            </w:r>
-            <w:r>
-              <w:rPr>
-                <w:rStyle w:val="IndexLink"/>
               </w:rPr>
               <w:t>vi</w:t>
             </w:r>
@@ -2945,7 +2904,6 @@
             <w:pStyle w:val="TOC2"/>
             <w:tabs>
               <w:tab w:val="left" w:pos="800" w:leader="none"/>
-              <w:tab w:val="right" w:pos="8640" w:leader="dot"/>
             </w:tabs>
             <w:rPr>
               <w:rFonts w:ascii="Aptos" w:hAnsi="Aptos" w:eastAsia="" w:cs="" w:asciiTheme="minorHAnsi" w:cstheme="minorBidi" w:eastAsiaTheme="minorEastAsia" w:hAnsiTheme="minorHAnsi"/>
@@ -2985,35 +2943,30 @@
                 <w:vanish w:val="false"/>
               </w:rPr>
               <w:t>Product Perspective</w:t>
+              <w:tab/>
+            </w:r>
+            <w:r>
+              <w:rPr>
+                <w:webHidden/>
+              </w:rPr>
+              <w:fldChar w:fldCharType="begin"/>
+            </w:r>
+            <w:r>
+              <w:rPr>
+                <w:webHidden/>
+              </w:rPr>
+              <w:instrText xml:space="preserve">PAGEREF _Toc223529117 \h</w:instrText>
+            </w:r>
+            <w:r>
+              <w:rPr>
+                <w:webHidden/>
+              </w:rPr>
+              <w:fldChar w:fldCharType="separate"/>
             </w:r>
             <w:r>
               <w:rPr>
                 <w:rStyle w:val="IndexLink"/>
                 <w:vanish/>
-              </w:rPr>
-              <w:tab/>
-            </w:r>
-            <w:r>
-              <w:rPr>
-                <w:webHidden/>
-              </w:rPr>
-              <w:fldChar w:fldCharType="begin"/>
-            </w:r>
-            <w:r>
-              <w:rPr>
-                <w:webHidden/>
-              </w:rPr>
-              <w:instrText xml:space="preserve">PAGEREF _Toc223529117 \h</w:instrText>
-            </w:r>
-            <w:r>
-              <w:rPr>
-                <w:webHidden/>
-              </w:rPr>
-              <w:fldChar w:fldCharType="separate"/>
-            </w:r>
-            <w:r>
-              <w:rPr>
-                <w:rStyle w:val="IndexLink"/>
               </w:rPr>
               <w:t>vi</w:t>
             </w:r>
@@ -3030,7 +2983,6 @@
             <w:pStyle w:val="TOC2"/>
             <w:tabs>
               <w:tab w:val="left" w:pos="800" w:leader="none"/>
-              <w:tab w:val="right" w:pos="8640" w:leader="dot"/>
             </w:tabs>
             <w:rPr>
               <w:rFonts w:ascii="Aptos" w:hAnsi="Aptos" w:eastAsia="" w:cs="" w:asciiTheme="minorHAnsi" w:cstheme="minorBidi" w:eastAsiaTheme="minorEastAsia" w:hAnsiTheme="minorHAnsi"/>
@@ -3070,35 +3022,30 @@
                 <w:vanish w:val="false"/>
               </w:rPr>
               <w:t>Product Architecture</w:t>
+              <w:tab/>
+            </w:r>
+            <w:r>
+              <w:rPr>
+                <w:webHidden/>
+              </w:rPr>
+              <w:fldChar w:fldCharType="begin"/>
+            </w:r>
+            <w:r>
+              <w:rPr>
+                <w:webHidden/>
+              </w:rPr>
+              <w:instrText xml:space="preserve">PAGEREF _Toc223529118 \h</w:instrText>
+            </w:r>
+            <w:r>
+              <w:rPr>
+                <w:webHidden/>
+              </w:rPr>
+              <w:fldChar w:fldCharType="separate"/>
             </w:r>
             <w:r>
               <w:rPr>
                 <w:rStyle w:val="IndexLink"/>
                 <w:vanish/>
-              </w:rPr>
-              <w:tab/>
-            </w:r>
-            <w:r>
-              <w:rPr>
-                <w:webHidden/>
-              </w:rPr>
-              <w:fldChar w:fldCharType="begin"/>
-            </w:r>
-            <w:r>
-              <w:rPr>
-                <w:webHidden/>
-              </w:rPr>
-              <w:instrText xml:space="preserve">PAGEREF _Toc223529118 \h</w:instrText>
-            </w:r>
-            <w:r>
-              <w:rPr>
-                <w:webHidden/>
-              </w:rPr>
-              <w:fldChar w:fldCharType="separate"/>
-            </w:r>
-            <w:r>
-              <w:rPr>
-                <w:rStyle w:val="IndexLink"/>
               </w:rPr>
               <w:t>vi</w:t>
             </w:r>
@@ -3115,7 +3062,6 @@
             <w:pStyle w:val="TOC2"/>
             <w:tabs>
               <w:tab w:val="left" w:pos="800" w:leader="none"/>
-              <w:tab w:val="right" w:pos="8640" w:leader="dot"/>
             </w:tabs>
             <w:rPr>
               <w:rFonts w:ascii="Aptos" w:hAnsi="Aptos" w:eastAsia="" w:cs="" w:asciiTheme="minorHAnsi" w:cstheme="minorBidi" w:eastAsiaTheme="minorEastAsia" w:hAnsiTheme="minorHAnsi"/>
@@ -3155,35 +3101,30 @@
                 <w:vanish w:val="false"/>
               </w:rPr>
               <w:t>Product Functionality/Features</w:t>
+              <w:tab/>
+            </w:r>
+            <w:r>
+              <w:rPr>
+                <w:webHidden/>
+              </w:rPr>
+              <w:fldChar w:fldCharType="begin"/>
+            </w:r>
+            <w:r>
+              <w:rPr>
+                <w:webHidden/>
+              </w:rPr>
+              <w:instrText xml:space="preserve">PAGEREF _Toc223529119 \h</w:instrText>
+            </w:r>
+            <w:r>
+              <w:rPr>
+                <w:webHidden/>
+              </w:rPr>
+              <w:fldChar w:fldCharType="separate"/>
             </w:r>
             <w:r>
               <w:rPr>
                 <w:rStyle w:val="IndexLink"/>
                 <w:vanish/>
-              </w:rPr>
-              <w:tab/>
-            </w:r>
-            <w:r>
-              <w:rPr>
-                <w:webHidden/>
-              </w:rPr>
-              <w:fldChar w:fldCharType="begin"/>
-            </w:r>
-            <w:r>
-              <w:rPr>
-                <w:webHidden/>
-              </w:rPr>
-              <w:instrText xml:space="preserve">PAGEREF _Toc223529119 \h</w:instrText>
-            </w:r>
-            <w:r>
-              <w:rPr>
-                <w:webHidden/>
-              </w:rPr>
-              <w:fldChar w:fldCharType="separate"/>
-            </w:r>
-            <w:r>
-              <w:rPr>
-                <w:rStyle w:val="IndexLink"/>
               </w:rPr>
               <w:t>vi</w:t>
             </w:r>
@@ -3200,7 +3141,6 @@
             <w:pStyle w:val="TOC2"/>
             <w:tabs>
               <w:tab w:val="left" w:pos="800" w:leader="none"/>
-              <w:tab w:val="right" w:pos="8640" w:leader="dot"/>
             </w:tabs>
             <w:rPr>
               <w:rFonts w:ascii="Aptos" w:hAnsi="Aptos" w:eastAsia="" w:cs="" w:asciiTheme="minorHAnsi" w:cstheme="minorBidi" w:eastAsiaTheme="minorEastAsia" w:hAnsiTheme="minorHAnsi"/>
@@ -3240,35 +3180,30 @@
                 <w:vanish w:val="false"/>
               </w:rPr>
               <w:t>Constraints</w:t>
+              <w:tab/>
+            </w:r>
+            <w:r>
+              <w:rPr>
+                <w:webHidden/>
+              </w:rPr>
+              <w:fldChar w:fldCharType="begin"/>
+            </w:r>
+            <w:r>
+              <w:rPr>
+                <w:webHidden/>
+              </w:rPr>
+              <w:instrText xml:space="preserve">PAGEREF _Toc223529120 \h</w:instrText>
+            </w:r>
+            <w:r>
+              <w:rPr>
+                <w:webHidden/>
+              </w:rPr>
+              <w:fldChar w:fldCharType="separate"/>
             </w:r>
             <w:r>
               <w:rPr>
                 <w:rStyle w:val="IndexLink"/>
                 <w:vanish/>
-              </w:rPr>
-              <w:tab/>
-            </w:r>
-            <w:r>
-              <w:rPr>
-                <w:webHidden/>
-              </w:rPr>
-              <w:fldChar w:fldCharType="begin"/>
-            </w:r>
-            <w:r>
-              <w:rPr>
-                <w:webHidden/>
-              </w:rPr>
-              <w:instrText xml:space="preserve">PAGEREF _Toc223529120 \h</w:instrText>
-            </w:r>
-            <w:r>
-              <w:rPr>
-                <w:webHidden/>
-              </w:rPr>
-              <w:fldChar w:fldCharType="separate"/>
-            </w:r>
-            <w:r>
-              <w:rPr>
-                <w:rStyle w:val="IndexLink"/>
               </w:rPr>
               <w:t>vi</w:t>
             </w:r>
@@ -3285,7 +3220,6 @@
             <w:pStyle w:val="TOC2"/>
             <w:tabs>
               <w:tab w:val="left" w:pos="800" w:leader="none"/>
-              <w:tab w:val="right" w:pos="8640" w:leader="dot"/>
             </w:tabs>
             <w:rPr>
               <w:rFonts w:ascii="Aptos" w:hAnsi="Aptos" w:eastAsia="" w:cs="" w:asciiTheme="minorHAnsi" w:cstheme="minorBidi" w:eastAsiaTheme="minorEastAsia" w:hAnsiTheme="minorHAnsi"/>
@@ -3325,35 +3259,30 @@
                 <w:vanish w:val="false"/>
               </w:rPr>
               <w:t>Assumptions and Dependencies</w:t>
+              <w:tab/>
+            </w:r>
+            <w:r>
+              <w:rPr>
+                <w:webHidden/>
+              </w:rPr>
+              <w:fldChar w:fldCharType="begin"/>
+            </w:r>
+            <w:r>
+              <w:rPr>
+                <w:webHidden/>
+              </w:rPr>
+              <w:instrText xml:space="preserve">PAGEREF _Toc223529121 \h</w:instrText>
+            </w:r>
+            <w:r>
+              <w:rPr>
+                <w:webHidden/>
+              </w:rPr>
+              <w:fldChar w:fldCharType="separate"/>
             </w:r>
             <w:r>
               <w:rPr>
                 <w:rStyle w:val="IndexLink"/>
                 <w:vanish/>
-              </w:rPr>
-              <w:tab/>
-            </w:r>
-            <w:r>
-              <w:rPr>
-                <w:webHidden/>
-              </w:rPr>
-              <w:fldChar w:fldCharType="begin"/>
-            </w:r>
-            <w:r>
-              <w:rPr>
-                <w:webHidden/>
-              </w:rPr>
-              <w:instrText xml:space="preserve">PAGEREF _Toc223529121 \h</w:instrText>
-            </w:r>
-            <w:r>
-              <w:rPr>
-                <w:webHidden/>
-              </w:rPr>
-              <w:fldChar w:fldCharType="separate"/>
-            </w:r>
-            <w:r>
-              <w:rPr>
-                <w:rStyle w:val="IndexLink"/>
               </w:rPr>
               <w:t>vi</w:t>
             </w:r>
@@ -3370,7 +3299,6 @@
             <w:pStyle w:val="TOC1"/>
             <w:tabs>
               <w:tab w:val="left" w:pos="400" w:leader="none"/>
-              <w:tab w:val="right" w:pos="8640" w:leader="dot"/>
             </w:tabs>
             <w:rPr>
               <w:rFonts w:ascii="Aptos" w:hAnsi="Aptos" w:eastAsia="" w:cs="" w:asciiTheme="minorHAnsi" w:cstheme="minorBidi" w:eastAsiaTheme="minorEastAsia" w:hAnsiTheme="minorHAnsi"/>
@@ -3413,35 +3341,30 @@
                 <w:vanish w:val="false"/>
               </w:rPr>
               <w:t>Specific Requirements</w:t>
+              <w:tab/>
+            </w:r>
+            <w:r>
+              <w:rPr>
+                <w:webHidden/>
+              </w:rPr>
+              <w:fldChar w:fldCharType="begin"/>
+            </w:r>
+            <w:r>
+              <w:rPr>
+                <w:webHidden/>
+              </w:rPr>
+              <w:instrText xml:space="preserve">PAGEREF _Toc223529122 \h</w:instrText>
+            </w:r>
+            <w:r>
+              <w:rPr>
+                <w:webHidden/>
+              </w:rPr>
+              <w:fldChar w:fldCharType="separate"/>
             </w:r>
             <w:r>
               <w:rPr>
                 <w:rStyle w:val="IndexLink"/>
                 <w:vanish/>
-              </w:rPr>
-              <w:tab/>
-            </w:r>
-            <w:r>
-              <w:rPr>
-                <w:webHidden/>
-              </w:rPr>
-              <w:fldChar w:fldCharType="begin"/>
-            </w:r>
-            <w:r>
-              <w:rPr>
-                <w:webHidden/>
-              </w:rPr>
-              <w:instrText xml:space="preserve">PAGEREF _Toc223529122 \h</w:instrText>
-            </w:r>
-            <w:r>
-              <w:rPr>
-                <w:webHidden/>
-              </w:rPr>
-              <w:fldChar w:fldCharType="separate"/>
-            </w:r>
-            <w:r>
-              <w:rPr>
-                <w:rStyle w:val="IndexLink"/>
               </w:rPr>
               <w:t>viii</w:t>
             </w:r>
@@ -3458,7 +3381,6 @@
             <w:pStyle w:val="TOC2"/>
             <w:tabs>
               <w:tab w:val="left" w:pos="800" w:leader="none"/>
-              <w:tab w:val="right" w:pos="8640" w:leader="dot"/>
             </w:tabs>
             <w:rPr>
               <w:rFonts w:ascii="Aptos" w:hAnsi="Aptos" w:eastAsia="" w:cs="" w:asciiTheme="minorHAnsi" w:cstheme="minorBidi" w:eastAsiaTheme="minorEastAsia" w:hAnsiTheme="minorHAnsi"/>
@@ -3498,35 +3420,30 @@
                 <w:vanish w:val="false"/>
               </w:rPr>
               <w:t>Functional Requirements</w:t>
+              <w:tab/>
+            </w:r>
+            <w:r>
+              <w:rPr>
+                <w:webHidden/>
+              </w:rPr>
+              <w:fldChar w:fldCharType="begin"/>
+            </w:r>
+            <w:r>
+              <w:rPr>
+                <w:webHidden/>
+              </w:rPr>
+              <w:instrText xml:space="preserve">PAGEREF _Toc223529123 \h</w:instrText>
+            </w:r>
+            <w:r>
+              <w:rPr>
+                <w:webHidden/>
+              </w:rPr>
+              <w:fldChar w:fldCharType="separate"/>
             </w:r>
             <w:r>
               <w:rPr>
                 <w:rStyle w:val="IndexLink"/>
                 <w:vanish/>
-              </w:rPr>
-              <w:tab/>
-            </w:r>
-            <w:r>
-              <w:rPr>
-                <w:webHidden/>
-              </w:rPr>
-              <w:fldChar w:fldCharType="begin"/>
-            </w:r>
-            <w:r>
-              <w:rPr>
-                <w:webHidden/>
-              </w:rPr>
-              <w:instrText xml:space="preserve">PAGEREF _Toc223529123 \h</w:instrText>
-            </w:r>
-            <w:r>
-              <w:rPr>
-                <w:webHidden/>
-              </w:rPr>
-              <w:fldChar w:fldCharType="separate"/>
-            </w:r>
-            <w:r>
-              <w:rPr>
-                <w:rStyle w:val="IndexLink"/>
               </w:rPr>
               <w:t>viii</w:t>
             </w:r>
@@ -3543,11 +3460,9 @@
             <w:pStyle w:val="TOC3"/>
             <w:tabs>
               <w:tab w:val="left" w:pos="1200" w:leader="none"/>
-              <w:tab w:val="right" w:pos="8640" w:leader="dot"/>
             </w:tabs>
             <w:rPr>
               <w:rFonts w:ascii="Aptos" w:hAnsi="Aptos" w:eastAsia="" w:cs="" w:asciiTheme="minorHAnsi" w:cstheme="minorBidi" w:eastAsiaTheme="minorEastAsia" w:hAnsiTheme="minorHAnsi"/>
-              <w:i w:val="false"/>
               <w:i w:val="false"/>
               <w:kern w:val="2"/>
               <w:sz w:val="24"/>
@@ -3582,35 +3497,30 @@
                 <w:vanish w:val="false"/>
               </w:rPr>
               <w:t>Common Requirements:</w:t>
+              <w:tab/>
+            </w:r>
+            <w:r>
+              <w:rPr>
+                <w:webHidden/>
+              </w:rPr>
+              <w:fldChar w:fldCharType="begin"/>
+            </w:r>
+            <w:r>
+              <w:rPr>
+                <w:webHidden/>
+              </w:rPr>
+              <w:instrText xml:space="preserve">PAGEREF _Toc223529124 \h</w:instrText>
+            </w:r>
+            <w:r>
+              <w:rPr>
+                <w:webHidden/>
+              </w:rPr>
+              <w:fldChar w:fldCharType="separate"/>
             </w:r>
             <w:r>
               <w:rPr>
                 <w:rStyle w:val="IndexLink"/>
                 <w:vanish/>
-              </w:rPr>
-              <w:tab/>
-            </w:r>
-            <w:r>
-              <w:rPr>
-                <w:webHidden/>
-              </w:rPr>
-              <w:fldChar w:fldCharType="begin"/>
-            </w:r>
-            <w:r>
-              <w:rPr>
-                <w:webHidden/>
-              </w:rPr>
-              <w:instrText xml:space="preserve">PAGEREF _Toc223529124 \h</w:instrText>
-            </w:r>
-            <w:r>
-              <w:rPr>
-                <w:webHidden/>
-              </w:rPr>
-              <w:fldChar w:fldCharType="separate"/>
-            </w:r>
-            <w:r>
-              <w:rPr>
-                <w:rStyle w:val="IndexLink"/>
               </w:rPr>
               <w:t>viii</w:t>
             </w:r>
@@ -3627,11 +3537,9 @@
             <w:pStyle w:val="TOC3"/>
             <w:tabs>
               <w:tab w:val="left" w:pos="1200" w:leader="none"/>
-              <w:tab w:val="right" w:pos="8640" w:leader="dot"/>
             </w:tabs>
             <w:rPr>
               <w:rFonts w:ascii="Aptos" w:hAnsi="Aptos" w:eastAsia="" w:cs="" w:asciiTheme="minorHAnsi" w:cstheme="minorBidi" w:eastAsiaTheme="minorEastAsia" w:hAnsiTheme="minorHAnsi"/>
-              <w:i w:val="false"/>
               <w:i w:val="false"/>
               <w:kern w:val="2"/>
               <w:sz w:val="24"/>
@@ -3666,35 +3574,30 @@
                 <w:vanish w:val="false"/>
               </w:rPr>
               <w:t>Users Module Requirements:</w:t>
+              <w:tab/>
+            </w:r>
+            <w:r>
+              <w:rPr>
+                <w:webHidden/>
+              </w:rPr>
+              <w:fldChar w:fldCharType="begin"/>
+            </w:r>
+            <w:r>
+              <w:rPr>
+                <w:webHidden/>
+              </w:rPr>
+              <w:instrText xml:space="preserve">PAGEREF _Toc223529125 \h</w:instrText>
+            </w:r>
+            <w:r>
+              <w:rPr>
+                <w:webHidden/>
+              </w:rPr>
+              <w:fldChar w:fldCharType="separate"/>
             </w:r>
             <w:r>
               <w:rPr>
                 <w:rStyle w:val="IndexLink"/>
                 <w:vanish/>
-              </w:rPr>
-              <w:tab/>
-            </w:r>
-            <w:r>
-              <w:rPr>
-                <w:webHidden/>
-              </w:rPr>
-              <w:fldChar w:fldCharType="begin"/>
-            </w:r>
-            <w:r>
-              <w:rPr>
-                <w:webHidden/>
-              </w:rPr>
-              <w:instrText xml:space="preserve">PAGEREF _Toc223529125 \h</w:instrText>
-            </w:r>
-            <w:r>
-              <w:rPr>
-                <w:webHidden/>
-              </w:rPr>
-              <w:fldChar w:fldCharType="separate"/>
-            </w:r>
-            <w:r>
-              <w:rPr>
-                <w:rStyle w:val="IndexLink"/>
               </w:rPr>
               <w:t>viii</w:t>
             </w:r>
@@ -3711,11 +3614,9 @@
             <w:pStyle w:val="TOC3"/>
             <w:tabs>
               <w:tab w:val="left" w:pos="1200" w:leader="none"/>
-              <w:tab w:val="right" w:pos="8640" w:leader="dot"/>
             </w:tabs>
             <w:rPr>
               <w:rFonts w:ascii="Aptos" w:hAnsi="Aptos" w:eastAsia="" w:cs="" w:asciiTheme="minorHAnsi" w:cstheme="minorBidi" w:eastAsiaTheme="minorEastAsia" w:hAnsiTheme="minorHAnsi"/>
-              <w:i w:val="false"/>
               <w:i w:val="false"/>
               <w:kern w:val="2"/>
               <w:sz w:val="24"/>
@@ -3750,35 +3651,30 @@
                 <w:vanish w:val="false"/>
               </w:rPr>
               <w:t>Datastore Module Requirements:</w:t>
+              <w:tab/>
+            </w:r>
+            <w:r>
+              <w:rPr>
+                <w:webHidden/>
+              </w:rPr>
+              <w:fldChar w:fldCharType="begin"/>
+            </w:r>
+            <w:r>
+              <w:rPr>
+                <w:webHidden/>
+              </w:rPr>
+              <w:instrText xml:space="preserve">PAGEREF _Toc223529126 \h</w:instrText>
+            </w:r>
+            <w:r>
+              <w:rPr>
+                <w:webHidden/>
+              </w:rPr>
+              <w:fldChar w:fldCharType="separate"/>
             </w:r>
             <w:r>
               <w:rPr>
                 <w:rStyle w:val="IndexLink"/>
                 <w:vanish/>
-              </w:rPr>
-              <w:tab/>
-            </w:r>
-            <w:r>
-              <w:rPr>
-                <w:webHidden/>
-              </w:rPr>
-              <w:fldChar w:fldCharType="begin"/>
-            </w:r>
-            <w:r>
-              <w:rPr>
-                <w:webHidden/>
-              </w:rPr>
-              <w:instrText xml:space="preserve">PAGEREF _Toc223529126 \h</w:instrText>
-            </w:r>
-            <w:r>
-              <w:rPr>
-                <w:webHidden/>
-              </w:rPr>
-              <w:fldChar w:fldCharType="separate"/>
-            </w:r>
-            <w:r>
-              <w:rPr>
-                <w:rStyle w:val="IndexLink"/>
               </w:rPr>
               <w:t>viii</w:t>
             </w:r>
@@ -3795,11 +3691,9 @@
             <w:pStyle w:val="TOC3"/>
             <w:tabs>
               <w:tab w:val="left" w:pos="1200" w:leader="none"/>
-              <w:tab w:val="right" w:pos="8640" w:leader="dot"/>
             </w:tabs>
             <w:rPr>
               <w:rFonts w:ascii="Aptos" w:hAnsi="Aptos" w:eastAsia="" w:cs="" w:asciiTheme="minorHAnsi" w:cstheme="minorBidi" w:eastAsiaTheme="minorEastAsia" w:hAnsiTheme="minorHAnsi"/>
-              <w:i w:val="false"/>
               <w:i w:val="false"/>
               <w:kern w:val="2"/>
               <w:sz w:val="24"/>
@@ -3834,35 +3728,30 @@
                 <w:vanish w:val="false"/>
               </w:rPr>
               <w:t>Network Module Requirements:</w:t>
+              <w:tab/>
+            </w:r>
+            <w:r>
+              <w:rPr>
+                <w:webHidden/>
+              </w:rPr>
+              <w:fldChar w:fldCharType="begin"/>
+            </w:r>
+            <w:r>
+              <w:rPr>
+                <w:webHidden/>
+              </w:rPr>
+              <w:instrText xml:space="preserve">PAGEREF _Toc223529127 \h</w:instrText>
+            </w:r>
+            <w:r>
+              <w:rPr>
+                <w:webHidden/>
+              </w:rPr>
+              <w:fldChar w:fldCharType="separate"/>
             </w:r>
             <w:r>
               <w:rPr>
                 <w:rStyle w:val="IndexLink"/>
                 <w:vanish/>
-              </w:rPr>
-              <w:tab/>
-            </w:r>
-            <w:r>
-              <w:rPr>
-                <w:webHidden/>
-              </w:rPr>
-              <w:fldChar w:fldCharType="begin"/>
-            </w:r>
-            <w:r>
-              <w:rPr>
-                <w:webHidden/>
-              </w:rPr>
-              <w:instrText xml:space="preserve">PAGEREF _Toc223529127 \h</w:instrText>
-            </w:r>
-            <w:r>
-              <w:rPr>
-                <w:webHidden/>
-              </w:rPr>
-              <w:fldChar w:fldCharType="separate"/>
-            </w:r>
-            <w:r>
-              <w:rPr>
-                <w:rStyle w:val="IndexLink"/>
               </w:rPr>
               <w:t>viii</w:t>
             </w:r>
@@ -3879,11 +3768,9 @@
             <w:pStyle w:val="TOC3"/>
             <w:tabs>
               <w:tab w:val="left" w:pos="1200" w:leader="none"/>
-              <w:tab w:val="right" w:pos="8640" w:leader="dot"/>
             </w:tabs>
             <w:rPr>
               <w:rFonts w:ascii="Aptos" w:hAnsi="Aptos" w:eastAsia="" w:cs="" w:asciiTheme="minorHAnsi" w:cstheme="minorBidi" w:eastAsiaTheme="minorEastAsia" w:hAnsiTheme="minorHAnsi"/>
-              <w:i w:val="false"/>
               <w:i w:val="false"/>
               <w:kern w:val="2"/>
               <w:sz w:val="24"/>
@@ -3918,35 +3805,30 @@
                 <w:vanish w:val="false"/>
               </w:rPr>
               <w:t>GUI Module Requirements:</w:t>
+              <w:tab/>
+            </w:r>
+            <w:r>
+              <w:rPr>
+                <w:webHidden/>
+              </w:rPr>
+              <w:fldChar w:fldCharType="begin"/>
+            </w:r>
+            <w:r>
+              <w:rPr>
+                <w:webHidden/>
+              </w:rPr>
+              <w:instrText xml:space="preserve">PAGEREF _Toc223529128 \h</w:instrText>
+            </w:r>
+            <w:r>
+              <w:rPr>
+                <w:webHidden/>
+              </w:rPr>
+              <w:fldChar w:fldCharType="separate"/>
             </w:r>
             <w:r>
               <w:rPr>
                 <w:rStyle w:val="IndexLink"/>
                 <w:vanish/>
-              </w:rPr>
-              <w:tab/>
-            </w:r>
-            <w:r>
-              <w:rPr>
-                <w:webHidden/>
-              </w:rPr>
-              <w:fldChar w:fldCharType="begin"/>
-            </w:r>
-            <w:r>
-              <w:rPr>
-                <w:webHidden/>
-              </w:rPr>
-              <w:instrText xml:space="preserve">PAGEREF _Toc223529128 \h</w:instrText>
-            </w:r>
-            <w:r>
-              <w:rPr>
-                <w:webHidden/>
-              </w:rPr>
-              <w:fldChar w:fldCharType="separate"/>
-            </w:r>
-            <w:r>
-              <w:rPr>
-                <w:rStyle w:val="IndexLink"/>
               </w:rPr>
               <w:t>viii</w:t>
             </w:r>
@@ -3963,11 +3845,9 @@
             <w:pStyle w:val="TOC3"/>
             <w:tabs>
               <w:tab w:val="left" w:pos="1200" w:leader="none"/>
-              <w:tab w:val="right" w:pos="8640" w:leader="dot"/>
             </w:tabs>
             <w:rPr>
               <w:rFonts w:ascii="Aptos" w:hAnsi="Aptos" w:eastAsia="" w:cs="" w:asciiTheme="minorHAnsi" w:cstheme="minorBidi" w:eastAsiaTheme="minorEastAsia" w:hAnsiTheme="minorHAnsi"/>
-              <w:i w:val="false"/>
               <w:i w:val="false"/>
               <w:kern w:val="2"/>
               <w:sz w:val="24"/>
@@ -4002,35 +3882,30 @@
                 <w:vanish w:val="false"/>
               </w:rPr>
               <w:t>Lobby Module Requirements:</w:t>
+              <w:tab/>
+            </w:r>
+            <w:r>
+              <w:rPr>
+                <w:webHidden/>
+              </w:rPr>
+              <w:fldChar w:fldCharType="begin"/>
+            </w:r>
+            <w:r>
+              <w:rPr>
+                <w:webHidden/>
+              </w:rPr>
+              <w:instrText xml:space="preserve">PAGEREF _Toc223529129 \h</w:instrText>
+            </w:r>
+            <w:r>
+              <w:rPr>
+                <w:webHidden/>
+              </w:rPr>
+              <w:fldChar w:fldCharType="separate"/>
             </w:r>
             <w:r>
               <w:rPr>
                 <w:rStyle w:val="IndexLink"/>
                 <w:vanish/>
-              </w:rPr>
-              <w:tab/>
-            </w:r>
-            <w:r>
-              <w:rPr>
-                <w:webHidden/>
-              </w:rPr>
-              <w:fldChar w:fldCharType="begin"/>
-            </w:r>
-            <w:r>
-              <w:rPr>
-                <w:webHidden/>
-              </w:rPr>
-              <w:instrText xml:space="preserve">PAGEREF _Toc223529129 \h</w:instrText>
-            </w:r>
-            <w:r>
-              <w:rPr>
-                <w:webHidden/>
-              </w:rPr>
-              <w:fldChar w:fldCharType="separate"/>
-            </w:r>
-            <w:r>
-              <w:rPr>
-                <w:rStyle w:val="IndexLink"/>
               </w:rPr>
               <w:t>viii</w:t>
             </w:r>
@@ -4047,11 +3922,9 @@
             <w:pStyle w:val="TOC3"/>
             <w:tabs>
               <w:tab w:val="left" w:pos="1200" w:leader="none"/>
-              <w:tab w:val="right" w:pos="8640" w:leader="dot"/>
             </w:tabs>
             <w:rPr>
               <w:rFonts w:ascii="Aptos" w:hAnsi="Aptos" w:eastAsia="" w:cs="" w:asciiTheme="minorHAnsi" w:cstheme="minorBidi" w:eastAsiaTheme="minorEastAsia" w:hAnsiTheme="minorHAnsi"/>
-              <w:i w:val="false"/>
               <w:i w:val="false"/>
               <w:kern w:val="2"/>
               <w:sz w:val="24"/>
@@ -4086,35 +3959,30 @@
                 <w:vanish w:val="false"/>
               </w:rPr>
               <w:t>Table Module Requirements:</w:t>
+              <w:tab/>
+            </w:r>
+            <w:r>
+              <w:rPr>
+                <w:webHidden/>
+              </w:rPr>
+              <w:fldChar w:fldCharType="begin"/>
+            </w:r>
+            <w:r>
+              <w:rPr>
+                <w:webHidden/>
+              </w:rPr>
+              <w:instrText xml:space="preserve">PAGEREF _Toc223529130 \h</w:instrText>
+            </w:r>
+            <w:r>
+              <w:rPr>
+                <w:webHidden/>
+              </w:rPr>
+              <w:fldChar w:fldCharType="separate"/>
             </w:r>
             <w:r>
               <w:rPr>
                 <w:rStyle w:val="IndexLink"/>
                 <w:vanish/>
-              </w:rPr>
-              <w:tab/>
-            </w:r>
-            <w:r>
-              <w:rPr>
-                <w:webHidden/>
-              </w:rPr>
-              <w:fldChar w:fldCharType="begin"/>
-            </w:r>
-            <w:r>
-              <w:rPr>
-                <w:webHidden/>
-              </w:rPr>
-              <w:instrText xml:space="preserve">PAGEREF _Toc223529130 \h</w:instrText>
-            </w:r>
-            <w:r>
-              <w:rPr>
-                <w:webHidden/>
-              </w:rPr>
-              <w:fldChar w:fldCharType="separate"/>
-            </w:r>
-            <w:r>
-              <w:rPr>
-                <w:rStyle w:val="IndexLink"/>
               </w:rPr>
               <w:t>viii</w:t>
             </w:r>
@@ -4131,11 +3999,9 @@
             <w:pStyle w:val="TOC3"/>
             <w:tabs>
               <w:tab w:val="left" w:pos="1200" w:leader="none"/>
-              <w:tab w:val="right" w:pos="8640" w:leader="dot"/>
             </w:tabs>
             <w:rPr>
               <w:rFonts w:ascii="Aptos" w:hAnsi="Aptos" w:eastAsia="" w:cs="" w:asciiTheme="minorHAnsi" w:cstheme="minorBidi" w:eastAsiaTheme="minorEastAsia" w:hAnsiTheme="minorHAnsi"/>
-              <w:i w:val="false"/>
               <w:i w:val="false"/>
               <w:kern w:val="2"/>
               <w:sz w:val="24"/>
@@ -4170,35 +4036,30 @@
                 <w:vanish w:val="false"/>
               </w:rPr>
               <w:t>Game Module Requirements:</w:t>
+              <w:tab/>
+            </w:r>
+            <w:r>
+              <w:rPr>
+                <w:webHidden/>
+              </w:rPr>
+              <w:fldChar w:fldCharType="begin"/>
+            </w:r>
+            <w:r>
+              <w:rPr>
+                <w:webHidden/>
+              </w:rPr>
+              <w:instrText xml:space="preserve">PAGEREF _Toc223529131 \h</w:instrText>
+            </w:r>
+            <w:r>
+              <w:rPr>
+                <w:webHidden/>
+              </w:rPr>
+              <w:fldChar w:fldCharType="separate"/>
             </w:r>
             <w:r>
               <w:rPr>
                 <w:rStyle w:val="IndexLink"/>
                 <w:vanish/>
-              </w:rPr>
-              <w:tab/>
-            </w:r>
-            <w:r>
-              <w:rPr>
-                <w:webHidden/>
-              </w:rPr>
-              <w:fldChar w:fldCharType="begin"/>
-            </w:r>
-            <w:r>
-              <w:rPr>
-                <w:webHidden/>
-              </w:rPr>
-              <w:instrText xml:space="preserve">PAGEREF _Toc223529131 \h</w:instrText>
-            </w:r>
-            <w:r>
-              <w:rPr>
-                <w:webHidden/>
-              </w:rPr>
-              <w:fldChar w:fldCharType="separate"/>
-            </w:r>
-            <w:r>
-              <w:rPr>
-                <w:rStyle w:val="IndexLink"/>
               </w:rPr>
               <w:t>viii</w:t>
             </w:r>
@@ -4215,7 +4076,6 @@
             <w:pStyle w:val="TOC2"/>
             <w:tabs>
               <w:tab w:val="left" w:pos="800" w:leader="none"/>
-              <w:tab w:val="right" w:pos="8640" w:leader="dot"/>
             </w:tabs>
             <w:rPr>
               <w:rFonts w:ascii="Aptos" w:hAnsi="Aptos" w:eastAsia="" w:cs="" w:asciiTheme="minorHAnsi" w:cstheme="minorBidi" w:eastAsiaTheme="minorEastAsia" w:hAnsiTheme="minorHAnsi"/>
@@ -4255,35 +4115,30 @@
                 <w:vanish w:val="false"/>
               </w:rPr>
               <w:t>External Interface Requirements</w:t>
+              <w:tab/>
+            </w:r>
+            <w:r>
+              <w:rPr>
+                <w:webHidden/>
+              </w:rPr>
+              <w:fldChar w:fldCharType="begin"/>
+            </w:r>
+            <w:r>
+              <w:rPr>
+                <w:webHidden/>
+              </w:rPr>
+              <w:instrText xml:space="preserve">PAGEREF _Toc223529132 \h</w:instrText>
+            </w:r>
+            <w:r>
+              <w:rPr>
+                <w:webHidden/>
+              </w:rPr>
+              <w:fldChar w:fldCharType="separate"/>
             </w:r>
             <w:r>
               <w:rPr>
                 <w:rStyle w:val="IndexLink"/>
                 <w:vanish/>
-              </w:rPr>
-              <w:tab/>
-            </w:r>
-            <w:r>
-              <w:rPr>
-                <w:webHidden/>
-              </w:rPr>
-              <w:fldChar w:fldCharType="begin"/>
-            </w:r>
-            <w:r>
-              <w:rPr>
-                <w:webHidden/>
-              </w:rPr>
-              <w:instrText xml:space="preserve">PAGEREF _Toc223529132 \h</w:instrText>
-            </w:r>
-            <w:r>
-              <w:rPr>
-                <w:webHidden/>
-              </w:rPr>
-              <w:fldChar w:fldCharType="separate"/>
-            </w:r>
-            <w:r>
-              <w:rPr>
-                <w:rStyle w:val="IndexLink"/>
               </w:rPr>
               <w:t>ix</w:t>
             </w:r>
@@ -4300,7 +4155,6 @@
             <w:pStyle w:val="TOC2"/>
             <w:tabs>
               <w:tab w:val="left" w:pos="800" w:leader="none"/>
-              <w:tab w:val="right" w:pos="8640" w:leader="dot"/>
             </w:tabs>
             <w:rPr>
               <w:rFonts w:ascii="Aptos" w:hAnsi="Aptos" w:eastAsia="" w:cs="" w:asciiTheme="minorHAnsi" w:cstheme="minorBidi" w:eastAsiaTheme="minorEastAsia" w:hAnsiTheme="minorHAnsi"/>
@@ -4340,35 +4194,30 @@
                 <w:vanish w:val="false"/>
               </w:rPr>
               <w:t>Internal Interface Requirements</w:t>
+              <w:tab/>
+            </w:r>
+            <w:r>
+              <w:rPr>
+                <w:webHidden/>
+              </w:rPr>
+              <w:fldChar w:fldCharType="begin"/>
+            </w:r>
+            <w:r>
+              <w:rPr>
+                <w:webHidden/>
+              </w:rPr>
+              <w:instrText xml:space="preserve">PAGEREF _Toc223529133 \h</w:instrText>
+            </w:r>
+            <w:r>
+              <w:rPr>
+                <w:webHidden/>
+              </w:rPr>
+              <w:fldChar w:fldCharType="separate"/>
             </w:r>
             <w:r>
               <w:rPr>
                 <w:rStyle w:val="IndexLink"/>
                 <w:vanish/>
-              </w:rPr>
-              <w:tab/>
-            </w:r>
-            <w:r>
-              <w:rPr>
-                <w:webHidden/>
-              </w:rPr>
-              <w:fldChar w:fldCharType="begin"/>
-            </w:r>
-            <w:r>
-              <w:rPr>
-                <w:webHidden/>
-              </w:rPr>
-              <w:instrText xml:space="preserve">PAGEREF _Toc223529133 \h</w:instrText>
-            </w:r>
-            <w:r>
-              <w:rPr>
-                <w:webHidden/>
-              </w:rPr>
-              <w:fldChar w:fldCharType="separate"/>
-            </w:r>
-            <w:r>
-              <w:rPr>
-                <w:rStyle w:val="IndexLink"/>
               </w:rPr>
               <w:t>ix</w:t>
             </w:r>
@@ -4385,7 +4234,6 @@
             <w:pStyle w:val="TOC1"/>
             <w:tabs>
               <w:tab w:val="left" w:pos="400" w:leader="none"/>
-              <w:tab w:val="right" w:pos="8640" w:leader="dot"/>
             </w:tabs>
             <w:rPr>
               <w:rFonts w:ascii="Aptos" w:hAnsi="Aptos" w:eastAsia="" w:cs="" w:asciiTheme="minorHAnsi" w:cstheme="minorBidi" w:eastAsiaTheme="minorEastAsia" w:hAnsiTheme="minorHAnsi"/>
@@ -4428,35 +4276,30 @@
                 <w:vanish w:val="false"/>
               </w:rPr>
               <w:t>Non-Functional Requirements</w:t>
+              <w:tab/>
+            </w:r>
+            <w:r>
+              <w:rPr>
+                <w:webHidden/>
+              </w:rPr>
+              <w:fldChar w:fldCharType="begin"/>
+            </w:r>
+            <w:r>
+              <w:rPr>
+                <w:webHidden/>
+              </w:rPr>
+              <w:instrText xml:space="preserve">PAGEREF _Toc223529134 \h</w:instrText>
+            </w:r>
+            <w:r>
+              <w:rPr>
+                <w:webHidden/>
+              </w:rPr>
+              <w:fldChar w:fldCharType="separate"/>
             </w:r>
             <w:r>
               <w:rPr>
                 <w:rStyle w:val="IndexLink"/>
                 <w:vanish/>
-              </w:rPr>
-              <w:tab/>
-            </w:r>
-            <w:r>
-              <w:rPr>
-                <w:webHidden/>
-              </w:rPr>
-              <w:fldChar w:fldCharType="begin"/>
-            </w:r>
-            <w:r>
-              <w:rPr>
-                <w:webHidden/>
-              </w:rPr>
-              <w:instrText xml:space="preserve">PAGEREF _Toc223529134 \h</w:instrText>
-            </w:r>
-            <w:r>
-              <w:rPr>
-                <w:webHidden/>
-              </w:rPr>
-              <w:fldChar w:fldCharType="separate"/>
-            </w:r>
-            <w:r>
-              <w:rPr>
-                <w:rStyle w:val="IndexLink"/>
               </w:rPr>
               <w:t>x</w:t>
             </w:r>
@@ -4473,7 +4316,6 @@
             <w:pStyle w:val="TOC2"/>
             <w:tabs>
               <w:tab w:val="left" w:pos="800" w:leader="none"/>
-              <w:tab w:val="right" w:pos="8640" w:leader="dot"/>
             </w:tabs>
             <w:rPr>
               <w:rFonts w:ascii="Aptos" w:hAnsi="Aptos" w:eastAsia="" w:cs="" w:asciiTheme="minorHAnsi" w:cstheme="minorBidi" w:eastAsiaTheme="minorEastAsia" w:hAnsiTheme="minorHAnsi"/>
@@ -4513,35 +4355,30 @@
                 <w:vanish w:val="false"/>
               </w:rPr>
               <w:t>Security and Privacy Requirements</w:t>
+              <w:tab/>
+            </w:r>
+            <w:r>
+              <w:rPr>
+                <w:webHidden/>
+              </w:rPr>
+              <w:fldChar w:fldCharType="begin"/>
+            </w:r>
+            <w:r>
+              <w:rPr>
+                <w:webHidden/>
+              </w:rPr>
+              <w:instrText xml:space="preserve">PAGEREF _Toc223529135 \h</w:instrText>
+            </w:r>
+            <w:r>
+              <w:rPr>
+                <w:webHidden/>
+              </w:rPr>
+              <w:fldChar w:fldCharType="separate"/>
             </w:r>
             <w:r>
               <w:rPr>
                 <w:rStyle w:val="IndexLink"/>
                 <w:vanish/>
-              </w:rPr>
-              <w:tab/>
-            </w:r>
-            <w:r>
-              <w:rPr>
-                <w:webHidden/>
-              </w:rPr>
-              <w:fldChar w:fldCharType="begin"/>
-            </w:r>
-            <w:r>
-              <w:rPr>
-                <w:webHidden/>
-              </w:rPr>
-              <w:instrText xml:space="preserve">PAGEREF _Toc223529135 \h</w:instrText>
-            </w:r>
-            <w:r>
-              <w:rPr>
-                <w:webHidden/>
-              </w:rPr>
-              <w:fldChar w:fldCharType="separate"/>
-            </w:r>
-            <w:r>
-              <w:rPr>
-                <w:rStyle w:val="IndexLink"/>
               </w:rPr>
               <w:t>x</w:t>
             </w:r>
@@ -4558,7 +4395,6 @@
             <w:pStyle w:val="TOC2"/>
             <w:tabs>
               <w:tab w:val="left" w:pos="800" w:leader="none"/>
-              <w:tab w:val="right" w:pos="8640" w:leader="dot"/>
             </w:tabs>
             <w:rPr>
               <w:rFonts w:ascii="Aptos" w:hAnsi="Aptos" w:eastAsia="" w:cs="" w:asciiTheme="minorHAnsi" w:cstheme="minorBidi" w:eastAsiaTheme="minorEastAsia" w:hAnsiTheme="minorHAnsi"/>
@@ -4598,35 +4434,30 @@
                 <w:vanish w:val="false"/>
               </w:rPr>
               <w:t>Environmental Requirements</w:t>
+              <w:tab/>
+            </w:r>
+            <w:r>
+              <w:rPr>
+                <w:webHidden/>
+              </w:rPr>
+              <w:fldChar w:fldCharType="begin"/>
+            </w:r>
+            <w:r>
+              <w:rPr>
+                <w:webHidden/>
+              </w:rPr>
+              <w:instrText xml:space="preserve">PAGEREF _Toc223529136 \h</w:instrText>
+            </w:r>
+            <w:r>
+              <w:rPr>
+                <w:webHidden/>
+              </w:rPr>
+              <w:fldChar w:fldCharType="separate"/>
             </w:r>
             <w:r>
               <w:rPr>
                 <w:rStyle w:val="IndexLink"/>
                 <w:vanish/>
-              </w:rPr>
-              <w:tab/>
-            </w:r>
-            <w:r>
-              <w:rPr>
-                <w:webHidden/>
-              </w:rPr>
-              <w:fldChar w:fldCharType="begin"/>
-            </w:r>
-            <w:r>
-              <w:rPr>
-                <w:webHidden/>
-              </w:rPr>
-              <w:instrText xml:space="preserve">PAGEREF _Toc223529136 \h</w:instrText>
-            </w:r>
-            <w:r>
-              <w:rPr>
-                <w:webHidden/>
-              </w:rPr>
-              <w:fldChar w:fldCharType="separate"/>
-            </w:r>
-            <w:r>
-              <w:rPr>
-                <w:rStyle w:val="IndexLink"/>
               </w:rPr>
               <w:t>x</w:t>
             </w:r>
@@ -4643,7 +4474,6 @@
             <w:pStyle w:val="TOC2"/>
             <w:tabs>
               <w:tab w:val="left" w:pos="800" w:leader="none"/>
-              <w:tab w:val="right" w:pos="8640" w:leader="dot"/>
             </w:tabs>
             <w:rPr>
               <w:rFonts w:ascii="Aptos" w:hAnsi="Aptos" w:eastAsia="" w:cs="" w:asciiTheme="minorHAnsi" w:cstheme="minorBidi" w:eastAsiaTheme="minorEastAsia" w:hAnsiTheme="minorHAnsi"/>
@@ -4683,35 +4513,30 @@
                 <w:vanish w:val="false"/>
               </w:rPr>
               <w:t>Performance Requirements</w:t>
+              <w:tab/>
+            </w:r>
+            <w:r>
+              <w:rPr>
+                <w:webHidden/>
+              </w:rPr>
+              <w:fldChar w:fldCharType="begin"/>
+            </w:r>
+            <w:r>
+              <w:rPr>
+                <w:webHidden/>
+              </w:rPr>
+              <w:instrText xml:space="preserve">PAGEREF _Toc223529137 \h</w:instrText>
+            </w:r>
+            <w:r>
+              <w:rPr>
+                <w:webHidden/>
+              </w:rPr>
+              <w:fldChar w:fldCharType="separate"/>
             </w:r>
             <w:r>
               <w:rPr>
                 <w:rStyle w:val="IndexLink"/>
                 <w:vanish/>
-              </w:rPr>
-              <w:tab/>
-            </w:r>
-            <w:r>
-              <w:rPr>
-                <w:webHidden/>
-              </w:rPr>
-              <w:fldChar w:fldCharType="begin"/>
-            </w:r>
-            <w:r>
-              <w:rPr>
-                <w:webHidden/>
-              </w:rPr>
-              <w:instrText xml:space="preserve">PAGEREF _Toc223529137 \h</w:instrText>
-            </w:r>
-            <w:r>
-              <w:rPr>
-                <w:webHidden/>
-              </w:rPr>
-              <w:fldChar w:fldCharType="separate"/>
-            </w:r>
-            <w:r>
-              <w:rPr>
-                <w:rStyle w:val="IndexLink"/>
               </w:rPr>
               <w:t>x</w:t>
             </w:r>
@@ -4725,6 +4550,7 @@
           <w:r>
             <w:rPr>
               <w:rStyle w:val="IndexLink"/>
+              <w:vanish/>
             </w:rPr>
             <w:fldChar w:fldCharType="end"/>
           </w:r>
@@ -4736,7 +4562,6 @@
         <w:pStyle w:val="TOC2"/>
         <w:tabs>
           <w:tab w:val="left" w:pos="800" w:leader="none"/>
-          <w:tab w:val="right" w:pos="8640" w:leader="dot"/>
         </w:tabs>
         <w:rPr>
           <w:rFonts w:ascii="Calibri" w:hAnsi="Calibri" w:cs="Calibri"/>
@@ -5418,7 +5243,7 @@
           <wp:inline distT="0" distB="0" distL="0" distR="0">
             <wp:extent cx="5484495" cy="6080760"/>
             <wp:effectExtent l="0" t="0" r="0" b="0"/>
-            <wp:docPr id="3" name="Picture 4" descr=""/>
+            <wp:docPr id="3" name="Picture 4"/>
             <wp:cNvGraphicFramePr>
               <a:graphicFrameLocks xmlns:a="http://schemas.openxmlformats.org/drawingml/2006/main" noChangeAspect="1"/>
             </wp:cNvGraphicFramePr>
@@ -5426,7 +5251,7 @@
               <a:graphicData uri="http://schemas.openxmlformats.org/drawingml/2006/picture">
                 <pic:pic xmlns:pic="http://schemas.openxmlformats.org/drawingml/2006/picture">
                   <pic:nvPicPr>
-                    <pic:cNvPr id="3" name="Picture 4" descr=""/>
+                    <pic:cNvPr id="3" name="Picture 4"/>
                     <pic:cNvPicPr>
                       <a:picLocks noChangeAspect="1" noChangeArrowheads="1"/>
                     </pic:cNvPicPr>
@@ -6016,11 +5841,47 @@
     <w:p>
       <w:pPr>
         <w:pStyle w:val="Paragraph2"/>
-        <w:ind w:left="0"/>
-        <w:rPr/>
-      </w:pPr>
-      <w:r>
-        <w:rPr/>
+        <w:rPr>
+          <w:color w:val="00B0F0"/>
+        </w:rPr>
+      </w:pPr>
+      <w:r>
+        <w:rPr>
+          <w:color w:val="00B0F0"/>
+        </w:rPr>
+        <w:t>3.1.</w:t>
+      </w:r>
+      <w:r>
+        <w:rPr>
+          <w:color w:val="00B0F0"/>
+        </w:rPr>
+        <w:t>3</w:t>
+      </w:r>
+      <w:r>
+        <w:rPr>
+          <w:color w:val="00B0F0"/>
+        </w:rPr>
+        <w:t>.</w:t>
+      </w:r>
+      <w:r>
+        <w:rPr>
+          <w:color w:val="00B0F0"/>
+        </w:rPr>
+        <w:t xml:space="preserve">1 Data such as user credentials or personal information like payment method will be stored with on the server with no access from the client program with the exception of an authenticated successful user login capable of viewing the specific information tied to their ID. </w:t>
+      </w:r>
+    </w:p>
+    <w:p>
+      <w:pPr>
+        <w:pStyle w:val="Paragraph2"/>
+        <w:rPr>
+          <w:color w:val="00B0F0"/>
+        </w:rPr>
+      </w:pPr>
+      <w:r>
+        <w:rPr>
+          <w:color w:val="00B0F0"/>
+        </w:rPr>
+        <w:t xml:space="preserve">3.1.3.2 Updates such as the current balance from one’s user account will be accessible in real time, following with game outcomes such as lost or won bets. </w:t>
       </w:r>
     </w:p>
     <w:p>
@@ -6042,11 +5903,290 @@
     <w:p>
       <w:pPr>
         <w:pStyle w:val="Paragraph2"/>
-        <w:ind w:left="0"/>
-        <w:rPr/>
-      </w:pPr>
-      <w:r>
-        <w:rPr/>
+        <w:widowControl/>
+        <w:suppressAutoHyphens w:val="true"/>
+        <w:bidi w:val="0"/>
+        <w:spacing w:before="80" w:after="0"/>
+        <w:jc w:val="both"/>
+        <w:rPr>
+          <w:rFonts w:ascii="Times New Roman" w:hAnsi="Times New Roman" w:eastAsia="Times New Roman" w:cs="Times New Roman"/>
+          <w:color w:val="00B0F0"/>
+          <w:kern w:val="0"/>
+          <w:sz w:val="20"/>
+          <w:szCs w:val="20"/>
+          <w:lang w:val="en-US" w:eastAsia="zh-CN" w:bidi="ar-SA"/>
+        </w:rPr>
+      </w:pPr>
+      <w:r>
+        <w:rPr>
+          <w:rFonts w:eastAsia="Times New Roman" w:cs="Times New Roman"/>
+          <w:color w:val="00B0F0"/>
+          <w:kern w:val="0"/>
+          <w:sz w:val="20"/>
+          <w:szCs w:val="20"/>
+          <w:lang w:val="en-US" w:eastAsia="zh-CN" w:bidi="ar-SA"/>
+        </w:rPr>
+        <w:t>3.1.4.1 The system shall allow client applications to establish a TCP/IP connection with the server before accessing any game features.</w:t>
+      </w:r>
+    </w:p>
+    <w:p>
+      <w:pPr>
+        <w:pStyle w:val="Paragraph2"/>
+        <w:widowControl/>
+        <w:suppressAutoHyphens w:val="true"/>
+        <w:bidi w:val="0"/>
+        <w:spacing w:before="80" w:after="0"/>
+        <w:jc w:val="both"/>
+        <w:rPr>
+          <w:rFonts w:ascii="Times New Roman" w:hAnsi="Times New Roman" w:eastAsia="Times New Roman" w:cs="Times New Roman"/>
+          <w:color w:val="00B0F0"/>
+          <w:kern w:val="0"/>
+          <w:sz w:val="20"/>
+          <w:szCs w:val="20"/>
+          <w:lang w:val="en-US" w:eastAsia="zh-CN" w:bidi="ar-SA"/>
+        </w:rPr>
+      </w:pPr>
+      <w:r>
+        <w:rPr>
+          <w:rFonts w:eastAsia="Times New Roman" w:cs="Times New Roman"/>
+          <w:color w:val="00B0F0"/>
+          <w:kern w:val="0"/>
+          <w:sz w:val="20"/>
+          <w:szCs w:val="20"/>
+          <w:lang w:val="en-US" w:eastAsia="zh-CN" w:bidi="ar-SA"/>
+        </w:rPr>
+        <w:t>3.1.4.2 The server shall maintain persistent connections with all active client sessions during gameplay.</w:t>
+      </w:r>
+    </w:p>
+    <w:p>
+      <w:pPr>
+        <w:pStyle w:val="Paragraph2"/>
+        <w:widowControl/>
+        <w:suppressAutoHyphens w:val="true"/>
+        <w:bidi w:val="0"/>
+        <w:spacing w:before="80" w:after="0"/>
+        <w:jc w:val="both"/>
+        <w:rPr>
+          <w:rFonts w:ascii="Times New Roman" w:hAnsi="Times New Roman" w:eastAsia="Times New Roman" w:cs="Times New Roman"/>
+          <w:color w:val="00B0F0"/>
+          <w:kern w:val="0"/>
+          <w:sz w:val="20"/>
+          <w:szCs w:val="20"/>
+          <w:lang w:val="en-US" w:eastAsia="zh-CN" w:bidi="ar-SA"/>
+        </w:rPr>
+      </w:pPr>
+      <w:r>
+        <w:rPr>
+          <w:rFonts w:eastAsia="Times New Roman" w:cs="Times New Roman"/>
+          <w:color w:val="00B0F0"/>
+          <w:kern w:val="0"/>
+          <w:sz w:val="20"/>
+          <w:szCs w:val="20"/>
+          <w:lang w:val="en-US" w:eastAsia="zh-CN" w:bidi="ar-SA"/>
+        </w:rPr>
+        <w:t>3.1.4.3 The network module shall transmit player actions (hit, stand, bet, split, double down, insurance) from the client to the server.</w:t>
+      </w:r>
+    </w:p>
+    <w:p>
+      <w:pPr>
+        <w:pStyle w:val="Paragraph2"/>
+        <w:widowControl/>
+        <w:suppressAutoHyphens w:val="true"/>
+        <w:bidi w:val="0"/>
+        <w:spacing w:before="80" w:after="0"/>
+        <w:jc w:val="both"/>
+        <w:rPr>
+          <w:rFonts w:ascii="Times New Roman" w:hAnsi="Times New Roman" w:eastAsia="Times New Roman" w:cs="Times New Roman"/>
+          <w:color w:val="00B0F0"/>
+          <w:kern w:val="0"/>
+          <w:sz w:val="20"/>
+          <w:szCs w:val="20"/>
+          <w:lang w:val="en-US" w:eastAsia="zh-CN" w:bidi="ar-SA"/>
+        </w:rPr>
+      </w:pPr>
+      <w:r>
+        <w:rPr>
+          <w:rFonts w:eastAsia="Times New Roman" w:cs="Times New Roman"/>
+          <w:color w:val="00B0F0"/>
+          <w:kern w:val="0"/>
+          <w:sz w:val="20"/>
+          <w:szCs w:val="20"/>
+          <w:lang w:val="en-US" w:eastAsia="zh-CN" w:bidi="ar-SA"/>
+        </w:rPr>
+        <w:t>3.1.4.4 The server shall broadcast updated game state information to all clients at a table after each player action.</w:t>
+      </w:r>
+    </w:p>
+    <w:p>
+      <w:pPr>
+        <w:pStyle w:val="Paragraph2"/>
+        <w:widowControl/>
+        <w:suppressAutoHyphens w:val="true"/>
+        <w:bidi w:val="0"/>
+        <w:spacing w:before="80" w:after="0"/>
+        <w:jc w:val="both"/>
+        <w:rPr>
+          <w:rFonts w:ascii="Times New Roman" w:hAnsi="Times New Roman" w:eastAsia="Times New Roman" w:cs="Times New Roman"/>
+          <w:color w:val="00B0F0"/>
+          <w:kern w:val="0"/>
+          <w:sz w:val="20"/>
+          <w:szCs w:val="20"/>
+          <w:lang w:val="en-US" w:eastAsia="zh-CN" w:bidi="ar-SA"/>
+        </w:rPr>
+      </w:pPr>
+      <w:r>
+        <w:rPr>
+          <w:rFonts w:eastAsia="Times New Roman" w:cs="Times New Roman"/>
+          <w:color w:val="00B0F0"/>
+          <w:kern w:val="0"/>
+          <w:sz w:val="20"/>
+          <w:szCs w:val="20"/>
+          <w:lang w:val="en-US" w:eastAsia="zh-CN" w:bidi="ar-SA"/>
+        </w:rPr>
+        <w:t>3.1.4.5 The network module shall detect client disconnections and notify the server.</w:t>
+      </w:r>
+    </w:p>
+    <w:p>
+      <w:pPr>
+        <w:pStyle w:val="Paragraph2"/>
+        <w:widowControl/>
+        <w:suppressAutoHyphens w:val="true"/>
+        <w:bidi w:val="0"/>
+        <w:spacing w:before="80" w:after="0"/>
+        <w:jc w:val="both"/>
+        <w:rPr>
+          <w:rFonts w:ascii="Times New Roman" w:hAnsi="Times New Roman" w:eastAsia="Times New Roman" w:cs="Times New Roman"/>
+          <w:color w:val="00B0F0"/>
+          <w:kern w:val="0"/>
+          <w:sz w:val="20"/>
+          <w:szCs w:val="20"/>
+          <w:lang w:val="en-US" w:eastAsia="zh-CN" w:bidi="ar-SA"/>
+        </w:rPr>
+      </w:pPr>
+      <w:r>
+        <w:rPr>
+          <w:rFonts w:eastAsia="Times New Roman" w:cs="Times New Roman"/>
+          <w:color w:val="00B0F0"/>
+          <w:kern w:val="0"/>
+          <w:sz w:val="20"/>
+          <w:szCs w:val="20"/>
+          <w:lang w:val="en-US" w:eastAsia="zh-CN" w:bidi="ar-SA"/>
+        </w:rPr>
+        <w:t>3.1.4.6 If a client disconnects during gameplay, the server shall maintain the player's game state until the round is completed.</w:t>
+      </w:r>
+    </w:p>
+    <w:p>
+      <w:pPr>
+        <w:pStyle w:val="Paragraph2"/>
+        <w:widowControl/>
+        <w:suppressAutoHyphens w:val="true"/>
+        <w:bidi w:val="0"/>
+        <w:spacing w:before="80" w:after="0"/>
+        <w:jc w:val="both"/>
+        <w:rPr>
+          <w:rFonts w:ascii="Times New Roman" w:hAnsi="Times New Roman" w:eastAsia="Times New Roman" w:cs="Times New Roman"/>
+          <w:color w:val="00B0F0"/>
+          <w:kern w:val="0"/>
+          <w:sz w:val="20"/>
+          <w:szCs w:val="20"/>
+          <w:lang w:val="en-US" w:eastAsia="zh-CN" w:bidi="ar-SA"/>
+        </w:rPr>
+      </w:pPr>
+      <w:r>
+        <w:rPr>
+          <w:rFonts w:eastAsia="Times New Roman" w:cs="Times New Roman"/>
+          <w:color w:val="00B0F0"/>
+          <w:kern w:val="0"/>
+          <w:sz w:val="20"/>
+          <w:szCs w:val="20"/>
+          <w:lang w:val="en-US" w:eastAsia="zh-CN" w:bidi="ar-SA"/>
+        </w:rPr>
+        <w:t>3.1.4.7 The network module shall allow disconnected clients to reconnect and resume their session if the round has not yet completed.</w:t>
+      </w:r>
+    </w:p>
+    <w:p>
+      <w:pPr>
+        <w:pStyle w:val="Paragraph2"/>
+        <w:widowControl/>
+        <w:suppressAutoHyphens w:val="true"/>
+        <w:bidi w:val="0"/>
+        <w:spacing w:before="80" w:after="0"/>
+        <w:jc w:val="both"/>
+        <w:rPr>
+          <w:rFonts w:ascii="Times New Roman" w:hAnsi="Times New Roman" w:eastAsia="Times New Roman" w:cs="Times New Roman"/>
+          <w:color w:val="00B0F0"/>
+          <w:kern w:val="0"/>
+          <w:sz w:val="20"/>
+          <w:szCs w:val="20"/>
+          <w:lang w:val="en-US" w:eastAsia="zh-CN" w:bidi="ar-SA"/>
+        </w:rPr>
+      </w:pPr>
+      <w:r>
+        <w:rPr>
+          <w:rFonts w:eastAsia="Times New Roman" w:cs="Times New Roman"/>
+          <w:color w:val="00B0F0"/>
+          <w:kern w:val="0"/>
+          <w:sz w:val="20"/>
+          <w:szCs w:val="20"/>
+          <w:lang w:val="en-US" w:eastAsia="zh-CN" w:bidi="ar-SA"/>
+        </w:rPr>
+        <w:t>3.1.4.8 Network messages exchanged between client and server shall contain only gameplay data and required session identifiers.</w:t>
+      </w:r>
+    </w:p>
+    <w:p>
+      <w:pPr>
+        <w:pStyle w:val="Paragraph2"/>
+        <w:widowControl/>
+        <w:suppressAutoHyphens w:val="true"/>
+        <w:bidi w:val="0"/>
+        <w:spacing w:before="80" w:after="0"/>
+        <w:jc w:val="both"/>
+        <w:rPr>
+          <w:rFonts w:ascii="Times New Roman" w:hAnsi="Times New Roman" w:eastAsia="Times New Roman" w:cs="Times New Roman"/>
+          <w:color w:val="00B0F0"/>
+          <w:kern w:val="0"/>
+          <w:sz w:val="20"/>
+          <w:szCs w:val="20"/>
+          <w:lang w:val="en-US" w:eastAsia="zh-CN" w:bidi="ar-SA"/>
+        </w:rPr>
+      </w:pPr>
+      <w:r>
+        <w:rPr>
+          <w:rFonts w:eastAsia="Times New Roman" w:cs="Times New Roman"/>
+          <w:color w:val="00B0F0"/>
+          <w:kern w:val="0"/>
+          <w:sz w:val="20"/>
+          <w:szCs w:val="20"/>
+          <w:lang w:val="en-US" w:eastAsia="zh-CN" w:bidi="ar-SA"/>
+        </w:rPr>
+        <w:t>3.1.4.9 The server shall reject connection attempts from clients that are already logged in from another session.</w:t>
+      </w:r>
+    </w:p>
+    <w:p>
+      <w:pPr>
+        <w:pStyle w:val="Paragraph2"/>
+        <w:widowControl/>
+        <w:suppressAutoHyphens w:val="true"/>
+        <w:bidi w:val="0"/>
+        <w:spacing w:before="80" w:after="0"/>
+        <w:jc w:val="both"/>
+        <w:rPr>
+          <w:rFonts w:ascii="Times New Roman" w:hAnsi="Times New Roman" w:eastAsia="Times New Roman" w:cs="Times New Roman"/>
+          <w:color w:val="00B0F0"/>
+          <w:kern w:val="0"/>
+          <w:sz w:val="20"/>
+          <w:szCs w:val="20"/>
+          <w:lang w:val="en-US" w:eastAsia="zh-CN" w:bidi="ar-SA"/>
+        </w:rPr>
+      </w:pPr>
+      <w:r>
+        <w:rPr>
+          <w:rFonts w:eastAsia="Times New Roman" w:cs="Times New Roman"/>
+          <w:color w:val="00B0F0"/>
+          <w:kern w:val="0"/>
+          <w:sz w:val="20"/>
+          <w:szCs w:val="20"/>
+          <w:lang w:val="en-US" w:eastAsia="zh-CN" w:bidi="ar-SA"/>
+        </w:rPr>
       </w:r>
     </w:p>
     <w:p>
@@ -6109,6 +6249,62 @@
     </w:p>
     <w:p>
       <w:pPr>
+        <w:pStyle w:val="Paragraph2"/>
+        <w:rPr>
+          <w:color w:val="00B0F0"/>
+        </w:rPr>
+      </w:pPr>
+      <w:r>
+        <w:rPr>
+          <w:color w:val="00B0F0"/>
+        </w:rPr>
+        <w:t>3.1.5.4 During events such as player disconnections, table closures via dealer disconnection, or other abrupt ends to rounds and games the GUI will provide a notification indicating that the round in progress will complete before the remaining online users at a table are brought back to the lobby screen.</w:t>
+      </w:r>
+    </w:p>
+    <w:p>
+      <w:pPr>
+        <w:pStyle w:val="Paragraph2"/>
+        <w:rPr>
+          <w:color w:val="00B0F0"/>
+        </w:rPr>
+      </w:pPr>
+      <w:r>
+        <w:rPr>
+          <w:color w:val="00B0F0"/>
+        </w:rPr>
+        <w:t xml:space="preserve">3.1.5.5 The GUI will be providing real time input and signals for the client programs to send to the server for the functions outlined in each layer of the game client interface. </w:t>
+      </w:r>
+    </w:p>
+    <w:p>
+      <w:pPr>
+        <w:pStyle w:val="Paragraph2"/>
+        <w:rPr>
+          <w:color w:val="00B0F0"/>
+        </w:rPr>
+      </w:pPr>
+      <w:r>
+        <w:rPr>
+          <w:color w:val="00B0F0"/>
+        </w:rPr>
+        <w:t xml:space="preserve">3.1.5.6 With role-based permissions between the player and dealer user type, the GUI will display the relevant accessible commands and information to each respective user after proper authentication on login. </w:t>
+      </w:r>
+    </w:p>
+    <w:p>
+      <w:pPr>
+        <w:pStyle w:val="Paragraph2"/>
+        <w:rPr>
+          <w:color w:val="00B0F0"/>
+        </w:rPr>
+      </w:pPr>
+      <w:r>
+        <w:rPr>
+          <w:color w:val="00B0F0"/>
+        </w:rPr>
+        <w:t>3.1.5.7 While actions may not be available depending on the game state or phase, the GUI will communicate that the player is still connected and consistently display the active happenings of the table.</w:t>
+      </w:r>
+    </w:p>
+    <w:p>
+      <w:pPr>
         <w:pStyle w:val="Heading3"/>
         <w:numPr>
           <w:ilvl w:val="2"/>
@@ -6126,13 +6322,28 @@
     <w:p>
       <w:pPr>
         <w:pStyle w:val="Paragraph2"/>
-        <w:rPr>
-          <w:color w:val="729FCF"/>
-        </w:rPr>
-      </w:pPr>
-      <w:r>
-        <w:rPr>
-          <w:color w:val="729FCF"/>
+        <w:widowControl/>
+        <w:suppressAutoHyphens w:val="true"/>
+        <w:bidi w:val="0"/>
+        <w:spacing w:before="80" w:after="0"/>
+        <w:jc w:val="both"/>
+        <w:rPr>
+          <w:rFonts w:ascii="Times New Roman" w:hAnsi="Times New Roman" w:eastAsia="Times New Roman" w:cs="Times New Roman"/>
+          <w:color w:val="00B0F0"/>
+          <w:kern w:val="0"/>
+          <w:sz w:val="20"/>
+          <w:szCs w:val="20"/>
+          <w:lang w:val="en-US" w:eastAsia="zh-CN" w:bidi="ar-SA"/>
+        </w:rPr>
+      </w:pPr>
+      <w:r>
+        <w:rPr>
+          <w:rFonts w:eastAsia="Times New Roman" w:cs="Times New Roman"/>
+          <w:color w:val="00B0F0"/>
+          <w:kern w:val="0"/>
+          <w:sz w:val="20"/>
+          <w:szCs w:val="20"/>
+          <w:lang w:val="en-US" w:eastAsia="zh-CN" w:bidi="ar-SA"/>
         </w:rPr>
         <w:t>3.1.6.1 Players will be sent to the lobby after logging in.</w:t>
       </w:r>
@@ -6140,13 +6351,28 @@
     <w:p>
       <w:pPr>
         <w:pStyle w:val="Paragraph2"/>
-        <w:rPr>
-          <w:color w:val="729FCF"/>
-        </w:rPr>
-      </w:pPr>
-      <w:r>
-        <w:rPr>
-          <w:color w:val="729FCF"/>
+        <w:widowControl/>
+        <w:suppressAutoHyphens w:val="true"/>
+        <w:bidi w:val="0"/>
+        <w:spacing w:before="80" w:after="0"/>
+        <w:jc w:val="both"/>
+        <w:rPr>
+          <w:rFonts w:ascii="Times New Roman" w:hAnsi="Times New Roman" w:eastAsia="Times New Roman" w:cs="Times New Roman"/>
+          <w:color w:val="00B0F0"/>
+          <w:kern w:val="0"/>
+          <w:sz w:val="20"/>
+          <w:szCs w:val="20"/>
+          <w:lang w:val="en-US" w:eastAsia="zh-CN" w:bidi="ar-SA"/>
+        </w:rPr>
+      </w:pPr>
+      <w:r>
+        <w:rPr>
+          <w:rFonts w:eastAsia="Times New Roman" w:cs="Times New Roman"/>
+          <w:color w:val="00B0F0"/>
+          <w:kern w:val="0"/>
+          <w:sz w:val="20"/>
+          <w:szCs w:val="20"/>
+          <w:lang w:val="en-US" w:eastAsia="zh-CN" w:bidi="ar-SA"/>
         </w:rPr>
         <w:t>3.1.6.2 Players will be able to deposit and withdraw money from the lobby.</w:t>
       </w:r>
@@ -6154,13 +6380,28 @@
     <w:p>
       <w:pPr>
         <w:pStyle w:val="Paragraph2"/>
-        <w:rPr>
-          <w:color w:val="729FCF"/>
-        </w:rPr>
-      </w:pPr>
-      <w:r>
-        <w:rPr>
-          <w:color w:val="729FCF"/>
+        <w:widowControl/>
+        <w:suppressAutoHyphens w:val="true"/>
+        <w:bidi w:val="0"/>
+        <w:spacing w:before="80" w:after="0"/>
+        <w:jc w:val="both"/>
+        <w:rPr>
+          <w:rFonts w:ascii="Times New Roman" w:hAnsi="Times New Roman" w:eastAsia="Times New Roman" w:cs="Times New Roman"/>
+          <w:color w:val="00B0F0"/>
+          <w:kern w:val="0"/>
+          <w:sz w:val="20"/>
+          <w:szCs w:val="20"/>
+          <w:lang w:val="en-US" w:eastAsia="zh-CN" w:bidi="ar-SA"/>
+        </w:rPr>
+      </w:pPr>
+      <w:r>
+        <w:rPr>
+          <w:rFonts w:eastAsia="Times New Roman" w:cs="Times New Roman"/>
+          <w:color w:val="00B0F0"/>
+          <w:kern w:val="0"/>
+          <w:sz w:val="20"/>
+          <w:szCs w:val="20"/>
+          <w:lang w:val="en-US" w:eastAsia="zh-CN" w:bidi="ar-SA"/>
         </w:rPr>
         <w:t>3.1.6.3 Players will be able to join any open table from the lobby</w:t>
       </w:r>
@@ -6168,13 +6409,28 @@
     <w:p>
       <w:pPr>
         <w:pStyle w:val="Paragraph2"/>
-        <w:rPr>
-          <w:color w:val="729FCF"/>
-        </w:rPr>
-      </w:pPr>
-      <w:r>
-        <w:rPr>
-          <w:color w:val="729FCF"/>
+        <w:widowControl/>
+        <w:suppressAutoHyphens w:val="true"/>
+        <w:bidi w:val="0"/>
+        <w:spacing w:before="80" w:after="0"/>
+        <w:jc w:val="both"/>
+        <w:rPr>
+          <w:rFonts w:ascii="Times New Roman" w:hAnsi="Times New Roman" w:eastAsia="Times New Roman" w:cs="Times New Roman"/>
+          <w:color w:val="00B0F0"/>
+          <w:kern w:val="0"/>
+          <w:sz w:val="20"/>
+          <w:szCs w:val="20"/>
+          <w:lang w:val="en-US" w:eastAsia="zh-CN" w:bidi="ar-SA"/>
+        </w:rPr>
+      </w:pPr>
+      <w:r>
+        <w:rPr>
+          <w:rFonts w:eastAsia="Times New Roman" w:cs="Times New Roman"/>
+          <w:color w:val="00B0F0"/>
+          <w:kern w:val="0"/>
+          <w:sz w:val="20"/>
+          <w:szCs w:val="20"/>
+          <w:lang w:val="en-US" w:eastAsia="zh-CN" w:bidi="ar-SA"/>
         </w:rPr>
         <w:t>3.1.6.4 Players will be able to see table options and rules from the lobby.</w:t>
       </w:r>
@@ -6211,13 +6467,28 @@
     <w:p>
       <w:pPr>
         <w:pStyle w:val="Paragraph2"/>
-        <w:rPr>
-          <w:color w:val="729FCF"/>
-        </w:rPr>
-      </w:pPr>
-      <w:r>
-        <w:rPr>
-          <w:color w:val="729FCF"/>
+        <w:widowControl/>
+        <w:suppressAutoHyphens w:val="true"/>
+        <w:bidi w:val="0"/>
+        <w:spacing w:before="80" w:after="0"/>
+        <w:jc w:val="both"/>
+        <w:rPr>
+          <w:rFonts w:ascii="Times New Roman" w:hAnsi="Times New Roman" w:eastAsia="Times New Roman" w:cs="Times New Roman"/>
+          <w:color w:val="00B0F0"/>
+          <w:kern w:val="0"/>
+          <w:sz w:val="20"/>
+          <w:szCs w:val="20"/>
+          <w:lang w:val="en-US" w:eastAsia="zh-CN" w:bidi="ar-SA"/>
+        </w:rPr>
+      </w:pPr>
+      <w:r>
+        <w:rPr>
+          <w:rFonts w:eastAsia="Times New Roman" w:cs="Times New Roman"/>
+          <w:color w:val="00B0F0"/>
+          <w:kern w:val="0"/>
+          <w:sz w:val="20"/>
+          <w:szCs w:val="20"/>
+          <w:lang w:val="en-US" w:eastAsia="zh-CN" w:bidi="ar-SA"/>
         </w:rPr>
         <w:t>3.1.7.1 Tables are created whenever a dealer joins the server</w:t>
       </w:r>
@@ -6225,13 +6496,28 @@
     <w:p>
       <w:pPr>
         <w:pStyle w:val="Paragraph2"/>
-        <w:rPr>
-          <w:color w:val="729FCF"/>
-        </w:rPr>
-      </w:pPr>
-      <w:r>
-        <w:rPr>
-          <w:color w:val="729FCF"/>
+        <w:widowControl/>
+        <w:suppressAutoHyphens w:val="true"/>
+        <w:bidi w:val="0"/>
+        <w:spacing w:before="80" w:after="0"/>
+        <w:jc w:val="both"/>
+        <w:rPr>
+          <w:rFonts w:ascii="Times New Roman" w:hAnsi="Times New Roman" w:eastAsia="Times New Roman" w:cs="Times New Roman"/>
+          <w:color w:val="00B0F0"/>
+          <w:kern w:val="0"/>
+          <w:sz w:val="20"/>
+          <w:szCs w:val="20"/>
+          <w:lang w:val="en-US" w:eastAsia="zh-CN" w:bidi="ar-SA"/>
+        </w:rPr>
+      </w:pPr>
+      <w:r>
+        <w:rPr>
+          <w:rFonts w:eastAsia="Times New Roman" w:cs="Times New Roman"/>
+          <w:color w:val="00B0F0"/>
+          <w:kern w:val="0"/>
+          <w:sz w:val="20"/>
+          <w:szCs w:val="20"/>
+          <w:lang w:val="en-US" w:eastAsia="zh-CN" w:bidi="ar-SA"/>
         </w:rPr>
         <w:t>3.1.7.2 Tables are opened whenever the dealer finalizes the table options</w:t>
       </w:r>
@@ -6239,13 +6525,28 @@
     <w:p>
       <w:pPr>
         <w:pStyle w:val="Paragraph2"/>
-        <w:rPr>
-          <w:color w:val="729FCF"/>
-        </w:rPr>
-      </w:pPr>
-      <w:r>
-        <w:rPr>
-          <w:color w:val="729FCF"/>
+        <w:widowControl/>
+        <w:suppressAutoHyphens w:val="true"/>
+        <w:bidi w:val="0"/>
+        <w:spacing w:before="80" w:after="0"/>
+        <w:jc w:val="both"/>
+        <w:rPr>
+          <w:rFonts w:ascii="Times New Roman" w:hAnsi="Times New Roman" w:eastAsia="Times New Roman" w:cs="Times New Roman"/>
+          <w:color w:val="00B0F0"/>
+          <w:kern w:val="0"/>
+          <w:sz w:val="20"/>
+          <w:szCs w:val="20"/>
+          <w:lang w:val="en-US" w:eastAsia="zh-CN" w:bidi="ar-SA"/>
+        </w:rPr>
+      </w:pPr>
+      <w:r>
+        <w:rPr>
+          <w:rFonts w:eastAsia="Times New Roman" w:cs="Times New Roman"/>
+          <w:color w:val="00B0F0"/>
+          <w:kern w:val="0"/>
+          <w:sz w:val="20"/>
+          <w:szCs w:val="20"/>
+          <w:lang w:val="en-US" w:eastAsia="zh-CN" w:bidi="ar-SA"/>
         </w:rPr>
         <w:t>3.1.7.3 Table options are as followed: setting betting limits, setting shoe size, setting the turn timer.</w:t>
       </w:r>
@@ -6253,13 +6554,28 @@
     <w:p>
       <w:pPr>
         <w:pStyle w:val="Paragraph2"/>
-        <w:rPr>
-          <w:color w:val="729FCF"/>
-        </w:rPr>
-      </w:pPr>
-      <w:r>
-        <w:rPr>
-          <w:color w:val="729FCF"/>
+        <w:widowControl/>
+        <w:suppressAutoHyphens w:val="true"/>
+        <w:bidi w:val="0"/>
+        <w:spacing w:before="80" w:after="0"/>
+        <w:jc w:val="both"/>
+        <w:rPr>
+          <w:rFonts w:ascii="Times New Roman" w:hAnsi="Times New Roman" w:eastAsia="Times New Roman" w:cs="Times New Roman"/>
+          <w:color w:val="00B0F0"/>
+          <w:kern w:val="0"/>
+          <w:sz w:val="20"/>
+          <w:szCs w:val="20"/>
+          <w:lang w:val="en-US" w:eastAsia="zh-CN" w:bidi="ar-SA"/>
+        </w:rPr>
+      </w:pPr>
+      <w:r>
+        <w:rPr>
+          <w:rFonts w:eastAsia="Times New Roman" w:cs="Times New Roman"/>
+          <w:color w:val="00B0F0"/>
+          <w:kern w:val="0"/>
+          <w:sz w:val="20"/>
+          <w:szCs w:val="20"/>
+          <w:lang w:val="en-US" w:eastAsia="zh-CN" w:bidi="ar-SA"/>
         </w:rPr>
         <w:t>3.1.7.4 Players must have the minimum bet in order to join the table</w:t>
       </w:r>
@@ -6267,13 +6583,28 @@
     <w:p>
       <w:pPr>
         <w:pStyle w:val="Paragraph2"/>
-        <w:rPr>
-          <w:color w:val="729FCF"/>
-        </w:rPr>
-      </w:pPr>
-      <w:r>
-        <w:rPr>
-          <w:color w:val="729FCF"/>
+        <w:widowControl/>
+        <w:suppressAutoHyphens w:val="true"/>
+        <w:bidi w:val="0"/>
+        <w:spacing w:before="80" w:after="0"/>
+        <w:jc w:val="both"/>
+        <w:rPr>
+          <w:rFonts w:ascii="Times New Roman" w:hAnsi="Times New Roman" w:eastAsia="Times New Roman" w:cs="Times New Roman"/>
+          <w:color w:val="00B0F0"/>
+          <w:kern w:val="0"/>
+          <w:sz w:val="20"/>
+          <w:szCs w:val="20"/>
+          <w:lang w:val="en-US" w:eastAsia="zh-CN" w:bidi="ar-SA"/>
+        </w:rPr>
+      </w:pPr>
+      <w:r>
+        <w:rPr>
+          <w:rFonts w:eastAsia="Times New Roman" w:cs="Times New Roman"/>
+          <w:color w:val="00B0F0"/>
+          <w:kern w:val="0"/>
+          <w:sz w:val="20"/>
+          <w:szCs w:val="20"/>
+          <w:lang w:val="en-US" w:eastAsia="zh-CN" w:bidi="ar-SA"/>
         </w:rPr>
         <w:t xml:space="preserve">3.1.7.5 The dealer can close the table at any time. When the dealer sets the table to be closed, the game continues until the current round is complete. </w:t>
       </w:r>
@@ -6281,33 +6612,57 @@
     <w:p>
       <w:pPr>
         <w:pStyle w:val="Paragraph2"/>
-        <w:rPr>
-          <w:color w:val="729FCF"/>
-        </w:rPr>
-      </w:pPr>
-      <w:r>
-        <w:rPr>
-          <w:color w:val="729FCF"/>
-        </w:rPr>
-        <w:t xml:space="preserve">3.1.7.6 </w:t>
-      </w:r>
-      <w:r>
-        <w:rPr>
-          <w:color w:val="729FCF"/>
-        </w:rPr>
-        <w:t>Each table will have a maximum of 6 players and 1 dealer.</w:t>
+        <w:widowControl/>
+        <w:suppressAutoHyphens w:val="true"/>
+        <w:bidi w:val="0"/>
+        <w:spacing w:before="80" w:after="0"/>
+        <w:jc w:val="both"/>
+        <w:rPr>
+          <w:rFonts w:ascii="Times New Roman" w:hAnsi="Times New Roman" w:eastAsia="Times New Roman" w:cs="Times New Roman"/>
+          <w:color w:val="00B0F0"/>
+          <w:kern w:val="0"/>
+          <w:sz w:val="20"/>
+          <w:szCs w:val="20"/>
+          <w:lang w:val="en-US" w:eastAsia="zh-CN" w:bidi="ar-SA"/>
+        </w:rPr>
+      </w:pPr>
+      <w:r>
+        <w:rPr>
+          <w:rFonts w:eastAsia="Times New Roman" w:cs="Times New Roman"/>
+          <w:color w:val="00B0F0"/>
+          <w:kern w:val="0"/>
+          <w:sz w:val="20"/>
+          <w:szCs w:val="20"/>
+          <w:lang w:val="en-US" w:eastAsia="zh-CN" w:bidi="ar-SA"/>
+        </w:rPr>
+        <w:t>3.1.7.6 Each table will have a maximum of 6 players and 1 dealer.</w:t>
       </w:r>
     </w:p>
     <w:p>
       <w:pPr>
         <w:pStyle w:val="Paragraph2"/>
-        <w:rPr>
-          <w:color w:val="729FCF"/>
-        </w:rPr>
-      </w:pPr>
-      <w:r>
-        <w:rPr>
-          <w:color w:val="729FCF"/>
+        <w:widowControl/>
+        <w:suppressAutoHyphens w:val="true"/>
+        <w:bidi w:val="0"/>
+        <w:spacing w:before="80" w:after="0"/>
+        <w:jc w:val="both"/>
+        <w:rPr>
+          <w:rFonts w:ascii="Times New Roman" w:hAnsi="Times New Roman" w:eastAsia="Times New Roman" w:cs="Times New Roman"/>
+          <w:color w:val="00B0F0"/>
+          <w:kern w:val="0"/>
+          <w:sz w:val="20"/>
+          <w:szCs w:val="20"/>
+          <w:lang w:val="en-US" w:eastAsia="zh-CN" w:bidi="ar-SA"/>
+        </w:rPr>
+      </w:pPr>
+      <w:r>
+        <w:rPr>
+          <w:rFonts w:eastAsia="Times New Roman" w:cs="Times New Roman"/>
+          <w:color w:val="00B0F0"/>
+          <w:kern w:val="0"/>
+          <w:sz w:val="20"/>
+          <w:szCs w:val="20"/>
+          <w:lang w:val="en-US" w:eastAsia="zh-CN" w:bidi="ar-SA"/>
         </w:rPr>
         <w:t>3.1.7.7 Table will be locked from new players while the table is at max capacity.</w:t>
       </w:r>
@@ -6568,15 +6923,217 @@
     <w:p>
       <w:pPr>
         <w:pStyle w:val="Paragraph2"/>
-        <w:rPr>
-          <w:color w:val="0070C0"/>
-        </w:rPr>
-      </w:pPr>
-      <w:r>
-        <w:rPr>
-          <w:color w:val="0070C0"/>
-        </w:rPr>
-        <w:t>3.2.1 The user interface must be graphical in nature and provide intuitive controls to allow for account management, including the adding and withdrawing of funds, and give users the ability to play blackjack with features such as button to hit, stand, double down, or split their hands and purchase insurance when applicable.</w:t>
+        <w:widowControl/>
+        <w:suppressAutoHyphens w:val="true"/>
+        <w:bidi w:val="0"/>
+        <w:spacing w:before="80" w:after="0"/>
+        <w:jc w:val="both"/>
+        <w:rPr>
+          <w:rFonts w:ascii="Times New Roman" w:hAnsi="Times New Roman" w:eastAsia="Times New Roman" w:cs="Times New Roman"/>
+          <w:color w:val="00B0F0"/>
+          <w:kern w:val="0"/>
+          <w:sz w:val="20"/>
+          <w:szCs w:val="20"/>
+          <w:lang w:val="en-US" w:eastAsia="zh-CN" w:bidi="ar-SA"/>
+        </w:rPr>
+      </w:pPr>
+      <w:r>
+        <w:rPr>
+          <w:rFonts w:eastAsia="Times New Roman" w:cs="Times New Roman"/>
+          <w:color w:val="00B0F0"/>
+          <w:kern w:val="0"/>
+          <w:sz w:val="20"/>
+          <w:szCs w:val="20"/>
+          <w:lang w:val="en-US" w:eastAsia="zh-CN" w:bidi="ar-SA"/>
+        </w:rPr>
+        <w:t>3.2.1 The system shall provide a graphical user interface for all user interactions including login, lobby navigation, table joining, and gameplay actions.</w:t>
+      </w:r>
+    </w:p>
+    <w:p>
+      <w:pPr>
+        <w:pStyle w:val="Paragraph2"/>
+        <w:widowControl/>
+        <w:suppressAutoHyphens w:val="true"/>
+        <w:bidi w:val="0"/>
+        <w:spacing w:before="80" w:after="0"/>
+        <w:jc w:val="both"/>
+        <w:rPr>
+          <w:rFonts w:ascii="Times New Roman" w:hAnsi="Times New Roman" w:eastAsia="Times New Roman" w:cs="Times New Roman"/>
+          <w:color w:val="00B0F0"/>
+          <w:kern w:val="0"/>
+          <w:sz w:val="20"/>
+          <w:szCs w:val="20"/>
+          <w:lang w:val="en-US" w:eastAsia="zh-CN" w:bidi="ar-SA"/>
+        </w:rPr>
+      </w:pPr>
+      <w:r>
+        <w:rPr>
+          <w:rFonts w:eastAsia="Times New Roman" w:cs="Times New Roman"/>
+          <w:color w:val="00B0F0"/>
+          <w:kern w:val="0"/>
+          <w:sz w:val="20"/>
+          <w:szCs w:val="20"/>
+          <w:lang w:val="en-US" w:eastAsia="zh-CN" w:bidi="ar-SA"/>
+        </w:rPr>
+        <w:t>3.2.2 The GUI shall present buttons or controls for player actions including hit, stand, split, double down, and insurance when available.</w:t>
+      </w:r>
+    </w:p>
+    <w:p>
+      <w:pPr>
+        <w:pStyle w:val="Paragraph2"/>
+        <w:widowControl/>
+        <w:suppressAutoHyphens w:val="true"/>
+        <w:bidi w:val="0"/>
+        <w:spacing w:before="80" w:after="0"/>
+        <w:jc w:val="both"/>
+        <w:rPr>
+          <w:rFonts w:ascii="Times New Roman" w:hAnsi="Times New Roman" w:eastAsia="Times New Roman" w:cs="Times New Roman"/>
+          <w:color w:val="00B0F0"/>
+          <w:kern w:val="0"/>
+          <w:sz w:val="20"/>
+          <w:szCs w:val="20"/>
+          <w:lang w:val="en-US" w:eastAsia="zh-CN" w:bidi="ar-SA"/>
+        </w:rPr>
+      </w:pPr>
+      <w:r>
+        <w:rPr>
+          <w:rFonts w:eastAsia="Times New Roman" w:cs="Times New Roman"/>
+          <w:color w:val="00B0F0"/>
+          <w:kern w:val="0"/>
+          <w:sz w:val="20"/>
+          <w:szCs w:val="20"/>
+          <w:lang w:val="en-US" w:eastAsia="zh-CN" w:bidi="ar-SA"/>
+        </w:rPr>
+        <w:t>3.2.3 The GUI shall display real-time updates of the game state including player hands, dealer hand, bets, timers, and outcomes.</w:t>
+      </w:r>
+    </w:p>
+    <w:p>
+      <w:pPr>
+        <w:pStyle w:val="Paragraph2"/>
+        <w:widowControl/>
+        <w:suppressAutoHyphens w:val="true"/>
+        <w:bidi w:val="0"/>
+        <w:spacing w:before="80" w:after="0"/>
+        <w:jc w:val="both"/>
+        <w:rPr>
+          <w:rFonts w:ascii="Times New Roman" w:hAnsi="Times New Roman" w:eastAsia="Times New Roman" w:cs="Times New Roman"/>
+          <w:color w:val="00B0F0"/>
+          <w:kern w:val="0"/>
+          <w:sz w:val="20"/>
+          <w:szCs w:val="20"/>
+          <w:lang w:val="en-US" w:eastAsia="zh-CN" w:bidi="ar-SA"/>
+        </w:rPr>
+      </w:pPr>
+      <w:r>
+        <w:rPr>
+          <w:rFonts w:eastAsia="Times New Roman" w:cs="Times New Roman"/>
+          <w:color w:val="00B0F0"/>
+          <w:kern w:val="0"/>
+          <w:sz w:val="20"/>
+          <w:szCs w:val="20"/>
+          <w:lang w:val="en-US" w:eastAsia="zh-CN" w:bidi="ar-SA"/>
+        </w:rPr>
+        <w:t>3.2.4 The system shall provide user interface elements allowing players to deposit funds, withdraw funds, and view current credit balances.</w:t>
+      </w:r>
+    </w:p>
+    <w:p>
+      <w:pPr>
+        <w:pStyle w:val="Paragraph2"/>
+        <w:widowControl/>
+        <w:suppressAutoHyphens w:val="true"/>
+        <w:bidi w:val="0"/>
+        <w:spacing w:before="80" w:after="0"/>
+        <w:jc w:val="both"/>
+        <w:rPr>
+          <w:rFonts w:ascii="Times New Roman" w:hAnsi="Times New Roman" w:eastAsia="Times New Roman" w:cs="Times New Roman"/>
+          <w:color w:val="00B0F0"/>
+          <w:kern w:val="0"/>
+          <w:sz w:val="20"/>
+          <w:szCs w:val="20"/>
+          <w:lang w:val="en-US" w:eastAsia="zh-CN" w:bidi="ar-SA"/>
+        </w:rPr>
+      </w:pPr>
+      <w:r>
+        <w:rPr>
+          <w:rFonts w:eastAsia="Times New Roman" w:cs="Times New Roman"/>
+          <w:color w:val="00B0F0"/>
+          <w:kern w:val="0"/>
+          <w:sz w:val="20"/>
+          <w:szCs w:val="20"/>
+          <w:lang w:val="en-US" w:eastAsia="zh-CN" w:bidi="ar-SA"/>
+        </w:rPr>
+        <w:t>3.2.5 The GUI shall display available tables within the lobby including table rules, current player count, and betting limits.</w:t>
+      </w:r>
+    </w:p>
+    <w:p>
+      <w:pPr>
+        <w:pStyle w:val="Paragraph2"/>
+        <w:widowControl/>
+        <w:suppressAutoHyphens w:val="true"/>
+        <w:bidi w:val="0"/>
+        <w:spacing w:before="80" w:after="0"/>
+        <w:jc w:val="both"/>
+        <w:rPr>
+          <w:rFonts w:ascii="Times New Roman" w:hAnsi="Times New Roman" w:eastAsia="Times New Roman" w:cs="Times New Roman"/>
+          <w:color w:val="00B0F0"/>
+          <w:kern w:val="0"/>
+          <w:sz w:val="20"/>
+          <w:szCs w:val="20"/>
+          <w:lang w:val="en-US" w:eastAsia="zh-CN" w:bidi="ar-SA"/>
+        </w:rPr>
+      </w:pPr>
+      <w:r>
+        <w:rPr>
+          <w:rFonts w:eastAsia="Times New Roman" w:cs="Times New Roman"/>
+          <w:color w:val="00B0F0"/>
+          <w:kern w:val="0"/>
+          <w:sz w:val="20"/>
+          <w:szCs w:val="20"/>
+          <w:lang w:val="en-US" w:eastAsia="zh-CN" w:bidi="ar-SA"/>
+        </w:rPr>
+        <w:t>3.2.6 The GUI shall notify users of connection issues, disconnections, or server shutdowns.</w:t>
+      </w:r>
+    </w:p>
+    <w:p>
+      <w:pPr>
+        <w:pStyle w:val="Paragraph2"/>
+        <w:widowControl/>
+        <w:suppressAutoHyphens w:val="true"/>
+        <w:bidi w:val="0"/>
+        <w:spacing w:before="80" w:after="0"/>
+        <w:jc w:val="both"/>
+        <w:rPr>
+          <w:rFonts w:ascii="Times New Roman" w:hAnsi="Times New Roman" w:eastAsia="Times New Roman" w:cs="Times New Roman"/>
+          <w:color w:val="00B0F0"/>
+          <w:kern w:val="0"/>
+          <w:sz w:val="20"/>
+          <w:szCs w:val="20"/>
+          <w:lang w:val="en-US" w:eastAsia="zh-CN" w:bidi="ar-SA"/>
+        </w:rPr>
+      </w:pPr>
+      <w:r>
+        <w:rPr>
+          <w:rFonts w:eastAsia="Times New Roman" w:cs="Times New Roman"/>
+          <w:color w:val="00B0F0"/>
+          <w:kern w:val="0"/>
+          <w:sz w:val="20"/>
+          <w:szCs w:val="20"/>
+          <w:lang w:val="en-US" w:eastAsia="zh-CN" w:bidi="ar-SA"/>
+        </w:rPr>
+        <w:t>3.2.7 The system shall interface with user payment methods (credit cards) to allow the purchase of in-game credits.</w:t>
+      </w:r>
+    </w:p>
+    <w:p>
+      <w:pPr>
+        <w:pStyle w:val="Paragraph2"/>
+        <w:rPr>
+          <w:color w:val="0070C0"/>
+        </w:rPr>
+      </w:pPr>
+      <w:r>
+        <w:rPr>
+          <w:color w:val="0070C0"/>
+        </w:rPr>
       </w:r>
     </w:p>
     <w:p>
@@ -6668,7 +7225,19 @@
         <w:rPr>
           <w:color w:val="0070C0"/>
         </w:rPr>
-        <w:t>4.4.1 All user accounts must use non-sensitive ID/password combinations as encryption will not be used and will be visible to developers.</w:t>
+        <w:t>4.</w:t>
+      </w:r>
+      <w:r>
+        <w:rPr>
+          <w:color w:val="0070C0"/>
+        </w:rPr>
+        <w:t>1</w:t>
+      </w:r>
+      <w:r>
+        <w:rPr>
+          <w:color w:val="0070C0"/>
+        </w:rPr>
+        <w:t>.1 All user accounts must use non-sensitive ID/password combinations as encryption will not be used and will be visible to developers.</w:t>
       </w:r>
     </w:p>
     <w:p>
@@ -7030,7 +7599,7 @@
       <mc:AlternateContent>
         <mc:Choice Requires="wps">
           <w:drawing>
-            <wp:anchor behindDoc="1" distT="0" distB="0" distL="0" distR="0" simplePos="0" locked="0" layoutInCell="0" allowOverlap="1" relativeHeight="2" wp14:anchorId="07B49E00">
+            <wp:anchor distT="0" distB="0" distL="0" distR="0" simplePos="0" relativeHeight="2" behindDoc="1" locked="0" layoutInCell="0" allowOverlap="1" wp14:anchorId="07B49E00">
               <wp:simplePos x="0" y="0"/>
               <wp:positionH relativeFrom="margin">
                 <wp:align>center</wp:align>
@@ -7110,7 +7679,7 @@
                         </w:p>
                       </w:txbxContent>
                     </wps:txbx>
-                    <wps:bodyPr lIns="0" rIns="0" tIns="0" bIns="0" anchor="t">
+                    <wps:bodyPr lIns="0" tIns="0" rIns="0" bIns="0" anchor="t">
                       <a:noAutofit/>
                     </wps:bodyPr>
                   </wps:wsp>
@@ -7121,7 +7690,7 @@
         </mc:Choice>
         <mc:Fallback>
           <w:pict>
-            <v:rect id="shape_0" ID="Frame1" path="m0,0l-2147483645,0l-2147483645,-2147483646l0,-2147483646xe" stroked="f" o:allowincell="f" style="position:absolute;margin-left:213.65pt;margin-top:0.05pt;width:4.6pt;height:9.3pt;mso-wrap-style:square;v-text-anchor:top;mso-position-horizontal:center;mso-position-horizontal-relative:margin" wp14:anchorId="07B49E00">
+            <v:rect id="shape_0" stroked="f" o:allowincell="f" style="position:absolute;margin-left:213.65pt;margin-top:0.05pt;width:4.6pt;height:9.3pt;mso-wrap-style:square;v-text-anchor:top;mso-position-horizontal:center;mso-position-horizontal-relative:margin" wp14:anchorId="07B49E00">
               <v:fill o:detectmouseclick="t" on="false"/>
               <v:stroke color="#3465a4" joinstyle="round" endcap="flat"/>
               <v:textbox>
@@ -7191,7 +7760,7 @@
       <mc:AlternateContent>
         <mc:Choice Requires="wps">
           <w:drawing>
-            <wp:anchor behindDoc="1" distT="0" distB="0" distL="0" distR="0" simplePos="0" locked="0" layoutInCell="0" allowOverlap="1" relativeHeight="2" wp14:anchorId="07B49E00">
+            <wp:anchor distT="0" distB="0" distL="0" distR="0" simplePos="0" relativeHeight="2" behindDoc="1" locked="0" layoutInCell="0" allowOverlap="1" wp14:anchorId="07B49E00">
               <wp:simplePos x="0" y="0"/>
               <wp:positionH relativeFrom="margin">
                 <wp:align>center</wp:align>
@@ -7271,7 +7840,7 @@
                         </w:p>
                       </w:txbxContent>
                     </wps:txbx>
-                    <wps:bodyPr lIns="0" rIns="0" tIns="0" bIns="0" anchor="t">
+                    <wps:bodyPr lIns="0" tIns="0" rIns="0" bIns="0" anchor="t">
                       <a:noAutofit/>
                     </wps:bodyPr>
                   </wps:wsp>
@@ -7282,7 +7851,7 @@
         </mc:Choice>
         <mc:Fallback>
           <w:pict>
-            <v:rect id="shape_0" ID="Frame1" path="m0,0l-2147483645,0l-2147483645,-2147483646l0,-2147483646xe" stroked="f" o:allowincell="f" style="position:absolute;margin-left:213.65pt;margin-top:0.05pt;width:4.6pt;height:9.3pt;mso-wrap-style:square;v-text-anchor:top;mso-position-horizontal:center;mso-position-horizontal-relative:margin" wp14:anchorId="07B49E00">
+            <v:rect id="shape_0" stroked="f" o:allowincell="f" style="position:absolute;margin-left:213.65pt;margin-top:0.05pt;width:4.6pt;height:9.3pt;mso-wrap-style:square;v-text-anchor:top;mso-position-horizontal:center;mso-position-horizontal-relative:margin" wp14:anchorId="07B49E00">
               <v:fill o:detectmouseclick="t" on="false"/>
               <v:stroke color="#3465a4" joinstyle="round" endcap="flat"/>
               <v:textbox>
@@ -7366,7 +7935,7 @@
       <mc:AlternateContent>
         <mc:Choice Requires="wps">
           <w:drawing>
-            <wp:anchor behindDoc="1" distT="0" distB="0" distL="0" distR="0" simplePos="0" locked="0" layoutInCell="0" allowOverlap="1" relativeHeight="19" wp14:anchorId="16546B0F">
+            <wp:anchor distT="0" distB="0" distL="0" distR="0" simplePos="0" relativeHeight="22" behindDoc="1" locked="0" layoutInCell="0" allowOverlap="1" wp14:anchorId="16546B0F">
               <wp:simplePos x="0" y="0"/>
               <wp:positionH relativeFrom="margin">
                 <wp:align>center</wp:align>
@@ -7434,7 +8003,7 @@
                               <w:rStyle w:val="PageNumber"/>
                               <w:color w:val="000000"/>
                             </w:rPr>
-                            <w:t>xi</w:t>
+                            <w:t>xii</w:t>
                           </w:r>
                           <w:r>
                             <w:rPr>
@@ -7446,7 +8015,7 @@
                         </w:p>
                       </w:txbxContent>
                     </wps:txbx>
-                    <wps:bodyPr lIns="0" rIns="0" tIns="0" bIns="0" anchor="t">
+                    <wps:bodyPr lIns="0" tIns="0" rIns="0" bIns="0" anchor="t">
                       <a:noAutofit/>
                     </wps:bodyPr>
                   </wps:wsp>
@@ -7457,7 +8026,7 @@
         </mc:Choice>
         <mc:Fallback>
           <w:pict>
-            <v:rect id="shape_0" ID="Frame2" path="m0,0l-2147483645,0l-2147483645,-2147483646l0,-2147483646xe" stroked="f" o:allowincell="f" style="position:absolute;margin-left:213.15pt;margin-top:0.05pt;width:5.6pt;height:1.75pt;mso-wrap-style:square;v-text-anchor:top;mso-position-horizontal:center;mso-position-horizontal-relative:margin" wp14:anchorId="16546B0F">
+            <v:rect id="shape_0" stroked="f" o:allowincell="f" style="position:absolute;margin-left:213.15pt;margin-top:0.05pt;width:5.6pt;height:1.75pt;mso-wrap-style:square;v-text-anchor:top;mso-position-horizontal:center;mso-position-horizontal-relative:margin" wp14:anchorId="16546B0F">
               <v:fill o:detectmouseclick="t" on="false"/>
               <v:stroke color="#3465a4" joinstyle="round" endcap="flat"/>
               <v:textbox>
@@ -7493,7 +8062,7 @@
                         <w:rStyle w:val="PageNumber"/>
                         <w:color w:val="000000"/>
                       </w:rPr>
-                      <w:t>xi</w:t>
+                      <w:t>xii</w:t>
                     </w:r>
                     <w:r>
                       <w:rPr>
@@ -7678,7 +8247,7 @@
 <w:hdr xmlns:o="urn:schemas-microsoft-com:office:office" xmlns:r="http://schemas.openxmlformats.org/officeDocument/2006/relationships" xmlns:v="urn:schemas-microsoft-com:vml" xmlns:w="http://schemas.openxmlformats.org/wordprocessingml/2006/main" xmlns:w10="urn:schemas-microsoft-com:office:word" xmlns:wp="http://schemas.openxmlformats.org/drawingml/2006/wordprocessingDrawing" xmlns:pic="http://schemas.openxmlformats.org/drawingml/2006/picture" xmlns:wps="http://schemas.microsoft.com/office/word/2010/wordprocessingShape" xmlns:wpg="http://schemas.microsoft.com/office/word/2010/wordprocessingGroup" xmlns:mc="http://schemas.openxmlformats.org/markup-compatibility/2006" xmlns:wp14="http://schemas.microsoft.com/office/word/2010/wordprocessingDrawing" xmlns:w14="http://schemas.microsoft.com/office/word/2010/wordml" xmlns:w15="http://schemas.microsoft.com/office/word/2012/wordml" mc:Ignorable="w14 wp14 w15">
   <w:p>
     <w:pPr>
-      <w:pStyle w:val="HeaderLeft"/>
+      <w:pStyle w:val="HeaderLeftuser"/>
       <w:rPr/>
     </w:pPr>
     <w:r>
@@ -7693,8 +8262,8 @@
   <w:abstractNum w:abstractNumId="1">
     <w:lvl w:ilvl="0">
       <w:start w:val="1"/>
+      <w:numFmt w:val="decimal"/>
       <w:pStyle w:val="Heading1"/>
-      <w:numFmt w:val="decimal"/>
       <w:lvlText w:val="%1."/>
       <w:lvlJc w:val="left"/>
       <w:pPr>
@@ -7704,16 +8273,16 @@
         <w:ind w:left="720" w:hanging="720"/>
       </w:pPr>
       <w:rPr>
-        <w:sz w:val="36"/>
         <w:b/>
         <w:kern w:val="2"/>
+        <w:sz w:val="36"/>
         <w:lang w:val="en-US" w:bidi="en-US"/>
       </w:rPr>
     </w:lvl>
     <w:lvl w:ilvl="1">
       <w:start w:val="1"/>
+      <w:numFmt w:val="decimal"/>
       <w:pStyle w:val="Heading2"/>
-      <w:numFmt w:val="decimal"/>
       <w:lvlText w:val="%1.%2."/>
       <w:lvlJc w:val="left"/>
       <w:pPr>
@@ -7726,8 +8295,8 @@
     </w:lvl>
     <w:lvl w:ilvl="2">
       <w:start w:val="1"/>
+      <w:numFmt w:val="decimal"/>
       <w:pStyle w:val="Heading3"/>
-      <w:numFmt w:val="decimal"/>
       <w:lvlText w:val="%1.%2.%3."/>
       <w:lvlJc w:val="left"/>
       <w:pPr>
@@ -7740,8 +8309,8 @@
     </w:lvl>
     <w:lvl w:ilvl="3">
       <w:start w:val="1"/>
+      <w:numFmt w:val="decimal"/>
       <w:pStyle w:val="Heading4"/>
-      <w:numFmt w:val="decimal"/>
       <w:lvlText w:val="%1.%2.%3.%4."/>
       <w:lvlJc w:val="left"/>
       <w:pPr>
@@ -7754,8 +8323,8 @@
     </w:lvl>
     <w:lvl w:ilvl="4">
       <w:start w:val="1"/>
+      <w:numFmt w:val="decimal"/>
       <w:pStyle w:val="Heading5"/>
-      <w:numFmt w:val="decimal"/>
       <w:lvlText w:val="%1.%2.%3.%4.%5."/>
       <w:lvlJc w:val="left"/>
       <w:pPr>
@@ -7768,8 +8337,8 @@
     </w:lvl>
     <w:lvl w:ilvl="5">
       <w:start w:val="1"/>
+      <w:numFmt w:val="decimal"/>
       <w:pStyle w:val="Heading6"/>
-      <w:numFmt w:val="decimal"/>
       <w:lvlText w:val="%1.%2.%3.%4.%5.%6."/>
       <w:lvlJc w:val="left"/>
       <w:pPr>
@@ -7782,8 +8351,8 @@
     </w:lvl>
     <w:lvl w:ilvl="6">
       <w:start w:val="1"/>
+      <w:numFmt w:val="decimal"/>
       <w:pStyle w:val="Heading7"/>
-      <w:numFmt w:val="decimal"/>
       <w:lvlText w:val="%1.%2.%3.%4.%5.%6.%7."/>
       <w:lvlJc w:val="left"/>
       <w:pPr>
@@ -7796,8 +8365,8 @@
     </w:lvl>
     <w:lvl w:ilvl="7">
       <w:start w:val="1"/>
+      <w:numFmt w:val="decimal"/>
       <w:pStyle w:val="Heading8"/>
-      <w:numFmt w:val="decimal"/>
       <w:lvlText w:val="%1.%2.%3.%4.%5.%6.%7.%8."/>
       <w:lvlJc w:val="left"/>
       <w:pPr>
@@ -7810,8 +8379,8 @@
     </w:lvl>
     <w:lvl w:ilvl="8">
       <w:start w:val="1"/>
+      <w:numFmt w:val="decimal"/>
       <w:pStyle w:val="Heading9"/>
-      <w:numFmt w:val="decimal"/>
       <w:lvlText w:val="%1.%2.%3.%4.%5.%6.%7.%8.%9."/>
       <w:lvlJc w:val="left"/>
       <w:pPr>
@@ -7836,9 +8405,9 @@
         <w:ind w:left="720" w:hanging="720"/>
       </w:pPr>
       <w:rPr>
-        <w:sz w:val="36"/>
         <w:b/>
         <w:kern w:val="2"/>
+        <w:sz w:val="36"/>
         <w:lang w:val="en-US" w:bidi="en-US"/>
       </w:rPr>
     </w:lvl>
@@ -9019,15 +9588,15 @@
       <w:bCs/>
     </w:rPr>
   </w:style>
-  <w:style w:type="paragraph" w:styleId="FrameContents" w:customStyle="1">
-    <w:name w:val="Frame Contents"/>
+  <w:style w:type="paragraph" w:styleId="FrameContentsuser" w:customStyle="1">
+    <w:name w:val="Frame Contents (user)"/>
     <w:basedOn w:val="Normal"/>
     <w:qFormat/>
     <w:pPr/>
     <w:rPr/>
   </w:style>
-  <w:style w:type="paragraph" w:styleId="HeaderLeft" w:customStyle="1">
-    <w:name w:val="Header Left"/>
+  <w:style w:type="paragraph" w:styleId="HeaderLeftuser" w:customStyle="1">
+    <w:name w:val="Header Left (user)"/>
     <w:basedOn w:val="Normal"/>
     <w:qFormat/>
     <w:pPr>
@@ -9040,8 +9609,8 @@
     </w:pPr>
     <w:rPr/>
   </w:style>
-  <w:style w:type="paragraph" w:styleId="FrameContentsuser" w:customStyle="1">
-    <w:name w:val="Frame Contents (user)"/>
+  <w:style w:type="paragraph" w:styleId="FrameContents" w:customStyle="1">
+    <w:name w:val="Frame Contents"/>
     <w:basedOn w:val="Normal"/>
     <w:qFormat/>
     <w:pPr/>
@@ -9083,37 +9652,37 @@
         <a:srgbClr val="000000"/>
       </a:dk1>
       <a:lt1>
-        <a:srgbClr val="ffffff"/>
+        <a:srgbClr val="FFFFFF"/>
       </a:lt1>
       <a:dk2>
-        <a:srgbClr val="0e2841"/>
+        <a:srgbClr val="0E2841"/>
       </a:dk2>
       <a:lt2>
-        <a:srgbClr val="e8e8e8"/>
+        <a:srgbClr val="E8E8E8"/>
       </a:lt2>
       <a:accent1>
         <a:srgbClr val="156082"/>
       </a:accent1>
       <a:accent2>
-        <a:srgbClr val="e97132"/>
+        <a:srgbClr val="E97132"/>
       </a:accent2>
       <a:accent3>
-        <a:srgbClr val="196b24"/>
+        <a:srgbClr val="196B24"/>
       </a:accent3>
       <a:accent4>
-        <a:srgbClr val="0f9ed5"/>
+        <a:srgbClr val="0F9ED5"/>
       </a:accent4>
       <a:accent5>
-        <a:srgbClr val="a02b93"/>
+        <a:srgbClr val="A02B93"/>
       </a:accent5>
       <a:accent6>
-        <a:srgbClr val="4ea72e"/>
+        <a:srgbClr val="4EA72E"/>
       </a:accent6>
       <a:hlink>
         <a:srgbClr val="467886"/>
       </a:hlink>
       <a:folHlink>
-        <a:srgbClr val="96607d"/>
+        <a:srgbClr val="96607D"/>
       </a:folHlink>
     </a:clrScheme>
     <a:fontScheme name="Office">

</xml_diff>

<commit_message>
Reupload of current version
</commit_message>
<xml_diff>
--- a/CS 401 - Group 2 - SRS Doc.docx
+++ b/CS 401 - Group 2 - SRS Doc.docx
@@ -1521,7 +1521,7 @@
               <w:rPr>
                 <w:color w:val="000000"/>
               </w:rPr>
-              <w:t>1.7.1</w:t>
+              <w:t>1.8</w:t>
             </w:r>
           </w:p>
         </w:tc>
@@ -1548,7 +1548,7 @@
               <w:rPr>
                 <w:color w:val="000000"/>
               </w:rPr>
-              <w:t>Added 3.1.1</w:t>
+              <w:t>Added Sequence Diagrams</w:t>
             </w:r>
           </w:p>
         </w:tc>
@@ -1576,7 +1576,7 @@
               <w:rPr>
                 <w:color w:val="000000"/>
               </w:rPr>
-              <w:t>Nick Vu</w:t>
+              <w:t>Paul Cooper</w:t>
             </w:r>
           </w:p>
         </w:tc>
@@ -1608,6 +1608,7 @@
                 <w:color w:val="000000"/>
                 <w:u w:val="single"/>
               </w:rPr>
+              <w:t>03/04/2026</w:t>
             </w:r>
           </w:p>
         </w:tc>
@@ -1634,6 +1635,7 @@
               <w:rPr>
                 <w:color w:val="000000"/>
               </w:rPr>
+              <w:t>1.9</w:t>
             </w:r>
           </w:p>
         </w:tc>
@@ -1660,6 +1662,7 @@
               <w:rPr>
                 <w:color w:val="000000"/>
               </w:rPr>
+              <w:t>Added Class Diagram</w:t>
             </w:r>
           </w:p>
         </w:tc>
@@ -1687,6 +1690,7 @@
               <w:rPr>
                 <w:color w:val="000000"/>
               </w:rPr>
+              <w:t>Nick Vu</w:t>
             </w:r>
           </w:p>
         </w:tc>
@@ -2421,7 +2425,6 @@
               <w:sz w:val="24"/>
               <w:szCs w:val="24"/>
               <w:lang w:eastAsia="en-US"/>
-              <w14:ligatures w14:val="standardContextual"/>
             </w:rPr>
           </w:pPr>
           <w:r>
@@ -2460,35 +2463,39 @@
                 <w:sz w:val="24"/>
                 <w:szCs w:val="24"/>
                 <w:lang w:eastAsia="en-US"/>
-                <w14:ligatures w14:val="standardContextual"/>
               </w:rPr>
               <w:tab/>
             </w:r>
             <w:r>
               <w:rPr>
-                <w:webHidden/>
-              </w:rPr>
-              <w:fldChar w:fldCharType="begin"/>
-            </w:r>
-            <w:r>
-              <w:rPr>
-                <w:webHidden/>
-              </w:rPr>
-              <w:instrText xml:space="preserve">PAGEREF _Toc223529111 \h</w:instrText>
-            </w:r>
-            <w:r>
-              <w:rPr>
-                <w:webHidden/>
-              </w:rPr>
-              <w:fldChar w:fldCharType="separate"/>
-            </w:r>
-            <w:r>
-              <w:rPr>
-                <w:rStyle w:val="IndexLink"/>
-                <w:vanish w:val="false"/>
+                <w:rStyle w:val="IndexLink"/>
               </w:rPr>
               <w:t>Purpose</w:t>
               <w:tab/>
+            </w:r>
+            <w:r>
+              <w:rPr>
+                <w:webHidden/>
+              </w:rPr>
+              <w:fldChar w:fldCharType="begin"/>
+            </w:r>
+            <w:r>
+              <w:rPr>
+                <w:webHidden/>
+              </w:rPr>
+              <w:instrText xml:space="preserve">PAGEREF _Toc223529111 \h</w:instrText>
+            </w:r>
+            <w:r>
+              <w:rPr>
+                <w:webHidden/>
+              </w:rPr>
+              <w:fldChar w:fldCharType="separate"/>
+            </w:r>
+            <w:r>
+              <w:rPr>
+                <w:rStyle w:val="IndexLink"/>
+                <w:vanish w:val="false"/>
+              </w:rPr>
               <w:t>iv</w:t>
             </w:r>
             <w:r>
@@ -2513,7 +2520,6 @@
               <w:sz w:val="24"/>
               <w:szCs w:val="24"/>
               <w:lang w:eastAsia="en-US"/>
-              <w14:ligatures w14:val="standardContextual"/>
             </w:rPr>
           </w:pPr>
           <w:hyperlink w:anchor="_Toc223529112">
@@ -2533,35 +2539,39 @@
                 <w:sz w:val="24"/>
                 <w:szCs w:val="24"/>
                 <w:lang w:eastAsia="en-US"/>
-                <w14:ligatures w14:val="standardContextual"/>
               </w:rPr>
               <w:tab/>
             </w:r>
             <w:r>
               <w:rPr>
-                <w:webHidden/>
-              </w:rPr>
-              <w:fldChar w:fldCharType="begin"/>
-            </w:r>
-            <w:r>
-              <w:rPr>
-                <w:webHidden/>
-              </w:rPr>
-              <w:instrText xml:space="preserve">PAGEREF _Toc223529112 \h</w:instrText>
-            </w:r>
-            <w:r>
-              <w:rPr>
-                <w:webHidden/>
-              </w:rPr>
-              <w:fldChar w:fldCharType="separate"/>
-            </w:r>
-            <w:r>
-              <w:rPr>
-                <w:rStyle w:val="IndexLink"/>
-                <w:vanish w:val="false"/>
+                <w:rStyle w:val="IndexLink"/>
               </w:rPr>
               <w:t>Scope</w:t>
               <w:tab/>
+            </w:r>
+            <w:r>
+              <w:rPr>
+                <w:webHidden/>
+              </w:rPr>
+              <w:fldChar w:fldCharType="begin"/>
+            </w:r>
+            <w:r>
+              <w:rPr>
+                <w:webHidden/>
+              </w:rPr>
+              <w:instrText xml:space="preserve">PAGEREF _Toc223529112 \h</w:instrText>
+            </w:r>
+            <w:r>
+              <w:rPr>
+                <w:webHidden/>
+              </w:rPr>
+              <w:fldChar w:fldCharType="separate"/>
+            </w:r>
+            <w:r>
+              <w:rPr>
+                <w:rStyle w:val="IndexLink"/>
+                <w:vanish w:val="false"/>
+              </w:rPr>
               <w:t>iv</w:t>
             </w:r>
             <w:r>
@@ -2586,7 +2596,6 @@
               <w:sz w:val="24"/>
               <w:szCs w:val="24"/>
               <w:lang w:eastAsia="en-US"/>
-              <w14:ligatures w14:val="standardContextual"/>
             </w:rPr>
           </w:pPr>
           <w:hyperlink w:anchor="_Toc223529113">
@@ -2606,35 +2615,39 @@
                 <w:sz w:val="24"/>
                 <w:szCs w:val="24"/>
                 <w:lang w:eastAsia="en-US"/>
-                <w14:ligatures w14:val="standardContextual"/>
               </w:rPr>
               <w:tab/>
             </w:r>
             <w:r>
               <w:rPr>
-                <w:webHidden/>
-              </w:rPr>
-              <w:fldChar w:fldCharType="begin"/>
-            </w:r>
-            <w:r>
-              <w:rPr>
-                <w:webHidden/>
-              </w:rPr>
-              <w:instrText xml:space="preserve">PAGEREF _Toc223529113 \h</w:instrText>
-            </w:r>
-            <w:r>
-              <w:rPr>
-                <w:webHidden/>
-              </w:rPr>
-              <w:fldChar w:fldCharType="separate"/>
-            </w:r>
-            <w:r>
-              <w:rPr>
-                <w:rStyle w:val="IndexLink"/>
-                <w:vanish w:val="false"/>
+                <w:rStyle w:val="IndexLink"/>
               </w:rPr>
               <w:t>Definitions, Acronyms, Abbreviations</w:t>
               <w:tab/>
+            </w:r>
+            <w:r>
+              <w:rPr>
+                <w:webHidden/>
+              </w:rPr>
+              <w:fldChar w:fldCharType="begin"/>
+            </w:r>
+            <w:r>
+              <w:rPr>
+                <w:webHidden/>
+              </w:rPr>
+              <w:instrText xml:space="preserve">PAGEREF _Toc223529113 \h</w:instrText>
+            </w:r>
+            <w:r>
+              <w:rPr>
+                <w:webHidden/>
+              </w:rPr>
+              <w:fldChar w:fldCharType="separate"/>
+            </w:r>
+            <w:r>
+              <w:rPr>
+                <w:rStyle w:val="IndexLink"/>
+                <w:vanish w:val="false"/>
+              </w:rPr>
               <w:t>iv</w:t>
             </w:r>
             <w:r>
@@ -2659,7 +2672,6 @@
               <w:sz w:val="24"/>
               <w:szCs w:val="24"/>
               <w:lang w:eastAsia="en-US"/>
-              <w14:ligatures w14:val="standardContextual"/>
             </w:rPr>
           </w:pPr>
           <w:hyperlink w:anchor="_Toc223529114">
@@ -2679,35 +2691,39 @@
                 <w:sz w:val="24"/>
                 <w:szCs w:val="24"/>
                 <w:lang w:eastAsia="en-US"/>
-                <w14:ligatures w14:val="standardContextual"/>
               </w:rPr>
               <w:tab/>
             </w:r>
             <w:r>
               <w:rPr>
-                <w:webHidden/>
-              </w:rPr>
-              <w:fldChar w:fldCharType="begin"/>
-            </w:r>
-            <w:r>
-              <w:rPr>
-                <w:webHidden/>
-              </w:rPr>
-              <w:instrText xml:space="preserve">PAGEREF _Toc223529114 \h</w:instrText>
-            </w:r>
-            <w:r>
-              <w:rPr>
-                <w:webHidden/>
-              </w:rPr>
-              <w:fldChar w:fldCharType="separate"/>
-            </w:r>
-            <w:r>
-              <w:rPr>
-                <w:rStyle w:val="IndexLink"/>
-                <w:vanish w:val="false"/>
+                <w:rStyle w:val="IndexLink"/>
               </w:rPr>
               <w:t>References</w:t>
               <w:tab/>
+            </w:r>
+            <w:r>
+              <w:rPr>
+                <w:webHidden/>
+              </w:rPr>
+              <w:fldChar w:fldCharType="begin"/>
+            </w:r>
+            <w:r>
+              <w:rPr>
+                <w:webHidden/>
+              </w:rPr>
+              <w:instrText xml:space="preserve">PAGEREF _Toc223529114 \h</w:instrText>
+            </w:r>
+            <w:r>
+              <w:rPr>
+                <w:webHidden/>
+              </w:rPr>
+              <w:fldChar w:fldCharType="separate"/>
+            </w:r>
+            <w:r>
+              <w:rPr>
+                <w:rStyle w:val="IndexLink"/>
+                <w:vanish w:val="false"/>
+              </w:rPr>
               <w:t>v</w:t>
             </w:r>
             <w:r>
@@ -2732,7 +2748,6 @@
               <w:sz w:val="24"/>
               <w:szCs w:val="24"/>
               <w:lang w:eastAsia="en-US"/>
-              <w14:ligatures w14:val="standardContextual"/>
             </w:rPr>
           </w:pPr>
           <w:hyperlink w:anchor="_Toc223529115">
@@ -2752,35 +2767,39 @@
                 <w:sz w:val="24"/>
                 <w:szCs w:val="24"/>
                 <w:lang w:eastAsia="en-US"/>
-                <w14:ligatures w14:val="standardContextual"/>
               </w:rPr>
               <w:tab/>
             </w:r>
             <w:r>
               <w:rPr>
-                <w:webHidden/>
-              </w:rPr>
-              <w:fldChar w:fldCharType="begin"/>
-            </w:r>
-            <w:r>
-              <w:rPr>
-                <w:webHidden/>
-              </w:rPr>
-              <w:instrText xml:space="preserve">PAGEREF _Toc223529115 \h</w:instrText>
-            </w:r>
-            <w:r>
-              <w:rPr>
-                <w:webHidden/>
-              </w:rPr>
-              <w:fldChar w:fldCharType="separate"/>
-            </w:r>
-            <w:r>
-              <w:rPr>
-                <w:rStyle w:val="IndexLink"/>
-                <w:vanish w:val="false"/>
+                <w:rStyle w:val="IndexLink"/>
               </w:rPr>
               <w:t>Overview</w:t>
               <w:tab/>
+            </w:r>
+            <w:r>
+              <w:rPr>
+                <w:webHidden/>
+              </w:rPr>
+              <w:fldChar w:fldCharType="begin"/>
+            </w:r>
+            <w:r>
+              <w:rPr>
+                <w:webHidden/>
+              </w:rPr>
+              <w:instrText xml:space="preserve">PAGEREF _Toc223529115 \h</w:instrText>
+            </w:r>
+            <w:r>
+              <w:rPr>
+                <w:webHidden/>
+              </w:rPr>
+              <w:fldChar w:fldCharType="separate"/>
+            </w:r>
+            <w:r>
+              <w:rPr>
+                <w:rStyle w:val="IndexLink"/>
+                <w:vanish w:val="false"/>
+              </w:rPr>
               <w:t>v</w:t>
             </w:r>
             <w:r>
@@ -2806,7 +2825,6 @@
               <w:sz w:val="24"/>
               <w:szCs w:val="24"/>
               <w:lang w:eastAsia="en-US"/>
-              <w14:ligatures w14:val="standardContextual"/>
             </w:rPr>
           </w:pPr>
           <w:hyperlink w:anchor="_Toc223529116">
@@ -2828,35 +2846,39 @@
                 <w:sz w:val="24"/>
                 <w:szCs w:val="24"/>
                 <w:lang w:eastAsia="en-US"/>
-                <w14:ligatures w14:val="standardContextual"/>
               </w:rPr>
               <w:tab/>
             </w:r>
             <w:r>
               <w:rPr>
-                <w:webHidden/>
-              </w:rPr>
-              <w:fldChar w:fldCharType="begin"/>
-            </w:r>
-            <w:r>
-              <w:rPr>
-                <w:webHidden/>
-              </w:rPr>
-              <w:instrText xml:space="preserve">PAGEREF _Toc223529116 \h</w:instrText>
-            </w:r>
-            <w:r>
-              <w:rPr>
-                <w:webHidden/>
-              </w:rPr>
-              <w:fldChar w:fldCharType="separate"/>
-            </w:r>
-            <w:r>
-              <w:rPr>
-                <w:rStyle w:val="IndexLink"/>
-                <w:vanish w:val="false"/>
+                <w:rStyle w:val="IndexLink"/>
               </w:rPr>
               <w:t>Overall Description</w:t>
               <w:tab/>
+            </w:r>
+            <w:r>
+              <w:rPr>
+                <w:webHidden/>
+              </w:rPr>
+              <w:fldChar w:fldCharType="begin"/>
+            </w:r>
+            <w:r>
+              <w:rPr>
+                <w:webHidden/>
+              </w:rPr>
+              <w:instrText xml:space="preserve">PAGEREF _Toc223529116 \h</w:instrText>
+            </w:r>
+            <w:r>
+              <w:rPr>
+                <w:webHidden/>
+              </w:rPr>
+              <w:fldChar w:fldCharType="separate"/>
+            </w:r>
+            <w:r>
+              <w:rPr>
+                <w:rStyle w:val="IndexLink"/>
+                <w:vanish w:val="false"/>
+              </w:rPr>
               <w:t>vi</w:t>
             </w:r>
             <w:r>
@@ -2881,7 +2903,6 @@
               <w:sz w:val="24"/>
               <w:szCs w:val="24"/>
               <w:lang w:eastAsia="en-US"/>
-              <w14:ligatures w14:val="standardContextual"/>
             </w:rPr>
           </w:pPr>
           <w:hyperlink w:anchor="_Toc223529117">
@@ -2901,35 +2922,39 @@
                 <w:sz w:val="24"/>
                 <w:szCs w:val="24"/>
                 <w:lang w:eastAsia="en-US"/>
-                <w14:ligatures w14:val="standardContextual"/>
               </w:rPr>
               <w:tab/>
             </w:r>
             <w:r>
               <w:rPr>
-                <w:webHidden/>
-              </w:rPr>
-              <w:fldChar w:fldCharType="begin"/>
-            </w:r>
-            <w:r>
-              <w:rPr>
-                <w:webHidden/>
-              </w:rPr>
-              <w:instrText xml:space="preserve">PAGEREF _Toc223529117 \h</w:instrText>
-            </w:r>
-            <w:r>
-              <w:rPr>
-                <w:webHidden/>
-              </w:rPr>
-              <w:fldChar w:fldCharType="separate"/>
-            </w:r>
-            <w:r>
-              <w:rPr>
-                <w:rStyle w:val="IndexLink"/>
-                <w:vanish w:val="false"/>
+                <w:rStyle w:val="IndexLink"/>
               </w:rPr>
               <w:t>Product Perspective</w:t>
               <w:tab/>
+            </w:r>
+            <w:r>
+              <w:rPr>
+                <w:webHidden/>
+              </w:rPr>
+              <w:fldChar w:fldCharType="begin"/>
+            </w:r>
+            <w:r>
+              <w:rPr>
+                <w:webHidden/>
+              </w:rPr>
+              <w:instrText xml:space="preserve">PAGEREF _Toc223529117 \h</w:instrText>
+            </w:r>
+            <w:r>
+              <w:rPr>
+                <w:webHidden/>
+              </w:rPr>
+              <w:fldChar w:fldCharType="separate"/>
+            </w:r>
+            <w:r>
+              <w:rPr>
+                <w:rStyle w:val="IndexLink"/>
+                <w:vanish w:val="false"/>
+              </w:rPr>
               <w:t>vi</w:t>
             </w:r>
             <w:r>
@@ -2954,7 +2979,6 @@
               <w:sz w:val="24"/>
               <w:szCs w:val="24"/>
               <w:lang w:eastAsia="en-US"/>
-              <w14:ligatures w14:val="standardContextual"/>
             </w:rPr>
           </w:pPr>
           <w:hyperlink w:anchor="_Toc223529118">
@@ -2974,35 +2998,39 @@
                 <w:sz w:val="24"/>
                 <w:szCs w:val="24"/>
                 <w:lang w:eastAsia="en-US"/>
-                <w14:ligatures w14:val="standardContextual"/>
               </w:rPr>
               <w:tab/>
             </w:r>
             <w:r>
               <w:rPr>
-                <w:webHidden/>
-              </w:rPr>
-              <w:fldChar w:fldCharType="begin"/>
-            </w:r>
-            <w:r>
-              <w:rPr>
-                <w:webHidden/>
-              </w:rPr>
-              <w:instrText xml:space="preserve">PAGEREF _Toc223529118 \h</w:instrText>
-            </w:r>
-            <w:r>
-              <w:rPr>
-                <w:webHidden/>
-              </w:rPr>
-              <w:fldChar w:fldCharType="separate"/>
-            </w:r>
-            <w:r>
-              <w:rPr>
-                <w:rStyle w:val="IndexLink"/>
-                <w:vanish w:val="false"/>
+                <w:rStyle w:val="IndexLink"/>
               </w:rPr>
               <w:t>Product Architecture</w:t>
               <w:tab/>
+            </w:r>
+            <w:r>
+              <w:rPr>
+                <w:webHidden/>
+              </w:rPr>
+              <w:fldChar w:fldCharType="begin"/>
+            </w:r>
+            <w:r>
+              <w:rPr>
+                <w:webHidden/>
+              </w:rPr>
+              <w:instrText xml:space="preserve">PAGEREF _Toc223529118 \h</w:instrText>
+            </w:r>
+            <w:r>
+              <w:rPr>
+                <w:webHidden/>
+              </w:rPr>
+              <w:fldChar w:fldCharType="separate"/>
+            </w:r>
+            <w:r>
+              <w:rPr>
+                <w:rStyle w:val="IndexLink"/>
+                <w:vanish w:val="false"/>
+              </w:rPr>
               <w:t>vi</w:t>
             </w:r>
             <w:r>
@@ -3027,7 +3055,6 @@
               <w:sz w:val="24"/>
               <w:szCs w:val="24"/>
               <w:lang w:eastAsia="en-US"/>
-              <w14:ligatures w14:val="standardContextual"/>
             </w:rPr>
           </w:pPr>
           <w:hyperlink w:anchor="_Toc223529119">
@@ -3047,35 +3074,39 @@
                 <w:sz w:val="24"/>
                 <w:szCs w:val="24"/>
                 <w:lang w:eastAsia="en-US"/>
-                <w14:ligatures w14:val="standardContextual"/>
               </w:rPr>
               <w:tab/>
             </w:r>
             <w:r>
               <w:rPr>
-                <w:webHidden/>
-              </w:rPr>
-              <w:fldChar w:fldCharType="begin"/>
-            </w:r>
-            <w:r>
-              <w:rPr>
-                <w:webHidden/>
-              </w:rPr>
-              <w:instrText xml:space="preserve">PAGEREF _Toc223529119 \h</w:instrText>
-            </w:r>
-            <w:r>
-              <w:rPr>
-                <w:webHidden/>
-              </w:rPr>
-              <w:fldChar w:fldCharType="separate"/>
-            </w:r>
-            <w:r>
-              <w:rPr>
-                <w:rStyle w:val="IndexLink"/>
-                <w:vanish w:val="false"/>
+                <w:rStyle w:val="IndexLink"/>
               </w:rPr>
               <w:t>Product Functionality/Features</w:t>
               <w:tab/>
+            </w:r>
+            <w:r>
+              <w:rPr>
+                <w:webHidden/>
+              </w:rPr>
+              <w:fldChar w:fldCharType="begin"/>
+            </w:r>
+            <w:r>
+              <w:rPr>
+                <w:webHidden/>
+              </w:rPr>
+              <w:instrText xml:space="preserve">PAGEREF _Toc223529119 \h</w:instrText>
+            </w:r>
+            <w:r>
+              <w:rPr>
+                <w:webHidden/>
+              </w:rPr>
+              <w:fldChar w:fldCharType="separate"/>
+            </w:r>
+            <w:r>
+              <w:rPr>
+                <w:rStyle w:val="IndexLink"/>
+                <w:vanish w:val="false"/>
+              </w:rPr>
               <w:t>vi</w:t>
             </w:r>
             <w:r>
@@ -3100,7 +3131,6 @@
               <w:sz w:val="24"/>
               <w:szCs w:val="24"/>
               <w:lang w:eastAsia="en-US"/>
-              <w14:ligatures w14:val="standardContextual"/>
             </w:rPr>
           </w:pPr>
           <w:hyperlink w:anchor="_Toc223529120">
@@ -3120,35 +3150,39 @@
                 <w:sz w:val="24"/>
                 <w:szCs w:val="24"/>
                 <w:lang w:eastAsia="en-US"/>
-                <w14:ligatures w14:val="standardContextual"/>
               </w:rPr>
               <w:tab/>
             </w:r>
             <w:r>
               <w:rPr>
-                <w:webHidden/>
-              </w:rPr>
-              <w:fldChar w:fldCharType="begin"/>
-            </w:r>
-            <w:r>
-              <w:rPr>
-                <w:webHidden/>
-              </w:rPr>
-              <w:instrText xml:space="preserve">PAGEREF _Toc223529120 \h</w:instrText>
-            </w:r>
-            <w:r>
-              <w:rPr>
-                <w:webHidden/>
-              </w:rPr>
-              <w:fldChar w:fldCharType="separate"/>
-            </w:r>
-            <w:r>
-              <w:rPr>
-                <w:rStyle w:val="IndexLink"/>
-                <w:vanish w:val="false"/>
+                <w:rStyle w:val="IndexLink"/>
               </w:rPr>
               <w:t>Constraints</w:t>
               <w:tab/>
+            </w:r>
+            <w:r>
+              <w:rPr>
+                <w:webHidden/>
+              </w:rPr>
+              <w:fldChar w:fldCharType="begin"/>
+            </w:r>
+            <w:r>
+              <w:rPr>
+                <w:webHidden/>
+              </w:rPr>
+              <w:instrText xml:space="preserve">PAGEREF _Toc223529120 \h</w:instrText>
+            </w:r>
+            <w:r>
+              <w:rPr>
+                <w:webHidden/>
+              </w:rPr>
+              <w:fldChar w:fldCharType="separate"/>
+            </w:r>
+            <w:r>
+              <w:rPr>
+                <w:rStyle w:val="IndexLink"/>
+                <w:vanish w:val="false"/>
+              </w:rPr>
               <w:t>vi</w:t>
             </w:r>
             <w:r>
@@ -3173,7 +3207,6 @@
               <w:sz w:val="24"/>
               <w:szCs w:val="24"/>
               <w:lang w:eastAsia="en-US"/>
-              <w14:ligatures w14:val="standardContextual"/>
             </w:rPr>
           </w:pPr>
           <w:hyperlink w:anchor="_Toc223529121">
@@ -3193,35 +3226,39 @@
                 <w:sz w:val="24"/>
                 <w:szCs w:val="24"/>
                 <w:lang w:eastAsia="en-US"/>
-                <w14:ligatures w14:val="standardContextual"/>
               </w:rPr>
               <w:tab/>
             </w:r>
             <w:r>
               <w:rPr>
-                <w:webHidden/>
-              </w:rPr>
-              <w:fldChar w:fldCharType="begin"/>
-            </w:r>
-            <w:r>
-              <w:rPr>
-                <w:webHidden/>
-              </w:rPr>
-              <w:instrText xml:space="preserve">PAGEREF _Toc223529121 \h</w:instrText>
-            </w:r>
-            <w:r>
-              <w:rPr>
-                <w:webHidden/>
-              </w:rPr>
-              <w:fldChar w:fldCharType="separate"/>
-            </w:r>
-            <w:r>
-              <w:rPr>
-                <w:rStyle w:val="IndexLink"/>
-                <w:vanish w:val="false"/>
+                <w:rStyle w:val="IndexLink"/>
               </w:rPr>
               <w:t>Assumptions and Dependencies</w:t>
               <w:tab/>
+            </w:r>
+            <w:r>
+              <w:rPr>
+                <w:webHidden/>
+              </w:rPr>
+              <w:fldChar w:fldCharType="begin"/>
+            </w:r>
+            <w:r>
+              <w:rPr>
+                <w:webHidden/>
+              </w:rPr>
+              <w:instrText xml:space="preserve">PAGEREF _Toc223529121 \h</w:instrText>
+            </w:r>
+            <w:r>
+              <w:rPr>
+                <w:webHidden/>
+              </w:rPr>
+              <w:fldChar w:fldCharType="separate"/>
+            </w:r>
+            <w:r>
+              <w:rPr>
+                <w:rStyle w:val="IndexLink"/>
+                <w:vanish w:val="false"/>
+              </w:rPr>
               <w:t>vi</w:t>
             </w:r>
             <w:r>
@@ -3247,7 +3284,6 @@
               <w:sz w:val="24"/>
               <w:szCs w:val="24"/>
               <w:lang w:eastAsia="en-US"/>
-              <w14:ligatures w14:val="standardContextual"/>
             </w:rPr>
           </w:pPr>
           <w:hyperlink w:anchor="_Toc223529122">
@@ -3269,35 +3305,39 @@
                 <w:sz w:val="24"/>
                 <w:szCs w:val="24"/>
                 <w:lang w:eastAsia="en-US"/>
-                <w14:ligatures w14:val="standardContextual"/>
               </w:rPr>
               <w:tab/>
             </w:r>
             <w:r>
               <w:rPr>
-                <w:webHidden/>
-              </w:rPr>
-              <w:fldChar w:fldCharType="begin"/>
-            </w:r>
-            <w:r>
-              <w:rPr>
-                <w:webHidden/>
-              </w:rPr>
-              <w:instrText xml:space="preserve">PAGEREF _Toc223529122 \h</w:instrText>
-            </w:r>
-            <w:r>
-              <w:rPr>
-                <w:webHidden/>
-              </w:rPr>
-              <w:fldChar w:fldCharType="separate"/>
-            </w:r>
-            <w:r>
-              <w:rPr>
-                <w:rStyle w:val="IndexLink"/>
-                <w:vanish w:val="false"/>
+                <w:rStyle w:val="IndexLink"/>
               </w:rPr>
               <w:t>Specific Requirements</w:t>
               <w:tab/>
+            </w:r>
+            <w:r>
+              <w:rPr>
+                <w:webHidden/>
+              </w:rPr>
+              <w:fldChar w:fldCharType="begin"/>
+            </w:r>
+            <w:r>
+              <w:rPr>
+                <w:webHidden/>
+              </w:rPr>
+              <w:instrText xml:space="preserve">PAGEREF _Toc223529122 \h</w:instrText>
+            </w:r>
+            <w:r>
+              <w:rPr>
+                <w:webHidden/>
+              </w:rPr>
+              <w:fldChar w:fldCharType="separate"/>
+            </w:r>
+            <w:r>
+              <w:rPr>
+                <w:rStyle w:val="IndexLink"/>
+                <w:vanish w:val="false"/>
+              </w:rPr>
               <w:t>viii</w:t>
             </w:r>
             <w:r>
@@ -3322,7 +3362,6 @@
               <w:sz w:val="24"/>
               <w:szCs w:val="24"/>
               <w:lang w:eastAsia="en-US"/>
-              <w14:ligatures w14:val="standardContextual"/>
             </w:rPr>
           </w:pPr>
           <w:hyperlink w:anchor="_Toc223529123">
@@ -3342,35 +3381,39 @@
                 <w:sz w:val="24"/>
                 <w:szCs w:val="24"/>
                 <w:lang w:eastAsia="en-US"/>
-                <w14:ligatures w14:val="standardContextual"/>
               </w:rPr>
               <w:tab/>
             </w:r>
             <w:r>
               <w:rPr>
-                <w:webHidden/>
-              </w:rPr>
-              <w:fldChar w:fldCharType="begin"/>
-            </w:r>
-            <w:r>
-              <w:rPr>
-                <w:webHidden/>
-              </w:rPr>
-              <w:instrText xml:space="preserve">PAGEREF _Toc223529123 \h</w:instrText>
-            </w:r>
-            <w:r>
-              <w:rPr>
-                <w:webHidden/>
-              </w:rPr>
-              <w:fldChar w:fldCharType="separate"/>
-            </w:r>
-            <w:r>
-              <w:rPr>
-                <w:rStyle w:val="IndexLink"/>
-                <w:vanish w:val="false"/>
+                <w:rStyle w:val="IndexLink"/>
               </w:rPr>
               <w:t>Functional Requirements</w:t>
               <w:tab/>
+            </w:r>
+            <w:r>
+              <w:rPr>
+                <w:webHidden/>
+              </w:rPr>
+              <w:fldChar w:fldCharType="begin"/>
+            </w:r>
+            <w:r>
+              <w:rPr>
+                <w:webHidden/>
+              </w:rPr>
+              <w:instrText xml:space="preserve">PAGEREF _Toc223529123 \h</w:instrText>
+            </w:r>
+            <w:r>
+              <w:rPr>
+                <w:webHidden/>
+              </w:rPr>
+              <w:fldChar w:fldCharType="separate"/>
+            </w:r>
+            <w:r>
+              <w:rPr>
+                <w:rStyle w:val="IndexLink"/>
+                <w:vanish w:val="false"/>
+              </w:rPr>
               <w:t>viii</w:t>
             </w:r>
             <w:r>
@@ -3394,7 +3437,6 @@
               <w:sz w:val="24"/>
               <w:szCs w:val="24"/>
               <w:lang w:eastAsia="en-US"/>
-              <w14:ligatures w14:val="standardContextual"/>
             </w:rPr>
           </w:pPr>
           <w:hyperlink w:anchor="_Toc223529124">
@@ -3413,35 +3455,39 @@
                 <w:sz w:val="24"/>
                 <w:szCs w:val="24"/>
                 <w:lang w:eastAsia="en-US"/>
-                <w14:ligatures w14:val="standardContextual"/>
               </w:rPr>
               <w:tab/>
             </w:r>
             <w:r>
               <w:rPr>
-                <w:webHidden/>
-              </w:rPr>
-              <w:fldChar w:fldCharType="begin"/>
-            </w:r>
-            <w:r>
-              <w:rPr>
-                <w:webHidden/>
-              </w:rPr>
-              <w:instrText xml:space="preserve">PAGEREF _Toc223529124 \h</w:instrText>
-            </w:r>
-            <w:r>
-              <w:rPr>
-                <w:webHidden/>
-              </w:rPr>
-              <w:fldChar w:fldCharType="separate"/>
-            </w:r>
-            <w:r>
-              <w:rPr>
-                <w:rStyle w:val="IndexLink"/>
-                <w:vanish w:val="false"/>
+                <w:rStyle w:val="IndexLink"/>
               </w:rPr>
               <w:t>Common Requirements:</w:t>
               <w:tab/>
+            </w:r>
+            <w:r>
+              <w:rPr>
+                <w:webHidden/>
+              </w:rPr>
+              <w:fldChar w:fldCharType="begin"/>
+            </w:r>
+            <w:r>
+              <w:rPr>
+                <w:webHidden/>
+              </w:rPr>
+              <w:instrText xml:space="preserve">PAGEREF _Toc223529124 \h</w:instrText>
+            </w:r>
+            <w:r>
+              <w:rPr>
+                <w:webHidden/>
+              </w:rPr>
+              <w:fldChar w:fldCharType="separate"/>
+            </w:r>
+            <w:r>
+              <w:rPr>
+                <w:rStyle w:val="IndexLink"/>
+                <w:vanish w:val="false"/>
+              </w:rPr>
               <w:t>viii</w:t>
             </w:r>
             <w:r>
@@ -3465,7 +3511,6 @@
               <w:sz w:val="24"/>
               <w:szCs w:val="24"/>
               <w:lang w:eastAsia="en-US"/>
-              <w14:ligatures w14:val="standardContextual"/>
             </w:rPr>
           </w:pPr>
           <w:hyperlink w:anchor="_Toc223529125">
@@ -3484,35 +3529,39 @@
                 <w:sz w:val="24"/>
                 <w:szCs w:val="24"/>
                 <w:lang w:eastAsia="en-US"/>
-                <w14:ligatures w14:val="standardContextual"/>
               </w:rPr>
               <w:tab/>
             </w:r>
             <w:r>
               <w:rPr>
-                <w:webHidden/>
-              </w:rPr>
-              <w:fldChar w:fldCharType="begin"/>
-            </w:r>
-            <w:r>
-              <w:rPr>
-                <w:webHidden/>
-              </w:rPr>
-              <w:instrText xml:space="preserve">PAGEREF _Toc223529125 \h</w:instrText>
-            </w:r>
-            <w:r>
-              <w:rPr>
-                <w:webHidden/>
-              </w:rPr>
-              <w:fldChar w:fldCharType="separate"/>
-            </w:r>
-            <w:r>
-              <w:rPr>
-                <w:rStyle w:val="IndexLink"/>
-                <w:vanish w:val="false"/>
+                <w:rStyle w:val="IndexLink"/>
               </w:rPr>
               <w:t>Users Module Requirements:</w:t>
               <w:tab/>
+            </w:r>
+            <w:r>
+              <w:rPr>
+                <w:webHidden/>
+              </w:rPr>
+              <w:fldChar w:fldCharType="begin"/>
+            </w:r>
+            <w:r>
+              <w:rPr>
+                <w:webHidden/>
+              </w:rPr>
+              <w:instrText xml:space="preserve">PAGEREF _Toc223529125 \h</w:instrText>
+            </w:r>
+            <w:r>
+              <w:rPr>
+                <w:webHidden/>
+              </w:rPr>
+              <w:fldChar w:fldCharType="separate"/>
+            </w:r>
+            <w:r>
+              <w:rPr>
+                <w:rStyle w:val="IndexLink"/>
+                <w:vanish w:val="false"/>
+              </w:rPr>
               <w:t>viii</w:t>
             </w:r>
             <w:r>
@@ -3536,7 +3585,6 @@
               <w:sz w:val="24"/>
               <w:szCs w:val="24"/>
               <w:lang w:eastAsia="en-US"/>
-              <w14:ligatures w14:val="standardContextual"/>
             </w:rPr>
           </w:pPr>
           <w:hyperlink w:anchor="_Toc223529126">
@@ -3555,35 +3603,39 @@
                 <w:sz w:val="24"/>
                 <w:szCs w:val="24"/>
                 <w:lang w:eastAsia="en-US"/>
-                <w14:ligatures w14:val="standardContextual"/>
               </w:rPr>
               <w:tab/>
             </w:r>
             <w:r>
               <w:rPr>
-                <w:webHidden/>
-              </w:rPr>
-              <w:fldChar w:fldCharType="begin"/>
-            </w:r>
-            <w:r>
-              <w:rPr>
-                <w:webHidden/>
-              </w:rPr>
-              <w:instrText xml:space="preserve">PAGEREF _Toc223529126 \h</w:instrText>
-            </w:r>
-            <w:r>
-              <w:rPr>
-                <w:webHidden/>
-              </w:rPr>
-              <w:fldChar w:fldCharType="separate"/>
-            </w:r>
-            <w:r>
-              <w:rPr>
-                <w:rStyle w:val="IndexLink"/>
-                <w:vanish w:val="false"/>
+                <w:rStyle w:val="IndexLink"/>
               </w:rPr>
               <w:t>Datastore Module Requirements:</w:t>
               <w:tab/>
+            </w:r>
+            <w:r>
+              <w:rPr>
+                <w:webHidden/>
+              </w:rPr>
+              <w:fldChar w:fldCharType="begin"/>
+            </w:r>
+            <w:r>
+              <w:rPr>
+                <w:webHidden/>
+              </w:rPr>
+              <w:instrText xml:space="preserve">PAGEREF _Toc223529126 \h</w:instrText>
+            </w:r>
+            <w:r>
+              <w:rPr>
+                <w:webHidden/>
+              </w:rPr>
+              <w:fldChar w:fldCharType="separate"/>
+            </w:r>
+            <w:r>
+              <w:rPr>
+                <w:rStyle w:val="IndexLink"/>
+                <w:vanish w:val="false"/>
+              </w:rPr>
               <w:t>viii</w:t>
             </w:r>
             <w:r>
@@ -3607,7 +3659,6 @@
               <w:sz w:val="24"/>
               <w:szCs w:val="24"/>
               <w:lang w:eastAsia="en-US"/>
-              <w14:ligatures w14:val="standardContextual"/>
             </w:rPr>
           </w:pPr>
           <w:hyperlink w:anchor="_Toc223529127">
@@ -3626,35 +3677,39 @@
                 <w:sz w:val="24"/>
                 <w:szCs w:val="24"/>
                 <w:lang w:eastAsia="en-US"/>
-                <w14:ligatures w14:val="standardContextual"/>
               </w:rPr>
               <w:tab/>
             </w:r>
             <w:r>
               <w:rPr>
-                <w:webHidden/>
-              </w:rPr>
-              <w:fldChar w:fldCharType="begin"/>
-            </w:r>
-            <w:r>
-              <w:rPr>
-                <w:webHidden/>
-              </w:rPr>
-              <w:instrText xml:space="preserve">PAGEREF _Toc223529127 \h</w:instrText>
-            </w:r>
-            <w:r>
-              <w:rPr>
-                <w:webHidden/>
-              </w:rPr>
-              <w:fldChar w:fldCharType="separate"/>
-            </w:r>
-            <w:r>
-              <w:rPr>
-                <w:rStyle w:val="IndexLink"/>
-                <w:vanish w:val="false"/>
+                <w:rStyle w:val="IndexLink"/>
               </w:rPr>
               <w:t>Network Module Requirements:</w:t>
               <w:tab/>
+            </w:r>
+            <w:r>
+              <w:rPr>
+                <w:webHidden/>
+              </w:rPr>
+              <w:fldChar w:fldCharType="begin"/>
+            </w:r>
+            <w:r>
+              <w:rPr>
+                <w:webHidden/>
+              </w:rPr>
+              <w:instrText xml:space="preserve">PAGEREF _Toc223529127 \h</w:instrText>
+            </w:r>
+            <w:r>
+              <w:rPr>
+                <w:webHidden/>
+              </w:rPr>
+              <w:fldChar w:fldCharType="separate"/>
+            </w:r>
+            <w:r>
+              <w:rPr>
+                <w:rStyle w:val="IndexLink"/>
+                <w:vanish w:val="false"/>
+              </w:rPr>
               <w:t>viii</w:t>
             </w:r>
             <w:r>
@@ -3678,7 +3733,6 @@
               <w:sz w:val="24"/>
               <w:szCs w:val="24"/>
               <w:lang w:eastAsia="en-US"/>
-              <w14:ligatures w14:val="standardContextual"/>
             </w:rPr>
           </w:pPr>
           <w:hyperlink w:anchor="_Toc223529128">
@@ -3697,35 +3751,39 @@
                 <w:sz w:val="24"/>
                 <w:szCs w:val="24"/>
                 <w:lang w:eastAsia="en-US"/>
-                <w14:ligatures w14:val="standardContextual"/>
               </w:rPr>
               <w:tab/>
             </w:r>
             <w:r>
               <w:rPr>
-                <w:webHidden/>
-              </w:rPr>
-              <w:fldChar w:fldCharType="begin"/>
-            </w:r>
-            <w:r>
-              <w:rPr>
-                <w:webHidden/>
-              </w:rPr>
-              <w:instrText xml:space="preserve">PAGEREF _Toc223529128 \h</w:instrText>
-            </w:r>
-            <w:r>
-              <w:rPr>
-                <w:webHidden/>
-              </w:rPr>
-              <w:fldChar w:fldCharType="separate"/>
-            </w:r>
-            <w:r>
-              <w:rPr>
-                <w:rStyle w:val="IndexLink"/>
-                <w:vanish w:val="false"/>
+                <w:rStyle w:val="IndexLink"/>
               </w:rPr>
               <w:t>GUI Module Requirements:</w:t>
               <w:tab/>
+            </w:r>
+            <w:r>
+              <w:rPr>
+                <w:webHidden/>
+              </w:rPr>
+              <w:fldChar w:fldCharType="begin"/>
+            </w:r>
+            <w:r>
+              <w:rPr>
+                <w:webHidden/>
+              </w:rPr>
+              <w:instrText xml:space="preserve">PAGEREF _Toc223529128 \h</w:instrText>
+            </w:r>
+            <w:r>
+              <w:rPr>
+                <w:webHidden/>
+              </w:rPr>
+              <w:fldChar w:fldCharType="separate"/>
+            </w:r>
+            <w:r>
+              <w:rPr>
+                <w:rStyle w:val="IndexLink"/>
+                <w:vanish w:val="false"/>
+              </w:rPr>
               <w:t>viii</w:t>
             </w:r>
             <w:r>
@@ -3749,7 +3807,6 @@
               <w:sz w:val="24"/>
               <w:szCs w:val="24"/>
               <w:lang w:eastAsia="en-US"/>
-              <w14:ligatures w14:val="standardContextual"/>
             </w:rPr>
           </w:pPr>
           <w:hyperlink w:anchor="_Toc223529129">
@@ -3768,35 +3825,39 @@
                 <w:sz w:val="24"/>
                 <w:szCs w:val="24"/>
                 <w:lang w:eastAsia="en-US"/>
-                <w14:ligatures w14:val="standardContextual"/>
               </w:rPr>
               <w:tab/>
             </w:r>
             <w:r>
               <w:rPr>
-                <w:webHidden/>
-              </w:rPr>
-              <w:fldChar w:fldCharType="begin"/>
-            </w:r>
-            <w:r>
-              <w:rPr>
-                <w:webHidden/>
-              </w:rPr>
-              <w:instrText xml:space="preserve">PAGEREF _Toc223529129 \h</w:instrText>
-            </w:r>
-            <w:r>
-              <w:rPr>
-                <w:webHidden/>
-              </w:rPr>
-              <w:fldChar w:fldCharType="separate"/>
-            </w:r>
-            <w:r>
-              <w:rPr>
-                <w:rStyle w:val="IndexLink"/>
-                <w:vanish w:val="false"/>
+                <w:rStyle w:val="IndexLink"/>
               </w:rPr>
               <w:t>Lobby Module Requirements:</w:t>
               <w:tab/>
+            </w:r>
+            <w:r>
+              <w:rPr>
+                <w:webHidden/>
+              </w:rPr>
+              <w:fldChar w:fldCharType="begin"/>
+            </w:r>
+            <w:r>
+              <w:rPr>
+                <w:webHidden/>
+              </w:rPr>
+              <w:instrText xml:space="preserve">PAGEREF _Toc223529129 \h</w:instrText>
+            </w:r>
+            <w:r>
+              <w:rPr>
+                <w:webHidden/>
+              </w:rPr>
+              <w:fldChar w:fldCharType="separate"/>
+            </w:r>
+            <w:r>
+              <w:rPr>
+                <w:rStyle w:val="IndexLink"/>
+                <w:vanish w:val="false"/>
+              </w:rPr>
               <w:t>viii</w:t>
             </w:r>
             <w:r>
@@ -3820,7 +3881,6 @@
               <w:sz w:val="24"/>
               <w:szCs w:val="24"/>
               <w:lang w:eastAsia="en-US"/>
-              <w14:ligatures w14:val="standardContextual"/>
             </w:rPr>
           </w:pPr>
           <w:hyperlink w:anchor="_Toc223529130">
@@ -3839,35 +3899,39 @@
                 <w:sz w:val="24"/>
                 <w:szCs w:val="24"/>
                 <w:lang w:eastAsia="en-US"/>
-                <w14:ligatures w14:val="standardContextual"/>
               </w:rPr>
               <w:tab/>
             </w:r>
             <w:r>
               <w:rPr>
-                <w:webHidden/>
-              </w:rPr>
-              <w:fldChar w:fldCharType="begin"/>
-            </w:r>
-            <w:r>
-              <w:rPr>
-                <w:webHidden/>
-              </w:rPr>
-              <w:instrText xml:space="preserve">PAGEREF _Toc223529130 \h</w:instrText>
-            </w:r>
-            <w:r>
-              <w:rPr>
-                <w:webHidden/>
-              </w:rPr>
-              <w:fldChar w:fldCharType="separate"/>
-            </w:r>
-            <w:r>
-              <w:rPr>
-                <w:rStyle w:val="IndexLink"/>
-                <w:vanish w:val="false"/>
+                <w:rStyle w:val="IndexLink"/>
               </w:rPr>
               <w:t>Table Module Requirements:</w:t>
               <w:tab/>
+            </w:r>
+            <w:r>
+              <w:rPr>
+                <w:webHidden/>
+              </w:rPr>
+              <w:fldChar w:fldCharType="begin"/>
+            </w:r>
+            <w:r>
+              <w:rPr>
+                <w:webHidden/>
+              </w:rPr>
+              <w:instrText xml:space="preserve">PAGEREF _Toc223529130 \h</w:instrText>
+            </w:r>
+            <w:r>
+              <w:rPr>
+                <w:webHidden/>
+              </w:rPr>
+              <w:fldChar w:fldCharType="separate"/>
+            </w:r>
+            <w:r>
+              <w:rPr>
+                <w:rStyle w:val="IndexLink"/>
+                <w:vanish w:val="false"/>
+              </w:rPr>
               <w:t>viii</w:t>
             </w:r>
             <w:r>
@@ -3891,7 +3955,6 @@
               <w:sz w:val="24"/>
               <w:szCs w:val="24"/>
               <w:lang w:eastAsia="en-US"/>
-              <w14:ligatures w14:val="standardContextual"/>
             </w:rPr>
           </w:pPr>
           <w:hyperlink w:anchor="_Toc223529131">
@@ -3910,35 +3973,39 @@
                 <w:sz w:val="24"/>
                 <w:szCs w:val="24"/>
                 <w:lang w:eastAsia="en-US"/>
-                <w14:ligatures w14:val="standardContextual"/>
               </w:rPr>
               <w:tab/>
             </w:r>
             <w:r>
               <w:rPr>
-                <w:webHidden/>
-              </w:rPr>
-              <w:fldChar w:fldCharType="begin"/>
-            </w:r>
-            <w:r>
-              <w:rPr>
-                <w:webHidden/>
-              </w:rPr>
-              <w:instrText xml:space="preserve">PAGEREF _Toc223529131 \h</w:instrText>
-            </w:r>
-            <w:r>
-              <w:rPr>
-                <w:webHidden/>
-              </w:rPr>
-              <w:fldChar w:fldCharType="separate"/>
-            </w:r>
-            <w:r>
-              <w:rPr>
-                <w:rStyle w:val="IndexLink"/>
-                <w:vanish w:val="false"/>
+                <w:rStyle w:val="IndexLink"/>
               </w:rPr>
               <w:t>Game Module Requirements:</w:t>
               <w:tab/>
+            </w:r>
+            <w:r>
+              <w:rPr>
+                <w:webHidden/>
+              </w:rPr>
+              <w:fldChar w:fldCharType="begin"/>
+            </w:r>
+            <w:r>
+              <w:rPr>
+                <w:webHidden/>
+              </w:rPr>
+              <w:instrText xml:space="preserve">PAGEREF _Toc223529131 \h</w:instrText>
+            </w:r>
+            <w:r>
+              <w:rPr>
+                <w:webHidden/>
+              </w:rPr>
+              <w:fldChar w:fldCharType="separate"/>
+            </w:r>
+            <w:r>
+              <w:rPr>
+                <w:rStyle w:val="IndexLink"/>
+                <w:vanish w:val="false"/>
+              </w:rPr>
               <w:t>viii</w:t>
             </w:r>
             <w:r>
@@ -3963,7 +4030,6 @@
               <w:sz w:val="24"/>
               <w:szCs w:val="24"/>
               <w:lang w:eastAsia="en-US"/>
-              <w14:ligatures w14:val="standardContextual"/>
             </w:rPr>
           </w:pPr>
           <w:hyperlink w:anchor="_Toc223529132">
@@ -3983,35 +4049,39 @@
                 <w:sz w:val="24"/>
                 <w:szCs w:val="24"/>
                 <w:lang w:eastAsia="en-US"/>
-                <w14:ligatures w14:val="standardContextual"/>
               </w:rPr>
               <w:tab/>
             </w:r>
             <w:r>
               <w:rPr>
-                <w:webHidden/>
-              </w:rPr>
-              <w:fldChar w:fldCharType="begin"/>
-            </w:r>
-            <w:r>
-              <w:rPr>
-                <w:webHidden/>
-              </w:rPr>
-              <w:instrText xml:space="preserve">PAGEREF _Toc223529132 \h</w:instrText>
-            </w:r>
-            <w:r>
-              <w:rPr>
-                <w:webHidden/>
-              </w:rPr>
-              <w:fldChar w:fldCharType="separate"/>
-            </w:r>
-            <w:r>
-              <w:rPr>
-                <w:rStyle w:val="IndexLink"/>
-                <w:vanish w:val="false"/>
+                <w:rStyle w:val="IndexLink"/>
               </w:rPr>
               <w:t>External Interface Requirements</w:t>
               <w:tab/>
+            </w:r>
+            <w:r>
+              <w:rPr>
+                <w:webHidden/>
+              </w:rPr>
+              <w:fldChar w:fldCharType="begin"/>
+            </w:r>
+            <w:r>
+              <w:rPr>
+                <w:webHidden/>
+              </w:rPr>
+              <w:instrText xml:space="preserve">PAGEREF _Toc223529132 \h</w:instrText>
+            </w:r>
+            <w:r>
+              <w:rPr>
+                <w:webHidden/>
+              </w:rPr>
+              <w:fldChar w:fldCharType="separate"/>
+            </w:r>
+            <w:r>
+              <w:rPr>
+                <w:rStyle w:val="IndexLink"/>
+                <w:vanish w:val="false"/>
+              </w:rPr>
               <w:t>ix</w:t>
             </w:r>
             <w:r>
@@ -4036,7 +4106,6 @@
               <w:sz w:val="24"/>
               <w:szCs w:val="24"/>
               <w:lang w:eastAsia="en-US"/>
-              <w14:ligatures w14:val="standardContextual"/>
             </w:rPr>
           </w:pPr>
           <w:hyperlink w:anchor="_Toc223529133">
@@ -4056,35 +4125,39 @@
                 <w:sz w:val="24"/>
                 <w:szCs w:val="24"/>
                 <w:lang w:eastAsia="en-US"/>
-                <w14:ligatures w14:val="standardContextual"/>
               </w:rPr>
               <w:tab/>
             </w:r>
             <w:r>
               <w:rPr>
-                <w:webHidden/>
-              </w:rPr>
-              <w:fldChar w:fldCharType="begin"/>
-            </w:r>
-            <w:r>
-              <w:rPr>
-                <w:webHidden/>
-              </w:rPr>
-              <w:instrText xml:space="preserve">PAGEREF _Toc223529133 \h</w:instrText>
-            </w:r>
-            <w:r>
-              <w:rPr>
-                <w:webHidden/>
-              </w:rPr>
-              <w:fldChar w:fldCharType="separate"/>
-            </w:r>
-            <w:r>
-              <w:rPr>
-                <w:rStyle w:val="IndexLink"/>
-                <w:vanish w:val="false"/>
+                <w:rStyle w:val="IndexLink"/>
               </w:rPr>
               <w:t>Internal Interface Requirements</w:t>
               <w:tab/>
+            </w:r>
+            <w:r>
+              <w:rPr>
+                <w:webHidden/>
+              </w:rPr>
+              <w:fldChar w:fldCharType="begin"/>
+            </w:r>
+            <w:r>
+              <w:rPr>
+                <w:webHidden/>
+              </w:rPr>
+              <w:instrText xml:space="preserve">PAGEREF _Toc223529133 \h</w:instrText>
+            </w:r>
+            <w:r>
+              <w:rPr>
+                <w:webHidden/>
+              </w:rPr>
+              <w:fldChar w:fldCharType="separate"/>
+            </w:r>
+            <w:r>
+              <w:rPr>
+                <w:rStyle w:val="IndexLink"/>
+                <w:vanish w:val="false"/>
+              </w:rPr>
               <w:t>ix</w:t>
             </w:r>
             <w:r>
@@ -4110,7 +4183,6 @@
               <w:sz w:val="24"/>
               <w:szCs w:val="24"/>
               <w:lang w:eastAsia="en-US"/>
-              <w14:ligatures w14:val="standardContextual"/>
             </w:rPr>
           </w:pPr>
           <w:hyperlink w:anchor="_Toc223529134">
@@ -4132,35 +4204,39 @@
                 <w:sz w:val="24"/>
                 <w:szCs w:val="24"/>
                 <w:lang w:eastAsia="en-US"/>
-                <w14:ligatures w14:val="standardContextual"/>
               </w:rPr>
               <w:tab/>
             </w:r>
             <w:r>
               <w:rPr>
-                <w:webHidden/>
-              </w:rPr>
-              <w:fldChar w:fldCharType="begin"/>
-            </w:r>
-            <w:r>
-              <w:rPr>
-                <w:webHidden/>
-              </w:rPr>
-              <w:instrText xml:space="preserve">PAGEREF _Toc223529134 \h</w:instrText>
-            </w:r>
-            <w:r>
-              <w:rPr>
-                <w:webHidden/>
-              </w:rPr>
-              <w:fldChar w:fldCharType="separate"/>
-            </w:r>
-            <w:r>
-              <w:rPr>
-                <w:rStyle w:val="IndexLink"/>
-                <w:vanish w:val="false"/>
+                <w:rStyle w:val="IndexLink"/>
               </w:rPr>
               <w:t>Non-Functional Requirements</w:t>
               <w:tab/>
+            </w:r>
+            <w:r>
+              <w:rPr>
+                <w:webHidden/>
+              </w:rPr>
+              <w:fldChar w:fldCharType="begin"/>
+            </w:r>
+            <w:r>
+              <w:rPr>
+                <w:webHidden/>
+              </w:rPr>
+              <w:instrText xml:space="preserve">PAGEREF _Toc223529134 \h</w:instrText>
+            </w:r>
+            <w:r>
+              <w:rPr>
+                <w:webHidden/>
+              </w:rPr>
+              <w:fldChar w:fldCharType="separate"/>
+            </w:r>
+            <w:r>
+              <w:rPr>
+                <w:rStyle w:val="IndexLink"/>
+                <w:vanish w:val="false"/>
+              </w:rPr>
               <w:t>x</w:t>
             </w:r>
             <w:r>
@@ -4185,7 +4261,6 @@
               <w:sz w:val="24"/>
               <w:szCs w:val="24"/>
               <w:lang w:eastAsia="en-US"/>
-              <w14:ligatures w14:val="standardContextual"/>
             </w:rPr>
           </w:pPr>
           <w:hyperlink w:anchor="_Toc223529135">
@@ -4205,35 +4280,39 @@
                 <w:sz w:val="24"/>
                 <w:szCs w:val="24"/>
                 <w:lang w:eastAsia="en-US"/>
-                <w14:ligatures w14:val="standardContextual"/>
               </w:rPr>
               <w:tab/>
             </w:r>
             <w:r>
               <w:rPr>
-                <w:webHidden/>
-              </w:rPr>
-              <w:fldChar w:fldCharType="begin"/>
-            </w:r>
-            <w:r>
-              <w:rPr>
-                <w:webHidden/>
-              </w:rPr>
-              <w:instrText xml:space="preserve">PAGEREF _Toc223529135 \h</w:instrText>
-            </w:r>
-            <w:r>
-              <w:rPr>
-                <w:webHidden/>
-              </w:rPr>
-              <w:fldChar w:fldCharType="separate"/>
-            </w:r>
-            <w:r>
-              <w:rPr>
-                <w:rStyle w:val="IndexLink"/>
-                <w:vanish w:val="false"/>
+                <w:rStyle w:val="IndexLink"/>
               </w:rPr>
               <w:t>Security and Privacy Requirements</w:t>
               <w:tab/>
+            </w:r>
+            <w:r>
+              <w:rPr>
+                <w:webHidden/>
+              </w:rPr>
+              <w:fldChar w:fldCharType="begin"/>
+            </w:r>
+            <w:r>
+              <w:rPr>
+                <w:webHidden/>
+              </w:rPr>
+              <w:instrText xml:space="preserve">PAGEREF _Toc223529135 \h</w:instrText>
+            </w:r>
+            <w:r>
+              <w:rPr>
+                <w:webHidden/>
+              </w:rPr>
+              <w:fldChar w:fldCharType="separate"/>
+            </w:r>
+            <w:r>
+              <w:rPr>
+                <w:rStyle w:val="IndexLink"/>
+                <w:vanish w:val="false"/>
+              </w:rPr>
               <w:t>x</w:t>
             </w:r>
             <w:r>
@@ -4258,7 +4337,6 @@
               <w:sz w:val="24"/>
               <w:szCs w:val="24"/>
               <w:lang w:eastAsia="en-US"/>
-              <w14:ligatures w14:val="standardContextual"/>
             </w:rPr>
           </w:pPr>
           <w:hyperlink w:anchor="_Toc223529136">
@@ -4278,35 +4356,39 @@
                 <w:sz w:val="24"/>
                 <w:szCs w:val="24"/>
                 <w:lang w:eastAsia="en-US"/>
-                <w14:ligatures w14:val="standardContextual"/>
               </w:rPr>
               <w:tab/>
             </w:r>
             <w:r>
               <w:rPr>
-                <w:webHidden/>
-              </w:rPr>
-              <w:fldChar w:fldCharType="begin"/>
-            </w:r>
-            <w:r>
-              <w:rPr>
-                <w:webHidden/>
-              </w:rPr>
-              <w:instrText xml:space="preserve">PAGEREF _Toc223529136 \h</w:instrText>
-            </w:r>
-            <w:r>
-              <w:rPr>
-                <w:webHidden/>
-              </w:rPr>
-              <w:fldChar w:fldCharType="separate"/>
-            </w:r>
-            <w:r>
-              <w:rPr>
-                <w:rStyle w:val="IndexLink"/>
-                <w:vanish w:val="false"/>
+                <w:rStyle w:val="IndexLink"/>
               </w:rPr>
               <w:t>Environmental Requirements</w:t>
               <w:tab/>
+            </w:r>
+            <w:r>
+              <w:rPr>
+                <w:webHidden/>
+              </w:rPr>
+              <w:fldChar w:fldCharType="begin"/>
+            </w:r>
+            <w:r>
+              <w:rPr>
+                <w:webHidden/>
+              </w:rPr>
+              <w:instrText xml:space="preserve">PAGEREF _Toc223529136 \h</w:instrText>
+            </w:r>
+            <w:r>
+              <w:rPr>
+                <w:webHidden/>
+              </w:rPr>
+              <w:fldChar w:fldCharType="separate"/>
+            </w:r>
+            <w:r>
+              <w:rPr>
+                <w:rStyle w:val="IndexLink"/>
+                <w:vanish w:val="false"/>
+              </w:rPr>
               <w:t>x</w:t>
             </w:r>
             <w:r>
@@ -4331,7 +4413,6 @@
               <w:sz w:val="24"/>
               <w:szCs w:val="24"/>
               <w:lang w:eastAsia="en-US"/>
-              <w14:ligatures w14:val="standardContextual"/>
             </w:rPr>
           </w:pPr>
           <w:hyperlink w:anchor="_Toc223529137">
@@ -4351,35 +4432,39 @@
                 <w:sz w:val="24"/>
                 <w:szCs w:val="24"/>
                 <w:lang w:eastAsia="en-US"/>
-                <w14:ligatures w14:val="standardContextual"/>
               </w:rPr>
               <w:tab/>
             </w:r>
             <w:r>
               <w:rPr>
-                <w:webHidden/>
-              </w:rPr>
-              <w:fldChar w:fldCharType="begin"/>
-            </w:r>
-            <w:r>
-              <w:rPr>
-                <w:webHidden/>
-              </w:rPr>
-              <w:instrText xml:space="preserve">PAGEREF _Toc223529137 \h</w:instrText>
-            </w:r>
-            <w:r>
-              <w:rPr>
-                <w:webHidden/>
-              </w:rPr>
-              <w:fldChar w:fldCharType="separate"/>
-            </w:r>
-            <w:r>
-              <w:rPr>
-                <w:rStyle w:val="IndexLink"/>
-                <w:vanish w:val="false"/>
+                <w:rStyle w:val="IndexLink"/>
               </w:rPr>
               <w:t>Performance Requirements</w:t>
               <w:tab/>
+            </w:r>
+            <w:r>
+              <w:rPr>
+                <w:webHidden/>
+              </w:rPr>
+              <w:fldChar w:fldCharType="begin"/>
+            </w:r>
+            <w:r>
+              <w:rPr>
+                <w:webHidden/>
+              </w:rPr>
+              <w:instrText xml:space="preserve">PAGEREF _Toc223529137 \h</w:instrText>
+            </w:r>
+            <w:r>
+              <w:rPr>
+                <w:webHidden/>
+              </w:rPr>
+              <w:fldChar w:fldCharType="separate"/>
+            </w:r>
+            <w:r>
+              <w:rPr>
+                <w:rStyle w:val="IndexLink"/>
+                <w:vanish w:val="false"/>
+              </w:rPr>
               <w:t>x</w:t>
             </w:r>
             <w:r>
@@ -5074,6 +5159,7 @@
     <w:p>
       <w:pPr>
         <w:pStyle w:val="Paragraph2"/>
+        <w:jc w:val="center"/>
         <w:rPr>
           <w:rFonts w:ascii="Calibri" w:hAnsi="Calibri" w:cs="Calibri"/>
           <w:color w:val="0070C0"/>
@@ -5126,13 +5212,13 @@
         <w:pStyle w:val="Paragraph2"/>
         <w:rPr>
           <w:rFonts w:ascii="Calibri" w:hAnsi="Calibri" w:cs="Calibri"/>
-          <w:color w:val="7030A0"/>
+          <w:color w:val="0070C0"/>
         </w:rPr>
       </w:pPr>
       <w:r>
         <w:rPr>
           <w:rFonts w:cs="Calibri" w:ascii="Calibri" w:hAnsi="Calibri"/>
-          <w:color w:val="7030A0"/>
+          <w:color w:val="0070C0"/>
         </w:rPr>
         <w:t>1.2.3 Class Diagrams – Step 5 in assignment description</w:t>
       </w:r>
@@ -5142,15 +5228,351 @@
         <w:pStyle w:val="Paragraph2"/>
         <w:rPr>
           <w:rFonts w:ascii="Calibri" w:hAnsi="Calibri" w:cs="Calibri"/>
-          <w:color w:val="7030A0"/>
+          <w:color w:val="0070C0"/>
+        </w:rPr>
+      </w:pPr>
+      <w:r>
+        <w:rPr/>
+        <w:drawing>
+          <wp:inline distT="0" distB="0" distL="0" distR="0">
+            <wp:extent cx="5486400" cy="5918200"/>
+            <wp:effectExtent l="0" t="0" r="0" b="0"/>
+            <wp:docPr id="4" name="Picture 1"/>
+            <wp:cNvGraphicFramePr>
+              <a:graphicFrameLocks xmlns:a="http://schemas.openxmlformats.org/drawingml/2006/main" noChangeAspect="1"/>
+            </wp:cNvGraphicFramePr>
+            <a:graphic xmlns:a="http://schemas.openxmlformats.org/drawingml/2006/main">
+              <a:graphicData uri="http://schemas.openxmlformats.org/drawingml/2006/picture">
+                <pic:pic xmlns:pic="http://schemas.openxmlformats.org/drawingml/2006/picture">
+                  <pic:nvPicPr>
+                    <pic:cNvPr id="4" name="Picture 1"/>
+                    <pic:cNvPicPr>
+                      <a:picLocks noChangeAspect="1" noChangeArrowheads="1"/>
+                    </pic:cNvPicPr>
+                  </pic:nvPicPr>
+                  <pic:blipFill>
+                    <a:blip r:embed="rId16"/>
+                    <a:stretch>
+                      <a:fillRect/>
+                    </a:stretch>
+                  </pic:blipFill>
+                  <pic:spPr bwMode="auto">
+                    <a:xfrm>
+                      <a:off x="0" y="0"/>
+                      <a:ext cx="5486400" cy="5918200"/>
+                    </a:xfrm>
+                    <a:prstGeom prst="rect">
+                      <a:avLst/>
+                    </a:prstGeom>
+                    <a:noFill/>
+                  </pic:spPr>
+                </pic:pic>
+              </a:graphicData>
+            </a:graphic>
+          </wp:inline>
+        </w:drawing>
+      </w:r>
+    </w:p>
+    <w:p>
+      <w:pPr>
+        <w:pStyle w:val="Paragraph2"/>
+        <w:rPr>
+          <w:rFonts w:ascii="Calibri" w:hAnsi="Calibri" w:cs="Calibri"/>
+          <w:color w:val="0070C0"/>
         </w:rPr>
       </w:pPr>
       <w:r>
         <w:rPr>
           <w:rFonts w:cs="Calibri" w:ascii="Calibri" w:hAnsi="Calibri"/>
-          <w:color w:val="7030A0"/>
+          <w:color w:val="0070C0"/>
         </w:rPr>
         <w:t>1.2.4 Sequence Diagrams – Step 6 in assignment description</w:t>
+      </w:r>
+    </w:p>
+    <w:p>
+      <w:pPr>
+        <w:pStyle w:val="Paragraph2"/>
+        <w:rPr>
+          <w:rFonts w:ascii="Calibri" w:hAnsi="Calibri" w:cs="Calibri"/>
+          <w:color w:val="0070C0"/>
+        </w:rPr>
+      </w:pPr>
+      <w:r>
+        <w:rPr>
+          <w:rFonts w:cs="Calibri" w:ascii="Calibri" w:hAnsi="Calibri"/>
+          <w:color w:val="0070C0"/>
+        </w:rPr>
+        <w:tab/>
+        <w:t>1.2.4.1: User Creation</w:t>
+      </w:r>
+    </w:p>
+    <w:p>
+      <w:pPr>
+        <w:pStyle w:val="Paragraph2"/>
+        <w:jc w:val="center"/>
+        <w:rPr>
+          <w:rFonts w:ascii="Calibri" w:hAnsi="Calibri" w:cs="Calibri"/>
+          <w:color w:val="0070C0"/>
+        </w:rPr>
+      </w:pPr>
+      <w:r>
+        <w:rPr/>
+        <w:drawing>
+          <wp:inline distT="0" distB="0" distL="0" distR="0">
+            <wp:extent cx="1814195" cy="1279525"/>
+            <wp:effectExtent l="0" t="0" r="0" b="0"/>
+            <wp:docPr id="5" name="Picture 5"/>
+            <wp:cNvGraphicFramePr>
+              <a:graphicFrameLocks xmlns:a="http://schemas.openxmlformats.org/drawingml/2006/main" noChangeAspect="1"/>
+            </wp:cNvGraphicFramePr>
+            <a:graphic xmlns:a="http://schemas.openxmlformats.org/drawingml/2006/main">
+              <a:graphicData uri="http://schemas.openxmlformats.org/drawingml/2006/picture">
+                <pic:pic xmlns:pic="http://schemas.openxmlformats.org/drawingml/2006/picture">
+                  <pic:nvPicPr>
+                    <pic:cNvPr id="5" name="Picture 5"/>
+                    <pic:cNvPicPr>
+                      <a:picLocks noChangeAspect="1" noChangeArrowheads="1"/>
+                    </pic:cNvPicPr>
+                  </pic:nvPicPr>
+                  <pic:blipFill>
+                    <a:blip r:embed="rId17"/>
+                    <a:stretch>
+                      <a:fillRect/>
+                    </a:stretch>
+                  </pic:blipFill>
+                  <pic:spPr bwMode="auto">
+                    <a:xfrm>
+                      <a:off x="0" y="0"/>
+                      <a:ext cx="1814195" cy="1279525"/>
+                    </a:xfrm>
+                    <a:prstGeom prst="rect">
+                      <a:avLst/>
+                    </a:prstGeom>
+                    <a:noFill/>
+                  </pic:spPr>
+                </pic:pic>
+              </a:graphicData>
+            </a:graphic>
+          </wp:inline>
+        </w:drawing>
+      </w:r>
+    </w:p>
+    <w:p>
+      <w:pPr>
+        <w:pStyle w:val="Paragraph2"/>
+        <w:rPr>
+          <w:rFonts w:ascii="Calibri" w:hAnsi="Calibri" w:cs="Calibri"/>
+          <w:color w:val="0070C0"/>
+        </w:rPr>
+      </w:pPr>
+      <w:r>
+        <w:rPr>
+          <w:rFonts w:cs="Calibri" w:ascii="Calibri" w:hAnsi="Calibri"/>
+          <w:color w:val="0070C0"/>
+        </w:rPr>
+        <w:tab/>
+        <w:t>1.2.4.2: Player pre game sequence</w:t>
+      </w:r>
+    </w:p>
+    <w:p>
+      <w:pPr>
+        <w:pStyle w:val="Paragraph2"/>
+        <w:rPr>
+          <w:rFonts w:ascii="Calibri" w:hAnsi="Calibri" w:cs="Calibri"/>
+          <w:color w:val="0070C0"/>
+        </w:rPr>
+      </w:pPr>
+      <w:r>
+        <w:rPr/>
+        <w:drawing>
+          <wp:inline distT="0" distB="0" distL="0" distR="0">
+            <wp:extent cx="5486400" cy="4235450"/>
+            <wp:effectExtent l="0" t="0" r="0" b="0"/>
+            <wp:docPr id="6" name="Picture 6"/>
+            <wp:cNvGraphicFramePr>
+              <a:graphicFrameLocks xmlns:a="http://schemas.openxmlformats.org/drawingml/2006/main" noChangeAspect="1"/>
+            </wp:cNvGraphicFramePr>
+            <a:graphic xmlns:a="http://schemas.openxmlformats.org/drawingml/2006/main">
+              <a:graphicData uri="http://schemas.openxmlformats.org/drawingml/2006/picture">
+                <pic:pic xmlns:pic="http://schemas.openxmlformats.org/drawingml/2006/picture">
+                  <pic:nvPicPr>
+                    <pic:cNvPr id="6" name="Picture 6"/>
+                    <pic:cNvPicPr>
+                      <a:picLocks noChangeAspect="1" noChangeArrowheads="1"/>
+                    </pic:cNvPicPr>
+                  </pic:nvPicPr>
+                  <pic:blipFill>
+                    <a:blip r:embed="rId18"/>
+                    <a:stretch>
+                      <a:fillRect/>
+                    </a:stretch>
+                  </pic:blipFill>
+                  <pic:spPr bwMode="auto">
+                    <a:xfrm>
+                      <a:off x="0" y="0"/>
+                      <a:ext cx="5486400" cy="4235450"/>
+                    </a:xfrm>
+                    <a:prstGeom prst="rect">
+                      <a:avLst/>
+                    </a:prstGeom>
+                    <a:noFill/>
+                  </pic:spPr>
+                </pic:pic>
+              </a:graphicData>
+            </a:graphic>
+          </wp:inline>
+        </w:drawing>
+      </w:r>
+    </w:p>
+    <w:p>
+      <w:pPr>
+        <w:pStyle w:val="Paragraph2"/>
+        <w:rPr>
+          <w:rFonts w:ascii="Calibri" w:hAnsi="Calibri" w:cs="Calibri"/>
+          <w:color w:val="0070C0"/>
+        </w:rPr>
+      </w:pPr>
+      <w:r>
+        <w:rPr>
+          <w:rFonts w:cs="Calibri" w:ascii="Calibri" w:hAnsi="Calibri"/>
+          <w:color w:val="0070C0"/>
+        </w:rPr>
+        <w:tab/>
+        <w:t>1.2.4.3: Dealer pre game sequence</w:t>
+      </w:r>
+    </w:p>
+    <w:p>
+      <w:pPr>
+        <w:pStyle w:val="Paragraph2"/>
+        <w:rPr>
+          <w:rFonts w:ascii="Calibri" w:hAnsi="Calibri" w:cs="Calibri"/>
+          <w:color w:val="0070C0"/>
+        </w:rPr>
+      </w:pPr>
+      <w:r>
+        <w:rPr/>
+        <w:drawing>
+          <wp:inline distT="0" distB="0" distL="0" distR="0">
+            <wp:extent cx="5486400" cy="5025390"/>
+            <wp:effectExtent l="0" t="0" r="0" b="0"/>
+            <wp:docPr id="7" name="Picture 7"/>
+            <wp:cNvGraphicFramePr>
+              <a:graphicFrameLocks xmlns:a="http://schemas.openxmlformats.org/drawingml/2006/main" noChangeAspect="1"/>
+            </wp:cNvGraphicFramePr>
+            <a:graphic xmlns:a="http://schemas.openxmlformats.org/drawingml/2006/main">
+              <a:graphicData uri="http://schemas.openxmlformats.org/drawingml/2006/picture">
+                <pic:pic xmlns:pic="http://schemas.openxmlformats.org/drawingml/2006/picture">
+                  <pic:nvPicPr>
+                    <pic:cNvPr id="7" name="Picture 7"/>
+                    <pic:cNvPicPr>
+                      <a:picLocks noChangeAspect="1" noChangeArrowheads="1"/>
+                    </pic:cNvPicPr>
+                  </pic:nvPicPr>
+                  <pic:blipFill>
+                    <a:blip r:embed="rId19"/>
+                    <a:stretch>
+                      <a:fillRect/>
+                    </a:stretch>
+                  </pic:blipFill>
+                  <pic:spPr bwMode="auto">
+                    <a:xfrm>
+                      <a:off x="0" y="0"/>
+                      <a:ext cx="5486400" cy="5025390"/>
+                    </a:xfrm>
+                    <a:prstGeom prst="rect">
+                      <a:avLst/>
+                    </a:prstGeom>
+                    <a:noFill/>
+                  </pic:spPr>
+                </pic:pic>
+              </a:graphicData>
+            </a:graphic>
+          </wp:inline>
+        </w:drawing>
+      </w:r>
+    </w:p>
+    <w:p>
+      <w:pPr>
+        <w:pStyle w:val="Paragraph2"/>
+        <w:rPr>
+          <w:rFonts w:ascii="Calibri" w:hAnsi="Calibri" w:cs="Calibri"/>
+          <w:color w:val="0070C0"/>
+        </w:rPr>
+      </w:pPr>
+      <w:r>
+        <w:rPr>
+          <w:rFonts w:cs="Calibri" w:ascii="Calibri" w:hAnsi="Calibri"/>
+          <w:color w:val="0070C0"/>
+        </w:rPr>
+        <w:tab/>
+        <w:t>1.2.4.4: Player in game sequence</w:t>
+      </w:r>
+    </w:p>
+    <w:p>
+      <w:pPr>
+        <w:pStyle w:val="Paragraph2"/>
+        <w:rPr>
+          <w:rFonts w:ascii="Calibri" w:hAnsi="Calibri" w:cs="Calibri"/>
+          <w:color w:val="0070C0"/>
+        </w:rPr>
+      </w:pPr>
+      <w:r>
+        <w:rPr/>
+        <w:drawing>
+          <wp:inline distT="0" distB="0" distL="0" distR="0">
+            <wp:extent cx="5476240" cy="7017385"/>
+            <wp:effectExtent l="0" t="0" r="0" b="0"/>
+            <wp:docPr id="8" name="Picture 8"/>
+            <wp:cNvGraphicFramePr>
+              <a:graphicFrameLocks xmlns:a="http://schemas.openxmlformats.org/drawingml/2006/main" noChangeAspect="1"/>
+            </wp:cNvGraphicFramePr>
+            <a:graphic xmlns:a="http://schemas.openxmlformats.org/drawingml/2006/main">
+              <a:graphicData uri="http://schemas.openxmlformats.org/drawingml/2006/picture">
+                <pic:pic xmlns:pic="http://schemas.openxmlformats.org/drawingml/2006/picture">
+                  <pic:nvPicPr>
+                    <pic:cNvPr id="8" name="Picture 8"/>
+                    <pic:cNvPicPr>
+                      <a:picLocks noChangeAspect="1" noChangeArrowheads="1"/>
+                    </pic:cNvPicPr>
+                  </pic:nvPicPr>
+                  <pic:blipFill>
+                    <a:blip r:embed="rId20"/>
+                    <a:stretch>
+                      <a:fillRect/>
+                    </a:stretch>
+                  </pic:blipFill>
+                  <pic:spPr bwMode="auto">
+                    <a:xfrm>
+                      <a:off x="0" y="0"/>
+                      <a:ext cx="5476240" cy="7017385"/>
+                    </a:xfrm>
+                    <a:prstGeom prst="rect">
+                      <a:avLst/>
+                    </a:prstGeom>
+                    <a:noFill/>
+                  </pic:spPr>
+                </pic:pic>
+              </a:graphicData>
+            </a:graphic>
+          </wp:inline>
+        </w:drawing>
+      </w:r>
+    </w:p>
+    <w:p>
+      <w:pPr>
+        <w:pStyle w:val="Paragraph2"/>
+        <w:rPr>
+          <w:rFonts w:ascii="Calibri" w:hAnsi="Calibri" w:cs="Calibri"/>
+          <w:color w:val="0070C0"/>
+        </w:rPr>
+      </w:pPr>
+      <w:r>
+        <w:rPr>
+          <w:rFonts w:cs="Calibri" w:ascii="Calibri" w:hAnsi="Calibri"/>
+          <w:color w:val="0070C0"/>
+        </w:rPr>
+        <w:tab/>
+        <w:t>1.2.4.5 Dealer in game sequence</w:t>
       </w:r>
     </w:p>
     <w:p>
@@ -5526,7 +5948,6 @@
         <w:rPr/>
         <w:t>Common Requirements:</w:t>
       </w:r>
-      <w:bookmarkStart w:id="16" w:name="REQBV1E74"/>
       <w:bookmarkEnd w:id="15"/>
     </w:p>
     <w:p>
@@ -5539,7 +5960,6 @@
         <w:jc w:val="both"/>
         <w:rPr/>
       </w:pPr>
-      <w:bookmarkEnd w:id="16"/>
       <w:r>
         <w:rPr>
           <w:rStyle w:val="Strong"/>
@@ -5565,20 +5985,7 @@
           <w:szCs w:val="20"/>
           <w:lang w:val="en-US" w:eastAsia="zh-CN" w:bidi="ar-SA"/>
         </w:rPr>
-        <w:t xml:space="preserve"> Users should be allowed to log in using their </w:t>
-      </w:r>
-      <w:r>
-        <w:rPr>
-          <w:rFonts w:eastAsia="Times New Roman" w:cs="Times New Roman"/>
-          <w:b w:val="false"/>
-          <w:bCs w:val="false"/>
-          <w:color w:val="00B0F0"/>
-          <w:kern w:val="0"/>
-          <w:sz w:val="20"/>
-          <w:szCs w:val="20"/>
-          <w:lang w:val="en-US" w:eastAsia="zh-CN" w:bidi="ar-SA"/>
-        </w:rPr>
-        <w:t>personal username and password credentials, comprised of alphanumeric characters</w:t>
+        <w:t xml:space="preserve"> Users should be allowed to log in using their personal username and password credentials, comprised of alphanumeric characters</w:t>
       </w:r>
     </w:p>
     <w:p>
@@ -5849,34 +6256,6 @@
     </w:p>
     <w:p>
       <w:pPr>
-        <w:pStyle w:val="Paragraph2"/>
-        <w:widowControl/>
-        <w:suppressAutoHyphens w:val="true"/>
-        <w:bidi w:val="0"/>
-        <w:spacing w:before="80" w:after="0"/>
-        <w:jc w:val="both"/>
-        <w:rPr>
-          <w:rFonts w:ascii="Times New Roman" w:hAnsi="Times New Roman" w:eastAsia="Times New Roman" w:cs="Times New Roman"/>
-          <w:color w:val="00B0F0"/>
-          <w:kern w:val="0"/>
-          <w:sz w:val="20"/>
-          <w:szCs w:val="20"/>
-          <w:lang w:val="en-US" w:eastAsia="zh-CN" w:bidi="ar-SA"/>
-        </w:rPr>
-      </w:pPr>
-      <w:r>
-        <w:rPr>
-          <w:rFonts w:eastAsia="Times New Roman" w:cs="Times New Roman"/>
-          <w:color w:val="00B0F0"/>
-          <w:kern w:val="0"/>
-          <w:sz w:val="20"/>
-          <w:szCs w:val="20"/>
-          <w:lang w:val="en-US" w:eastAsia="zh-CN" w:bidi="ar-SA"/>
-        </w:rPr>
-      </w:r>
-    </w:p>
-    <w:p>
-      <w:pPr>
         <w:pStyle w:val="Heading3"/>
         <w:numPr>
           <w:ilvl w:val="2"/>
@@ -5884,12 +6263,12 @@
         </w:numPr>
         <w:rPr/>
       </w:pPr>
-      <w:bookmarkStart w:id="17" w:name="_Toc223529125"/>
+      <w:bookmarkStart w:id="16" w:name="_Toc223529125"/>
       <w:r>
         <w:rPr/>
         <w:t>Users Module Requirements:</w:t>
       </w:r>
-      <w:bookmarkEnd w:id="17"/>
+      <w:bookmarkEnd w:id="16"/>
     </w:p>
     <w:p>
       <w:pPr>
@@ -5927,12 +6306,12 @@
         </w:numPr>
         <w:rPr/>
       </w:pPr>
-      <w:bookmarkStart w:id="18" w:name="_Toc223529126"/>
+      <w:bookmarkStart w:id="17" w:name="_Toc223529126"/>
       <w:r>
         <w:rPr/>
         <w:t>Datastore Module Requirements:</w:t>
       </w:r>
-      <w:bookmarkEnd w:id="18"/>
+      <w:bookmarkEnd w:id="17"/>
     </w:p>
     <w:p>
       <w:pPr>
@@ -5971,38 +6350,23 @@
         </w:numPr>
         <w:rPr/>
       </w:pPr>
-      <w:bookmarkStart w:id="19" w:name="_Toc223529127"/>
+      <w:bookmarkStart w:id="18" w:name="_Toc223529127"/>
       <w:r>
         <w:rPr/>
         <w:t>Network Module Requirements:</w:t>
       </w:r>
-      <w:bookmarkEnd w:id="19"/>
+      <w:bookmarkEnd w:id="18"/>
     </w:p>
     <w:p>
       <w:pPr>
         <w:pStyle w:val="Paragraph2"/>
-        <w:widowControl/>
-        <w:suppressAutoHyphens w:val="true"/>
-        <w:bidi w:val="0"/>
-        <w:spacing w:before="80" w:after="0"/>
-        <w:jc w:val="both"/>
-        <w:rPr>
-          <w:rFonts w:ascii="Times New Roman" w:hAnsi="Times New Roman" w:eastAsia="Times New Roman" w:cs="Times New Roman"/>
-          <w:color w:val="00B0F0"/>
-          <w:kern w:val="0"/>
-          <w:sz w:val="20"/>
-          <w:szCs w:val="20"/>
-          <w:lang w:val="en-US" w:eastAsia="zh-CN" w:bidi="ar-SA"/>
-        </w:rPr>
-      </w:pPr>
-      <w:r>
-        <w:rPr>
-          <w:rFonts w:eastAsia="Times New Roman" w:cs="Times New Roman"/>
-          <w:color w:val="00B0F0"/>
-          <w:kern w:val="0"/>
-          <w:sz w:val="20"/>
-          <w:szCs w:val="20"/>
-          <w:lang w:val="en-US" w:eastAsia="zh-CN" w:bidi="ar-SA"/>
+        <w:rPr>
+          <w:color w:val="00B0F0"/>
+        </w:rPr>
+      </w:pPr>
+      <w:r>
+        <w:rPr>
+          <w:color w:val="00B0F0"/>
         </w:rPr>
         <w:t>3.1.4.1 The system shall allow client applications to establish a TCP/IP connection with the server before accessing any game features.</w:t>
       </w:r>
@@ -6010,28 +6374,13 @@
     <w:p>
       <w:pPr>
         <w:pStyle w:val="Paragraph2"/>
-        <w:widowControl/>
-        <w:suppressAutoHyphens w:val="true"/>
-        <w:bidi w:val="0"/>
-        <w:spacing w:before="80" w:after="0"/>
-        <w:jc w:val="both"/>
-        <w:rPr>
-          <w:rFonts w:ascii="Times New Roman" w:hAnsi="Times New Roman" w:eastAsia="Times New Roman" w:cs="Times New Roman"/>
-          <w:color w:val="00B0F0"/>
-          <w:kern w:val="0"/>
-          <w:sz w:val="20"/>
-          <w:szCs w:val="20"/>
-          <w:lang w:val="en-US" w:eastAsia="zh-CN" w:bidi="ar-SA"/>
-        </w:rPr>
-      </w:pPr>
-      <w:r>
-        <w:rPr>
-          <w:rFonts w:eastAsia="Times New Roman" w:cs="Times New Roman"/>
-          <w:color w:val="00B0F0"/>
-          <w:kern w:val="0"/>
-          <w:sz w:val="20"/>
-          <w:szCs w:val="20"/>
-          <w:lang w:val="en-US" w:eastAsia="zh-CN" w:bidi="ar-SA"/>
+        <w:rPr>
+          <w:color w:val="00B0F0"/>
+        </w:rPr>
+      </w:pPr>
+      <w:r>
+        <w:rPr>
+          <w:color w:val="00B0F0"/>
         </w:rPr>
         <w:t>3.1.4.2 The server shall maintain persistent connections with all active client sessions during gameplay.</w:t>
       </w:r>
@@ -6039,28 +6388,13 @@
     <w:p>
       <w:pPr>
         <w:pStyle w:val="Paragraph2"/>
-        <w:widowControl/>
-        <w:suppressAutoHyphens w:val="true"/>
-        <w:bidi w:val="0"/>
-        <w:spacing w:before="80" w:after="0"/>
-        <w:jc w:val="both"/>
-        <w:rPr>
-          <w:rFonts w:ascii="Times New Roman" w:hAnsi="Times New Roman" w:eastAsia="Times New Roman" w:cs="Times New Roman"/>
-          <w:color w:val="00B0F0"/>
-          <w:kern w:val="0"/>
-          <w:sz w:val="20"/>
-          <w:szCs w:val="20"/>
-          <w:lang w:val="en-US" w:eastAsia="zh-CN" w:bidi="ar-SA"/>
-        </w:rPr>
-      </w:pPr>
-      <w:r>
-        <w:rPr>
-          <w:rFonts w:eastAsia="Times New Roman" w:cs="Times New Roman"/>
-          <w:color w:val="00B0F0"/>
-          <w:kern w:val="0"/>
-          <w:sz w:val="20"/>
-          <w:szCs w:val="20"/>
-          <w:lang w:val="en-US" w:eastAsia="zh-CN" w:bidi="ar-SA"/>
+        <w:rPr>
+          <w:color w:val="00B0F0"/>
+        </w:rPr>
+      </w:pPr>
+      <w:r>
+        <w:rPr>
+          <w:color w:val="00B0F0"/>
         </w:rPr>
         <w:t>3.1.4.3 The network module shall transmit player actions (hit, stand, bet, split, double down, insurance) from the client to the server.</w:t>
       </w:r>
@@ -6068,28 +6402,13 @@
     <w:p>
       <w:pPr>
         <w:pStyle w:val="Paragraph2"/>
-        <w:widowControl/>
-        <w:suppressAutoHyphens w:val="true"/>
-        <w:bidi w:val="0"/>
-        <w:spacing w:before="80" w:after="0"/>
-        <w:jc w:val="both"/>
-        <w:rPr>
-          <w:rFonts w:ascii="Times New Roman" w:hAnsi="Times New Roman" w:eastAsia="Times New Roman" w:cs="Times New Roman"/>
-          <w:color w:val="00B0F0"/>
-          <w:kern w:val="0"/>
-          <w:sz w:val="20"/>
-          <w:szCs w:val="20"/>
-          <w:lang w:val="en-US" w:eastAsia="zh-CN" w:bidi="ar-SA"/>
-        </w:rPr>
-      </w:pPr>
-      <w:r>
-        <w:rPr>
-          <w:rFonts w:eastAsia="Times New Roman" w:cs="Times New Roman"/>
-          <w:color w:val="00B0F0"/>
-          <w:kern w:val="0"/>
-          <w:sz w:val="20"/>
-          <w:szCs w:val="20"/>
-          <w:lang w:val="en-US" w:eastAsia="zh-CN" w:bidi="ar-SA"/>
+        <w:rPr>
+          <w:color w:val="00B0F0"/>
+        </w:rPr>
+      </w:pPr>
+      <w:r>
+        <w:rPr>
+          <w:color w:val="00B0F0"/>
         </w:rPr>
         <w:t>3.1.4.4 The server shall broadcast updated game state information to all clients at a table after each player action.</w:t>
       </w:r>
@@ -6097,28 +6416,13 @@
     <w:p>
       <w:pPr>
         <w:pStyle w:val="Paragraph2"/>
-        <w:widowControl/>
-        <w:suppressAutoHyphens w:val="true"/>
-        <w:bidi w:val="0"/>
-        <w:spacing w:before="80" w:after="0"/>
-        <w:jc w:val="both"/>
-        <w:rPr>
-          <w:rFonts w:ascii="Times New Roman" w:hAnsi="Times New Roman" w:eastAsia="Times New Roman" w:cs="Times New Roman"/>
-          <w:color w:val="00B0F0"/>
-          <w:kern w:val="0"/>
-          <w:sz w:val="20"/>
-          <w:szCs w:val="20"/>
-          <w:lang w:val="en-US" w:eastAsia="zh-CN" w:bidi="ar-SA"/>
-        </w:rPr>
-      </w:pPr>
-      <w:r>
-        <w:rPr>
-          <w:rFonts w:eastAsia="Times New Roman" w:cs="Times New Roman"/>
-          <w:color w:val="00B0F0"/>
-          <w:kern w:val="0"/>
-          <w:sz w:val="20"/>
-          <w:szCs w:val="20"/>
-          <w:lang w:val="en-US" w:eastAsia="zh-CN" w:bidi="ar-SA"/>
+        <w:rPr>
+          <w:color w:val="00B0F0"/>
+        </w:rPr>
+      </w:pPr>
+      <w:r>
+        <w:rPr>
+          <w:color w:val="00B0F0"/>
         </w:rPr>
         <w:t>3.1.4.5 The network module shall detect client disconnections and notify the server.</w:t>
       </w:r>
@@ -6126,28 +6430,13 @@
     <w:p>
       <w:pPr>
         <w:pStyle w:val="Paragraph2"/>
-        <w:widowControl/>
-        <w:suppressAutoHyphens w:val="true"/>
-        <w:bidi w:val="0"/>
-        <w:spacing w:before="80" w:after="0"/>
-        <w:jc w:val="both"/>
-        <w:rPr>
-          <w:rFonts w:ascii="Times New Roman" w:hAnsi="Times New Roman" w:eastAsia="Times New Roman" w:cs="Times New Roman"/>
-          <w:color w:val="00B0F0"/>
-          <w:kern w:val="0"/>
-          <w:sz w:val="20"/>
-          <w:szCs w:val="20"/>
-          <w:lang w:val="en-US" w:eastAsia="zh-CN" w:bidi="ar-SA"/>
-        </w:rPr>
-      </w:pPr>
-      <w:r>
-        <w:rPr>
-          <w:rFonts w:eastAsia="Times New Roman" w:cs="Times New Roman"/>
-          <w:color w:val="00B0F0"/>
-          <w:kern w:val="0"/>
-          <w:sz w:val="20"/>
-          <w:szCs w:val="20"/>
-          <w:lang w:val="en-US" w:eastAsia="zh-CN" w:bidi="ar-SA"/>
+        <w:rPr>
+          <w:color w:val="00B0F0"/>
+        </w:rPr>
+      </w:pPr>
+      <w:r>
+        <w:rPr>
+          <w:color w:val="00B0F0"/>
         </w:rPr>
         <w:t>3.1.4.6 If a client disconnects during gameplay, the server shall maintain the player's game state until the round is completed.</w:t>
       </w:r>
@@ -6155,28 +6444,13 @@
     <w:p>
       <w:pPr>
         <w:pStyle w:val="Paragraph2"/>
-        <w:widowControl/>
-        <w:suppressAutoHyphens w:val="true"/>
-        <w:bidi w:val="0"/>
-        <w:spacing w:before="80" w:after="0"/>
-        <w:jc w:val="both"/>
-        <w:rPr>
-          <w:rFonts w:ascii="Times New Roman" w:hAnsi="Times New Roman" w:eastAsia="Times New Roman" w:cs="Times New Roman"/>
-          <w:color w:val="00B0F0"/>
-          <w:kern w:val="0"/>
-          <w:sz w:val="20"/>
-          <w:szCs w:val="20"/>
-          <w:lang w:val="en-US" w:eastAsia="zh-CN" w:bidi="ar-SA"/>
-        </w:rPr>
-      </w:pPr>
-      <w:r>
-        <w:rPr>
-          <w:rFonts w:eastAsia="Times New Roman" w:cs="Times New Roman"/>
-          <w:color w:val="00B0F0"/>
-          <w:kern w:val="0"/>
-          <w:sz w:val="20"/>
-          <w:szCs w:val="20"/>
-          <w:lang w:val="en-US" w:eastAsia="zh-CN" w:bidi="ar-SA"/>
+        <w:rPr>
+          <w:color w:val="00B0F0"/>
+        </w:rPr>
+      </w:pPr>
+      <w:r>
+        <w:rPr>
+          <w:color w:val="00B0F0"/>
         </w:rPr>
         <w:t>3.1.4.7 The network module shall allow disconnected clients to reconnect and resume their session if the round has not yet completed.</w:t>
       </w:r>
@@ -6184,28 +6458,13 @@
     <w:p>
       <w:pPr>
         <w:pStyle w:val="Paragraph2"/>
-        <w:widowControl/>
-        <w:suppressAutoHyphens w:val="true"/>
-        <w:bidi w:val="0"/>
-        <w:spacing w:before="80" w:after="0"/>
-        <w:jc w:val="both"/>
-        <w:rPr>
-          <w:rFonts w:ascii="Times New Roman" w:hAnsi="Times New Roman" w:eastAsia="Times New Roman" w:cs="Times New Roman"/>
-          <w:color w:val="00B0F0"/>
-          <w:kern w:val="0"/>
-          <w:sz w:val="20"/>
-          <w:szCs w:val="20"/>
-          <w:lang w:val="en-US" w:eastAsia="zh-CN" w:bidi="ar-SA"/>
-        </w:rPr>
-      </w:pPr>
-      <w:r>
-        <w:rPr>
-          <w:rFonts w:eastAsia="Times New Roman" w:cs="Times New Roman"/>
-          <w:color w:val="00B0F0"/>
-          <w:kern w:val="0"/>
-          <w:sz w:val="20"/>
-          <w:szCs w:val="20"/>
-          <w:lang w:val="en-US" w:eastAsia="zh-CN" w:bidi="ar-SA"/>
+        <w:rPr>
+          <w:color w:val="00B0F0"/>
+        </w:rPr>
+      </w:pPr>
+      <w:r>
+        <w:rPr>
+          <w:color w:val="00B0F0"/>
         </w:rPr>
         <w:t>3.1.4.8 Network messages exchanged between client and server shall contain only gameplay data and required session identifiers.</w:t>
       </w:r>
@@ -6213,28 +6472,13 @@
     <w:p>
       <w:pPr>
         <w:pStyle w:val="Paragraph2"/>
-        <w:widowControl/>
-        <w:suppressAutoHyphens w:val="true"/>
-        <w:bidi w:val="0"/>
-        <w:spacing w:before="80" w:after="0"/>
-        <w:jc w:val="both"/>
-        <w:rPr>
-          <w:rFonts w:ascii="Times New Roman" w:hAnsi="Times New Roman" w:eastAsia="Times New Roman" w:cs="Times New Roman"/>
-          <w:color w:val="00B0F0"/>
-          <w:kern w:val="0"/>
-          <w:sz w:val="20"/>
-          <w:szCs w:val="20"/>
-          <w:lang w:val="en-US" w:eastAsia="zh-CN" w:bidi="ar-SA"/>
-        </w:rPr>
-      </w:pPr>
-      <w:r>
-        <w:rPr>
-          <w:rFonts w:eastAsia="Times New Roman" w:cs="Times New Roman"/>
-          <w:color w:val="00B0F0"/>
-          <w:kern w:val="0"/>
-          <w:sz w:val="20"/>
-          <w:szCs w:val="20"/>
-          <w:lang w:val="en-US" w:eastAsia="zh-CN" w:bidi="ar-SA"/>
+        <w:rPr>
+          <w:color w:val="00B0F0"/>
+        </w:rPr>
+      </w:pPr>
+      <w:r>
+        <w:rPr>
+          <w:color w:val="00B0F0"/>
         </w:rPr>
         <w:t>3.1.4.9 The server shall reject connection attempts from clients that are already logged in from another session.</w:t>
       </w:r>
@@ -6242,28 +6486,13 @@
     <w:p>
       <w:pPr>
         <w:pStyle w:val="Paragraph2"/>
-        <w:widowControl/>
-        <w:suppressAutoHyphens w:val="true"/>
-        <w:bidi w:val="0"/>
-        <w:spacing w:before="80" w:after="0"/>
-        <w:jc w:val="both"/>
-        <w:rPr>
-          <w:rFonts w:ascii="Times New Roman" w:hAnsi="Times New Roman" w:eastAsia="Times New Roman" w:cs="Times New Roman"/>
-          <w:color w:val="00B0F0"/>
-          <w:kern w:val="0"/>
-          <w:sz w:val="20"/>
-          <w:szCs w:val="20"/>
-          <w:lang w:val="en-US" w:eastAsia="zh-CN" w:bidi="ar-SA"/>
-        </w:rPr>
-      </w:pPr>
-      <w:r>
-        <w:rPr>
-          <w:rFonts w:eastAsia="Times New Roman" w:cs="Times New Roman"/>
-          <w:color w:val="00B0F0"/>
-          <w:kern w:val="0"/>
-          <w:sz w:val="20"/>
-          <w:szCs w:val="20"/>
-          <w:lang w:val="en-US" w:eastAsia="zh-CN" w:bidi="ar-SA"/>
+        <w:rPr>
+          <w:color w:val="00B0F0"/>
+        </w:rPr>
+      </w:pPr>
+      <w:r>
+        <w:rPr>
+          <w:color w:val="00B0F0"/>
         </w:rPr>
       </w:r>
     </w:p>
@@ -6276,12 +6505,12 @@
         </w:numPr>
         <w:rPr/>
       </w:pPr>
-      <w:bookmarkStart w:id="20" w:name="_Toc223529128"/>
+      <w:bookmarkStart w:id="19" w:name="_Toc223529128"/>
       <w:r>
         <w:rPr/>
         <w:t>GUI Module Requirements:</w:t>
       </w:r>
-      <w:bookmarkEnd w:id="20"/>
+      <w:bookmarkEnd w:id="19"/>
     </w:p>
     <w:p>
       <w:pPr>
@@ -6390,38 +6619,23 @@
         </w:numPr>
         <w:rPr/>
       </w:pPr>
-      <w:bookmarkStart w:id="21" w:name="_Toc223529129"/>
+      <w:bookmarkStart w:id="20" w:name="_Toc223529129"/>
       <w:r>
         <w:rPr/>
         <w:t>Lobby Module Requirements:</w:t>
       </w:r>
-      <w:bookmarkEnd w:id="21"/>
+      <w:bookmarkEnd w:id="20"/>
     </w:p>
     <w:p>
       <w:pPr>
         <w:pStyle w:val="Paragraph2"/>
-        <w:widowControl/>
-        <w:suppressAutoHyphens w:val="true"/>
-        <w:bidi w:val="0"/>
-        <w:spacing w:before="80" w:after="0"/>
-        <w:jc w:val="both"/>
-        <w:rPr>
-          <w:rFonts w:ascii="Times New Roman" w:hAnsi="Times New Roman" w:eastAsia="Times New Roman" w:cs="Times New Roman"/>
-          <w:color w:val="00B0F0"/>
-          <w:kern w:val="0"/>
-          <w:sz w:val="20"/>
-          <w:szCs w:val="20"/>
-          <w:lang w:val="en-US" w:eastAsia="zh-CN" w:bidi="ar-SA"/>
-        </w:rPr>
-      </w:pPr>
-      <w:r>
-        <w:rPr>
-          <w:rFonts w:eastAsia="Times New Roman" w:cs="Times New Roman"/>
-          <w:color w:val="00B0F0"/>
-          <w:kern w:val="0"/>
-          <w:sz w:val="20"/>
-          <w:szCs w:val="20"/>
-          <w:lang w:val="en-US" w:eastAsia="zh-CN" w:bidi="ar-SA"/>
+        <w:rPr>
+          <w:color w:val="00B0F0"/>
+        </w:rPr>
+      </w:pPr>
+      <w:r>
+        <w:rPr>
+          <w:color w:val="00B0F0"/>
         </w:rPr>
         <w:t>3.1.6.1 Players will be sent to the lobby after logging in.</w:t>
       </w:r>
@@ -6429,28 +6643,13 @@
     <w:p>
       <w:pPr>
         <w:pStyle w:val="Paragraph2"/>
-        <w:widowControl/>
-        <w:suppressAutoHyphens w:val="true"/>
-        <w:bidi w:val="0"/>
-        <w:spacing w:before="80" w:after="0"/>
-        <w:jc w:val="both"/>
-        <w:rPr>
-          <w:rFonts w:ascii="Times New Roman" w:hAnsi="Times New Roman" w:eastAsia="Times New Roman" w:cs="Times New Roman"/>
-          <w:color w:val="00B0F0"/>
-          <w:kern w:val="0"/>
-          <w:sz w:val="20"/>
-          <w:szCs w:val="20"/>
-          <w:lang w:val="en-US" w:eastAsia="zh-CN" w:bidi="ar-SA"/>
-        </w:rPr>
-      </w:pPr>
-      <w:r>
-        <w:rPr>
-          <w:rFonts w:eastAsia="Times New Roman" w:cs="Times New Roman"/>
-          <w:color w:val="00B0F0"/>
-          <w:kern w:val="0"/>
-          <w:sz w:val="20"/>
-          <w:szCs w:val="20"/>
-          <w:lang w:val="en-US" w:eastAsia="zh-CN" w:bidi="ar-SA"/>
+        <w:rPr>
+          <w:color w:val="00B0F0"/>
+        </w:rPr>
+      </w:pPr>
+      <w:r>
+        <w:rPr>
+          <w:color w:val="00B0F0"/>
         </w:rPr>
         <w:t>3.1.6.2 Players will be able to deposit and withdraw money from the lobby.</w:t>
       </w:r>
@@ -6458,28 +6657,13 @@
     <w:p>
       <w:pPr>
         <w:pStyle w:val="Paragraph2"/>
-        <w:widowControl/>
-        <w:suppressAutoHyphens w:val="true"/>
-        <w:bidi w:val="0"/>
-        <w:spacing w:before="80" w:after="0"/>
-        <w:jc w:val="both"/>
-        <w:rPr>
-          <w:rFonts w:ascii="Times New Roman" w:hAnsi="Times New Roman" w:eastAsia="Times New Roman" w:cs="Times New Roman"/>
-          <w:color w:val="00B0F0"/>
-          <w:kern w:val="0"/>
-          <w:sz w:val="20"/>
-          <w:szCs w:val="20"/>
-          <w:lang w:val="en-US" w:eastAsia="zh-CN" w:bidi="ar-SA"/>
-        </w:rPr>
-      </w:pPr>
-      <w:r>
-        <w:rPr>
-          <w:rFonts w:eastAsia="Times New Roman" w:cs="Times New Roman"/>
-          <w:color w:val="00B0F0"/>
-          <w:kern w:val="0"/>
-          <w:sz w:val="20"/>
-          <w:szCs w:val="20"/>
-          <w:lang w:val="en-US" w:eastAsia="zh-CN" w:bidi="ar-SA"/>
+        <w:rPr>
+          <w:color w:val="00B0F0"/>
+        </w:rPr>
+      </w:pPr>
+      <w:r>
+        <w:rPr>
+          <w:color w:val="00B0F0"/>
         </w:rPr>
         <w:t>3.1.6.3 Players will be able to join any open table from the lobby</w:t>
       </w:r>
@@ -6487,28 +6671,13 @@
     <w:p>
       <w:pPr>
         <w:pStyle w:val="Paragraph2"/>
-        <w:widowControl/>
-        <w:suppressAutoHyphens w:val="true"/>
-        <w:bidi w:val="0"/>
-        <w:spacing w:before="80" w:after="0"/>
-        <w:jc w:val="both"/>
-        <w:rPr>
-          <w:rFonts w:ascii="Times New Roman" w:hAnsi="Times New Roman" w:eastAsia="Times New Roman" w:cs="Times New Roman"/>
-          <w:color w:val="00B0F0"/>
-          <w:kern w:val="0"/>
-          <w:sz w:val="20"/>
-          <w:szCs w:val="20"/>
-          <w:lang w:val="en-US" w:eastAsia="zh-CN" w:bidi="ar-SA"/>
-        </w:rPr>
-      </w:pPr>
-      <w:r>
-        <w:rPr>
-          <w:rFonts w:eastAsia="Times New Roman" w:cs="Times New Roman"/>
-          <w:color w:val="00B0F0"/>
-          <w:kern w:val="0"/>
-          <w:sz w:val="20"/>
-          <w:szCs w:val="20"/>
-          <w:lang w:val="en-US" w:eastAsia="zh-CN" w:bidi="ar-SA"/>
+        <w:rPr>
+          <w:color w:val="00B0F0"/>
+        </w:rPr>
+      </w:pPr>
+      <w:r>
+        <w:rPr>
+          <w:color w:val="00B0F0"/>
         </w:rPr>
         <w:t>3.1.6.4 Players will be able to see table options and rules from the lobby.</w:t>
       </w:r>
@@ -6535,38 +6704,23 @@
         </w:numPr>
         <w:rPr/>
       </w:pPr>
-      <w:bookmarkStart w:id="22" w:name="_Toc223529130"/>
+      <w:bookmarkStart w:id="21" w:name="_Toc223529130"/>
       <w:r>
         <w:rPr/>
         <w:t>Table Module Requirements:</w:t>
       </w:r>
-      <w:bookmarkEnd w:id="22"/>
+      <w:bookmarkEnd w:id="21"/>
     </w:p>
     <w:p>
       <w:pPr>
         <w:pStyle w:val="Paragraph2"/>
-        <w:widowControl/>
-        <w:suppressAutoHyphens w:val="true"/>
-        <w:bidi w:val="0"/>
-        <w:spacing w:before="80" w:after="0"/>
-        <w:jc w:val="both"/>
-        <w:rPr>
-          <w:rFonts w:ascii="Times New Roman" w:hAnsi="Times New Roman" w:eastAsia="Times New Roman" w:cs="Times New Roman"/>
-          <w:color w:val="00B0F0"/>
-          <w:kern w:val="0"/>
-          <w:sz w:val="20"/>
-          <w:szCs w:val="20"/>
-          <w:lang w:val="en-US" w:eastAsia="zh-CN" w:bidi="ar-SA"/>
-        </w:rPr>
-      </w:pPr>
-      <w:r>
-        <w:rPr>
-          <w:rFonts w:eastAsia="Times New Roman" w:cs="Times New Roman"/>
-          <w:color w:val="00B0F0"/>
-          <w:kern w:val="0"/>
-          <w:sz w:val="20"/>
-          <w:szCs w:val="20"/>
-          <w:lang w:val="en-US" w:eastAsia="zh-CN" w:bidi="ar-SA"/>
+        <w:rPr>
+          <w:color w:val="00B0F0"/>
+        </w:rPr>
+      </w:pPr>
+      <w:r>
+        <w:rPr>
+          <w:color w:val="00B0F0"/>
         </w:rPr>
         <w:t>3.1.7.1 Tables are created whenever a dealer joins the server</w:t>
       </w:r>
@@ -6574,28 +6728,13 @@
     <w:p>
       <w:pPr>
         <w:pStyle w:val="Paragraph2"/>
-        <w:widowControl/>
-        <w:suppressAutoHyphens w:val="true"/>
-        <w:bidi w:val="0"/>
-        <w:spacing w:before="80" w:after="0"/>
-        <w:jc w:val="both"/>
-        <w:rPr>
-          <w:rFonts w:ascii="Times New Roman" w:hAnsi="Times New Roman" w:eastAsia="Times New Roman" w:cs="Times New Roman"/>
-          <w:color w:val="00B0F0"/>
-          <w:kern w:val="0"/>
-          <w:sz w:val="20"/>
-          <w:szCs w:val="20"/>
-          <w:lang w:val="en-US" w:eastAsia="zh-CN" w:bidi="ar-SA"/>
-        </w:rPr>
-      </w:pPr>
-      <w:r>
-        <w:rPr>
-          <w:rFonts w:eastAsia="Times New Roman" w:cs="Times New Roman"/>
-          <w:color w:val="00B0F0"/>
-          <w:kern w:val="0"/>
-          <w:sz w:val="20"/>
-          <w:szCs w:val="20"/>
-          <w:lang w:val="en-US" w:eastAsia="zh-CN" w:bidi="ar-SA"/>
+        <w:rPr>
+          <w:color w:val="00B0F0"/>
+        </w:rPr>
+      </w:pPr>
+      <w:r>
+        <w:rPr>
+          <w:color w:val="00B0F0"/>
         </w:rPr>
         <w:t>3.1.7.2 Tables are opened whenever the dealer finalizes the table options</w:t>
       </w:r>
@@ -6603,28 +6742,13 @@
     <w:p>
       <w:pPr>
         <w:pStyle w:val="Paragraph2"/>
-        <w:widowControl/>
-        <w:suppressAutoHyphens w:val="true"/>
-        <w:bidi w:val="0"/>
-        <w:spacing w:before="80" w:after="0"/>
-        <w:jc w:val="both"/>
-        <w:rPr>
-          <w:rFonts w:ascii="Times New Roman" w:hAnsi="Times New Roman" w:eastAsia="Times New Roman" w:cs="Times New Roman"/>
-          <w:color w:val="00B0F0"/>
-          <w:kern w:val="0"/>
-          <w:sz w:val="20"/>
-          <w:szCs w:val="20"/>
-          <w:lang w:val="en-US" w:eastAsia="zh-CN" w:bidi="ar-SA"/>
-        </w:rPr>
-      </w:pPr>
-      <w:r>
-        <w:rPr>
-          <w:rFonts w:eastAsia="Times New Roman" w:cs="Times New Roman"/>
-          <w:color w:val="00B0F0"/>
-          <w:kern w:val="0"/>
-          <w:sz w:val="20"/>
-          <w:szCs w:val="20"/>
-          <w:lang w:val="en-US" w:eastAsia="zh-CN" w:bidi="ar-SA"/>
+        <w:rPr>
+          <w:color w:val="00B0F0"/>
+        </w:rPr>
+      </w:pPr>
+      <w:r>
+        <w:rPr>
+          <w:color w:val="00B0F0"/>
         </w:rPr>
         <w:t>3.1.7.3 Table options are as followed: setting betting limits, setting shoe size, setting the turn timer.</w:t>
       </w:r>
@@ -6632,28 +6756,13 @@
     <w:p>
       <w:pPr>
         <w:pStyle w:val="Paragraph2"/>
-        <w:widowControl/>
-        <w:suppressAutoHyphens w:val="true"/>
-        <w:bidi w:val="0"/>
-        <w:spacing w:before="80" w:after="0"/>
-        <w:jc w:val="both"/>
-        <w:rPr>
-          <w:rFonts w:ascii="Times New Roman" w:hAnsi="Times New Roman" w:eastAsia="Times New Roman" w:cs="Times New Roman"/>
-          <w:color w:val="00B0F0"/>
-          <w:kern w:val="0"/>
-          <w:sz w:val="20"/>
-          <w:szCs w:val="20"/>
-          <w:lang w:val="en-US" w:eastAsia="zh-CN" w:bidi="ar-SA"/>
-        </w:rPr>
-      </w:pPr>
-      <w:r>
-        <w:rPr>
-          <w:rFonts w:eastAsia="Times New Roman" w:cs="Times New Roman"/>
-          <w:color w:val="00B0F0"/>
-          <w:kern w:val="0"/>
-          <w:sz w:val="20"/>
-          <w:szCs w:val="20"/>
-          <w:lang w:val="en-US" w:eastAsia="zh-CN" w:bidi="ar-SA"/>
+        <w:rPr>
+          <w:color w:val="00B0F0"/>
+        </w:rPr>
+      </w:pPr>
+      <w:r>
+        <w:rPr>
+          <w:color w:val="00B0F0"/>
         </w:rPr>
         <w:t>3.1.7.4 Players must have the minimum bet in order to join the table</w:t>
       </w:r>
@@ -6661,28 +6770,13 @@
     <w:p>
       <w:pPr>
         <w:pStyle w:val="Paragraph2"/>
-        <w:widowControl/>
-        <w:suppressAutoHyphens w:val="true"/>
-        <w:bidi w:val="0"/>
-        <w:spacing w:before="80" w:after="0"/>
-        <w:jc w:val="both"/>
-        <w:rPr>
-          <w:rFonts w:ascii="Times New Roman" w:hAnsi="Times New Roman" w:eastAsia="Times New Roman" w:cs="Times New Roman"/>
-          <w:color w:val="00B0F0"/>
-          <w:kern w:val="0"/>
-          <w:sz w:val="20"/>
-          <w:szCs w:val="20"/>
-          <w:lang w:val="en-US" w:eastAsia="zh-CN" w:bidi="ar-SA"/>
-        </w:rPr>
-      </w:pPr>
-      <w:r>
-        <w:rPr>
-          <w:rFonts w:eastAsia="Times New Roman" w:cs="Times New Roman"/>
-          <w:color w:val="00B0F0"/>
-          <w:kern w:val="0"/>
-          <w:sz w:val="20"/>
-          <w:szCs w:val="20"/>
-          <w:lang w:val="en-US" w:eastAsia="zh-CN" w:bidi="ar-SA"/>
+        <w:rPr>
+          <w:color w:val="00B0F0"/>
+        </w:rPr>
+      </w:pPr>
+      <w:r>
+        <w:rPr>
+          <w:color w:val="00B0F0"/>
         </w:rPr>
         <w:t xml:space="preserve">3.1.7.5 The dealer can close the table at any time. When the dealer sets the table to be closed, the game continues until the current round is complete. </w:t>
       </w:r>
@@ -6690,28 +6784,13 @@
     <w:p>
       <w:pPr>
         <w:pStyle w:val="Paragraph2"/>
-        <w:widowControl/>
-        <w:suppressAutoHyphens w:val="true"/>
-        <w:bidi w:val="0"/>
-        <w:spacing w:before="80" w:after="0"/>
-        <w:jc w:val="both"/>
-        <w:rPr>
-          <w:rFonts w:ascii="Times New Roman" w:hAnsi="Times New Roman" w:eastAsia="Times New Roman" w:cs="Times New Roman"/>
-          <w:color w:val="00B0F0"/>
-          <w:kern w:val="0"/>
-          <w:sz w:val="20"/>
-          <w:szCs w:val="20"/>
-          <w:lang w:val="en-US" w:eastAsia="zh-CN" w:bidi="ar-SA"/>
-        </w:rPr>
-      </w:pPr>
-      <w:r>
-        <w:rPr>
-          <w:rFonts w:eastAsia="Times New Roman" w:cs="Times New Roman"/>
-          <w:color w:val="00B0F0"/>
-          <w:kern w:val="0"/>
-          <w:sz w:val="20"/>
-          <w:szCs w:val="20"/>
-          <w:lang w:val="en-US" w:eastAsia="zh-CN" w:bidi="ar-SA"/>
+        <w:rPr>
+          <w:color w:val="00B0F0"/>
+        </w:rPr>
+      </w:pPr>
+      <w:r>
+        <w:rPr>
+          <w:color w:val="00B0F0"/>
         </w:rPr>
         <w:t>3.1.7.6 Each table will have a maximum of 6 players and 1 dealer.</w:t>
       </w:r>
@@ -6719,28 +6798,13 @@
     <w:p>
       <w:pPr>
         <w:pStyle w:val="Paragraph2"/>
-        <w:widowControl/>
-        <w:suppressAutoHyphens w:val="true"/>
-        <w:bidi w:val="0"/>
-        <w:spacing w:before="80" w:after="0"/>
-        <w:jc w:val="both"/>
-        <w:rPr>
-          <w:rFonts w:ascii="Times New Roman" w:hAnsi="Times New Roman" w:eastAsia="Times New Roman" w:cs="Times New Roman"/>
-          <w:color w:val="00B0F0"/>
-          <w:kern w:val="0"/>
-          <w:sz w:val="20"/>
-          <w:szCs w:val="20"/>
-          <w:lang w:val="en-US" w:eastAsia="zh-CN" w:bidi="ar-SA"/>
-        </w:rPr>
-      </w:pPr>
-      <w:r>
-        <w:rPr>
-          <w:rFonts w:eastAsia="Times New Roman" w:cs="Times New Roman"/>
-          <w:color w:val="00B0F0"/>
-          <w:kern w:val="0"/>
-          <w:sz w:val="20"/>
-          <w:szCs w:val="20"/>
-          <w:lang w:val="en-US" w:eastAsia="zh-CN" w:bidi="ar-SA"/>
+        <w:rPr>
+          <w:color w:val="00B0F0"/>
+        </w:rPr>
+      </w:pPr>
+      <w:r>
+        <w:rPr>
+          <w:color w:val="00B0F0"/>
         </w:rPr>
         <w:t>3.1.7.7 Table will be locked from new players while the table is at max capacity.</w:t>
       </w:r>
@@ -6754,12 +6818,12 @@
         </w:numPr>
         <w:rPr/>
       </w:pPr>
-      <w:bookmarkStart w:id="23" w:name="_Toc223529131"/>
+      <w:bookmarkStart w:id="22" w:name="_Toc223529131"/>
       <w:r>
         <w:rPr/>
         <w:t>Game Module Requirements:</w:t>
       </w:r>
-      <w:bookmarkEnd w:id="23"/>
+      <w:bookmarkEnd w:id="22"/>
     </w:p>
     <w:p>
       <w:pPr>
@@ -6991,38 +7055,23 @@
         </w:numPr>
         <w:rPr/>
       </w:pPr>
-      <w:bookmarkStart w:id="24" w:name="_Toc223529132"/>
+      <w:bookmarkStart w:id="23" w:name="_Toc223529132"/>
       <w:r>
         <w:rPr/>
         <w:t>External Interface Requirements</w:t>
       </w:r>
-      <w:bookmarkEnd w:id="24"/>
+      <w:bookmarkEnd w:id="23"/>
     </w:p>
     <w:p>
       <w:pPr>
         <w:pStyle w:val="Paragraph2"/>
-        <w:widowControl/>
-        <w:suppressAutoHyphens w:val="true"/>
-        <w:bidi w:val="0"/>
-        <w:spacing w:before="80" w:after="0"/>
-        <w:jc w:val="both"/>
-        <w:rPr>
-          <w:rFonts w:ascii="Times New Roman" w:hAnsi="Times New Roman" w:eastAsia="Times New Roman" w:cs="Times New Roman"/>
-          <w:color w:val="00B0F0"/>
-          <w:kern w:val="0"/>
-          <w:sz w:val="20"/>
-          <w:szCs w:val="20"/>
-          <w:lang w:val="en-US" w:eastAsia="zh-CN" w:bidi="ar-SA"/>
-        </w:rPr>
-      </w:pPr>
-      <w:r>
-        <w:rPr>
-          <w:rFonts w:eastAsia="Times New Roman" w:cs="Times New Roman"/>
-          <w:color w:val="00B0F0"/>
-          <w:kern w:val="0"/>
-          <w:sz w:val="20"/>
-          <w:szCs w:val="20"/>
-          <w:lang w:val="en-US" w:eastAsia="zh-CN" w:bidi="ar-SA"/>
+        <w:rPr>
+          <w:color w:val="00B0F0"/>
+        </w:rPr>
+      </w:pPr>
+      <w:r>
+        <w:rPr>
+          <w:color w:val="00B0F0"/>
         </w:rPr>
         <w:t>3.2.1 The system shall provide a graphical user interface for all user interactions including login, lobby navigation, table joining, and gameplay actions.</w:t>
       </w:r>
@@ -7030,28 +7079,13 @@
     <w:p>
       <w:pPr>
         <w:pStyle w:val="Paragraph2"/>
-        <w:widowControl/>
-        <w:suppressAutoHyphens w:val="true"/>
-        <w:bidi w:val="0"/>
-        <w:spacing w:before="80" w:after="0"/>
-        <w:jc w:val="both"/>
-        <w:rPr>
-          <w:rFonts w:ascii="Times New Roman" w:hAnsi="Times New Roman" w:eastAsia="Times New Roman" w:cs="Times New Roman"/>
-          <w:color w:val="00B0F0"/>
-          <w:kern w:val="0"/>
-          <w:sz w:val="20"/>
-          <w:szCs w:val="20"/>
-          <w:lang w:val="en-US" w:eastAsia="zh-CN" w:bidi="ar-SA"/>
-        </w:rPr>
-      </w:pPr>
-      <w:r>
-        <w:rPr>
-          <w:rFonts w:eastAsia="Times New Roman" w:cs="Times New Roman"/>
-          <w:color w:val="00B0F0"/>
-          <w:kern w:val="0"/>
-          <w:sz w:val="20"/>
-          <w:szCs w:val="20"/>
-          <w:lang w:val="en-US" w:eastAsia="zh-CN" w:bidi="ar-SA"/>
+        <w:rPr>
+          <w:color w:val="00B0F0"/>
+        </w:rPr>
+      </w:pPr>
+      <w:r>
+        <w:rPr>
+          <w:color w:val="00B0F0"/>
         </w:rPr>
         <w:t>3.2.2 The GUI shall present buttons or controls for player actions including hit, stand, split, double down, and insurance when available.</w:t>
       </w:r>
@@ -7059,28 +7093,13 @@
     <w:p>
       <w:pPr>
         <w:pStyle w:val="Paragraph2"/>
-        <w:widowControl/>
-        <w:suppressAutoHyphens w:val="true"/>
-        <w:bidi w:val="0"/>
-        <w:spacing w:before="80" w:after="0"/>
-        <w:jc w:val="both"/>
-        <w:rPr>
-          <w:rFonts w:ascii="Times New Roman" w:hAnsi="Times New Roman" w:eastAsia="Times New Roman" w:cs="Times New Roman"/>
-          <w:color w:val="00B0F0"/>
-          <w:kern w:val="0"/>
-          <w:sz w:val="20"/>
-          <w:szCs w:val="20"/>
-          <w:lang w:val="en-US" w:eastAsia="zh-CN" w:bidi="ar-SA"/>
-        </w:rPr>
-      </w:pPr>
-      <w:r>
-        <w:rPr>
-          <w:rFonts w:eastAsia="Times New Roman" w:cs="Times New Roman"/>
-          <w:color w:val="00B0F0"/>
-          <w:kern w:val="0"/>
-          <w:sz w:val="20"/>
-          <w:szCs w:val="20"/>
-          <w:lang w:val="en-US" w:eastAsia="zh-CN" w:bidi="ar-SA"/>
+        <w:rPr>
+          <w:color w:val="00B0F0"/>
+        </w:rPr>
+      </w:pPr>
+      <w:r>
+        <w:rPr>
+          <w:color w:val="00B0F0"/>
         </w:rPr>
         <w:t>3.2.3 The GUI shall display real-time updates of the game state including player hands, dealer hand, bets, timers, and outcomes.</w:t>
       </w:r>
@@ -7088,28 +7107,13 @@
     <w:p>
       <w:pPr>
         <w:pStyle w:val="Paragraph2"/>
-        <w:widowControl/>
-        <w:suppressAutoHyphens w:val="true"/>
-        <w:bidi w:val="0"/>
-        <w:spacing w:before="80" w:after="0"/>
-        <w:jc w:val="both"/>
-        <w:rPr>
-          <w:rFonts w:ascii="Times New Roman" w:hAnsi="Times New Roman" w:eastAsia="Times New Roman" w:cs="Times New Roman"/>
-          <w:color w:val="00B0F0"/>
-          <w:kern w:val="0"/>
-          <w:sz w:val="20"/>
-          <w:szCs w:val="20"/>
-          <w:lang w:val="en-US" w:eastAsia="zh-CN" w:bidi="ar-SA"/>
-        </w:rPr>
-      </w:pPr>
-      <w:r>
-        <w:rPr>
-          <w:rFonts w:eastAsia="Times New Roman" w:cs="Times New Roman"/>
-          <w:color w:val="00B0F0"/>
-          <w:kern w:val="0"/>
-          <w:sz w:val="20"/>
-          <w:szCs w:val="20"/>
-          <w:lang w:val="en-US" w:eastAsia="zh-CN" w:bidi="ar-SA"/>
+        <w:rPr>
+          <w:color w:val="00B0F0"/>
+        </w:rPr>
+      </w:pPr>
+      <w:r>
+        <w:rPr>
+          <w:color w:val="00B0F0"/>
         </w:rPr>
         <w:t>3.2.4 The system shall provide user interface elements allowing players to deposit funds, withdraw funds, and view current credit balances.</w:t>
       </w:r>
@@ -7117,28 +7121,13 @@
     <w:p>
       <w:pPr>
         <w:pStyle w:val="Paragraph2"/>
-        <w:widowControl/>
-        <w:suppressAutoHyphens w:val="true"/>
-        <w:bidi w:val="0"/>
-        <w:spacing w:before="80" w:after="0"/>
-        <w:jc w:val="both"/>
-        <w:rPr>
-          <w:rFonts w:ascii="Times New Roman" w:hAnsi="Times New Roman" w:eastAsia="Times New Roman" w:cs="Times New Roman"/>
-          <w:color w:val="00B0F0"/>
-          <w:kern w:val="0"/>
-          <w:sz w:val="20"/>
-          <w:szCs w:val="20"/>
-          <w:lang w:val="en-US" w:eastAsia="zh-CN" w:bidi="ar-SA"/>
-        </w:rPr>
-      </w:pPr>
-      <w:r>
-        <w:rPr>
-          <w:rFonts w:eastAsia="Times New Roman" w:cs="Times New Roman"/>
-          <w:color w:val="00B0F0"/>
-          <w:kern w:val="0"/>
-          <w:sz w:val="20"/>
-          <w:szCs w:val="20"/>
-          <w:lang w:val="en-US" w:eastAsia="zh-CN" w:bidi="ar-SA"/>
+        <w:rPr>
+          <w:color w:val="00B0F0"/>
+        </w:rPr>
+      </w:pPr>
+      <w:r>
+        <w:rPr>
+          <w:color w:val="00B0F0"/>
         </w:rPr>
         <w:t>3.2.5 The GUI shall display available tables within the lobby including table rules, current player count, and betting limits.</w:t>
       </w:r>
@@ -7146,28 +7135,13 @@
     <w:p>
       <w:pPr>
         <w:pStyle w:val="Paragraph2"/>
-        <w:widowControl/>
-        <w:suppressAutoHyphens w:val="true"/>
-        <w:bidi w:val="0"/>
-        <w:spacing w:before="80" w:after="0"/>
-        <w:jc w:val="both"/>
-        <w:rPr>
-          <w:rFonts w:ascii="Times New Roman" w:hAnsi="Times New Roman" w:eastAsia="Times New Roman" w:cs="Times New Roman"/>
-          <w:color w:val="00B0F0"/>
-          <w:kern w:val="0"/>
-          <w:sz w:val="20"/>
-          <w:szCs w:val="20"/>
-          <w:lang w:val="en-US" w:eastAsia="zh-CN" w:bidi="ar-SA"/>
-        </w:rPr>
-      </w:pPr>
-      <w:r>
-        <w:rPr>
-          <w:rFonts w:eastAsia="Times New Roman" w:cs="Times New Roman"/>
-          <w:color w:val="00B0F0"/>
-          <w:kern w:val="0"/>
-          <w:sz w:val="20"/>
-          <w:szCs w:val="20"/>
-          <w:lang w:val="en-US" w:eastAsia="zh-CN" w:bidi="ar-SA"/>
+        <w:rPr>
+          <w:color w:val="00B0F0"/>
+        </w:rPr>
+      </w:pPr>
+      <w:r>
+        <w:rPr>
+          <w:color w:val="00B0F0"/>
         </w:rPr>
         <w:t>3.2.6 The GUI shall notify users of connection issues, disconnections, or server shutdowns.</w:t>
       </w:r>
@@ -7175,28 +7149,13 @@
     <w:p>
       <w:pPr>
         <w:pStyle w:val="Paragraph2"/>
-        <w:widowControl/>
-        <w:suppressAutoHyphens w:val="true"/>
-        <w:bidi w:val="0"/>
-        <w:spacing w:before="80" w:after="0"/>
-        <w:jc w:val="both"/>
-        <w:rPr>
-          <w:rFonts w:ascii="Times New Roman" w:hAnsi="Times New Roman" w:eastAsia="Times New Roman" w:cs="Times New Roman"/>
-          <w:color w:val="00B0F0"/>
-          <w:kern w:val="0"/>
-          <w:sz w:val="20"/>
-          <w:szCs w:val="20"/>
-          <w:lang w:val="en-US" w:eastAsia="zh-CN" w:bidi="ar-SA"/>
-        </w:rPr>
-      </w:pPr>
-      <w:r>
-        <w:rPr>
-          <w:rFonts w:eastAsia="Times New Roman" w:cs="Times New Roman"/>
-          <w:color w:val="00B0F0"/>
-          <w:kern w:val="0"/>
-          <w:sz w:val="20"/>
-          <w:szCs w:val="20"/>
-          <w:lang w:val="en-US" w:eastAsia="zh-CN" w:bidi="ar-SA"/>
+        <w:rPr>
+          <w:color w:val="00B0F0"/>
+        </w:rPr>
+      </w:pPr>
+      <w:r>
+        <w:rPr>
+          <w:color w:val="00B0F0"/>
         </w:rPr>
         <w:t>3.2.7 The system shall interface with user payment methods (credit cards) to allow the purchase of in-game credits.</w:t>
       </w:r>
@@ -7223,12 +7182,12 @@
         </w:numPr>
         <w:rPr/>
       </w:pPr>
-      <w:bookmarkStart w:id="25" w:name="_Toc223529133"/>
+      <w:bookmarkStart w:id="24" w:name="_Toc223529133"/>
       <w:r>
         <w:rPr/>
         <w:t>Internal Interface Requirements</w:t>
       </w:r>
-      <w:bookmarkEnd w:id="25"/>
+      <w:bookmarkEnd w:id="24"/>
     </w:p>
     <w:p>
       <w:pPr>
@@ -7269,12 +7228,12 @@
         </w:numPr>
         <w:rPr/>
       </w:pPr>
-      <w:bookmarkStart w:id="26" w:name="_Toc223529134"/>
+      <w:bookmarkStart w:id="25" w:name="_Toc223529134"/>
       <w:r>
         <w:rPr/>
         <w:t>Non-Functional Requirements</w:t>
       </w:r>
-      <w:bookmarkEnd w:id="26"/>
+      <w:bookmarkEnd w:id="25"/>
     </w:p>
     <w:p>
       <w:pPr>
@@ -7285,12 +7244,12 @@
         </w:numPr>
         <w:rPr/>
       </w:pPr>
-      <w:bookmarkStart w:id="27" w:name="_Toc223529135"/>
+      <w:bookmarkStart w:id="26" w:name="_Toc223529135"/>
       <w:r>
         <w:rPr/>
         <w:t>Security and Privacy Requirements</w:t>
       </w:r>
-      <w:bookmarkEnd w:id="27"/>
+      <w:bookmarkEnd w:id="26"/>
     </w:p>
     <w:p>
       <w:pPr>
@@ -7329,12 +7288,12 @@
         </w:numPr>
         <w:rPr/>
       </w:pPr>
-      <w:bookmarkStart w:id="28" w:name="_Toc223529136"/>
+      <w:bookmarkStart w:id="27" w:name="_Toc223529136"/>
       <w:r>
         <w:rPr/>
         <w:t>Environmental Requirements</w:t>
       </w:r>
-      <w:bookmarkEnd w:id="28"/>
+      <w:bookmarkEnd w:id="27"/>
     </w:p>
     <w:p>
       <w:pPr>
@@ -7344,7 +7303,7 @@
           <w:color w:val="7030A0"/>
         </w:rPr>
       </w:pPr>
-      <w:bookmarkStart w:id="29" w:name="REQBV3HG5"/>
+      <w:bookmarkStart w:id="28" w:name="REQBV3HG5"/>
       <w:r>
         <w:rPr>
           <w:color w:val="7030A0"/>
@@ -7379,7 +7338,7 @@
         </w:rPr>
         <w:t>System cannot require that any software other than a web browser be installed on user computers. </w:t>
       </w:r>
-      <w:bookmarkEnd w:id="29"/>
+      <w:bookmarkEnd w:id="28"/>
     </w:p>
     <w:p>
       <w:pPr>
@@ -7389,7 +7348,7 @@
           <w:color w:val="7030A0"/>
         </w:rPr>
       </w:pPr>
-      <w:bookmarkStart w:id="30" w:name="REQBV5QU8"/>
+      <w:bookmarkStart w:id="29" w:name="REQBV5QU8"/>
       <w:r>
         <w:rPr>
           <w:color w:val="7030A0"/>
@@ -7409,7 +7368,7 @@
         </w:rPr>
         <w:t>System must make use of the University’s existing Oracle 9i implementation for its database. </w:t>
       </w:r>
-      <w:bookmarkEnd w:id="30"/>
+      <w:bookmarkEnd w:id="29"/>
     </w:p>
     <w:p>
       <w:pPr>
@@ -7419,7 +7378,7 @@
           <w:color w:val="7030A0"/>
         </w:rPr>
       </w:pPr>
-      <w:bookmarkStart w:id="31" w:name="REQBV5RT8"/>
+      <w:bookmarkStart w:id="30" w:name="REQBV5RT8"/>
       <w:r>
         <w:rPr>
           <w:color w:val="7030A0"/>
@@ -7439,7 +7398,7 @@
         </w:rPr>
         <w:t>System must be deployed on existing Linux-based server infrastructure. </w:t>
       </w:r>
-      <w:bookmarkEnd w:id="31"/>
+      <w:bookmarkEnd w:id="30"/>
     </w:p>
     <w:p>
       <w:pPr>
@@ -7464,14 +7423,14 @@
         </w:numPr>
         <w:rPr/>
       </w:pPr>
-      <w:bookmarkStart w:id="32" w:name="_Toc223529137"/>
+      <w:bookmarkStart w:id="31" w:name="_Toc223529137"/>
       <w:r>
         <w:rPr/>
         <w:t>Performance Requirements</w:t>
       </w:r>
-      <w:bookmarkStart w:id="33" w:name="REQBV5SS8"/>
+      <w:bookmarkStart w:id="32" w:name="REQBV5SS8"/>
+      <w:bookmarkEnd w:id="31"/>
       <w:bookmarkEnd w:id="32"/>
-      <w:bookmarkEnd w:id="33"/>
     </w:p>
     <w:p>
       <w:pPr>
@@ -7536,12 +7495,12 @@
     <w:p>
       <w:pPr>
         <w:sectPr>
-          <w:headerReference w:type="even" r:id="rId16"/>
-          <w:headerReference w:type="default" r:id="rId17"/>
-          <w:headerReference w:type="first" r:id="rId18"/>
-          <w:footerReference w:type="even" r:id="rId19"/>
-          <w:footerReference w:type="default" r:id="rId20"/>
-          <w:footerReference w:type="first" r:id="rId21"/>
+          <w:headerReference w:type="even" r:id="rId21"/>
+          <w:headerReference w:type="default" r:id="rId22"/>
+          <w:headerReference w:type="first" r:id="rId23"/>
+          <w:footerReference w:type="even" r:id="rId24"/>
+          <w:footerReference w:type="default" r:id="rId25"/>
+          <w:footerReference w:type="first" r:id="rId26"/>
           <w:type w:val="nextPage"/>
           <w:pgSz w:w="12240" w:h="15840"/>
           <w:pgMar w:left="1800" w:right="1800" w:gutter="0" w:header="720" w:top="1440" w:footer="1080" w:bottom="1800"/>
@@ -7662,10 +7621,12 @@
     </w:pPr>
     <w:r>
       <w:rPr/>
+    </w:r>
+    <w:r>
       <mc:AlternateContent>
         <mc:Choice Requires="wps">
           <w:drawing>
-            <wp:anchor distT="0" distB="0" distL="0" distR="0" simplePos="0" relativeHeight="2" behindDoc="1" locked="0" layoutInCell="0" allowOverlap="1" wp14:anchorId="07B49E00">
+            <wp:anchor distT="0" distB="0" distL="0" distR="0" simplePos="0" relativeHeight="8" behindDoc="0" locked="0" layoutInCell="0" allowOverlap="1">
               <wp:simplePos x="0" y="0"/>
               <wp:positionH relativeFrom="margin">
                 <wp:align>center</wp:align>
@@ -7675,31 +7636,24 @@
               </wp:positionV>
               <wp:extent cx="59055" cy="118745"/>
               <wp:effectExtent l="0" t="0" r="0" b="0"/>
-              <wp:wrapSquare wrapText="largest"/>
+              <wp:wrapSquare wrapText="bothSides"/>
               <wp:docPr id="1" name="Frame1"/>
               <a:graphic xmlns:a="http://schemas.openxmlformats.org/drawingml/2006/main">
                 <a:graphicData uri="http://schemas.microsoft.com/office/word/2010/wordprocessingShape">
                   <wps:wsp>
-                    <wps:cNvSpPr/>
+                    <wps:cNvSpPr txBox="1"/>
                     <wps:spPr>
                       <a:xfrm>
                         <a:off x="0" y="0"/>
-                        <a:ext cx="59040" cy="118800"/>
+                        <a:ext cx="59055" cy="118745"/>
                       </a:xfrm>
-                      <a:prstGeom prst="rect">
-                        <a:avLst/>
-                      </a:prstGeom>
-                      <a:noFill/>
-                      <a:ln w="0">
-                        <a:noFill/>
-                      </a:ln>
+                      <a:prstGeom prst="rect"/>
+                      <a:solidFill>
+                        <a:srgbClr val="FFFFFF">
+                          <a:alpha val="0"/>
+                        </a:srgbClr>
+                      </a:solidFill>
                     </wps:spPr>
-                    <wps:style>
-                      <a:lnRef idx="0"/>
-                      <a:fillRef idx="0"/>
-                      <a:effectRef idx="0"/>
-                      <a:fontRef idx="minor"/>
-                    </wps:style>
                     <wps:txbx>
                       <w:txbxContent>
                         <w:p>
@@ -7745,7 +7699,7 @@
                         </w:p>
                       </w:txbxContent>
                     </wps:txbx>
-                    <wps:bodyPr lIns="0" tIns="0" rIns="0" bIns="0" anchor="t">
+                    <wps:bodyPr anchor="t" lIns="0" tIns="0" rIns="0" bIns="0">
                       <a:noAutofit/>
                     </wps:bodyPr>
                   </wps:wsp>
@@ -7756,10 +7710,8 @@
         </mc:Choice>
         <mc:Fallback>
           <w:pict>
-            <v:rect id="shape_0" stroked="f" o:allowincell="f" style="position:absolute;margin-left:213.65pt;margin-top:0.05pt;width:4.6pt;height:9.3pt;mso-wrap-style:square;v-text-anchor:top;mso-position-horizontal:center;mso-position-horizontal-relative:margin" wp14:anchorId="07B49E00">
-              <v:fill o:detectmouseclick="t" on="false"/>
-              <v:stroke color="#3465a4" joinstyle="round" endcap="flat"/>
-              <v:textbox>
+            <v:rect stroked="f" strokeweight="0pt" style="position:absolute;rotation:-0;width:4.65pt;height:9.35pt;mso-wrap-distance-left:0pt;mso-wrap-distance-right:0pt;mso-wrap-distance-top:0pt;mso-wrap-distance-bottom:0pt;margin-top:0.05pt;mso-position-vertical-relative:text;margin-left:213.7pt;mso-position-horizontal:center;mso-position-horizontal-relative:margin">
+              <v:textbox inset="0in,0in,0in,0in">
                 <w:txbxContent>
                   <w:p>
                     <w:pPr>
@@ -7804,7 +7756,7 @@
                   </w:p>
                 </w:txbxContent>
               </v:textbox>
-              <w10:wrap type="square" side="largest"/>
+              <w10:wrap type="square"/>
             </v:rect>
           </w:pict>
         </mc:Fallback>
@@ -7823,10 +7775,12 @@
     </w:pPr>
     <w:r>
       <w:rPr/>
+    </w:r>
+    <w:r>
       <mc:AlternateContent>
         <mc:Choice Requires="wps">
           <w:drawing>
-            <wp:anchor distT="0" distB="0" distL="0" distR="0" simplePos="0" relativeHeight="2" behindDoc="1" locked="0" layoutInCell="0" allowOverlap="1" wp14:anchorId="07B49E00">
+            <wp:anchor distT="0" distB="0" distL="0" distR="0" simplePos="0" relativeHeight="8" behindDoc="0" locked="0" layoutInCell="0" allowOverlap="1">
               <wp:simplePos x="0" y="0"/>
               <wp:positionH relativeFrom="margin">
                 <wp:align>center</wp:align>
@@ -7836,31 +7790,24 @@
               </wp:positionV>
               <wp:extent cx="59055" cy="118745"/>
               <wp:effectExtent l="0" t="0" r="0" b="0"/>
-              <wp:wrapSquare wrapText="largest"/>
+              <wp:wrapSquare wrapText="bothSides"/>
               <wp:docPr id="2" name="Frame1"/>
               <a:graphic xmlns:a="http://schemas.openxmlformats.org/drawingml/2006/main">
                 <a:graphicData uri="http://schemas.microsoft.com/office/word/2010/wordprocessingShape">
                   <wps:wsp>
-                    <wps:cNvSpPr/>
+                    <wps:cNvSpPr txBox="1"/>
                     <wps:spPr>
                       <a:xfrm>
                         <a:off x="0" y="0"/>
-                        <a:ext cx="59040" cy="118800"/>
+                        <a:ext cx="59055" cy="118745"/>
                       </a:xfrm>
-                      <a:prstGeom prst="rect">
-                        <a:avLst/>
-                      </a:prstGeom>
-                      <a:noFill/>
-                      <a:ln w="0">
-                        <a:noFill/>
-                      </a:ln>
+                      <a:prstGeom prst="rect"/>
+                      <a:solidFill>
+                        <a:srgbClr val="FFFFFF">
+                          <a:alpha val="0"/>
+                        </a:srgbClr>
+                      </a:solidFill>
                     </wps:spPr>
-                    <wps:style>
-                      <a:lnRef idx="0"/>
-                      <a:fillRef idx="0"/>
-                      <a:effectRef idx="0"/>
-                      <a:fontRef idx="minor"/>
-                    </wps:style>
                     <wps:txbx>
                       <w:txbxContent>
                         <w:p>
@@ -7906,7 +7853,7 @@
                         </w:p>
                       </w:txbxContent>
                     </wps:txbx>
-                    <wps:bodyPr lIns="0" tIns="0" rIns="0" bIns="0" anchor="t">
+                    <wps:bodyPr anchor="t" lIns="0" tIns="0" rIns="0" bIns="0">
                       <a:noAutofit/>
                     </wps:bodyPr>
                   </wps:wsp>
@@ -7917,10 +7864,8 @@
         </mc:Choice>
         <mc:Fallback>
           <w:pict>
-            <v:rect id="shape_0" stroked="f" o:allowincell="f" style="position:absolute;margin-left:213.65pt;margin-top:0.05pt;width:4.6pt;height:9.3pt;mso-wrap-style:square;v-text-anchor:top;mso-position-horizontal:center;mso-position-horizontal-relative:margin" wp14:anchorId="07B49E00">
-              <v:fill o:detectmouseclick="t" on="false"/>
-              <v:stroke color="#3465a4" joinstyle="round" endcap="flat"/>
-              <v:textbox>
+            <v:rect stroked="f" strokeweight="0pt" style="position:absolute;rotation:-0;width:4.65pt;height:9.35pt;mso-wrap-distance-left:0pt;mso-wrap-distance-right:0pt;mso-wrap-distance-top:0pt;mso-wrap-distance-bottom:0pt;margin-top:0.05pt;mso-position-vertical-relative:text;margin-left:213.7pt;mso-position-horizontal:center;mso-position-horizontal-relative:margin">
+              <v:textbox inset="0in,0in,0in,0in">
                 <w:txbxContent>
                   <w:p>
                     <w:pPr>
@@ -7965,7 +7910,7 @@
                   </w:p>
                 </w:txbxContent>
               </v:textbox>
-              <w10:wrap type="square" side="largest"/>
+              <w10:wrap type="square"/>
             </v:rect>
           </w:pict>
         </mc:Fallback>
@@ -7998,10 +7943,12 @@
     </w:pPr>
     <w:r>
       <w:rPr/>
+    </w:r>
+    <w:r>
       <mc:AlternateContent>
         <mc:Choice Requires="wps">
           <w:drawing>
-            <wp:anchor distT="0" distB="0" distL="0" distR="0" simplePos="0" relativeHeight="24" behindDoc="1" locked="0" layoutInCell="0" allowOverlap="1" wp14:anchorId="16546B0F">
+            <wp:anchor distT="0" distB="0" distL="0" distR="0" simplePos="0" relativeHeight="23" behindDoc="0" locked="0" layoutInCell="0" allowOverlap="1">
               <wp:simplePos x="0" y="0"/>
               <wp:positionH relativeFrom="margin">
                 <wp:align>center</wp:align>
@@ -8011,31 +7958,24 @@
               </wp:positionV>
               <wp:extent cx="71755" cy="22860"/>
               <wp:effectExtent l="0" t="0" r="0" b="0"/>
-              <wp:wrapSquare wrapText="largest"/>
-              <wp:docPr id="4" name="Frame2"/>
+              <wp:wrapSquare wrapText="bothSides"/>
+              <wp:docPr id="9" name="Frame3"/>
               <a:graphic xmlns:a="http://schemas.openxmlformats.org/drawingml/2006/main">
                 <a:graphicData uri="http://schemas.microsoft.com/office/word/2010/wordprocessingShape">
                   <wps:wsp>
-                    <wps:cNvSpPr/>
+                    <wps:cNvSpPr txBox="1"/>
                     <wps:spPr>
                       <a:xfrm>
                         <a:off x="0" y="0"/>
-                        <a:ext cx="71640" cy="23040"/>
+                        <a:ext cx="71755" cy="22860"/>
                       </a:xfrm>
-                      <a:prstGeom prst="rect">
-                        <a:avLst/>
-                      </a:prstGeom>
-                      <a:noFill/>
-                      <a:ln w="0">
-                        <a:noFill/>
-                      </a:ln>
+                      <a:prstGeom prst="rect"/>
+                      <a:solidFill>
+                        <a:srgbClr val="FFFFFF">
+                          <a:alpha val="0"/>
+                        </a:srgbClr>
+                      </a:solidFill>
                     </wps:spPr>
-                    <wps:style>
-                      <a:lnRef idx="0"/>
-                      <a:fillRef idx="0"/>
-                      <a:effectRef idx="0"/>
-                      <a:fontRef idx="minor"/>
-                    </wps:style>
                     <wps:txbx>
                       <w:txbxContent>
                         <w:p>
@@ -8069,7 +8009,7 @@
                               <w:rStyle w:val="PageNumber"/>
                               <w:color w:val="000000"/>
                             </w:rPr>
-                            <w:t>xiii</w:t>
+                            <w:t>xviii</w:t>
                           </w:r>
                           <w:r>
                             <w:rPr>
@@ -8081,7 +8021,7 @@
                         </w:p>
                       </w:txbxContent>
                     </wps:txbx>
-                    <wps:bodyPr lIns="0" tIns="0" rIns="0" bIns="0" anchor="t">
+                    <wps:bodyPr anchor="t" lIns="0" tIns="0" rIns="0" bIns="0">
                       <a:noAutofit/>
                     </wps:bodyPr>
                   </wps:wsp>
@@ -8092,10 +8032,8 @@
         </mc:Choice>
         <mc:Fallback>
           <w:pict>
-            <v:rect id="shape_0" stroked="f" o:allowincell="f" style="position:absolute;margin-left:213.15pt;margin-top:0.05pt;width:5.6pt;height:1.75pt;mso-wrap-style:square;v-text-anchor:top;mso-position-horizontal:center;mso-position-horizontal-relative:margin" wp14:anchorId="16546B0F">
-              <v:fill o:detectmouseclick="t" on="false"/>
-              <v:stroke color="#3465a4" joinstyle="round" endcap="flat"/>
-              <v:textbox>
+            <v:rect stroked="f" strokeweight="0pt" style="position:absolute;rotation:-0;width:5.65pt;height:1.8pt;mso-wrap-distance-left:0pt;mso-wrap-distance-right:0pt;mso-wrap-distance-top:0pt;mso-wrap-distance-bottom:0pt;margin-top:0.05pt;mso-position-vertical-relative:text;margin-left:213.2pt;mso-position-horizontal:center;mso-position-horizontal-relative:margin">
+              <v:textbox inset="0in,0in,0in,0in">
                 <w:txbxContent>
                   <w:p>
                     <w:pPr>
@@ -8128,7 +8066,7 @@
                         <w:rStyle w:val="PageNumber"/>
                         <w:color w:val="000000"/>
                       </w:rPr>
-                      <w:t>xiii</w:t>
+                      <w:t>xviii</w:t>
                     </w:r>
                     <w:r>
                       <w:rPr>
@@ -8140,7 +8078,7 @@
                   </w:p>
                 </w:txbxContent>
               </v:textbox>
-              <w10:wrap type="square" side="largest"/>
+              <w10:wrap type="square"/>
             </v:rect>
           </w:pict>
         </mc:Fallback>
@@ -9002,7 +8940,7 @@
       <w:kern w:val="0"/>
       <w:sz w:val="20"/>
       <w:szCs w:val="20"/>
-      <w:lang w:val="en-US" w:eastAsia="zh-CN" w:bidi="ar-SA"/>
+      <w:lang w:bidi="ar-SA" w:val="en-US" w:eastAsia="zh-CN"/>
     </w:rPr>
   </w:style>
   <w:style w:type="paragraph" w:styleId="Heading1">
@@ -9630,7 +9568,7 @@
       <w:kern w:val="0"/>
       <w:sz w:val="20"/>
       <w:szCs w:val="20"/>
-      <w:lang w:val="en-US" w:eastAsia="zh-CN" w:bidi="ar-SA"/>
+      <w:lang w:bidi="ar-SA" w:val="en-US" w:eastAsia="zh-CN"/>
     </w:rPr>
   </w:style>
   <w:style w:type="paragraph" w:styleId="BodyTextIndent">

</xml_diff>